<commit_message>
Week 02 Exercises added
</commit_message>
<xml_diff>
--- a/LABlogbook_2523747_Neural Computing and Deep Learning (2025 MOD006568 TRI2 F01CIN).docx
+++ b/LABlogbook_2523747_Neural Computing and Deep Learning (2025 MOD006568 TRI2 F01CIN).docx
@@ -20,10 +20,99 @@
     </w:p>
     <w:p>
       <w:pPr>
-        <w:jc w:val="center"/>
-        <w:rPr>
-          <w:sz w:val="44"/>
-          <w:szCs w:val="44"/>
+        <w:rPr>
+          <w:b/>
+          <w:bCs/>
+          <w:sz w:val="28"/>
+          <w:szCs w:val="28"/>
+        </w:rPr>
+      </w:pPr>
+    </w:p>
+    <w:p>
+      <w:pPr>
+        <w:rPr>
+          <w:b/>
+          <w:bCs/>
+          <w:sz w:val="28"/>
+          <w:szCs w:val="28"/>
+        </w:rPr>
+      </w:pPr>
+      <w:r>
+        <w:rPr>
+          <w:b/>
+          <w:bCs/>
+          <w:sz w:val="28"/>
+          <w:szCs w:val="28"/>
+        </w:rPr>
+        <w:t>Neural Computing and Deep Learning (2025 MOD006568 TRI2 F01CIN)</w:t>
+      </w:r>
+    </w:p>
+    <w:p>
+      <w:pPr>
+        <w:rPr>
+          <w:b/>
+          <w:bCs/>
+          <w:sz w:val="28"/>
+          <w:szCs w:val="28"/>
+        </w:rPr>
+      </w:pPr>
+      <w:r>
+        <w:rPr>
+          <w:b/>
+          <w:bCs/>
+          <w:sz w:val="28"/>
+          <w:szCs w:val="28"/>
+        </w:rPr>
+        <w:t>Student number</w:t>
+      </w:r>
+      <w:r>
+        <w:rPr>
+          <w:b/>
+          <w:bCs/>
+          <w:sz w:val="28"/>
+          <w:szCs w:val="28"/>
+        </w:rPr>
+        <w:t>:</w:t>
+      </w:r>
+      <w:r>
+        <w:t xml:space="preserve"> </w:t>
+      </w:r>
+      <w:r>
+        <w:rPr>
+          <w:b/>
+          <w:bCs/>
+          <w:sz w:val="28"/>
+          <w:szCs w:val="28"/>
+        </w:rPr>
+        <w:t>2523747</w:t>
+      </w:r>
+    </w:p>
+    <w:p>
+      <w:pPr>
+        <w:rPr>
+          <w:b/>
+          <w:bCs/>
+          <w:sz w:val="28"/>
+          <w:szCs w:val="28"/>
+        </w:rPr>
+      </w:pPr>
+      <w:r>
+        <w:rPr>
+          <w:b/>
+          <w:bCs/>
+          <w:sz w:val="28"/>
+          <w:szCs w:val="28"/>
+        </w:rPr>
+        <w:t>Name: H.W.M.V.A Wijesinghe</w:t>
+      </w:r>
+    </w:p>
+    <w:p>
+      <w:pPr>
+        <w:rPr>
+          <w:b/>
+          <w:bCs/>
+          <w:sz w:val="28"/>
+          <w:szCs w:val="28"/>
         </w:rPr>
       </w:pPr>
     </w:p>
@@ -117,6 +206,66 @@
           <w:u w:val="single"/>
         </w:rPr>
       </w:pPr>
+    </w:p>
+    <w:p>
+      <w:pPr>
+        <w:jc w:val="both"/>
+        <w:rPr>
+          <w:sz w:val="44"/>
+          <w:szCs w:val="44"/>
+          <w:u w:val="single"/>
+        </w:rPr>
+      </w:pPr>
+    </w:p>
+    <w:p>
+      <w:pPr>
+        <w:jc w:val="both"/>
+        <w:rPr>
+          <w:sz w:val="44"/>
+          <w:szCs w:val="44"/>
+          <w:u w:val="single"/>
+        </w:rPr>
+      </w:pPr>
+    </w:p>
+    <w:p>
+      <w:pPr>
+        <w:jc w:val="both"/>
+        <w:rPr>
+          <w:sz w:val="44"/>
+          <w:szCs w:val="44"/>
+          <w:u w:val="single"/>
+        </w:rPr>
+      </w:pPr>
+    </w:p>
+    <w:p>
+      <w:pPr>
+        <w:jc w:val="both"/>
+        <w:rPr>
+          <w:sz w:val="44"/>
+          <w:szCs w:val="44"/>
+          <w:u w:val="single"/>
+        </w:rPr>
+      </w:pPr>
+    </w:p>
+    <w:p>
+      <w:pPr>
+        <w:jc w:val="both"/>
+        <w:rPr>
+          <w:sz w:val="44"/>
+          <w:szCs w:val="44"/>
+          <w:u w:val="single"/>
+        </w:rPr>
+      </w:pPr>
+    </w:p>
+    <w:p>
+      <w:pPr>
+        <w:jc w:val="both"/>
+        <w:rPr>
+          <w:sz w:val="44"/>
+          <w:szCs w:val="44"/>
+          <w:u w:val="single"/>
+        </w:rPr>
+      </w:pPr>
       <w:r>
         <w:rPr>
           <w:sz w:val="44"/>
@@ -130,6 +279,194 @@
       <w:pPr>
         <w:jc w:val="both"/>
         <w:rPr>
+          <w:sz w:val="24"/>
+          <w:szCs w:val="24"/>
+          <w:lang w:val="en-US"/>
+        </w:rPr>
+      </w:pPr>
+      <w:r>
+        <w:rPr>
+          <w:b/>
+          <w:bCs/>
+          <w:sz w:val="24"/>
+          <w:szCs w:val="24"/>
+          <w:lang w:val="en-US"/>
+        </w:rPr>
+        <w:t>Test Accuracy</w:t>
+      </w:r>
+      <w:r>
+        <w:rPr>
+          <w:sz w:val="24"/>
+          <w:szCs w:val="24"/>
+          <w:lang w:val="en-US"/>
+        </w:rPr>
+        <w:t>: 0.453</w:t>
+      </w:r>
+    </w:p>
+    <w:p>
+      <w:pPr>
+        <w:jc w:val="both"/>
+        <w:rPr>
+          <w:sz w:val="44"/>
+          <w:szCs w:val="44"/>
+          <w:u w:val="single"/>
+        </w:rPr>
+      </w:pPr>
+    </w:p>
+    <w:p>
+      <w:pPr>
+        <w:jc w:val="both"/>
+        <w:rPr>
+          <w:sz w:val="44"/>
+          <w:szCs w:val="44"/>
+          <w:u w:val="single"/>
+        </w:rPr>
+      </w:pPr>
+    </w:p>
+    <w:p>
+      <w:pPr>
+        <w:jc w:val="both"/>
+        <w:rPr>
+          <w:sz w:val="44"/>
+          <w:szCs w:val="44"/>
+          <w:u w:val="single"/>
+        </w:rPr>
+      </w:pPr>
+    </w:p>
+    <w:p>
+      <w:pPr>
+        <w:jc w:val="both"/>
+        <w:rPr>
+          <w:sz w:val="44"/>
+          <w:szCs w:val="44"/>
+          <w:u w:val="single"/>
+        </w:rPr>
+      </w:pPr>
+    </w:p>
+    <w:p>
+      <w:pPr>
+        <w:jc w:val="both"/>
+        <w:rPr>
+          <w:sz w:val="44"/>
+          <w:szCs w:val="44"/>
+          <w:u w:val="single"/>
+        </w:rPr>
+      </w:pPr>
+    </w:p>
+    <w:p>
+      <w:pPr>
+        <w:jc w:val="both"/>
+        <w:rPr>
+          <w:sz w:val="44"/>
+          <w:szCs w:val="44"/>
+          <w:u w:val="single"/>
+        </w:rPr>
+      </w:pPr>
+    </w:p>
+    <w:p>
+      <w:pPr>
+        <w:jc w:val="both"/>
+        <w:rPr>
+          <w:sz w:val="44"/>
+          <w:szCs w:val="44"/>
+          <w:u w:val="single"/>
+        </w:rPr>
+      </w:pPr>
+    </w:p>
+    <w:p>
+      <w:pPr>
+        <w:jc w:val="both"/>
+        <w:rPr>
+          <w:sz w:val="44"/>
+          <w:szCs w:val="44"/>
+          <w:u w:val="single"/>
+        </w:rPr>
+      </w:pPr>
+    </w:p>
+    <w:p>
+      <w:pPr>
+        <w:jc w:val="both"/>
+        <w:rPr>
+          <w:sz w:val="44"/>
+          <w:szCs w:val="44"/>
+          <w:u w:val="single"/>
+        </w:rPr>
+      </w:pPr>
+    </w:p>
+    <w:p>
+      <w:pPr>
+        <w:jc w:val="both"/>
+        <w:rPr>
+          <w:sz w:val="44"/>
+          <w:szCs w:val="44"/>
+          <w:u w:val="single"/>
+        </w:rPr>
+      </w:pPr>
+    </w:p>
+    <w:p>
+      <w:pPr>
+        <w:jc w:val="both"/>
+        <w:rPr>
+          <w:sz w:val="44"/>
+          <w:szCs w:val="44"/>
+          <w:u w:val="single"/>
+        </w:rPr>
+      </w:pPr>
+    </w:p>
+    <w:p>
+      <w:pPr>
+        <w:jc w:val="both"/>
+        <w:rPr>
+          <w:sz w:val="44"/>
+          <w:szCs w:val="44"/>
+          <w:u w:val="single"/>
+        </w:rPr>
+      </w:pPr>
+    </w:p>
+    <w:p>
+      <w:pPr>
+        <w:jc w:val="both"/>
+        <w:rPr>
+          <w:sz w:val="44"/>
+          <w:szCs w:val="44"/>
+          <w:u w:val="single"/>
+        </w:rPr>
+      </w:pPr>
+    </w:p>
+    <w:p>
+      <w:pPr>
+        <w:jc w:val="both"/>
+        <w:rPr>
+          <w:sz w:val="44"/>
+          <w:szCs w:val="44"/>
+          <w:u w:val="single"/>
+        </w:rPr>
+      </w:pPr>
+    </w:p>
+    <w:p>
+      <w:pPr>
+        <w:jc w:val="both"/>
+        <w:rPr>
+          <w:sz w:val="44"/>
+          <w:szCs w:val="44"/>
+          <w:u w:val="single"/>
+        </w:rPr>
+      </w:pPr>
+    </w:p>
+    <w:p>
+      <w:pPr>
+        <w:jc w:val="both"/>
+        <w:rPr>
+          <w:sz w:val="44"/>
+          <w:szCs w:val="44"/>
+          <w:u w:val="single"/>
+        </w:rPr>
+      </w:pPr>
+    </w:p>
+    <w:p>
+      <w:pPr>
+        <w:jc w:val="both"/>
+        <w:rPr>
           <w:sz w:val="44"/>
           <w:szCs w:val="44"/>
           <w:u w:val="single"/>
@@ -402,6 +739,7 @@
           <w:szCs w:val="44"/>
           <w:u w:val="single"/>
         </w:rPr>
+        <w:lastRenderedPageBreak/>
         <w:t>Lab 12</w:t>
       </w:r>
     </w:p>

</xml_diff>

<commit_message>
Week 03 exercises added
</commit_message>
<xml_diff>
--- a/LABlogbook_2523747_Neural Computing and Deep Learning (2025 MOD006568 TRI2 F01CIN).docx
+++ b/LABlogbook_2523747_Neural Computing and Deep Learning (2025 MOD006568 TRI2 F01CIN).docx
@@ -23,8 +23,8 @@
         <w:rPr>
           <w:b/>
           <w:bCs/>
-          <w:sz w:val="28"/>
-          <w:szCs w:val="28"/>
+          <w:sz w:val="24"/>
+          <w:szCs w:val="24"/>
         </w:rPr>
       </w:pPr>
     </w:p>
@@ -33,16 +33,16 @@
         <w:rPr>
           <w:b/>
           <w:bCs/>
-          <w:sz w:val="28"/>
-          <w:szCs w:val="28"/>
+          <w:sz w:val="24"/>
+          <w:szCs w:val="24"/>
         </w:rPr>
       </w:pPr>
       <w:r>
         <w:rPr>
           <w:b/>
           <w:bCs/>
-          <w:sz w:val="28"/>
-          <w:szCs w:val="28"/>
+          <w:sz w:val="24"/>
+          <w:szCs w:val="24"/>
         </w:rPr>
         <w:t>Neural Computing and Deep Learning (2025 MOD006568 TRI2 F01CIN)</w:t>
       </w:r>
@@ -52,56 +52,51 @@
         <w:rPr>
           <w:b/>
           <w:bCs/>
-          <w:sz w:val="28"/>
-          <w:szCs w:val="28"/>
+          <w:sz w:val="24"/>
+          <w:szCs w:val="24"/>
         </w:rPr>
       </w:pPr>
       <w:r>
         <w:rPr>
           <w:b/>
           <w:bCs/>
-          <w:sz w:val="28"/>
-          <w:szCs w:val="28"/>
-        </w:rPr>
-        <w:t>Student number</w:t>
+          <w:sz w:val="24"/>
+          <w:szCs w:val="24"/>
+        </w:rPr>
+        <w:t>Student number:</w:t>
+      </w:r>
+      <w:r>
+        <w:rPr>
+          <w:sz w:val="24"/>
+          <w:szCs w:val="24"/>
+        </w:rPr>
+        <w:t xml:space="preserve"> </w:t>
       </w:r>
       <w:r>
         <w:rPr>
           <w:b/>
           <w:bCs/>
-          <w:sz w:val="28"/>
-          <w:szCs w:val="28"/>
-        </w:rPr>
-        <w:t>:</w:t>
-      </w:r>
-      <w:r>
-        <w:t xml:space="preserve"> </w:t>
-      </w:r>
-      <w:r>
+          <w:sz w:val="24"/>
+          <w:szCs w:val="24"/>
+        </w:rPr>
+        <w:t>2523747</w:t>
+      </w:r>
+    </w:p>
+    <w:p>
+      <w:pPr>
         <w:rPr>
           <w:b/>
           <w:bCs/>
-          <w:sz w:val="28"/>
-          <w:szCs w:val="28"/>
-        </w:rPr>
-        <w:t>2523747</w:t>
-      </w:r>
-    </w:p>
-    <w:p>
-      <w:pPr>
+          <w:sz w:val="44"/>
+          <w:szCs w:val="44"/>
+        </w:rPr>
+      </w:pPr>
+      <w:r>
         <w:rPr>
           <w:b/>
           <w:bCs/>
-          <w:sz w:val="28"/>
-          <w:szCs w:val="28"/>
-        </w:rPr>
-      </w:pPr>
-      <w:r>
-        <w:rPr>
-          <w:b/>
-          <w:bCs/>
-          <w:sz w:val="28"/>
-          <w:szCs w:val="28"/>
+          <w:sz w:val="24"/>
+          <w:szCs w:val="24"/>
         </w:rPr>
         <w:t>Name: H.W.M.V.A Wijesinghe</w:t>
       </w:r>
@@ -109,10 +104,8 @@
     <w:p>
       <w:pPr>
         <w:rPr>
-          <w:b/>
-          <w:bCs/>
-          <w:sz w:val="28"/>
-          <w:szCs w:val="28"/>
+          <w:sz w:val="44"/>
+          <w:szCs w:val="44"/>
         </w:rPr>
       </w:pPr>
     </w:p>
@@ -256,22 +249,13 @@
           <w:u w:val="single"/>
         </w:rPr>
       </w:pPr>
-    </w:p>
-    <w:p>
-      <w:pPr>
-        <w:jc w:val="both"/>
-        <w:rPr>
-          <w:sz w:val="44"/>
-          <w:szCs w:val="44"/>
-          <w:u w:val="single"/>
-        </w:rPr>
-      </w:pPr>
-      <w:r>
-        <w:rPr>
-          <w:sz w:val="44"/>
-          <w:szCs w:val="44"/>
-          <w:u w:val="single"/>
-        </w:rPr>
+      <w:r>
+        <w:rPr>
+          <w:sz w:val="44"/>
+          <w:szCs w:val="44"/>
+          <w:u w:val="single"/>
+        </w:rPr>
+        <w:lastRenderedPageBreak/>
         <w:t>Lab 2</w:t>
       </w:r>
     </w:p>
@@ -488,6 +472,7 @@
           <w:szCs w:val="44"/>
           <w:u w:val="single"/>
         </w:rPr>
+        <w:lastRenderedPageBreak/>
         <w:t>Lab 3</w:t>
       </w:r>
     </w:p>
@@ -495,6 +480,588 @@
       <w:pPr>
         <w:jc w:val="both"/>
         <w:rPr>
+          <w:sz w:val="24"/>
+          <w:szCs w:val="24"/>
+          <w:lang w:val="en-US"/>
+        </w:rPr>
+      </w:pPr>
+      <w:r>
+        <w:rPr>
+          <w:b/>
+          <w:bCs/>
+          <w:sz w:val="24"/>
+          <w:szCs w:val="24"/>
+          <w:lang w:val="en-US"/>
+        </w:rPr>
+        <w:t xml:space="preserve">Test </w:t>
+      </w:r>
+      <w:r>
+        <w:rPr>
+          <w:b/>
+          <w:bCs/>
+          <w:sz w:val="24"/>
+          <w:szCs w:val="24"/>
+          <w:lang w:val="en-US"/>
+        </w:rPr>
+        <w:t>A</w:t>
+      </w:r>
+      <w:r>
+        <w:rPr>
+          <w:b/>
+          <w:bCs/>
+          <w:sz w:val="24"/>
+          <w:szCs w:val="24"/>
+          <w:lang w:val="en-US"/>
+        </w:rPr>
+        <w:t>ccuracy</w:t>
+      </w:r>
+      <w:r>
+        <w:rPr>
+          <w:sz w:val="24"/>
+          <w:szCs w:val="24"/>
+          <w:lang w:val="en-US"/>
+        </w:rPr>
+        <w:t>: 0.8863999843597412</w:t>
+      </w:r>
+    </w:p>
+    <w:p>
+      <w:pPr>
+        <w:jc w:val="both"/>
+        <w:rPr>
+          <w:sz w:val="24"/>
+          <w:szCs w:val="24"/>
+          <w:lang w:val="en-US"/>
+        </w:rPr>
+      </w:pPr>
+    </w:p>
+    <w:p>
+      <w:pPr>
+        <w:jc w:val="both"/>
+        <w:rPr>
+          <w:b/>
+          <w:bCs/>
+          <w:sz w:val="24"/>
+          <w:szCs w:val="24"/>
+          <w:lang w:val="en-US"/>
+        </w:rPr>
+      </w:pPr>
+      <w:r>
+        <w:rPr>
+          <w:b/>
+          <w:bCs/>
+          <w:sz w:val="24"/>
+          <w:szCs w:val="24"/>
+          <w:lang w:val="en-US"/>
+        </w:rPr>
+        <w:t>Test Summary</w:t>
+      </w:r>
+    </w:p>
+    <w:p>
+      <w:pPr>
+        <w:jc w:val="both"/>
+        <w:rPr>
+          <w:sz w:val="20"/>
+          <w:szCs w:val="20"/>
+          <w:lang w:val="en-US"/>
+        </w:rPr>
+      </w:pPr>
+      <w:r>
+        <w:rPr>
+          <w:sz w:val="20"/>
+          <w:szCs w:val="20"/>
+          <w:lang w:val="en-US"/>
+        </w:rPr>
+        <w:t>_________________________________________________________________</w:t>
+      </w:r>
+    </w:p>
+    <w:p>
+      <w:pPr>
+        <w:jc w:val="both"/>
+        <w:rPr>
+          <w:sz w:val="20"/>
+          <w:szCs w:val="20"/>
+          <w:lang w:val="en-US"/>
+        </w:rPr>
+      </w:pPr>
+      <w:r>
+        <w:rPr>
+          <w:sz w:val="20"/>
+          <w:szCs w:val="20"/>
+          <w:lang w:val="en-US"/>
+        </w:rPr>
+        <w:t xml:space="preserve"> Layer (</w:t>
+      </w:r>
+      <w:proofErr w:type="gramStart"/>
+      <w:r>
+        <w:rPr>
+          <w:sz w:val="20"/>
+          <w:szCs w:val="20"/>
+          <w:lang w:val="en-US"/>
+        </w:rPr>
+        <w:t xml:space="preserve">type)   </w:t>
+      </w:r>
+      <w:proofErr w:type="gramEnd"/>
+      <w:r>
+        <w:rPr>
+          <w:sz w:val="20"/>
+          <w:szCs w:val="20"/>
+          <w:lang w:val="en-US"/>
+        </w:rPr>
+        <w:t xml:space="preserve">             Output Shape              Param #   </w:t>
+      </w:r>
+    </w:p>
+    <w:p>
+      <w:pPr>
+        <w:jc w:val="both"/>
+        <w:rPr>
+          <w:sz w:val="20"/>
+          <w:szCs w:val="20"/>
+          <w:lang w:val="en-US"/>
+        </w:rPr>
+      </w:pPr>
+      <w:r>
+        <w:rPr>
+          <w:sz w:val="20"/>
+          <w:szCs w:val="20"/>
+          <w:lang w:val="en-US"/>
+        </w:rPr>
+        <w:t>=================================================================</w:t>
+      </w:r>
+    </w:p>
+    <w:p>
+      <w:pPr>
+        <w:jc w:val="both"/>
+        <w:rPr>
+          <w:sz w:val="20"/>
+          <w:szCs w:val="20"/>
+          <w:lang w:val="en-US"/>
+        </w:rPr>
+      </w:pPr>
+      <w:r>
+        <w:rPr>
+          <w:sz w:val="20"/>
+          <w:szCs w:val="20"/>
+          <w:lang w:val="en-US"/>
+        </w:rPr>
+        <w:t xml:space="preserve"> flatten (</w:t>
+      </w:r>
+      <w:proofErr w:type="gramStart"/>
+      <w:r>
+        <w:rPr>
+          <w:sz w:val="20"/>
+          <w:szCs w:val="20"/>
+          <w:lang w:val="en-US"/>
+        </w:rPr>
+        <w:t xml:space="preserve">Flatten)   </w:t>
+      </w:r>
+      <w:proofErr w:type="gramEnd"/>
+      <w:r>
+        <w:rPr>
+          <w:sz w:val="20"/>
+          <w:szCs w:val="20"/>
+          <w:lang w:val="en-US"/>
+        </w:rPr>
+        <w:t xml:space="preserve">     </w:t>
+      </w:r>
+      <w:proofErr w:type="gramStart"/>
+      <w:r>
+        <w:rPr>
+          <w:sz w:val="20"/>
+          <w:szCs w:val="20"/>
+          <w:lang w:val="en-US"/>
+        </w:rPr>
+        <w:t xml:space="preserve">   (</w:t>
+      </w:r>
+      <w:proofErr w:type="gramEnd"/>
+      <w:r>
+        <w:rPr>
+          <w:sz w:val="20"/>
+          <w:szCs w:val="20"/>
+          <w:lang w:val="en-US"/>
+        </w:rPr>
+        <w:t xml:space="preserve">None, 784)               0         </w:t>
+      </w:r>
+    </w:p>
+    <w:p>
+      <w:pPr>
+        <w:jc w:val="both"/>
+        <w:rPr>
+          <w:sz w:val="20"/>
+          <w:szCs w:val="20"/>
+          <w:lang w:val="en-US"/>
+        </w:rPr>
+      </w:pPr>
+      <w:r>
+        <w:rPr>
+          <w:sz w:val="20"/>
+          <w:szCs w:val="20"/>
+          <w:lang w:val="en-US"/>
+        </w:rPr>
+        <w:t xml:space="preserve">                                                                 </w:t>
+      </w:r>
+    </w:p>
+    <w:p>
+      <w:pPr>
+        <w:jc w:val="both"/>
+        <w:rPr>
+          <w:sz w:val="20"/>
+          <w:szCs w:val="20"/>
+          <w:lang w:val="en-US"/>
+        </w:rPr>
+      </w:pPr>
+      <w:r>
+        <w:rPr>
+          <w:sz w:val="20"/>
+          <w:szCs w:val="20"/>
+          <w:lang w:val="en-US"/>
+        </w:rPr>
+        <w:t xml:space="preserve"> dense (</w:t>
+      </w:r>
+      <w:proofErr w:type="gramStart"/>
+      <w:r>
+        <w:rPr>
+          <w:sz w:val="20"/>
+          <w:szCs w:val="20"/>
+          <w:lang w:val="en-US"/>
+        </w:rPr>
+        <w:t xml:space="preserve">Dense)   </w:t>
+      </w:r>
+      <w:proofErr w:type="gramEnd"/>
+      <w:r>
+        <w:rPr>
+          <w:sz w:val="20"/>
+          <w:szCs w:val="20"/>
+          <w:lang w:val="en-US"/>
+        </w:rPr>
+        <w:t xml:space="preserve">         </w:t>
+      </w:r>
+      <w:proofErr w:type="gramStart"/>
+      <w:r>
+        <w:rPr>
+          <w:sz w:val="20"/>
+          <w:szCs w:val="20"/>
+          <w:lang w:val="en-US"/>
+        </w:rPr>
+        <w:t xml:space="preserve">   (</w:t>
+      </w:r>
+      <w:proofErr w:type="gramEnd"/>
+      <w:r>
+        <w:rPr>
+          <w:sz w:val="20"/>
+          <w:szCs w:val="20"/>
+          <w:lang w:val="en-US"/>
+        </w:rPr>
+        <w:t xml:space="preserve">None, 128)               100480    </w:t>
+      </w:r>
+    </w:p>
+    <w:p>
+      <w:pPr>
+        <w:jc w:val="both"/>
+        <w:rPr>
+          <w:sz w:val="20"/>
+          <w:szCs w:val="20"/>
+          <w:lang w:val="en-US"/>
+        </w:rPr>
+      </w:pPr>
+      <w:r>
+        <w:rPr>
+          <w:sz w:val="20"/>
+          <w:szCs w:val="20"/>
+          <w:lang w:val="en-US"/>
+        </w:rPr>
+        <w:t xml:space="preserve">                                                                 </w:t>
+      </w:r>
+    </w:p>
+    <w:p>
+      <w:pPr>
+        <w:jc w:val="both"/>
+        <w:rPr>
+          <w:sz w:val="20"/>
+          <w:szCs w:val="20"/>
+          <w:lang w:val="en-US"/>
+        </w:rPr>
+      </w:pPr>
+      <w:r>
+        <w:rPr>
+          <w:sz w:val="20"/>
+          <w:szCs w:val="20"/>
+          <w:lang w:val="en-US"/>
+        </w:rPr>
+        <w:t xml:space="preserve"> dense_1 (</w:t>
+      </w:r>
+      <w:proofErr w:type="gramStart"/>
+      <w:r>
+        <w:rPr>
+          <w:sz w:val="20"/>
+          <w:szCs w:val="20"/>
+          <w:lang w:val="en-US"/>
+        </w:rPr>
+        <w:t xml:space="preserve">Dense)   </w:t>
+      </w:r>
+      <w:proofErr w:type="gramEnd"/>
+      <w:r>
+        <w:rPr>
+          <w:sz w:val="20"/>
+          <w:szCs w:val="20"/>
+          <w:lang w:val="en-US"/>
+        </w:rPr>
+        <w:t xml:space="preserve">       </w:t>
+      </w:r>
+      <w:proofErr w:type="gramStart"/>
+      <w:r>
+        <w:rPr>
+          <w:sz w:val="20"/>
+          <w:szCs w:val="20"/>
+          <w:lang w:val="en-US"/>
+        </w:rPr>
+        <w:t xml:space="preserve">   (</w:t>
+      </w:r>
+      <w:proofErr w:type="gramEnd"/>
+      <w:r>
+        <w:rPr>
+          <w:sz w:val="20"/>
+          <w:szCs w:val="20"/>
+          <w:lang w:val="en-US"/>
+        </w:rPr>
+        <w:t xml:space="preserve">None, 64)                8256      </w:t>
+      </w:r>
+    </w:p>
+    <w:p>
+      <w:pPr>
+        <w:jc w:val="both"/>
+        <w:rPr>
+          <w:sz w:val="20"/>
+          <w:szCs w:val="20"/>
+          <w:lang w:val="en-US"/>
+        </w:rPr>
+      </w:pPr>
+      <w:r>
+        <w:rPr>
+          <w:sz w:val="20"/>
+          <w:szCs w:val="20"/>
+          <w:lang w:val="en-US"/>
+        </w:rPr>
+        <w:t xml:space="preserve">                                                                 </w:t>
+      </w:r>
+    </w:p>
+    <w:p>
+      <w:pPr>
+        <w:jc w:val="both"/>
+        <w:rPr>
+          <w:sz w:val="20"/>
+          <w:szCs w:val="20"/>
+          <w:lang w:val="en-US"/>
+        </w:rPr>
+      </w:pPr>
+      <w:r>
+        <w:rPr>
+          <w:sz w:val="20"/>
+          <w:szCs w:val="20"/>
+          <w:lang w:val="en-US"/>
+        </w:rPr>
+        <w:t xml:space="preserve"> dense_2 (</w:t>
+      </w:r>
+      <w:proofErr w:type="gramStart"/>
+      <w:r>
+        <w:rPr>
+          <w:sz w:val="20"/>
+          <w:szCs w:val="20"/>
+          <w:lang w:val="en-US"/>
+        </w:rPr>
+        <w:t xml:space="preserve">Dense)   </w:t>
+      </w:r>
+      <w:proofErr w:type="gramEnd"/>
+      <w:r>
+        <w:rPr>
+          <w:sz w:val="20"/>
+          <w:szCs w:val="20"/>
+          <w:lang w:val="en-US"/>
+        </w:rPr>
+        <w:t xml:space="preserve">       </w:t>
+      </w:r>
+      <w:proofErr w:type="gramStart"/>
+      <w:r>
+        <w:rPr>
+          <w:sz w:val="20"/>
+          <w:szCs w:val="20"/>
+          <w:lang w:val="en-US"/>
+        </w:rPr>
+        <w:t xml:space="preserve">   (</w:t>
+      </w:r>
+      <w:proofErr w:type="gramEnd"/>
+      <w:r>
+        <w:rPr>
+          <w:sz w:val="20"/>
+          <w:szCs w:val="20"/>
+          <w:lang w:val="en-US"/>
+        </w:rPr>
+        <w:t xml:space="preserve">None, 10)                650       </w:t>
+      </w:r>
+    </w:p>
+    <w:p>
+      <w:pPr>
+        <w:jc w:val="both"/>
+        <w:rPr>
+          <w:sz w:val="20"/>
+          <w:szCs w:val="20"/>
+          <w:lang w:val="en-US"/>
+        </w:rPr>
+      </w:pPr>
+      <w:r>
+        <w:rPr>
+          <w:sz w:val="20"/>
+          <w:szCs w:val="20"/>
+          <w:lang w:val="en-US"/>
+        </w:rPr>
+        <w:t xml:space="preserve">                                                                 </w:t>
+      </w:r>
+    </w:p>
+    <w:p>
+      <w:pPr>
+        <w:jc w:val="both"/>
+        <w:rPr>
+          <w:sz w:val="20"/>
+          <w:szCs w:val="20"/>
+          <w:lang w:val="en-US"/>
+        </w:rPr>
+      </w:pPr>
+      <w:r>
+        <w:rPr>
+          <w:sz w:val="20"/>
+          <w:szCs w:val="20"/>
+          <w:lang w:val="en-US"/>
+        </w:rPr>
+        <w:t>=================================================================</w:t>
+      </w:r>
+    </w:p>
+    <w:p>
+      <w:pPr>
+        <w:jc w:val="both"/>
+        <w:rPr>
+          <w:sz w:val="20"/>
+          <w:szCs w:val="20"/>
+          <w:lang w:val="en-US"/>
+        </w:rPr>
+      </w:pPr>
+      <w:r>
+        <w:rPr>
+          <w:sz w:val="20"/>
+          <w:szCs w:val="20"/>
+          <w:lang w:val="en-US"/>
+        </w:rPr>
+        <w:t>Total params: 109386 (427.29 KB)</w:t>
+      </w:r>
+    </w:p>
+    <w:p>
+      <w:pPr>
+        <w:jc w:val="both"/>
+        <w:rPr>
+          <w:sz w:val="20"/>
+          <w:szCs w:val="20"/>
+          <w:lang w:val="en-US"/>
+        </w:rPr>
+      </w:pPr>
+      <w:r>
+        <w:rPr>
+          <w:sz w:val="20"/>
+          <w:szCs w:val="20"/>
+          <w:lang w:val="en-US"/>
+        </w:rPr>
+        <w:t>Trainable params: 109386 (427.29 KB)</w:t>
+      </w:r>
+    </w:p>
+    <w:p>
+      <w:pPr>
+        <w:jc w:val="both"/>
+        <w:rPr>
+          <w:sz w:val="20"/>
+          <w:szCs w:val="20"/>
+          <w:lang w:val="en-US"/>
+        </w:rPr>
+      </w:pPr>
+      <w:r>
+        <w:rPr>
+          <w:sz w:val="20"/>
+          <w:szCs w:val="20"/>
+          <w:lang w:val="en-US"/>
+        </w:rPr>
+        <w:t>Non-trainable params: 0 (0.00 Byte)</w:t>
+      </w:r>
+    </w:p>
+    <w:p>
+      <w:pPr>
+        <w:jc w:val="both"/>
+        <w:rPr>
+          <w:sz w:val="44"/>
+          <w:szCs w:val="44"/>
+          <w:u w:val="single"/>
+        </w:rPr>
+      </w:pPr>
+    </w:p>
+    <w:p>
+      <w:pPr>
+        <w:jc w:val="both"/>
+        <w:rPr>
+          <w:sz w:val="44"/>
+          <w:szCs w:val="44"/>
+          <w:u w:val="single"/>
+        </w:rPr>
+      </w:pPr>
+    </w:p>
+    <w:p>
+      <w:pPr>
+        <w:jc w:val="both"/>
+        <w:rPr>
+          <w:sz w:val="44"/>
+          <w:szCs w:val="44"/>
+          <w:u w:val="single"/>
+        </w:rPr>
+      </w:pPr>
+    </w:p>
+    <w:p>
+      <w:pPr>
+        <w:jc w:val="both"/>
+        <w:rPr>
+          <w:sz w:val="44"/>
+          <w:szCs w:val="44"/>
+          <w:u w:val="single"/>
+        </w:rPr>
+      </w:pPr>
+    </w:p>
+    <w:p>
+      <w:pPr>
+        <w:jc w:val="both"/>
+        <w:rPr>
+          <w:sz w:val="44"/>
+          <w:szCs w:val="44"/>
+          <w:u w:val="single"/>
+        </w:rPr>
+      </w:pPr>
+    </w:p>
+    <w:p>
+      <w:pPr>
+        <w:jc w:val="both"/>
+        <w:rPr>
+          <w:sz w:val="44"/>
+          <w:szCs w:val="44"/>
+          <w:u w:val="single"/>
+        </w:rPr>
+      </w:pPr>
+    </w:p>
+    <w:p>
+      <w:pPr>
+        <w:jc w:val="both"/>
+        <w:rPr>
+          <w:sz w:val="44"/>
+          <w:szCs w:val="44"/>
+          <w:u w:val="single"/>
+        </w:rPr>
+      </w:pPr>
+    </w:p>
+    <w:p>
+      <w:pPr>
+        <w:jc w:val="both"/>
+        <w:rPr>
           <w:sz w:val="44"/>
           <w:szCs w:val="44"/>
           <w:u w:val="single"/>
@@ -739,7 +1306,6 @@
           <w:szCs w:val="44"/>
           <w:u w:val="single"/>
         </w:rPr>
-        <w:lastRenderedPageBreak/>
         <w:t>Lab 12</w:t>
       </w:r>
     </w:p>
@@ -1157,7 +1723,6 @@
   <w:style w:type="character" w:default="1" w:styleId="DefaultParagraphFont">
     <w:name w:val="Default Paragraph Font"/>
     <w:uiPriority w:val="1"/>
-    <w:semiHidden/>
     <w:unhideWhenUsed/>
   </w:style>
   <w:style w:type="table" w:default="1" w:styleId="TableNormal">

</xml_diff>

<commit_message>
Week 04 Exercises added
</commit_message>
<xml_diff>
--- a/LABlogbook_2523747_Neural Computing and Deep Learning (2025 MOD006568 TRI2 F01CIN).docx
+++ b/LABlogbook_2523747_Neural Computing and Deep Learning (2025 MOD006568 TRI2 F01CIN).docx
@@ -158,7 +158,7 @@
                     </pic:cNvPicPr>
                   </pic:nvPicPr>
                   <pic:blipFill>
-                    <a:blip r:embed="rId4">
+                    <a:blip r:embed="rId5">
                       <a:extLst>
                         <a:ext uri="{28A0092B-C50C-407E-A947-70E740481C1C}">
                           <a14:useLocalDpi xmlns:a14="http://schemas.microsoft.com/office/drawing/2010/main" val="0"/>
@@ -1067,23 +1067,633 @@
           <w:u w:val="single"/>
         </w:rPr>
       </w:pPr>
-    </w:p>
-    <w:p>
-      <w:pPr>
-        <w:jc w:val="both"/>
-        <w:rPr>
-          <w:sz w:val="44"/>
-          <w:szCs w:val="44"/>
-          <w:u w:val="single"/>
-        </w:rPr>
-      </w:pPr>
-      <w:r>
-        <w:rPr>
-          <w:sz w:val="44"/>
-          <w:szCs w:val="44"/>
-          <w:u w:val="single"/>
-        </w:rPr>
+      <w:r>
+        <w:rPr>
+          <w:sz w:val="44"/>
+          <w:szCs w:val="44"/>
+          <w:u w:val="single"/>
+        </w:rPr>
+        <w:lastRenderedPageBreak/>
         <w:t>Lab 4</w:t>
+      </w:r>
+    </w:p>
+    <w:p>
+      <w:pPr>
+        <w:pStyle w:val="ListParagraph"/>
+        <w:numPr>
+          <w:ilvl w:val="0"/>
+          <w:numId w:val="1"/>
+        </w:numPr>
+        <w:jc w:val="both"/>
+        <w:rPr>
+          <w:b/>
+          <w:bCs/>
+          <w:sz w:val="24"/>
+          <w:szCs w:val="24"/>
+          <w:lang w:val="en-US"/>
+        </w:rPr>
+      </w:pPr>
+      <w:r>
+        <w:rPr>
+          <w:b/>
+          <w:bCs/>
+          <w:sz w:val="24"/>
+          <w:szCs w:val="24"/>
+          <w:lang w:val="en-US"/>
+        </w:rPr>
+        <w:t>Plot of the model's loss after every epoch</w:t>
+      </w:r>
+    </w:p>
+    <w:p>
+      <w:pPr>
+        <w:jc w:val="both"/>
+        <w:rPr>
+          <w:sz w:val="44"/>
+          <w:szCs w:val="44"/>
+          <w:u w:val="single"/>
+        </w:rPr>
+      </w:pPr>
+      <w:r>
+        <w:rPr>
+          <w:noProof/>
+        </w:rPr>
+        <w:drawing>
+          <wp:inline distT="0" distB="0" distL="0" distR="0" wp14:anchorId="517F1DDD" wp14:editId="0A397C64">
+            <wp:extent cx="6449329" cy="3337560"/>
+            <wp:effectExtent l="0" t="0" r="8890" b="0"/>
+            <wp:docPr id="1613173187" name="Picture 2"/>
+            <wp:cNvGraphicFramePr>
+              <a:graphicFrameLocks xmlns:a="http://schemas.openxmlformats.org/drawingml/2006/main" noChangeAspect="1"/>
+            </wp:cNvGraphicFramePr>
+            <a:graphic xmlns:a="http://schemas.openxmlformats.org/drawingml/2006/main">
+              <a:graphicData uri="http://schemas.openxmlformats.org/drawingml/2006/picture">
+                <pic:pic xmlns:pic="http://schemas.openxmlformats.org/drawingml/2006/picture">
+                  <pic:nvPicPr>
+                    <pic:cNvPr id="0" name="Picture 3"/>
+                    <pic:cNvPicPr>
+                      <a:picLocks noChangeAspect="1" noChangeArrowheads="1"/>
+                    </pic:cNvPicPr>
+                  </pic:nvPicPr>
+                  <pic:blipFill>
+                    <a:blip r:embed="rId6">
+                      <a:extLst>
+                        <a:ext uri="{28A0092B-C50C-407E-A947-70E740481C1C}">
+                          <a14:useLocalDpi xmlns:a14="http://schemas.microsoft.com/office/drawing/2010/main" val="0"/>
+                        </a:ext>
+                      </a:extLst>
+                    </a:blip>
+                    <a:srcRect/>
+                    <a:stretch>
+                      <a:fillRect/>
+                    </a:stretch>
+                  </pic:blipFill>
+                  <pic:spPr bwMode="auto">
+                    <a:xfrm>
+                      <a:off x="0" y="0"/>
+                      <a:ext cx="6455864" cy="3340942"/>
+                    </a:xfrm>
+                    <a:prstGeom prst="rect">
+                      <a:avLst/>
+                    </a:prstGeom>
+                    <a:noFill/>
+                    <a:ln>
+                      <a:noFill/>
+                    </a:ln>
+                  </pic:spPr>
+                </pic:pic>
+              </a:graphicData>
+            </a:graphic>
+          </wp:inline>
+        </w:drawing>
+      </w:r>
+    </w:p>
+    <w:p>
+      <w:pPr>
+        <w:pStyle w:val="ListParagraph"/>
+        <w:numPr>
+          <w:ilvl w:val="0"/>
+          <w:numId w:val="1"/>
+        </w:numPr>
+        <w:jc w:val="both"/>
+        <w:rPr>
+          <w:b/>
+          <w:bCs/>
+          <w:sz w:val="24"/>
+          <w:szCs w:val="24"/>
+          <w:lang w:val="en-US"/>
+        </w:rPr>
+      </w:pPr>
+      <w:r>
+        <w:rPr>
+          <w:b/>
+          <w:bCs/>
+          <w:sz w:val="24"/>
+          <w:szCs w:val="24"/>
+          <w:lang w:val="en-US"/>
+        </w:rPr>
+        <w:t>Test Summary</w:t>
+      </w:r>
+    </w:p>
+    <w:p>
+      <w:pPr>
+        <w:ind w:left="720"/>
+        <w:jc w:val="both"/>
+        <w:rPr>
+          <w:sz w:val="20"/>
+          <w:szCs w:val="20"/>
+          <w:lang w:val="en-US"/>
+        </w:rPr>
+      </w:pPr>
+      <w:r>
+        <w:rPr>
+          <w:sz w:val="20"/>
+          <w:szCs w:val="20"/>
+          <w:lang w:val="en-US"/>
+        </w:rPr>
+        <w:t>Layer (</w:t>
+      </w:r>
+      <w:proofErr w:type="gramStart"/>
+      <w:r>
+        <w:rPr>
+          <w:sz w:val="20"/>
+          <w:szCs w:val="20"/>
+          <w:lang w:val="en-US"/>
+        </w:rPr>
+        <w:t xml:space="preserve">type)   </w:t>
+      </w:r>
+      <w:proofErr w:type="gramEnd"/>
+      <w:r>
+        <w:rPr>
+          <w:sz w:val="20"/>
+          <w:szCs w:val="20"/>
+          <w:lang w:val="en-US"/>
+        </w:rPr>
+        <w:t xml:space="preserve">             Output Shape              Param #   </w:t>
+      </w:r>
+    </w:p>
+    <w:p>
+      <w:pPr>
+        <w:ind w:left="720"/>
+        <w:jc w:val="both"/>
+        <w:rPr>
+          <w:sz w:val="20"/>
+          <w:szCs w:val="20"/>
+          <w:lang w:val="en-US"/>
+        </w:rPr>
+      </w:pPr>
+      <w:r>
+        <w:rPr>
+          <w:sz w:val="20"/>
+          <w:szCs w:val="20"/>
+          <w:lang w:val="en-US"/>
+        </w:rPr>
+        <w:t>=================================================================</w:t>
+      </w:r>
+    </w:p>
+    <w:p>
+      <w:pPr>
+        <w:ind w:left="720"/>
+        <w:jc w:val="both"/>
+        <w:rPr>
+          <w:sz w:val="20"/>
+          <w:szCs w:val="20"/>
+          <w:lang w:val="en-US"/>
+        </w:rPr>
+      </w:pPr>
+      <w:r>
+        <w:rPr>
+          <w:sz w:val="20"/>
+          <w:szCs w:val="20"/>
+          <w:lang w:val="en-US"/>
+        </w:rPr>
+        <w:t xml:space="preserve"> dense (</w:t>
+      </w:r>
+      <w:proofErr w:type="gramStart"/>
+      <w:r>
+        <w:rPr>
+          <w:sz w:val="20"/>
+          <w:szCs w:val="20"/>
+          <w:lang w:val="en-US"/>
+        </w:rPr>
+        <w:t xml:space="preserve">Dense)   </w:t>
+      </w:r>
+      <w:proofErr w:type="gramEnd"/>
+      <w:r>
+        <w:rPr>
+          <w:sz w:val="20"/>
+          <w:szCs w:val="20"/>
+          <w:lang w:val="en-US"/>
+        </w:rPr>
+        <w:t xml:space="preserve">         </w:t>
+      </w:r>
+      <w:proofErr w:type="gramStart"/>
+      <w:r>
+        <w:rPr>
+          <w:sz w:val="20"/>
+          <w:szCs w:val="20"/>
+          <w:lang w:val="en-US"/>
+        </w:rPr>
+        <w:t xml:space="preserve">   (</w:t>
+      </w:r>
+      <w:proofErr w:type="gramEnd"/>
+      <w:r>
+        <w:rPr>
+          <w:sz w:val="20"/>
+          <w:szCs w:val="20"/>
+          <w:lang w:val="en-US"/>
+        </w:rPr>
+        <w:t xml:space="preserve">None, 64)                1280      </w:t>
+      </w:r>
+    </w:p>
+    <w:p>
+      <w:pPr>
+        <w:ind w:left="720"/>
+        <w:jc w:val="both"/>
+        <w:rPr>
+          <w:sz w:val="20"/>
+          <w:szCs w:val="20"/>
+          <w:lang w:val="en-US"/>
+        </w:rPr>
+      </w:pPr>
+      <w:r>
+        <w:rPr>
+          <w:sz w:val="20"/>
+          <w:szCs w:val="20"/>
+          <w:lang w:val="en-US"/>
+        </w:rPr>
+        <w:t xml:space="preserve">                                                                 </w:t>
+      </w:r>
+    </w:p>
+    <w:p>
+      <w:pPr>
+        <w:ind w:left="720"/>
+        <w:jc w:val="both"/>
+        <w:rPr>
+          <w:sz w:val="20"/>
+          <w:szCs w:val="20"/>
+          <w:lang w:val="en-US"/>
+        </w:rPr>
+      </w:pPr>
+      <w:r>
+        <w:rPr>
+          <w:sz w:val="20"/>
+          <w:szCs w:val="20"/>
+          <w:lang w:val="en-US"/>
+        </w:rPr>
+        <w:t xml:space="preserve"> dense_1 (</w:t>
+      </w:r>
+      <w:proofErr w:type="gramStart"/>
+      <w:r>
+        <w:rPr>
+          <w:sz w:val="20"/>
+          <w:szCs w:val="20"/>
+          <w:lang w:val="en-US"/>
+        </w:rPr>
+        <w:t xml:space="preserve">Dense)   </w:t>
+      </w:r>
+      <w:proofErr w:type="gramEnd"/>
+      <w:r>
+        <w:rPr>
+          <w:sz w:val="20"/>
+          <w:szCs w:val="20"/>
+          <w:lang w:val="en-US"/>
+        </w:rPr>
+        <w:t xml:space="preserve">       </w:t>
+      </w:r>
+      <w:proofErr w:type="gramStart"/>
+      <w:r>
+        <w:rPr>
+          <w:sz w:val="20"/>
+          <w:szCs w:val="20"/>
+          <w:lang w:val="en-US"/>
+        </w:rPr>
+        <w:t xml:space="preserve">   (</w:t>
+      </w:r>
+      <w:proofErr w:type="gramEnd"/>
+      <w:r>
+        <w:rPr>
+          <w:sz w:val="20"/>
+          <w:szCs w:val="20"/>
+          <w:lang w:val="en-US"/>
+        </w:rPr>
+        <w:t xml:space="preserve">None, 128)               8320      </w:t>
+      </w:r>
+    </w:p>
+    <w:p>
+      <w:pPr>
+        <w:ind w:left="720"/>
+        <w:jc w:val="both"/>
+        <w:rPr>
+          <w:sz w:val="20"/>
+          <w:szCs w:val="20"/>
+          <w:lang w:val="en-US"/>
+        </w:rPr>
+      </w:pPr>
+      <w:r>
+        <w:rPr>
+          <w:sz w:val="20"/>
+          <w:szCs w:val="20"/>
+          <w:lang w:val="en-US"/>
+        </w:rPr>
+        <w:t xml:space="preserve">                                                                 </w:t>
+      </w:r>
+    </w:p>
+    <w:p>
+      <w:pPr>
+        <w:ind w:left="720"/>
+        <w:jc w:val="both"/>
+        <w:rPr>
+          <w:sz w:val="20"/>
+          <w:szCs w:val="20"/>
+          <w:lang w:val="en-US"/>
+        </w:rPr>
+      </w:pPr>
+      <w:r>
+        <w:rPr>
+          <w:sz w:val="20"/>
+          <w:szCs w:val="20"/>
+          <w:lang w:val="en-US"/>
+        </w:rPr>
+        <w:t xml:space="preserve"> dense_2 (</w:t>
+      </w:r>
+      <w:proofErr w:type="gramStart"/>
+      <w:r>
+        <w:rPr>
+          <w:sz w:val="20"/>
+          <w:szCs w:val="20"/>
+          <w:lang w:val="en-US"/>
+        </w:rPr>
+        <w:t xml:space="preserve">Dense)   </w:t>
+      </w:r>
+      <w:proofErr w:type="gramEnd"/>
+      <w:r>
+        <w:rPr>
+          <w:sz w:val="20"/>
+          <w:szCs w:val="20"/>
+          <w:lang w:val="en-US"/>
+        </w:rPr>
+        <w:t xml:space="preserve">       </w:t>
+      </w:r>
+      <w:proofErr w:type="gramStart"/>
+      <w:r>
+        <w:rPr>
+          <w:sz w:val="20"/>
+          <w:szCs w:val="20"/>
+          <w:lang w:val="en-US"/>
+        </w:rPr>
+        <w:t xml:space="preserve">   (</w:t>
+      </w:r>
+      <w:proofErr w:type="gramEnd"/>
+      <w:r>
+        <w:rPr>
+          <w:sz w:val="20"/>
+          <w:szCs w:val="20"/>
+          <w:lang w:val="en-US"/>
+        </w:rPr>
+        <w:t xml:space="preserve">None, 64)                8256      </w:t>
+      </w:r>
+    </w:p>
+    <w:p>
+      <w:pPr>
+        <w:ind w:left="720"/>
+        <w:jc w:val="both"/>
+        <w:rPr>
+          <w:sz w:val="20"/>
+          <w:szCs w:val="20"/>
+          <w:lang w:val="en-US"/>
+        </w:rPr>
+      </w:pPr>
+      <w:r>
+        <w:rPr>
+          <w:sz w:val="20"/>
+          <w:szCs w:val="20"/>
+          <w:lang w:val="en-US"/>
+        </w:rPr>
+        <w:t xml:space="preserve">                                                                 </w:t>
+      </w:r>
+    </w:p>
+    <w:p>
+      <w:pPr>
+        <w:ind w:left="720"/>
+        <w:jc w:val="both"/>
+        <w:rPr>
+          <w:sz w:val="20"/>
+          <w:szCs w:val="20"/>
+          <w:lang w:val="en-US"/>
+        </w:rPr>
+      </w:pPr>
+      <w:r>
+        <w:rPr>
+          <w:sz w:val="20"/>
+          <w:szCs w:val="20"/>
+          <w:lang w:val="en-US"/>
+        </w:rPr>
+        <w:t xml:space="preserve"> dropout (</w:t>
+      </w:r>
+      <w:proofErr w:type="gramStart"/>
+      <w:r>
+        <w:rPr>
+          <w:sz w:val="20"/>
+          <w:szCs w:val="20"/>
+          <w:lang w:val="en-US"/>
+        </w:rPr>
+        <w:t xml:space="preserve">Dropout)   </w:t>
+      </w:r>
+      <w:proofErr w:type="gramEnd"/>
+      <w:r>
+        <w:rPr>
+          <w:sz w:val="20"/>
+          <w:szCs w:val="20"/>
+          <w:lang w:val="en-US"/>
+        </w:rPr>
+        <w:t xml:space="preserve">     </w:t>
+      </w:r>
+      <w:proofErr w:type="gramStart"/>
+      <w:r>
+        <w:rPr>
+          <w:sz w:val="20"/>
+          <w:szCs w:val="20"/>
+          <w:lang w:val="en-US"/>
+        </w:rPr>
+        <w:t xml:space="preserve">   (</w:t>
+      </w:r>
+      <w:proofErr w:type="gramEnd"/>
+      <w:r>
+        <w:rPr>
+          <w:sz w:val="20"/>
+          <w:szCs w:val="20"/>
+          <w:lang w:val="en-US"/>
+        </w:rPr>
+        <w:t xml:space="preserve">None, 64)                0         </w:t>
+      </w:r>
+    </w:p>
+    <w:p>
+      <w:pPr>
+        <w:ind w:left="720"/>
+        <w:jc w:val="both"/>
+        <w:rPr>
+          <w:sz w:val="20"/>
+          <w:szCs w:val="20"/>
+          <w:lang w:val="en-US"/>
+        </w:rPr>
+      </w:pPr>
+      <w:r>
+        <w:rPr>
+          <w:sz w:val="20"/>
+          <w:szCs w:val="20"/>
+          <w:lang w:val="en-US"/>
+        </w:rPr>
+        <w:t xml:space="preserve">                                                                 </w:t>
+      </w:r>
+    </w:p>
+    <w:p>
+      <w:pPr>
+        <w:ind w:left="720"/>
+        <w:jc w:val="both"/>
+        <w:rPr>
+          <w:sz w:val="20"/>
+          <w:szCs w:val="20"/>
+          <w:lang w:val="en-US"/>
+        </w:rPr>
+      </w:pPr>
+      <w:r>
+        <w:rPr>
+          <w:sz w:val="20"/>
+          <w:szCs w:val="20"/>
+          <w:lang w:val="en-US"/>
+        </w:rPr>
+        <w:t xml:space="preserve"> dense_3 (</w:t>
+      </w:r>
+      <w:proofErr w:type="gramStart"/>
+      <w:r>
+        <w:rPr>
+          <w:sz w:val="20"/>
+          <w:szCs w:val="20"/>
+          <w:lang w:val="en-US"/>
+        </w:rPr>
+        <w:t xml:space="preserve">Dense)   </w:t>
+      </w:r>
+      <w:proofErr w:type="gramEnd"/>
+      <w:r>
+        <w:rPr>
+          <w:sz w:val="20"/>
+          <w:szCs w:val="20"/>
+          <w:lang w:val="en-US"/>
+        </w:rPr>
+        <w:t xml:space="preserve">       </w:t>
+      </w:r>
+      <w:proofErr w:type="gramStart"/>
+      <w:r>
+        <w:rPr>
+          <w:sz w:val="20"/>
+          <w:szCs w:val="20"/>
+          <w:lang w:val="en-US"/>
+        </w:rPr>
+        <w:t xml:space="preserve">   (</w:t>
+      </w:r>
+      <w:proofErr w:type="gramEnd"/>
+      <w:r>
+        <w:rPr>
+          <w:sz w:val="20"/>
+          <w:szCs w:val="20"/>
+          <w:lang w:val="en-US"/>
+        </w:rPr>
+        <w:t xml:space="preserve">None, 1)                 65        </w:t>
+      </w:r>
+    </w:p>
+    <w:p>
+      <w:pPr>
+        <w:ind w:left="720"/>
+        <w:jc w:val="both"/>
+        <w:rPr>
+          <w:sz w:val="20"/>
+          <w:szCs w:val="20"/>
+          <w:lang w:val="en-US"/>
+        </w:rPr>
+      </w:pPr>
+      <w:r>
+        <w:rPr>
+          <w:sz w:val="20"/>
+          <w:szCs w:val="20"/>
+          <w:lang w:val="en-US"/>
+        </w:rPr>
+        <w:t xml:space="preserve">                                                                 </w:t>
+      </w:r>
+    </w:p>
+    <w:p>
+      <w:pPr>
+        <w:ind w:left="720"/>
+        <w:jc w:val="both"/>
+        <w:rPr>
+          <w:sz w:val="20"/>
+          <w:szCs w:val="20"/>
+          <w:lang w:val="en-US"/>
+        </w:rPr>
+      </w:pPr>
+      <w:r>
+        <w:rPr>
+          <w:sz w:val="20"/>
+          <w:szCs w:val="20"/>
+          <w:lang w:val="en-US"/>
+        </w:rPr>
+        <w:t>=================================================================</w:t>
+      </w:r>
+    </w:p>
+    <w:p>
+      <w:pPr>
+        <w:ind w:left="720"/>
+        <w:jc w:val="both"/>
+        <w:rPr>
+          <w:sz w:val="20"/>
+          <w:szCs w:val="20"/>
+          <w:lang w:val="en-US"/>
+        </w:rPr>
+      </w:pPr>
+      <w:r>
+        <w:rPr>
+          <w:sz w:val="20"/>
+          <w:szCs w:val="20"/>
+          <w:lang w:val="en-US"/>
+        </w:rPr>
+        <w:t>Total params: 17921 (70.00 KB)</w:t>
+      </w:r>
+    </w:p>
+    <w:p>
+      <w:pPr>
+        <w:ind w:left="720"/>
+        <w:jc w:val="both"/>
+        <w:rPr>
+          <w:sz w:val="20"/>
+          <w:szCs w:val="20"/>
+          <w:lang w:val="en-US"/>
+        </w:rPr>
+      </w:pPr>
+      <w:r>
+        <w:rPr>
+          <w:sz w:val="20"/>
+          <w:szCs w:val="20"/>
+          <w:lang w:val="en-US"/>
+        </w:rPr>
+        <w:t>Trainable params: 17921 (70.00 KB)</w:t>
+      </w:r>
+    </w:p>
+    <w:p>
+      <w:pPr>
+        <w:ind w:left="720"/>
+        <w:jc w:val="both"/>
+        <w:rPr>
+          <w:sz w:val="20"/>
+          <w:szCs w:val="20"/>
+          <w:lang w:val="en-US"/>
+        </w:rPr>
+      </w:pPr>
+      <w:r>
+        <w:rPr>
+          <w:sz w:val="20"/>
+          <w:szCs w:val="20"/>
+          <w:lang w:val="en-US"/>
+        </w:rPr>
+        <w:t>Non-trainable params: 0 (0.00 Byte)</w:t>
       </w:r>
     </w:p>
     <w:p>
@@ -1317,6 +1927,103 @@
     </w:sectPr>
   </w:body>
 </w:document>
+</file>
+
+<file path=word/numbering.xml><?xml version="1.0" encoding="utf-8"?>
+<w:numbering xmlns:wpc="http://schemas.microsoft.com/office/word/2010/wordprocessingCanvas" xmlns:cx="http://schemas.microsoft.com/office/drawing/2014/chartex" xmlns:cx1="http://schemas.microsoft.com/office/drawing/2015/9/8/chartex" xmlns:cx2="http://schemas.microsoft.com/office/drawing/2015/10/21/chartex" xmlns:cx3="http://schemas.microsoft.com/office/drawing/2016/5/9/chartex" xmlns:cx4="http://schemas.microsoft.com/office/drawing/2016/5/10/chartex" xmlns:cx5="http://schemas.microsoft.com/office/drawing/2016/5/11/chartex" xmlns:cx6="http://schemas.microsoft.com/office/drawing/2016/5/12/chartex" xmlns:cx7="http://schemas.microsoft.com/office/drawing/2016/5/13/chartex" xmlns:cx8="http://schemas.microsoft.com/office/drawing/2016/5/14/chartex" xmlns:mc="http://schemas.openxmlformats.org/markup-compatibility/2006" xmlns:aink="http://schemas.microsoft.com/office/drawing/2016/ink" xmlns:am3d="http://schemas.microsoft.com/office/drawing/2017/model3d" xmlns:o="urn:schemas-microsoft-com:office:office" xmlns:oel="http://schemas.microsoft.com/office/2019/extlst" xmlns:r="http://schemas.openxmlformats.org/officeDocument/2006/relationships" xmlns:m="http://schemas.openxmlformats.org/officeDocument/2006/math" xmlns:v="urn:schemas-microsoft-com:vml" xmlns:wp14="http://schemas.microsoft.com/office/word/2010/wordprocessingDrawing" xmlns:wp="http://schemas.openxmlformats.org/drawingml/2006/wordprocessingDrawing" xmlns:w10="urn:schemas-microsoft-com:office:word" xmlns:w="http://schemas.openxmlformats.org/wordprocessingml/2006/main" xmlns:w14="http://schemas.microsoft.com/office/word/2010/wordml" xmlns:w15="http://schemas.microsoft.com/office/word/2012/wordml" xmlns:w16cex="http://schemas.microsoft.com/office/word/2018/wordml/cex" xmlns:w16cid="http://schemas.microsoft.com/office/word/2016/wordml/cid" xmlns:w16="http://schemas.microsoft.com/office/word/2018/wordml" xmlns:w16du="http://schemas.microsoft.com/office/word/2023/wordml/word16du" xmlns:w16sdtdh="http://schemas.microsoft.com/office/word/2020/wordml/sdtdatahash" xmlns:w16sdtfl="http://schemas.microsoft.com/office/word/2024/wordml/sdtformatlock" xmlns:w16se="http://schemas.microsoft.com/office/word/2015/wordml/symex" xmlns:wpg="http://schemas.microsoft.com/office/word/2010/wordprocessingGroup" xmlns:wpi="http://schemas.microsoft.com/office/word/2010/wordprocessingInk" xmlns:wne="http://schemas.microsoft.com/office/word/2006/wordml" xmlns:wps="http://schemas.microsoft.com/office/word/2010/wordprocessingShape" mc:Ignorable="w14 w15 w16se w16cid w16 w16cex w16sdtdh w16sdtfl w16du wp14">
+  <w:abstractNum w:abstractNumId="0" w15:restartNumberingAfterBreak="0">
+    <w:nsid w:val="2FB85469"/>
+    <w:multiLevelType w:val="hybridMultilevel"/>
+    <w:tmpl w:val="93F2464C"/>
+    <w:lvl w:ilvl="0" w:tplc="ED3A6D04">
+      <w:start w:val="1"/>
+      <w:numFmt w:val="decimalZero"/>
+      <w:lvlText w:val="%1."/>
+      <w:lvlJc w:val="left"/>
+      <w:pPr>
+        <w:ind w:left="720" w:hanging="360"/>
+      </w:pPr>
+      <w:rPr>
+        <w:rFonts w:hint="default"/>
+      </w:rPr>
+    </w:lvl>
+    <w:lvl w:ilvl="1" w:tplc="04090019" w:tentative="1">
+      <w:start w:val="1"/>
+      <w:numFmt w:val="lowerLetter"/>
+      <w:lvlText w:val="%2."/>
+      <w:lvlJc w:val="left"/>
+      <w:pPr>
+        <w:ind w:left="1440" w:hanging="360"/>
+      </w:pPr>
+    </w:lvl>
+    <w:lvl w:ilvl="2" w:tplc="0409001B" w:tentative="1">
+      <w:start w:val="1"/>
+      <w:numFmt w:val="lowerRoman"/>
+      <w:lvlText w:val="%3."/>
+      <w:lvlJc w:val="right"/>
+      <w:pPr>
+        <w:ind w:left="2160" w:hanging="180"/>
+      </w:pPr>
+    </w:lvl>
+    <w:lvl w:ilvl="3" w:tplc="0409000F" w:tentative="1">
+      <w:start w:val="1"/>
+      <w:numFmt w:val="decimal"/>
+      <w:lvlText w:val="%4."/>
+      <w:lvlJc w:val="left"/>
+      <w:pPr>
+        <w:ind w:left="2880" w:hanging="360"/>
+      </w:pPr>
+    </w:lvl>
+    <w:lvl w:ilvl="4" w:tplc="04090019" w:tentative="1">
+      <w:start w:val="1"/>
+      <w:numFmt w:val="lowerLetter"/>
+      <w:lvlText w:val="%5."/>
+      <w:lvlJc w:val="left"/>
+      <w:pPr>
+        <w:ind w:left="3600" w:hanging="360"/>
+      </w:pPr>
+    </w:lvl>
+    <w:lvl w:ilvl="5" w:tplc="0409001B" w:tentative="1">
+      <w:start w:val="1"/>
+      <w:numFmt w:val="lowerRoman"/>
+      <w:lvlText w:val="%6."/>
+      <w:lvlJc w:val="right"/>
+      <w:pPr>
+        <w:ind w:left="4320" w:hanging="180"/>
+      </w:pPr>
+    </w:lvl>
+    <w:lvl w:ilvl="6" w:tplc="0409000F" w:tentative="1">
+      <w:start w:val="1"/>
+      <w:numFmt w:val="decimal"/>
+      <w:lvlText w:val="%7."/>
+      <w:lvlJc w:val="left"/>
+      <w:pPr>
+        <w:ind w:left="5040" w:hanging="360"/>
+      </w:pPr>
+    </w:lvl>
+    <w:lvl w:ilvl="7" w:tplc="04090019" w:tentative="1">
+      <w:start w:val="1"/>
+      <w:numFmt w:val="lowerLetter"/>
+      <w:lvlText w:val="%8."/>
+      <w:lvlJc w:val="left"/>
+      <w:pPr>
+        <w:ind w:left="5760" w:hanging="360"/>
+      </w:pPr>
+    </w:lvl>
+    <w:lvl w:ilvl="8" w:tplc="0409001B" w:tentative="1">
+      <w:start w:val="1"/>
+      <w:numFmt w:val="lowerRoman"/>
+      <w:lvlText w:val="%9."/>
+      <w:lvlJc w:val="right"/>
+      <w:pPr>
+        <w:ind w:left="6480" w:hanging="180"/>
+      </w:pPr>
+    </w:lvl>
+  </w:abstractNum>
+  <w:num w:numId="1" w16cid:durableId="891575872">
+    <w:abstractNumId w:val="0"/>
+  </w:num>
+</w:numbering>
 </file>
 
 <file path=word/styles.xml><?xml version="1.0" encoding="utf-8"?>
@@ -1719,6 +2426,7 @@
   <w:style w:type="paragraph" w:default="1" w:styleId="Normal">
     <w:name w:val="Normal"/>
     <w:qFormat/>
+    <w:rsid w:val="006B6A89"/>
   </w:style>
   <w:style w:type="character" w:default="1" w:styleId="DefaultParagraphFont">
     <w:name w:val="Default Paragraph Font"/>
@@ -1745,6 +2453,17 @@
     <w:uiPriority w:val="99"/>
     <w:semiHidden/>
     <w:unhideWhenUsed/>
+  </w:style>
+  <w:style w:type="paragraph" w:styleId="ListParagraph">
+    <w:name w:val="List Paragraph"/>
+    <w:basedOn w:val="Normal"/>
+    <w:uiPriority w:val="34"/>
+    <w:qFormat/>
+    <w:rsid w:val="006B6A89"/>
+    <w:pPr>
+      <w:ind w:left="720"/>
+      <w:contextualSpacing/>
+    </w:pPr>
   </w:style>
 </w:styles>
 </file>

</xml_diff>

<commit_message>
Week 05 Exercises added
</commit_message>
<xml_diff>
--- a/LABlogbook_2523747_Neural Computing and Deep Learning (2025 MOD006568 TRI2 F01CIN).docx
+++ b/LABlogbook_2523747_Neural Computing and Deep Learning (2025 MOD006568 TRI2 F01CIN).docx
@@ -1743,17 +1743,648 @@
           <w:u w:val="single"/>
         </w:rPr>
       </w:pPr>
-      <w:r>
-        <w:rPr>
-          <w:sz w:val="44"/>
-          <w:szCs w:val="44"/>
-          <w:u w:val="single"/>
-        </w:rPr>
+    </w:p>
+    <w:p>
+      <w:pPr>
+        <w:jc w:val="both"/>
+        <w:rPr>
+          <w:sz w:val="44"/>
+          <w:szCs w:val="44"/>
+          <w:u w:val="single"/>
+        </w:rPr>
+      </w:pPr>
+    </w:p>
+    <w:p>
+      <w:pPr>
+        <w:jc w:val="both"/>
+        <w:rPr>
+          <w:sz w:val="44"/>
+          <w:szCs w:val="44"/>
+          <w:u w:val="single"/>
+        </w:rPr>
+      </w:pPr>
+    </w:p>
+    <w:p>
+      <w:pPr>
+        <w:jc w:val="both"/>
+        <w:rPr>
+          <w:sz w:val="44"/>
+          <w:szCs w:val="44"/>
+          <w:u w:val="single"/>
+        </w:rPr>
+      </w:pPr>
+    </w:p>
+    <w:p>
+      <w:pPr>
+        <w:jc w:val="both"/>
+        <w:rPr>
+          <w:sz w:val="44"/>
+          <w:szCs w:val="44"/>
+          <w:u w:val="single"/>
+        </w:rPr>
+      </w:pPr>
+    </w:p>
+    <w:p>
+      <w:pPr>
+        <w:jc w:val="both"/>
+        <w:rPr>
+          <w:sz w:val="44"/>
+          <w:szCs w:val="44"/>
+          <w:u w:val="single"/>
+        </w:rPr>
+      </w:pPr>
+    </w:p>
+    <w:p>
+      <w:pPr>
+        <w:jc w:val="both"/>
+        <w:rPr>
+          <w:sz w:val="44"/>
+          <w:szCs w:val="44"/>
+          <w:u w:val="single"/>
+        </w:rPr>
+      </w:pPr>
+    </w:p>
+    <w:p>
+      <w:pPr>
+        <w:jc w:val="both"/>
+        <w:rPr>
+          <w:sz w:val="44"/>
+          <w:szCs w:val="44"/>
+          <w:u w:val="single"/>
+        </w:rPr>
+      </w:pPr>
+    </w:p>
+    <w:p>
+      <w:pPr>
+        <w:jc w:val="both"/>
+        <w:rPr>
+          <w:sz w:val="44"/>
+          <w:szCs w:val="44"/>
+          <w:u w:val="single"/>
+        </w:rPr>
+      </w:pPr>
+    </w:p>
+    <w:p>
+      <w:pPr>
+        <w:jc w:val="both"/>
+        <w:rPr>
+          <w:sz w:val="44"/>
+          <w:szCs w:val="44"/>
+          <w:u w:val="single"/>
+        </w:rPr>
+      </w:pPr>
+    </w:p>
+    <w:p>
+      <w:pPr>
+        <w:jc w:val="both"/>
+        <w:rPr>
+          <w:sz w:val="44"/>
+          <w:szCs w:val="44"/>
+          <w:u w:val="single"/>
+        </w:rPr>
+      </w:pPr>
+    </w:p>
+    <w:p>
+      <w:pPr>
+        <w:jc w:val="both"/>
+        <w:rPr>
+          <w:sz w:val="44"/>
+          <w:szCs w:val="44"/>
+          <w:u w:val="single"/>
+        </w:rPr>
+      </w:pPr>
+    </w:p>
+    <w:p>
+      <w:pPr>
+        <w:jc w:val="both"/>
+        <w:rPr>
+          <w:sz w:val="44"/>
+          <w:szCs w:val="44"/>
+          <w:u w:val="single"/>
+        </w:rPr>
+      </w:pPr>
+    </w:p>
+    <w:p>
+      <w:pPr>
+        <w:jc w:val="both"/>
+        <w:rPr>
+          <w:sz w:val="44"/>
+          <w:szCs w:val="44"/>
+          <w:u w:val="single"/>
+        </w:rPr>
+      </w:pPr>
+    </w:p>
+    <w:p>
+      <w:pPr>
+        <w:jc w:val="both"/>
+        <w:rPr>
+          <w:sz w:val="44"/>
+          <w:szCs w:val="44"/>
+          <w:u w:val="single"/>
+        </w:rPr>
+      </w:pPr>
+    </w:p>
+    <w:p>
+      <w:pPr>
+        <w:jc w:val="both"/>
+        <w:rPr>
+          <w:sz w:val="44"/>
+          <w:szCs w:val="44"/>
+          <w:u w:val="single"/>
+        </w:rPr>
+      </w:pPr>
+    </w:p>
+    <w:p>
+      <w:pPr>
+        <w:jc w:val="both"/>
+        <w:rPr>
+          <w:sz w:val="44"/>
+          <w:szCs w:val="44"/>
+          <w:u w:val="single"/>
+        </w:rPr>
+      </w:pPr>
+      <w:r>
+        <w:rPr>
+          <w:sz w:val="44"/>
+          <w:szCs w:val="44"/>
+          <w:u w:val="single"/>
+        </w:rPr>
+        <w:lastRenderedPageBreak/>
         <w:t>Lab 6</w:t>
       </w:r>
     </w:p>
     <w:p>
       <w:pPr>
+        <w:pStyle w:val="ListParagraph"/>
+        <w:numPr>
+          <w:ilvl w:val="0"/>
+          <w:numId w:val="2"/>
+        </w:numPr>
+        <w:jc w:val="both"/>
+        <w:rPr>
+          <w:b/>
+          <w:bCs/>
+          <w:sz w:val="24"/>
+          <w:szCs w:val="24"/>
+        </w:rPr>
+      </w:pPr>
+      <w:r>
+        <w:rPr>
+          <w:b/>
+          <w:bCs/>
+          <w:sz w:val="24"/>
+          <w:szCs w:val="24"/>
+        </w:rPr>
+        <w:t>Summary of second model</w:t>
+      </w:r>
+    </w:p>
+    <w:p>
+      <w:pPr>
+        <w:pStyle w:val="ListParagraph"/>
+        <w:jc w:val="both"/>
+        <w:rPr>
+          <w:b/>
+          <w:bCs/>
+          <w:sz w:val="24"/>
+          <w:szCs w:val="24"/>
+        </w:rPr>
+      </w:pPr>
+    </w:p>
+    <w:p>
+      <w:pPr>
+        <w:jc w:val="both"/>
+        <w:rPr>
+          <w:sz w:val="44"/>
+          <w:szCs w:val="44"/>
+          <w:u w:val="single"/>
+        </w:rPr>
+      </w:pPr>
+      <w:r>
+        <w:rPr>
+          <w:noProof/>
+        </w:rPr>
+        <w:drawing>
+          <wp:inline distT="0" distB="0" distL="0" distR="0" wp14:anchorId="2FA0A2AE" wp14:editId="17711509">
+            <wp:extent cx="5731510" cy="2255520"/>
+            <wp:effectExtent l="0" t="0" r="2540" b="0"/>
+            <wp:docPr id="641738828" name="Picture 1"/>
+            <wp:cNvGraphicFramePr>
+              <a:graphicFrameLocks xmlns:a="http://schemas.openxmlformats.org/drawingml/2006/main" noChangeAspect="1"/>
+            </wp:cNvGraphicFramePr>
+            <a:graphic xmlns:a="http://schemas.openxmlformats.org/drawingml/2006/main">
+              <a:graphicData uri="http://schemas.openxmlformats.org/drawingml/2006/picture">
+                <pic:pic xmlns:pic="http://schemas.openxmlformats.org/drawingml/2006/picture">
+                  <pic:nvPicPr>
+                    <pic:cNvPr id="641738828" name=""/>
+                    <pic:cNvPicPr/>
+                  </pic:nvPicPr>
+                  <pic:blipFill>
+                    <a:blip r:embed="rId7"/>
+                    <a:stretch>
+                      <a:fillRect/>
+                    </a:stretch>
+                  </pic:blipFill>
+                  <pic:spPr>
+                    <a:xfrm>
+                      <a:off x="0" y="0"/>
+                      <a:ext cx="5731510" cy="2255520"/>
+                    </a:xfrm>
+                    <a:prstGeom prst="rect">
+                      <a:avLst/>
+                    </a:prstGeom>
+                  </pic:spPr>
+                </pic:pic>
+              </a:graphicData>
+            </a:graphic>
+          </wp:inline>
+        </w:drawing>
+      </w:r>
+    </w:p>
+    <w:p>
+      <w:pPr>
+        <w:jc w:val="both"/>
+        <w:rPr>
+          <w:sz w:val="44"/>
+          <w:szCs w:val="44"/>
+          <w:u w:val="single"/>
+        </w:rPr>
+      </w:pPr>
+    </w:p>
+    <w:p>
+      <w:pPr>
+        <w:jc w:val="both"/>
+        <w:rPr>
+          <w:b/>
+          <w:bCs/>
+          <w:sz w:val="24"/>
+          <w:szCs w:val="24"/>
+        </w:rPr>
+      </w:pPr>
+      <w:r>
+        <w:rPr>
+          <w:b/>
+          <w:bCs/>
+          <w:sz w:val="24"/>
+          <w:szCs w:val="24"/>
+        </w:rPr>
+        <w:t xml:space="preserve">Copy </w:t>
+      </w:r>
+      <w:r>
+        <w:rPr>
+          <w:b/>
+          <w:bCs/>
+          <w:sz w:val="24"/>
+          <w:szCs w:val="24"/>
+        </w:rPr>
+        <w:t>of</w:t>
+      </w:r>
+      <w:r>
+        <w:rPr>
+          <w:b/>
+          <w:bCs/>
+          <w:sz w:val="24"/>
+          <w:szCs w:val="24"/>
+        </w:rPr>
+        <w:t xml:space="preserve"> early-stop code</w:t>
+      </w:r>
+    </w:p>
+    <w:p>
+      <w:pPr>
+        <w:jc w:val="both"/>
+      </w:pPr>
+      <w:r>
+        <w:t>LAST_DIGIT_IN_YOUR_SID = 7</w:t>
+      </w:r>
+    </w:p>
+    <w:p>
+      <w:pPr>
+        <w:jc w:val="both"/>
+      </w:pPr>
+      <w:proofErr w:type="spellStart"/>
+      <w:r>
+        <w:t>early_stop</w:t>
+      </w:r>
+      <w:proofErr w:type="spellEnd"/>
+      <w:r>
+        <w:t xml:space="preserve"> = </w:t>
+      </w:r>
+      <w:proofErr w:type="spellStart"/>
+      <w:proofErr w:type="gramStart"/>
+      <w:r>
+        <w:t>EarlyStopping</w:t>
+      </w:r>
+      <w:proofErr w:type="spellEnd"/>
+      <w:r>
+        <w:t>(</w:t>
+      </w:r>
+      <w:proofErr w:type="gramEnd"/>
+      <w:r>
+        <w:t>monitor='</w:t>
+      </w:r>
+      <w:proofErr w:type="spellStart"/>
+      <w:r>
+        <w:t>val_loss</w:t>
+      </w:r>
+      <w:proofErr w:type="gramStart"/>
+      <w:r>
+        <w:t>',patience</w:t>
+      </w:r>
+      <w:proofErr w:type="spellEnd"/>
+      <w:proofErr w:type="gramEnd"/>
+      <w:r>
+        <w:t xml:space="preserve"> = LAST_DIGIT_IN_YOUR_SID)</w:t>
+      </w:r>
+    </w:p>
+    <w:p>
+      <w:pPr>
+        <w:jc w:val="both"/>
+      </w:pPr>
+    </w:p>
+    <w:p>
+      <w:pPr>
+        <w:jc w:val="both"/>
+        <w:rPr>
+          <w:b/>
+          <w:bCs/>
+          <w:sz w:val="24"/>
+          <w:szCs w:val="24"/>
+        </w:rPr>
+      </w:pPr>
+      <w:r>
+        <w:rPr>
+          <w:b/>
+          <w:bCs/>
+          <w:sz w:val="24"/>
+          <w:szCs w:val="24"/>
+        </w:rPr>
+        <w:t xml:space="preserve">Copy </w:t>
+      </w:r>
+      <w:r>
+        <w:rPr>
+          <w:b/>
+          <w:bCs/>
+          <w:sz w:val="24"/>
+          <w:szCs w:val="24"/>
+        </w:rPr>
+        <w:t>of</w:t>
+      </w:r>
+      <w:r>
+        <w:rPr>
+          <w:b/>
+          <w:bCs/>
+          <w:sz w:val="24"/>
+          <w:szCs w:val="24"/>
+        </w:rPr>
+        <w:t xml:space="preserve"> history_2 fit-training-process</w:t>
+      </w:r>
+    </w:p>
+    <w:p>
+      <w:pPr>
+        <w:jc w:val="both"/>
+      </w:pPr>
+      <w:r>
+        <w:t xml:space="preserve">history_2 </w:t>
+      </w:r>
+      <w:proofErr w:type="gramStart"/>
+      <w:r>
+        <w:t>=  model2.fit</w:t>
+      </w:r>
+      <w:proofErr w:type="gramEnd"/>
+      <w:r>
+        <w:t>(</w:t>
+      </w:r>
+      <w:proofErr w:type="gramStart"/>
+      <w:r>
+        <w:t>generator,  epochs</w:t>
+      </w:r>
+      <w:proofErr w:type="gramEnd"/>
+      <w:r>
+        <w:t>=30,</w:t>
+      </w:r>
+    </w:p>
+    <w:p>
+      <w:pPr>
+        <w:jc w:val="both"/>
+      </w:pPr>
+      <w:r>
+        <w:t xml:space="preserve">                    </w:t>
+      </w:r>
+      <w:proofErr w:type="spellStart"/>
+      <w:r>
+        <w:t>validation_data</w:t>
+      </w:r>
+      <w:proofErr w:type="spellEnd"/>
+      <w:r>
+        <w:t>=</w:t>
+      </w:r>
+      <w:proofErr w:type="spellStart"/>
+      <w:r>
+        <w:t>validation_generator</w:t>
+      </w:r>
+      <w:proofErr w:type="spellEnd"/>
+      <w:r>
+        <w:t>)</w:t>
+      </w:r>
+    </w:p>
+    <w:p>
+      <w:pPr>
+        <w:jc w:val="both"/>
+      </w:pPr>
+    </w:p>
+    <w:p>
+      <w:pPr>
+        <w:jc w:val="both"/>
+        <w:rPr>
+          <w:b/>
+          <w:bCs/>
+          <w:sz w:val="24"/>
+          <w:szCs w:val="24"/>
+        </w:rPr>
+      </w:pPr>
+      <w:r>
+        <w:rPr>
+          <w:b/>
+          <w:bCs/>
+          <w:sz w:val="24"/>
+          <w:szCs w:val="24"/>
+        </w:rPr>
+        <w:t>plot of validation and test loss of history_2.</w:t>
+      </w:r>
+    </w:p>
+    <w:p>
+      <w:pPr>
+        <w:jc w:val="both"/>
+        <w:rPr>
+          <w:sz w:val="44"/>
+          <w:szCs w:val="44"/>
+          <w:u w:val="single"/>
+        </w:rPr>
+      </w:pPr>
+      <w:r>
+        <w:rPr>
+          <w:sz w:val="44"/>
+          <w:szCs w:val="44"/>
+          <w:u w:val="single"/>
+        </w:rPr>
+        <w:drawing>
+          <wp:inline distT="0" distB="0" distL="0" distR="0" wp14:anchorId="1A6C3F2B" wp14:editId="37675A75">
+            <wp:extent cx="3785937" cy="2247900"/>
+            <wp:effectExtent l="0" t="0" r="5080" b="0"/>
+            <wp:docPr id="834788448" name="Picture 1"/>
+            <wp:cNvGraphicFramePr>
+              <a:graphicFrameLocks xmlns:a="http://schemas.openxmlformats.org/drawingml/2006/main" noChangeAspect="1"/>
+            </wp:cNvGraphicFramePr>
+            <a:graphic xmlns:a="http://schemas.openxmlformats.org/drawingml/2006/main">
+              <a:graphicData uri="http://schemas.openxmlformats.org/drawingml/2006/picture">
+                <pic:pic xmlns:pic="http://schemas.openxmlformats.org/drawingml/2006/picture">
+                  <pic:nvPicPr>
+                    <pic:cNvPr id="834788448" name=""/>
+                    <pic:cNvPicPr/>
+                  </pic:nvPicPr>
+                  <pic:blipFill>
+                    <a:blip r:embed="rId8"/>
+                    <a:stretch>
+                      <a:fillRect/>
+                    </a:stretch>
+                  </pic:blipFill>
+                  <pic:spPr>
+                    <a:xfrm>
+                      <a:off x="0" y="0"/>
+                      <a:ext cx="3798014" cy="2255071"/>
+                    </a:xfrm>
+                    <a:prstGeom prst="rect">
+                      <a:avLst/>
+                    </a:prstGeom>
+                  </pic:spPr>
+                </pic:pic>
+              </a:graphicData>
+            </a:graphic>
+          </wp:inline>
+        </w:drawing>
+      </w:r>
+    </w:p>
+    <w:p>
+      <w:pPr>
+        <w:jc w:val="both"/>
+        <w:rPr>
+          <w:sz w:val="44"/>
+          <w:szCs w:val="44"/>
+          <w:u w:val="single"/>
+        </w:rPr>
+      </w:pPr>
+    </w:p>
+    <w:p>
+      <w:pPr>
+        <w:jc w:val="both"/>
+        <w:rPr>
+          <w:sz w:val="44"/>
+          <w:szCs w:val="44"/>
+          <w:u w:val="single"/>
+        </w:rPr>
+      </w:pPr>
+    </w:p>
+    <w:p>
+      <w:pPr>
+        <w:jc w:val="both"/>
+        <w:rPr>
+          <w:sz w:val="44"/>
+          <w:szCs w:val="44"/>
+          <w:u w:val="single"/>
+        </w:rPr>
+      </w:pPr>
+    </w:p>
+    <w:p>
+      <w:pPr>
+        <w:jc w:val="both"/>
+        <w:rPr>
+          <w:sz w:val="44"/>
+          <w:szCs w:val="44"/>
+          <w:u w:val="single"/>
+        </w:rPr>
+      </w:pPr>
+    </w:p>
+    <w:p>
+      <w:pPr>
+        <w:jc w:val="both"/>
+        <w:rPr>
+          <w:sz w:val="44"/>
+          <w:szCs w:val="44"/>
+          <w:u w:val="single"/>
+        </w:rPr>
+      </w:pPr>
+    </w:p>
+    <w:p>
+      <w:pPr>
+        <w:jc w:val="both"/>
+        <w:rPr>
+          <w:sz w:val="44"/>
+          <w:szCs w:val="44"/>
+          <w:u w:val="single"/>
+        </w:rPr>
+      </w:pPr>
+    </w:p>
+    <w:p>
+      <w:pPr>
+        <w:jc w:val="both"/>
+        <w:rPr>
+          <w:sz w:val="44"/>
+          <w:szCs w:val="44"/>
+          <w:u w:val="single"/>
+        </w:rPr>
+      </w:pPr>
+    </w:p>
+    <w:p>
+      <w:pPr>
+        <w:jc w:val="both"/>
+        <w:rPr>
+          <w:sz w:val="44"/>
+          <w:szCs w:val="44"/>
+          <w:u w:val="single"/>
+        </w:rPr>
+      </w:pPr>
+    </w:p>
+    <w:p>
+      <w:pPr>
+        <w:jc w:val="both"/>
+        <w:rPr>
+          <w:sz w:val="44"/>
+          <w:szCs w:val="44"/>
+          <w:u w:val="single"/>
+        </w:rPr>
+      </w:pPr>
+    </w:p>
+    <w:p>
+      <w:pPr>
+        <w:jc w:val="both"/>
+        <w:rPr>
+          <w:sz w:val="44"/>
+          <w:szCs w:val="44"/>
+          <w:u w:val="single"/>
+        </w:rPr>
+      </w:pPr>
+    </w:p>
+    <w:p>
+      <w:pPr>
+        <w:jc w:val="both"/>
+        <w:rPr>
+          <w:sz w:val="44"/>
+          <w:szCs w:val="44"/>
+          <w:u w:val="single"/>
+        </w:rPr>
+      </w:pPr>
+    </w:p>
+    <w:p>
+      <w:pPr>
+        <w:jc w:val="both"/>
+        <w:rPr>
+          <w:sz w:val="44"/>
+          <w:szCs w:val="44"/>
+          <w:u w:val="single"/>
+        </w:rPr>
+      </w:pPr>
+    </w:p>
+    <w:p>
+      <w:pPr>
         <w:jc w:val="both"/>
         <w:rPr>
           <w:sz w:val="44"/>
@@ -1861,6 +2492,7 @@
           <w:szCs w:val="44"/>
           <w:u w:val="single"/>
         </w:rPr>
+        <w:lastRenderedPageBreak/>
         <w:t>Lab 10</w:t>
       </w:r>
     </w:p>
@@ -1932,10 +2564,10 @@
 <file path=word/numbering.xml><?xml version="1.0" encoding="utf-8"?>
 <w:numbering xmlns:wpc="http://schemas.microsoft.com/office/word/2010/wordprocessingCanvas" xmlns:cx="http://schemas.microsoft.com/office/drawing/2014/chartex" xmlns:cx1="http://schemas.microsoft.com/office/drawing/2015/9/8/chartex" xmlns:cx2="http://schemas.microsoft.com/office/drawing/2015/10/21/chartex" xmlns:cx3="http://schemas.microsoft.com/office/drawing/2016/5/9/chartex" xmlns:cx4="http://schemas.microsoft.com/office/drawing/2016/5/10/chartex" xmlns:cx5="http://schemas.microsoft.com/office/drawing/2016/5/11/chartex" xmlns:cx6="http://schemas.microsoft.com/office/drawing/2016/5/12/chartex" xmlns:cx7="http://schemas.microsoft.com/office/drawing/2016/5/13/chartex" xmlns:cx8="http://schemas.microsoft.com/office/drawing/2016/5/14/chartex" xmlns:mc="http://schemas.openxmlformats.org/markup-compatibility/2006" xmlns:aink="http://schemas.microsoft.com/office/drawing/2016/ink" xmlns:am3d="http://schemas.microsoft.com/office/drawing/2017/model3d" xmlns:o="urn:schemas-microsoft-com:office:office" xmlns:oel="http://schemas.microsoft.com/office/2019/extlst" xmlns:r="http://schemas.openxmlformats.org/officeDocument/2006/relationships" xmlns:m="http://schemas.openxmlformats.org/officeDocument/2006/math" xmlns:v="urn:schemas-microsoft-com:vml" xmlns:wp14="http://schemas.microsoft.com/office/word/2010/wordprocessingDrawing" xmlns:wp="http://schemas.openxmlformats.org/drawingml/2006/wordprocessingDrawing" xmlns:w10="urn:schemas-microsoft-com:office:word" xmlns:w="http://schemas.openxmlformats.org/wordprocessingml/2006/main" xmlns:w14="http://schemas.microsoft.com/office/word/2010/wordml" xmlns:w15="http://schemas.microsoft.com/office/word/2012/wordml" xmlns:w16cex="http://schemas.microsoft.com/office/word/2018/wordml/cex" xmlns:w16cid="http://schemas.microsoft.com/office/word/2016/wordml/cid" xmlns:w16="http://schemas.microsoft.com/office/word/2018/wordml" xmlns:w16du="http://schemas.microsoft.com/office/word/2023/wordml/word16du" xmlns:w16sdtdh="http://schemas.microsoft.com/office/word/2020/wordml/sdtdatahash" xmlns:w16sdtfl="http://schemas.microsoft.com/office/word/2024/wordml/sdtformatlock" xmlns:w16se="http://schemas.microsoft.com/office/word/2015/wordml/symex" xmlns:wpg="http://schemas.microsoft.com/office/word/2010/wordprocessingGroup" xmlns:wpi="http://schemas.microsoft.com/office/word/2010/wordprocessingInk" xmlns:wne="http://schemas.microsoft.com/office/word/2006/wordml" xmlns:wps="http://schemas.microsoft.com/office/word/2010/wordprocessingShape" mc:Ignorable="w14 w15 w16se w16cid w16 w16cex w16sdtdh w16sdtfl w16du wp14">
   <w:abstractNum w:abstractNumId="0" w15:restartNumberingAfterBreak="0">
-    <w:nsid w:val="2FB85469"/>
+    <w:nsid w:val="163D5A14"/>
     <w:multiLevelType w:val="hybridMultilevel"/>
-    <w:tmpl w:val="93F2464C"/>
-    <w:lvl w:ilvl="0" w:tplc="ED3A6D04">
+    <w:tmpl w:val="B5E0D7F0"/>
+    <w:lvl w:ilvl="0" w:tplc="940279B6">
       <w:start w:val="1"/>
       <w:numFmt w:val="decimalZero"/>
       <w:lvlText w:val="%1."/>
@@ -2020,7 +2652,99 @@
       </w:pPr>
     </w:lvl>
   </w:abstractNum>
+  <w:abstractNum w:abstractNumId="1" w15:restartNumberingAfterBreak="0">
+    <w:nsid w:val="2FB85469"/>
+    <w:multiLevelType w:val="hybridMultilevel"/>
+    <w:tmpl w:val="93F2464C"/>
+    <w:lvl w:ilvl="0" w:tplc="ED3A6D04">
+      <w:start w:val="1"/>
+      <w:numFmt w:val="decimalZero"/>
+      <w:lvlText w:val="%1."/>
+      <w:lvlJc w:val="left"/>
+      <w:pPr>
+        <w:ind w:left="720" w:hanging="360"/>
+      </w:pPr>
+      <w:rPr>
+        <w:rFonts w:hint="default"/>
+      </w:rPr>
+    </w:lvl>
+    <w:lvl w:ilvl="1" w:tplc="04090019" w:tentative="1">
+      <w:start w:val="1"/>
+      <w:numFmt w:val="lowerLetter"/>
+      <w:lvlText w:val="%2."/>
+      <w:lvlJc w:val="left"/>
+      <w:pPr>
+        <w:ind w:left="1440" w:hanging="360"/>
+      </w:pPr>
+    </w:lvl>
+    <w:lvl w:ilvl="2" w:tplc="0409001B" w:tentative="1">
+      <w:start w:val="1"/>
+      <w:numFmt w:val="lowerRoman"/>
+      <w:lvlText w:val="%3."/>
+      <w:lvlJc w:val="right"/>
+      <w:pPr>
+        <w:ind w:left="2160" w:hanging="180"/>
+      </w:pPr>
+    </w:lvl>
+    <w:lvl w:ilvl="3" w:tplc="0409000F" w:tentative="1">
+      <w:start w:val="1"/>
+      <w:numFmt w:val="decimal"/>
+      <w:lvlText w:val="%4."/>
+      <w:lvlJc w:val="left"/>
+      <w:pPr>
+        <w:ind w:left="2880" w:hanging="360"/>
+      </w:pPr>
+    </w:lvl>
+    <w:lvl w:ilvl="4" w:tplc="04090019" w:tentative="1">
+      <w:start w:val="1"/>
+      <w:numFmt w:val="lowerLetter"/>
+      <w:lvlText w:val="%5."/>
+      <w:lvlJc w:val="left"/>
+      <w:pPr>
+        <w:ind w:left="3600" w:hanging="360"/>
+      </w:pPr>
+    </w:lvl>
+    <w:lvl w:ilvl="5" w:tplc="0409001B" w:tentative="1">
+      <w:start w:val="1"/>
+      <w:numFmt w:val="lowerRoman"/>
+      <w:lvlText w:val="%6."/>
+      <w:lvlJc w:val="right"/>
+      <w:pPr>
+        <w:ind w:left="4320" w:hanging="180"/>
+      </w:pPr>
+    </w:lvl>
+    <w:lvl w:ilvl="6" w:tplc="0409000F" w:tentative="1">
+      <w:start w:val="1"/>
+      <w:numFmt w:val="decimal"/>
+      <w:lvlText w:val="%7."/>
+      <w:lvlJc w:val="left"/>
+      <w:pPr>
+        <w:ind w:left="5040" w:hanging="360"/>
+      </w:pPr>
+    </w:lvl>
+    <w:lvl w:ilvl="7" w:tplc="04090019" w:tentative="1">
+      <w:start w:val="1"/>
+      <w:numFmt w:val="lowerLetter"/>
+      <w:lvlText w:val="%8."/>
+      <w:lvlJc w:val="left"/>
+      <w:pPr>
+        <w:ind w:left="5760" w:hanging="360"/>
+      </w:pPr>
+    </w:lvl>
+    <w:lvl w:ilvl="8" w:tplc="0409001B" w:tentative="1">
+      <w:start w:val="1"/>
+      <w:numFmt w:val="lowerRoman"/>
+      <w:lvlText w:val="%9."/>
+      <w:lvlJc w:val="right"/>
+      <w:pPr>
+        <w:ind w:left="6480" w:hanging="180"/>
+      </w:pPr>
+    </w:lvl>
+  </w:abstractNum>
   <w:num w:numId="1" w16cid:durableId="891575872">
+    <w:abstractNumId w:val="1"/>
+  </w:num>
+  <w:num w:numId="2" w16cid:durableId="1221945619">
     <w:abstractNumId w:val="0"/>
   </w:num>
 </w:numbering>
@@ -2426,7 +3150,7 @@
   <w:style w:type="paragraph" w:default="1" w:styleId="Normal">
     <w:name w:val="Normal"/>
     <w:qFormat/>
-    <w:rsid w:val="006B6A89"/>
+    <w:rsid w:val="00FC59A5"/>
   </w:style>
   <w:style w:type="character" w:default="1" w:styleId="DefaultParagraphFont">
     <w:name w:val="Default Paragraph Font"/>

</xml_diff>

<commit_message>
Week 06 Exercises added
</commit_message>
<xml_diff>
--- a/LABlogbook_2523747_Neural Computing and Deep Learning (2025 MOD006568 TRI2 F01CIN).docx
+++ b/LABlogbook_2523747_Neural Computing and Deep Learning (2025 MOD006568 TRI2 F01CIN).docx
@@ -589,25 +589,7 @@
           <w:szCs w:val="20"/>
           <w:lang w:val="en-US"/>
         </w:rPr>
-        <w:t xml:space="preserve"> Layer (</w:t>
-      </w:r>
-      <w:proofErr w:type="gramStart"/>
-      <w:r>
-        <w:rPr>
-          <w:sz w:val="20"/>
-          <w:szCs w:val="20"/>
-          <w:lang w:val="en-US"/>
-        </w:rPr>
-        <w:t xml:space="preserve">type)   </w:t>
-      </w:r>
-      <w:proofErr w:type="gramEnd"/>
-      <w:r>
-        <w:rPr>
-          <w:sz w:val="20"/>
-          <w:szCs w:val="20"/>
-          <w:lang w:val="en-US"/>
-        </w:rPr>
-        <w:t xml:space="preserve">             Output Shape              Param #   </w:t>
+        <w:t xml:space="preserve"> Layer (type)                Output Shape              Param #   </w:t>
       </w:r>
     </w:p>
     <w:p>
@@ -643,43 +625,7 @@
           <w:szCs w:val="20"/>
           <w:lang w:val="en-US"/>
         </w:rPr>
-        <w:t xml:space="preserve"> flatten (</w:t>
-      </w:r>
-      <w:proofErr w:type="gramStart"/>
-      <w:r>
-        <w:rPr>
-          <w:sz w:val="20"/>
-          <w:szCs w:val="20"/>
-          <w:lang w:val="en-US"/>
-        </w:rPr>
-        <w:t xml:space="preserve">Flatten)   </w:t>
-      </w:r>
-      <w:proofErr w:type="gramEnd"/>
-      <w:r>
-        <w:rPr>
-          <w:sz w:val="20"/>
-          <w:szCs w:val="20"/>
-          <w:lang w:val="en-US"/>
-        </w:rPr>
-        <w:t xml:space="preserve">     </w:t>
-      </w:r>
-      <w:proofErr w:type="gramStart"/>
-      <w:r>
-        <w:rPr>
-          <w:sz w:val="20"/>
-          <w:szCs w:val="20"/>
-          <w:lang w:val="en-US"/>
-        </w:rPr>
-        <w:t xml:space="preserve">   (</w:t>
-      </w:r>
-      <w:proofErr w:type="gramEnd"/>
-      <w:r>
-        <w:rPr>
-          <w:sz w:val="20"/>
-          <w:szCs w:val="20"/>
-          <w:lang w:val="en-US"/>
-        </w:rPr>
-        <w:t xml:space="preserve">None, 784)               0         </w:t>
+        <w:t xml:space="preserve"> flatten (Flatten)           (None, 784)               0         </w:t>
       </w:r>
     </w:p>
     <w:p>
@@ -715,43 +661,7 @@
           <w:szCs w:val="20"/>
           <w:lang w:val="en-US"/>
         </w:rPr>
-        <w:t xml:space="preserve"> dense (</w:t>
-      </w:r>
-      <w:proofErr w:type="gramStart"/>
-      <w:r>
-        <w:rPr>
-          <w:sz w:val="20"/>
-          <w:szCs w:val="20"/>
-          <w:lang w:val="en-US"/>
-        </w:rPr>
-        <w:t xml:space="preserve">Dense)   </w:t>
-      </w:r>
-      <w:proofErr w:type="gramEnd"/>
-      <w:r>
-        <w:rPr>
-          <w:sz w:val="20"/>
-          <w:szCs w:val="20"/>
-          <w:lang w:val="en-US"/>
-        </w:rPr>
-        <w:t xml:space="preserve">         </w:t>
-      </w:r>
-      <w:proofErr w:type="gramStart"/>
-      <w:r>
-        <w:rPr>
-          <w:sz w:val="20"/>
-          <w:szCs w:val="20"/>
-          <w:lang w:val="en-US"/>
-        </w:rPr>
-        <w:t xml:space="preserve">   (</w:t>
-      </w:r>
-      <w:proofErr w:type="gramEnd"/>
-      <w:r>
-        <w:rPr>
-          <w:sz w:val="20"/>
-          <w:szCs w:val="20"/>
-          <w:lang w:val="en-US"/>
-        </w:rPr>
-        <w:t xml:space="preserve">None, 128)               100480    </w:t>
+        <w:t xml:space="preserve"> dense (Dense)               (None, 128)               100480    </w:t>
       </w:r>
     </w:p>
     <w:p>
@@ -787,43 +697,7 @@
           <w:szCs w:val="20"/>
           <w:lang w:val="en-US"/>
         </w:rPr>
-        <w:t xml:space="preserve"> dense_1 (</w:t>
-      </w:r>
-      <w:proofErr w:type="gramStart"/>
-      <w:r>
-        <w:rPr>
-          <w:sz w:val="20"/>
-          <w:szCs w:val="20"/>
-          <w:lang w:val="en-US"/>
-        </w:rPr>
-        <w:t xml:space="preserve">Dense)   </w:t>
-      </w:r>
-      <w:proofErr w:type="gramEnd"/>
-      <w:r>
-        <w:rPr>
-          <w:sz w:val="20"/>
-          <w:szCs w:val="20"/>
-          <w:lang w:val="en-US"/>
-        </w:rPr>
-        <w:t xml:space="preserve">       </w:t>
-      </w:r>
-      <w:proofErr w:type="gramStart"/>
-      <w:r>
-        <w:rPr>
-          <w:sz w:val="20"/>
-          <w:szCs w:val="20"/>
-          <w:lang w:val="en-US"/>
-        </w:rPr>
-        <w:t xml:space="preserve">   (</w:t>
-      </w:r>
-      <w:proofErr w:type="gramEnd"/>
-      <w:r>
-        <w:rPr>
-          <w:sz w:val="20"/>
-          <w:szCs w:val="20"/>
-          <w:lang w:val="en-US"/>
-        </w:rPr>
-        <w:t xml:space="preserve">None, 64)                8256      </w:t>
+        <w:t xml:space="preserve"> dense_1 (Dense)             (None, 64)                8256      </w:t>
       </w:r>
     </w:p>
     <w:p>
@@ -859,43 +733,7 @@
           <w:szCs w:val="20"/>
           <w:lang w:val="en-US"/>
         </w:rPr>
-        <w:t xml:space="preserve"> dense_2 (</w:t>
-      </w:r>
-      <w:proofErr w:type="gramStart"/>
-      <w:r>
-        <w:rPr>
-          <w:sz w:val="20"/>
-          <w:szCs w:val="20"/>
-          <w:lang w:val="en-US"/>
-        </w:rPr>
-        <w:t xml:space="preserve">Dense)   </w:t>
-      </w:r>
-      <w:proofErr w:type="gramEnd"/>
-      <w:r>
-        <w:rPr>
-          <w:sz w:val="20"/>
-          <w:szCs w:val="20"/>
-          <w:lang w:val="en-US"/>
-        </w:rPr>
-        <w:t xml:space="preserve">       </w:t>
-      </w:r>
-      <w:proofErr w:type="gramStart"/>
-      <w:r>
-        <w:rPr>
-          <w:sz w:val="20"/>
-          <w:szCs w:val="20"/>
-          <w:lang w:val="en-US"/>
-        </w:rPr>
-        <w:t xml:space="preserve">   (</w:t>
-      </w:r>
-      <w:proofErr w:type="gramEnd"/>
-      <w:r>
-        <w:rPr>
-          <w:sz w:val="20"/>
-          <w:szCs w:val="20"/>
-          <w:lang w:val="en-US"/>
-        </w:rPr>
-        <w:t xml:space="preserve">None, 10)                650       </w:t>
+        <w:t xml:space="preserve"> dense_2 (Dense)             (None, 10)                650       </w:t>
       </w:r>
     </w:p>
     <w:p>
@@ -1210,25 +1048,7 @@
           <w:szCs w:val="20"/>
           <w:lang w:val="en-US"/>
         </w:rPr>
-        <w:t>Layer (</w:t>
-      </w:r>
-      <w:proofErr w:type="gramStart"/>
-      <w:r>
-        <w:rPr>
-          <w:sz w:val="20"/>
-          <w:szCs w:val="20"/>
-          <w:lang w:val="en-US"/>
-        </w:rPr>
-        <w:t xml:space="preserve">type)   </w:t>
-      </w:r>
-      <w:proofErr w:type="gramEnd"/>
-      <w:r>
-        <w:rPr>
-          <w:sz w:val="20"/>
-          <w:szCs w:val="20"/>
-          <w:lang w:val="en-US"/>
-        </w:rPr>
-        <w:t xml:space="preserve">             Output Shape              Param #   </w:t>
+        <w:t xml:space="preserve">Layer (type)                Output Shape              Param #   </w:t>
       </w:r>
     </w:p>
     <w:p>
@@ -1266,43 +1086,7 @@
           <w:szCs w:val="20"/>
           <w:lang w:val="en-US"/>
         </w:rPr>
-        <w:t xml:space="preserve"> dense (</w:t>
-      </w:r>
-      <w:proofErr w:type="gramStart"/>
-      <w:r>
-        <w:rPr>
-          <w:sz w:val="20"/>
-          <w:szCs w:val="20"/>
-          <w:lang w:val="en-US"/>
-        </w:rPr>
-        <w:t xml:space="preserve">Dense)   </w:t>
-      </w:r>
-      <w:proofErr w:type="gramEnd"/>
-      <w:r>
-        <w:rPr>
-          <w:sz w:val="20"/>
-          <w:szCs w:val="20"/>
-          <w:lang w:val="en-US"/>
-        </w:rPr>
-        <w:t xml:space="preserve">         </w:t>
-      </w:r>
-      <w:proofErr w:type="gramStart"/>
-      <w:r>
-        <w:rPr>
-          <w:sz w:val="20"/>
-          <w:szCs w:val="20"/>
-          <w:lang w:val="en-US"/>
-        </w:rPr>
-        <w:t xml:space="preserve">   (</w:t>
-      </w:r>
-      <w:proofErr w:type="gramEnd"/>
-      <w:r>
-        <w:rPr>
-          <w:sz w:val="20"/>
-          <w:szCs w:val="20"/>
-          <w:lang w:val="en-US"/>
-        </w:rPr>
-        <w:t xml:space="preserve">None, 64)                1280      </w:t>
+        <w:t xml:space="preserve"> dense (Dense)               (None, 64)                1280      </w:t>
       </w:r>
     </w:p>
     <w:p>
@@ -1340,43 +1124,7 @@
           <w:szCs w:val="20"/>
           <w:lang w:val="en-US"/>
         </w:rPr>
-        <w:t xml:space="preserve"> dense_1 (</w:t>
-      </w:r>
-      <w:proofErr w:type="gramStart"/>
-      <w:r>
-        <w:rPr>
-          <w:sz w:val="20"/>
-          <w:szCs w:val="20"/>
-          <w:lang w:val="en-US"/>
-        </w:rPr>
-        <w:t xml:space="preserve">Dense)   </w:t>
-      </w:r>
-      <w:proofErr w:type="gramEnd"/>
-      <w:r>
-        <w:rPr>
-          <w:sz w:val="20"/>
-          <w:szCs w:val="20"/>
-          <w:lang w:val="en-US"/>
-        </w:rPr>
-        <w:t xml:space="preserve">       </w:t>
-      </w:r>
-      <w:proofErr w:type="gramStart"/>
-      <w:r>
-        <w:rPr>
-          <w:sz w:val="20"/>
-          <w:szCs w:val="20"/>
-          <w:lang w:val="en-US"/>
-        </w:rPr>
-        <w:t xml:space="preserve">   (</w:t>
-      </w:r>
-      <w:proofErr w:type="gramEnd"/>
-      <w:r>
-        <w:rPr>
-          <w:sz w:val="20"/>
-          <w:szCs w:val="20"/>
-          <w:lang w:val="en-US"/>
-        </w:rPr>
-        <w:t xml:space="preserve">None, 128)               8320      </w:t>
+        <w:t xml:space="preserve"> dense_1 (Dense)             (None, 128)               8320      </w:t>
       </w:r>
     </w:p>
     <w:p>
@@ -1414,43 +1162,7 @@
           <w:szCs w:val="20"/>
           <w:lang w:val="en-US"/>
         </w:rPr>
-        <w:t xml:space="preserve"> dense_2 (</w:t>
-      </w:r>
-      <w:proofErr w:type="gramStart"/>
-      <w:r>
-        <w:rPr>
-          <w:sz w:val="20"/>
-          <w:szCs w:val="20"/>
-          <w:lang w:val="en-US"/>
-        </w:rPr>
-        <w:t xml:space="preserve">Dense)   </w:t>
-      </w:r>
-      <w:proofErr w:type="gramEnd"/>
-      <w:r>
-        <w:rPr>
-          <w:sz w:val="20"/>
-          <w:szCs w:val="20"/>
-          <w:lang w:val="en-US"/>
-        </w:rPr>
-        <w:t xml:space="preserve">       </w:t>
-      </w:r>
-      <w:proofErr w:type="gramStart"/>
-      <w:r>
-        <w:rPr>
-          <w:sz w:val="20"/>
-          <w:szCs w:val="20"/>
-          <w:lang w:val="en-US"/>
-        </w:rPr>
-        <w:t xml:space="preserve">   (</w:t>
-      </w:r>
-      <w:proofErr w:type="gramEnd"/>
-      <w:r>
-        <w:rPr>
-          <w:sz w:val="20"/>
-          <w:szCs w:val="20"/>
-          <w:lang w:val="en-US"/>
-        </w:rPr>
-        <w:t xml:space="preserve">None, 64)                8256      </w:t>
+        <w:t xml:space="preserve"> dense_2 (Dense)             (None, 64)                8256      </w:t>
       </w:r>
     </w:p>
     <w:p>
@@ -1488,43 +1200,7 @@
           <w:szCs w:val="20"/>
           <w:lang w:val="en-US"/>
         </w:rPr>
-        <w:t xml:space="preserve"> dropout (</w:t>
-      </w:r>
-      <w:proofErr w:type="gramStart"/>
-      <w:r>
-        <w:rPr>
-          <w:sz w:val="20"/>
-          <w:szCs w:val="20"/>
-          <w:lang w:val="en-US"/>
-        </w:rPr>
-        <w:t xml:space="preserve">Dropout)   </w:t>
-      </w:r>
-      <w:proofErr w:type="gramEnd"/>
-      <w:r>
-        <w:rPr>
-          <w:sz w:val="20"/>
-          <w:szCs w:val="20"/>
-          <w:lang w:val="en-US"/>
-        </w:rPr>
-        <w:t xml:space="preserve">     </w:t>
-      </w:r>
-      <w:proofErr w:type="gramStart"/>
-      <w:r>
-        <w:rPr>
-          <w:sz w:val="20"/>
-          <w:szCs w:val="20"/>
-          <w:lang w:val="en-US"/>
-        </w:rPr>
-        <w:t xml:space="preserve">   (</w:t>
-      </w:r>
-      <w:proofErr w:type="gramEnd"/>
-      <w:r>
-        <w:rPr>
-          <w:sz w:val="20"/>
-          <w:szCs w:val="20"/>
-          <w:lang w:val="en-US"/>
-        </w:rPr>
-        <w:t xml:space="preserve">None, 64)                0         </w:t>
+        <w:t xml:space="preserve"> dropout (Dropout)           (None, 64)                0         </w:t>
       </w:r>
     </w:p>
     <w:p>
@@ -1562,43 +1238,7 @@
           <w:szCs w:val="20"/>
           <w:lang w:val="en-US"/>
         </w:rPr>
-        <w:t xml:space="preserve"> dense_3 (</w:t>
-      </w:r>
-      <w:proofErr w:type="gramStart"/>
-      <w:r>
-        <w:rPr>
-          <w:sz w:val="20"/>
-          <w:szCs w:val="20"/>
-          <w:lang w:val="en-US"/>
-        </w:rPr>
-        <w:t xml:space="preserve">Dense)   </w:t>
-      </w:r>
-      <w:proofErr w:type="gramEnd"/>
-      <w:r>
-        <w:rPr>
-          <w:sz w:val="20"/>
-          <w:szCs w:val="20"/>
-          <w:lang w:val="en-US"/>
-        </w:rPr>
-        <w:t xml:space="preserve">       </w:t>
-      </w:r>
-      <w:proofErr w:type="gramStart"/>
-      <w:r>
-        <w:rPr>
-          <w:sz w:val="20"/>
-          <w:szCs w:val="20"/>
-          <w:lang w:val="en-US"/>
-        </w:rPr>
-        <w:t xml:space="preserve">   (</w:t>
-      </w:r>
-      <w:proofErr w:type="gramEnd"/>
-      <w:r>
-        <w:rPr>
-          <w:sz w:val="20"/>
-          <w:szCs w:val="20"/>
-          <w:lang w:val="en-US"/>
-        </w:rPr>
-        <w:t xml:space="preserve">None, 1)                 65        </w:t>
+        <w:t xml:space="preserve"> dense_3 (Dense)             (None, 1)                 65        </w:t>
       </w:r>
     </w:p>
     <w:p>
@@ -1733,6 +1373,36 @@
           <w:u w:val="single"/>
         </w:rPr>
       </w:pPr>
+      <w:r>
+        <w:rPr>
+          <w:b/>
+          <w:bCs/>
+          <w:sz w:val="24"/>
+          <w:szCs w:val="24"/>
+          <w:lang w:val="en-US"/>
+        </w:rPr>
+        <w:t xml:space="preserve">Test </w:t>
+      </w:r>
+      <w:r>
+        <w:rPr>
+          <w:b/>
+          <w:bCs/>
+          <w:sz w:val="24"/>
+          <w:szCs w:val="24"/>
+          <w:lang w:val="en-US"/>
+        </w:rPr>
+        <w:t>A</w:t>
+      </w:r>
+      <w:r>
+        <w:rPr>
+          <w:b/>
+          <w:bCs/>
+          <w:sz w:val="24"/>
+          <w:szCs w:val="24"/>
+          <w:lang w:val="en-US"/>
+        </w:rPr>
+        <w:t>ccuracy</w:t>
+      </w:r>
     </w:p>
     <w:p>
       <w:pPr>
@@ -2060,39 +1730,8 @@
       <w:pPr>
         <w:jc w:val="both"/>
       </w:pPr>
-      <w:proofErr w:type="spellStart"/>
-      <w:r>
-        <w:t>early_stop</w:t>
-      </w:r>
-      <w:proofErr w:type="spellEnd"/>
-      <w:r>
-        <w:t xml:space="preserve"> = </w:t>
-      </w:r>
-      <w:proofErr w:type="spellStart"/>
-      <w:proofErr w:type="gramStart"/>
-      <w:r>
-        <w:t>EarlyStopping</w:t>
-      </w:r>
-      <w:proofErr w:type="spellEnd"/>
-      <w:r>
-        <w:t>(</w:t>
-      </w:r>
-      <w:proofErr w:type="gramEnd"/>
-      <w:r>
-        <w:t>monitor='</w:t>
-      </w:r>
-      <w:proofErr w:type="spellStart"/>
-      <w:r>
-        <w:t>val_loss</w:t>
-      </w:r>
-      <w:proofErr w:type="gramStart"/>
-      <w:r>
-        <w:t>',patience</w:t>
-      </w:r>
-      <w:proofErr w:type="spellEnd"/>
-      <w:proofErr w:type="gramEnd"/>
-      <w:r>
-        <w:t xml:space="preserve"> = LAST_DIGIT_IN_YOUR_SID)</w:t>
+      <w:r>
+        <w:t>early_stop = EarlyStopping(monitor='val_loss',patience = LAST_DIGIT_IN_YOUR_SID)</w:t>
       </w:r>
     </w:p>
     <w:p>
@@ -2143,47 +1782,15 @@
         <w:jc w:val="both"/>
       </w:pPr>
       <w:r>
-        <w:t xml:space="preserve">history_2 </w:t>
-      </w:r>
-      <w:proofErr w:type="gramStart"/>
-      <w:r>
-        <w:t>=  model2.fit</w:t>
-      </w:r>
-      <w:proofErr w:type="gramEnd"/>
-      <w:r>
-        <w:t>(</w:t>
-      </w:r>
-      <w:proofErr w:type="gramStart"/>
-      <w:r>
-        <w:t>generator,  epochs</w:t>
-      </w:r>
-      <w:proofErr w:type="gramEnd"/>
-      <w:r>
-        <w:t>=30,</w:t>
-      </w:r>
-    </w:p>
-    <w:p>
-      <w:pPr>
-        <w:jc w:val="both"/>
-      </w:pPr>
-      <w:r>
-        <w:t xml:space="preserve">                    </w:t>
-      </w:r>
-      <w:proofErr w:type="spellStart"/>
-      <w:r>
-        <w:t>validation_data</w:t>
-      </w:r>
-      <w:proofErr w:type="spellEnd"/>
-      <w:r>
-        <w:t>=</w:t>
-      </w:r>
-      <w:proofErr w:type="spellStart"/>
-      <w:r>
-        <w:t>validation_generator</w:t>
-      </w:r>
-      <w:proofErr w:type="spellEnd"/>
-      <w:r>
-        <w:t>)</w:t>
+        <w:t>history_2 =  model2.fit(generator,  epochs=30,</w:t>
+      </w:r>
+    </w:p>
+    <w:p>
+      <w:pPr>
+        <w:jc w:val="both"/>
+      </w:pPr>
+      <w:r>
+        <w:t xml:space="preserve">                    validation_data=validation_generator)</w:t>
       </w:r>
     </w:p>
     <w:p>
@@ -2222,6 +1829,7 @@
       </w:pPr>
       <w:r>
         <w:rPr>
+          <w:noProof/>
           <w:sz w:val="44"/>
           <w:szCs w:val="44"/>
           <w:u w:val="single"/>
@@ -3155,6 +2763,7 @@
   <w:style w:type="character" w:default="1" w:styleId="DefaultParagraphFont">
     <w:name w:val="Default Paragraph Font"/>
     <w:uiPriority w:val="1"/>
+    <w:semiHidden/>
     <w:unhideWhenUsed/>
   </w:style>
   <w:style w:type="table" w:default="1" w:styleId="TableNormal">

</xml_diff>

<commit_message>
Week 07 exercises added
</commit_message>
<xml_diff>
--- a/LABlogbook_2523747_Neural Computing and Deep Learning (2025 MOD006568 TRI2 F01CIN).docx
+++ b/LABlogbook_2523747_Neural Computing and Deep Learning (2025 MOD006568 TRI2 F01CIN).docx
@@ -589,7 +589,25 @@
           <w:szCs w:val="20"/>
           <w:lang w:val="en-US"/>
         </w:rPr>
-        <w:t xml:space="preserve"> Layer (type)                Output Shape              Param #   </w:t>
+        <w:t xml:space="preserve"> Layer (</w:t>
+      </w:r>
+      <w:proofErr w:type="gramStart"/>
+      <w:r>
+        <w:rPr>
+          <w:sz w:val="20"/>
+          <w:szCs w:val="20"/>
+          <w:lang w:val="en-US"/>
+        </w:rPr>
+        <w:t xml:space="preserve">type)   </w:t>
+      </w:r>
+      <w:proofErr w:type="gramEnd"/>
+      <w:r>
+        <w:rPr>
+          <w:sz w:val="20"/>
+          <w:szCs w:val="20"/>
+          <w:lang w:val="en-US"/>
+        </w:rPr>
+        <w:t xml:space="preserve">             Output Shape              Param #   </w:t>
       </w:r>
     </w:p>
     <w:p>
@@ -625,7 +643,43 @@
           <w:szCs w:val="20"/>
           <w:lang w:val="en-US"/>
         </w:rPr>
-        <w:t xml:space="preserve"> flatten (Flatten)           (None, 784)               0         </w:t>
+        <w:t xml:space="preserve"> flatten (</w:t>
+      </w:r>
+      <w:proofErr w:type="gramStart"/>
+      <w:r>
+        <w:rPr>
+          <w:sz w:val="20"/>
+          <w:szCs w:val="20"/>
+          <w:lang w:val="en-US"/>
+        </w:rPr>
+        <w:t xml:space="preserve">Flatten)   </w:t>
+      </w:r>
+      <w:proofErr w:type="gramEnd"/>
+      <w:r>
+        <w:rPr>
+          <w:sz w:val="20"/>
+          <w:szCs w:val="20"/>
+          <w:lang w:val="en-US"/>
+        </w:rPr>
+        <w:t xml:space="preserve">     </w:t>
+      </w:r>
+      <w:proofErr w:type="gramStart"/>
+      <w:r>
+        <w:rPr>
+          <w:sz w:val="20"/>
+          <w:szCs w:val="20"/>
+          <w:lang w:val="en-US"/>
+        </w:rPr>
+        <w:t xml:space="preserve">   (</w:t>
+      </w:r>
+      <w:proofErr w:type="gramEnd"/>
+      <w:r>
+        <w:rPr>
+          <w:sz w:val="20"/>
+          <w:szCs w:val="20"/>
+          <w:lang w:val="en-US"/>
+        </w:rPr>
+        <w:t xml:space="preserve">None, 784)               0         </w:t>
       </w:r>
     </w:p>
     <w:p>
@@ -661,7 +715,43 @@
           <w:szCs w:val="20"/>
           <w:lang w:val="en-US"/>
         </w:rPr>
-        <w:t xml:space="preserve"> dense (Dense)               (None, 128)               100480    </w:t>
+        <w:t xml:space="preserve"> dense (</w:t>
+      </w:r>
+      <w:proofErr w:type="gramStart"/>
+      <w:r>
+        <w:rPr>
+          <w:sz w:val="20"/>
+          <w:szCs w:val="20"/>
+          <w:lang w:val="en-US"/>
+        </w:rPr>
+        <w:t xml:space="preserve">Dense)   </w:t>
+      </w:r>
+      <w:proofErr w:type="gramEnd"/>
+      <w:r>
+        <w:rPr>
+          <w:sz w:val="20"/>
+          <w:szCs w:val="20"/>
+          <w:lang w:val="en-US"/>
+        </w:rPr>
+        <w:t xml:space="preserve">         </w:t>
+      </w:r>
+      <w:proofErr w:type="gramStart"/>
+      <w:r>
+        <w:rPr>
+          <w:sz w:val="20"/>
+          <w:szCs w:val="20"/>
+          <w:lang w:val="en-US"/>
+        </w:rPr>
+        <w:t xml:space="preserve">   (</w:t>
+      </w:r>
+      <w:proofErr w:type="gramEnd"/>
+      <w:r>
+        <w:rPr>
+          <w:sz w:val="20"/>
+          <w:szCs w:val="20"/>
+          <w:lang w:val="en-US"/>
+        </w:rPr>
+        <w:t xml:space="preserve">None, 128)               100480    </w:t>
       </w:r>
     </w:p>
     <w:p>
@@ -697,7 +787,43 @@
           <w:szCs w:val="20"/>
           <w:lang w:val="en-US"/>
         </w:rPr>
-        <w:t xml:space="preserve"> dense_1 (Dense)             (None, 64)                8256      </w:t>
+        <w:t xml:space="preserve"> dense_1 (</w:t>
+      </w:r>
+      <w:proofErr w:type="gramStart"/>
+      <w:r>
+        <w:rPr>
+          <w:sz w:val="20"/>
+          <w:szCs w:val="20"/>
+          <w:lang w:val="en-US"/>
+        </w:rPr>
+        <w:t xml:space="preserve">Dense)   </w:t>
+      </w:r>
+      <w:proofErr w:type="gramEnd"/>
+      <w:r>
+        <w:rPr>
+          <w:sz w:val="20"/>
+          <w:szCs w:val="20"/>
+          <w:lang w:val="en-US"/>
+        </w:rPr>
+        <w:t xml:space="preserve">       </w:t>
+      </w:r>
+      <w:proofErr w:type="gramStart"/>
+      <w:r>
+        <w:rPr>
+          <w:sz w:val="20"/>
+          <w:szCs w:val="20"/>
+          <w:lang w:val="en-US"/>
+        </w:rPr>
+        <w:t xml:space="preserve">   (</w:t>
+      </w:r>
+      <w:proofErr w:type="gramEnd"/>
+      <w:r>
+        <w:rPr>
+          <w:sz w:val="20"/>
+          <w:szCs w:val="20"/>
+          <w:lang w:val="en-US"/>
+        </w:rPr>
+        <w:t xml:space="preserve">None, 64)                8256      </w:t>
       </w:r>
     </w:p>
     <w:p>
@@ -733,7 +859,43 @@
           <w:szCs w:val="20"/>
           <w:lang w:val="en-US"/>
         </w:rPr>
-        <w:t xml:space="preserve"> dense_2 (Dense)             (None, 10)                650       </w:t>
+        <w:t xml:space="preserve"> dense_2 (</w:t>
+      </w:r>
+      <w:proofErr w:type="gramStart"/>
+      <w:r>
+        <w:rPr>
+          <w:sz w:val="20"/>
+          <w:szCs w:val="20"/>
+          <w:lang w:val="en-US"/>
+        </w:rPr>
+        <w:t xml:space="preserve">Dense)   </w:t>
+      </w:r>
+      <w:proofErr w:type="gramEnd"/>
+      <w:r>
+        <w:rPr>
+          <w:sz w:val="20"/>
+          <w:szCs w:val="20"/>
+          <w:lang w:val="en-US"/>
+        </w:rPr>
+        <w:t xml:space="preserve">       </w:t>
+      </w:r>
+      <w:proofErr w:type="gramStart"/>
+      <w:r>
+        <w:rPr>
+          <w:sz w:val="20"/>
+          <w:szCs w:val="20"/>
+          <w:lang w:val="en-US"/>
+        </w:rPr>
+        <w:t xml:space="preserve">   (</w:t>
+      </w:r>
+      <w:proofErr w:type="gramEnd"/>
+      <w:r>
+        <w:rPr>
+          <w:sz w:val="20"/>
+          <w:szCs w:val="20"/>
+          <w:lang w:val="en-US"/>
+        </w:rPr>
+        <w:t xml:space="preserve">None, 10)                650       </w:t>
       </w:r>
     </w:p>
     <w:p>
@@ -1048,7 +1210,25 @@
           <w:szCs w:val="20"/>
           <w:lang w:val="en-US"/>
         </w:rPr>
-        <w:t xml:space="preserve">Layer (type)                Output Shape              Param #   </w:t>
+        <w:t>Layer (</w:t>
+      </w:r>
+      <w:proofErr w:type="gramStart"/>
+      <w:r>
+        <w:rPr>
+          <w:sz w:val="20"/>
+          <w:szCs w:val="20"/>
+          <w:lang w:val="en-US"/>
+        </w:rPr>
+        <w:t xml:space="preserve">type)   </w:t>
+      </w:r>
+      <w:proofErr w:type="gramEnd"/>
+      <w:r>
+        <w:rPr>
+          <w:sz w:val="20"/>
+          <w:szCs w:val="20"/>
+          <w:lang w:val="en-US"/>
+        </w:rPr>
+        <w:t xml:space="preserve">             Output Shape              Param #   </w:t>
       </w:r>
     </w:p>
     <w:p>
@@ -1086,7 +1266,43 @@
           <w:szCs w:val="20"/>
           <w:lang w:val="en-US"/>
         </w:rPr>
-        <w:t xml:space="preserve"> dense (Dense)               (None, 64)                1280      </w:t>
+        <w:t xml:space="preserve"> dense (</w:t>
+      </w:r>
+      <w:proofErr w:type="gramStart"/>
+      <w:r>
+        <w:rPr>
+          <w:sz w:val="20"/>
+          <w:szCs w:val="20"/>
+          <w:lang w:val="en-US"/>
+        </w:rPr>
+        <w:t xml:space="preserve">Dense)   </w:t>
+      </w:r>
+      <w:proofErr w:type="gramEnd"/>
+      <w:r>
+        <w:rPr>
+          <w:sz w:val="20"/>
+          <w:szCs w:val="20"/>
+          <w:lang w:val="en-US"/>
+        </w:rPr>
+        <w:t xml:space="preserve">         </w:t>
+      </w:r>
+      <w:proofErr w:type="gramStart"/>
+      <w:r>
+        <w:rPr>
+          <w:sz w:val="20"/>
+          <w:szCs w:val="20"/>
+          <w:lang w:val="en-US"/>
+        </w:rPr>
+        <w:t xml:space="preserve">   (</w:t>
+      </w:r>
+      <w:proofErr w:type="gramEnd"/>
+      <w:r>
+        <w:rPr>
+          <w:sz w:val="20"/>
+          <w:szCs w:val="20"/>
+          <w:lang w:val="en-US"/>
+        </w:rPr>
+        <w:t xml:space="preserve">None, 64)                1280      </w:t>
       </w:r>
     </w:p>
     <w:p>
@@ -1124,7 +1340,43 @@
           <w:szCs w:val="20"/>
           <w:lang w:val="en-US"/>
         </w:rPr>
-        <w:t xml:space="preserve"> dense_1 (Dense)             (None, 128)               8320      </w:t>
+        <w:t xml:space="preserve"> dense_1 (</w:t>
+      </w:r>
+      <w:proofErr w:type="gramStart"/>
+      <w:r>
+        <w:rPr>
+          <w:sz w:val="20"/>
+          <w:szCs w:val="20"/>
+          <w:lang w:val="en-US"/>
+        </w:rPr>
+        <w:t xml:space="preserve">Dense)   </w:t>
+      </w:r>
+      <w:proofErr w:type="gramEnd"/>
+      <w:r>
+        <w:rPr>
+          <w:sz w:val="20"/>
+          <w:szCs w:val="20"/>
+          <w:lang w:val="en-US"/>
+        </w:rPr>
+        <w:t xml:space="preserve">       </w:t>
+      </w:r>
+      <w:proofErr w:type="gramStart"/>
+      <w:r>
+        <w:rPr>
+          <w:sz w:val="20"/>
+          <w:szCs w:val="20"/>
+          <w:lang w:val="en-US"/>
+        </w:rPr>
+        <w:t xml:space="preserve">   (</w:t>
+      </w:r>
+      <w:proofErr w:type="gramEnd"/>
+      <w:r>
+        <w:rPr>
+          <w:sz w:val="20"/>
+          <w:szCs w:val="20"/>
+          <w:lang w:val="en-US"/>
+        </w:rPr>
+        <w:t xml:space="preserve">None, 128)               8320      </w:t>
       </w:r>
     </w:p>
     <w:p>
@@ -1162,7 +1414,43 @@
           <w:szCs w:val="20"/>
           <w:lang w:val="en-US"/>
         </w:rPr>
-        <w:t xml:space="preserve"> dense_2 (Dense)             (None, 64)                8256      </w:t>
+        <w:t xml:space="preserve"> dense_2 (</w:t>
+      </w:r>
+      <w:proofErr w:type="gramStart"/>
+      <w:r>
+        <w:rPr>
+          <w:sz w:val="20"/>
+          <w:szCs w:val="20"/>
+          <w:lang w:val="en-US"/>
+        </w:rPr>
+        <w:t xml:space="preserve">Dense)   </w:t>
+      </w:r>
+      <w:proofErr w:type="gramEnd"/>
+      <w:r>
+        <w:rPr>
+          <w:sz w:val="20"/>
+          <w:szCs w:val="20"/>
+          <w:lang w:val="en-US"/>
+        </w:rPr>
+        <w:t xml:space="preserve">       </w:t>
+      </w:r>
+      <w:proofErr w:type="gramStart"/>
+      <w:r>
+        <w:rPr>
+          <w:sz w:val="20"/>
+          <w:szCs w:val="20"/>
+          <w:lang w:val="en-US"/>
+        </w:rPr>
+        <w:t xml:space="preserve">   (</w:t>
+      </w:r>
+      <w:proofErr w:type="gramEnd"/>
+      <w:r>
+        <w:rPr>
+          <w:sz w:val="20"/>
+          <w:szCs w:val="20"/>
+          <w:lang w:val="en-US"/>
+        </w:rPr>
+        <w:t xml:space="preserve">None, 64)                8256      </w:t>
       </w:r>
     </w:p>
     <w:p>
@@ -1200,7 +1488,43 @@
           <w:szCs w:val="20"/>
           <w:lang w:val="en-US"/>
         </w:rPr>
-        <w:t xml:space="preserve"> dropout (Dropout)           (None, 64)                0         </w:t>
+        <w:t xml:space="preserve"> dropout (</w:t>
+      </w:r>
+      <w:proofErr w:type="gramStart"/>
+      <w:r>
+        <w:rPr>
+          <w:sz w:val="20"/>
+          <w:szCs w:val="20"/>
+          <w:lang w:val="en-US"/>
+        </w:rPr>
+        <w:t xml:space="preserve">Dropout)   </w:t>
+      </w:r>
+      <w:proofErr w:type="gramEnd"/>
+      <w:r>
+        <w:rPr>
+          <w:sz w:val="20"/>
+          <w:szCs w:val="20"/>
+          <w:lang w:val="en-US"/>
+        </w:rPr>
+        <w:t xml:space="preserve">     </w:t>
+      </w:r>
+      <w:proofErr w:type="gramStart"/>
+      <w:r>
+        <w:rPr>
+          <w:sz w:val="20"/>
+          <w:szCs w:val="20"/>
+          <w:lang w:val="en-US"/>
+        </w:rPr>
+        <w:t xml:space="preserve">   (</w:t>
+      </w:r>
+      <w:proofErr w:type="gramEnd"/>
+      <w:r>
+        <w:rPr>
+          <w:sz w:val="20"/>
+          <w:szCs w:val="20"/>
+          <w:lang w:val="en-US"/>
+        </w:rPr>
+        <w:t xml:space="preserve">None, 64)                0         </w:t>
       </w:r>
     </w:p>
     <w:p>
@@ -1238,7 +1562,43 @@
           <w:szCs w:val="20"/>
           <w:lang w:val="en-US"/>
         </w:rPr>
-        <w:t xml:space="preserve"> dense_3 (Dense)             (None, 1)                 65        </w:t>
+        <w:t xml:space="preserve"> dense_3 (</w:t>
+      </w:r>
+      <w:proofErr w:type="gramStart"/>
+      <w:r>
+        <w:rPr>
+          <w:sz w:val="20"/>
+          <w:szCs w:val="20"/>
+          <w:lang w:val="en-US"/>
+        </w:rPr>
+        <w:t xml:space="preserve">Dense)   </w:t>
+      </w:r>
+      <w:proofErr w:type="gramEnd"/>
+      <w:r>
+        <w:rPr>
+          <w:sz w:val="20"/>
+          <w:szCs w:val="20"/>
+          <w:lang w:val="en-US"/>
+        </w:rPr>
+        <w:t xml:space="preserve">       </w:t>
+      </w:r>
+      <w:proofErr w:type="gramStart"/>
+      <w:r>
+        <w:rPr>
+          <w:sz w:val="20"/>
+          <w:szCs w:val="20"/>
+          <w:lang w:val="en-US"/>
+        </w:rPr>
+        <w:t xml:space="preserve">   (</w:t>
+      </w:r>
+      <w:proofErr w:type="gramEnd"/>
+      <w:r>
+        <w:rPr>
+          <w:sz w:val="20"/>
+          <w:szCs w:val="20"/>
+          <w:lang w:val="en-US"/>
+        </w:rPr>
+        <w:t xml:space="preserve">None, 1)                 65        </w:t>
       </w:r>
     </w:p>
     <w:p>
@@ -1730,8 +2090,39 @@
       <w:pPr>
         <w:jc w:val="both"/>
       </w:pPr>
-      <w:r>
-        <w:t>early_stop = EarlyStopping(monitor='val_loss',patience = LAST_DIGIT_IN_YOUR_SID)</w:t>
+      <w:proofErr w:type="spellStart"/>
+      <w:r>
+        <w:t>early_stop</w:t>
+      </w:r>
+      <w:proofErr w:type="spellEnd"/>
+      <w:r>
+        <w:t xml:space="preserve"> = </w:t>
+      </w:r>
+      <w:proofErr w:type="spellStart"/>
+      <w:proofErr w:type="gramStart"/>
+      <w:r>
+        <w:t>EarlyStopping</w:t>
+      </w:r>
+      <w:proofErr w:type="spellEnd"/>
+      <w:r>
+        <w:t>(</w:t>
+      </w:r>
+      <w:proofErr w:type="gramEnd"/>
+      <w:r>
+        <w:t>monitor='</w:t>
+      </w:r>
+      <w:proofErr w:type="spellStart"/>
+      <w:r>
+        <w:t>val_loss</w:t>
+      </w:r>
+      <w:proofErr w:type="gramStart"/>
+      <w:r>
+        <w:t>',patience</w:t>
+      </w:r>
+      <w:proofErr w:type="spellEnd"/>
+      <w:proofErr w:type="gramEnd"/>
+      <w:r>
+        <w:t xml:space="preserve"> = LAST_DIGIT_IN_YOUR_SID)</w:t>
       </w:r>
     </w:p>
     <w:p>
@@ -1782,15 +2173,47 @@
         <w:jc w:val="both"/>
       </w:pPr>
       <w:r>
-        <w:t>history_2 =  model2.fit(generator,  epochs=30,</w:t>
-      </w:r>
-    </w:p>
-    <w:p>
-      <w:pPr>
-        <w:jc w:val="both"/>
-      </w:pPr>
-      <w:r>
-        <w:t xml:space="preserve">                    validation_data=validation_generator)</w:t>
+        <w:t xml:space="preserve">history_2 </w:t>
+      </w:r>
+      <w:proofErr w:type="gramStart"/>
+      <w:r>
+        <w:t>=  model2.fit</w:t>
+      </w:r>
+      <w:proofErr w:type="gramEnd"/>
+      <w:r>
+        <w:t>(</w:t>
+      </w:r>
+      <w:proofErr w:type="gramStart"/>
+      <w:r>
+        <w:t>generator,  epochs</w:t>
+      </w:r>
+      <w:proofErr w:type="gramEnd"/>
+      <w:r>
+        <w:t>=30,</w:t>
+      </w:r>
+    </w:p>
+    <w:p>
+      <w:pPr>
+        <w:jc w:val="both"/>
+      </w:pPr>
+      <w:r>
+        <w:t xml:space="preserve">                    </w:t>
+      </w:r>
+      <w:proofErr w:type="spellStart"/>
+      <w:r>
+        <w:t>validation_data</w:t>
+      </w:r>
+      <w:proofErr w:type="spellEnd"/>
+      <w:r>
+        <w:t>=</w:t>
+      </w:r>
+      <w:proofErr w:type="spellStart"/>
+      <w:r>
+        <w:t>validation_generator</w:t>
+      </w:r>
+      <w:proofErr w:type="spellEnd"/>
+      <w:r>
+        <w:t>)</w:t>
       </w:r>
     </w:p>
     <w:p>
@@ -1880,142 +2303,13 @@
           <w:u w:val="single"/>
         </w:rPr>
       </w:pPr>
-    </w:p>
-    <w:p>
-      <w:pPr>
-        <w:jc w:val="both"/>
-        <w:rPr>
-          <w:sz w:val="44"/>
-          <w:szCs w:val="44"/>
-          <w:u w:val="single"/>
-        </w:rPr>
-      </w:pPr>
-    </w:p>
-    <w:p>
-      <w:pPr>
-        <w:jc w:val="both"/>
-        <w:rPr>
-          <w:sz w:val="44"/>
-          <w:szCs w:val="44"/>
-          <w:u w:val="single"/>
-        </w:rPr>
-      </w:pPr>
-    </w:p>
-    <w:p>
-      <w:pPr>
-        <w:jc w:val="both"/>
-        <w:rPr>
-          <w:sz w:val="44"/>
-          <w:szCs w:val="44"/>
-          <w:u w:val="single"/>
-        </w:rPr>
-      </w:pPr>
-    </w:p>
-    <w:p>
-      <w:pPr>
-        <w:jc w:val="both"/>
-        <w:rPr>
-          <w:sz w:val="44"/>
-          <w:szCs w:val="44"/>
-          <w:u w:val="single"/>
-        </w:rPr>
-      </w:pPr>
-    </w:p>
-    <w:p>
-      <w:pPr>
-        <w:jc w:val="both"/>
-        <w:rPr>
-          <w:sz w:val="44"/>
-          <w:szCs w:val="44"/>
-          <w:u w:val="single"/>
-        </w:rPr>
-      </w:pPr>
-    </w:p>
-    <w:p>
-      <w:pPr>
-        <w:jc w:val="both"/>
-        <w:rPr>
-          <w:sz w:val="44"/>
-          <w:szCs w:val="44"/>
-          <w:u w:val="single"/>
-        </w:rPr>
-      </w:pPr>
-    </w:p>
-    <w:p>
-      <w:pPr>
-        <w:jc w:val="both"/>
-        <w:rPr>
-          <w:sz w:val="44"/>
-          <w:szCs w:val="44"/>
-          <w:u w:val="single"/>
-        </w:rPr>
-      </w:pPr>
-    </w:p>
-    <w:p>
-      <w:pPr>
-        <w:jc w:val="both"/>
-        <w:rPr>
-          <w:sz w:val="44"/>
-          <w:szCs w:val="44"/>
-          <w:u w:val="single"/>
-        </w:rPr>
-      </w:pPr>
-    </w:p>
-    <w:p>
-      <w:pPr>
-        <w:jc w:val="both"/>
-        <w:rPr>
-          <w:sz w:val="44"/>
-          <w:szCs w:val="44"/>
-          <w:u w:val="single"/>
-        </w:rPr>
-      </w:pPr>
-    </w:p>
-    <w:p>
-      <w:pPr>
-        <w:jc w:val="both"/>
-        <w:rPr>
-          <w:sz w:val="44"/>
-          <w:szCs w:val="44"/>
-          <w:u w:val="single"/>
-        </w:rPr>
-      </w:pPr>
-    </w:p>
-    <w:p>
-      <w:pPr>
-        <w:jc w:val="both"/>
-        <w:rPr>
-          <w:sz w:val="44"/>
-          <w:szCs w:val="44"/>
-          <w:u w:val="single"/>
-        </w:rPr>
-      </w:pPr>
-    </w:p>
-    <w:p>
-      <w:pPr>
-        <w:jc w:val="both"/>
-        <w:rPr>
-          <w:sz w:val="44"/>
-          <w:szCs w:val="44"/>
-          <w:u w:val="single"/>
-        </w:rPr>
-      </w:pPr>
-    </w:p>
-    <w:p>
-      <w:pPr>
-        <w:jc w:val="both"/>
-        <w:rPr>
-          <w:sz w:val="44"/>
-          <w:szCs w:val="44"/>
-          <w:u w:val="single"/>
-        </w:rPr>
-      </w:pPr>
-      <w:r>
-        <w:rPr>
-          <w:sz w:val="44"/>
-          <w:szCs w:val="44"/>
-          <w:u w:val="single"/>
-        </w:rPr>
+      <w:r>
+        <w:rPr>
+          <w:sz w:val="44"/>
+          <w:szCs w:val="44"/>
+          <w:u w:val="single"/>
+        </w:rPr>
+        <w:lastRenderedPageBreak/>
         <w:t>Lab 7</w:t>
       </w:r>
     </w:p>
@@ -2023,6 +2317,116 @@
       <w:pPr>
         <w:jc w:val="both"/>
         <w:rPr>
+          <w:b/>
+          <w:bCs/>
+          <w:sz w:val="24"/>
+          <w:szCs w:val="24"/>
+          <w:lang w:val="en-US"/>
+        </w:rPr>
+      </w:pPr>
+      <w:r>
+        <w:rPr>
+          <w:b/>
+          <w:bCs/>
+          <w:sz w:val="24"/>
+          <w:szCs w:val="24"/>
+          <w:lang w:val="en-US"/>
+        </w:rPr>
+        <w:t>Plot graphs for Accuracy and Loss Function for VGG16 and VGG19</w:t>
+      </w:r>
+    </w:p>
+    <w:p>
+      <w:pPr>
+        <w:jc w:val="both"/>
+        <w:rPr>
+          <w:b/>
+          <w:bCs/>
+          <w:sz w:val="24"/>
+          <w:szCs w:val="24"/>
+        </w:rPr>
+      </w:pPr>
+    </w:p>
+    <w:p>
+      <w:pPr>
+        <w:jc w:val="both"/>
+        <w:rPr>
+          <w:b/>
+          <w:bCs/>
+          <w:sz w:val="24"/>
+          <w:szCs w:val="24"/>
+          <w:lang w:val="en-US"/>
+        </w:rPr>
+      </w:pPr>
+      <w:r>
+        <w:rPr>
+          <w:b/>
+          <w:bCs/>
+          <w:sz w:val="24"/>
+          <w:szCs w:val="24"/>
+          <w:lang w:val="en-US"/>
+        </w:rPr>
+        <w:t>optimal number of epochs for training your VGG16 model.</w:t>
+      </w:r>
+    </w:p>
+    <w:p>
+      <w:pPr>
+        <w:jc w:val="both"/>
+        <w:rPr>
+          <w:b/>
+          <w:bCs/>
+          <w:sz w:val="24"/>
+          <w:szCs w:val="24"/>
+        </w:rPr>
+      </w:pPr>
+    </w:p>
+    <w:p>
+      <w:pPr>
+        <w:jc w:val="both"/>
+        <w:rPr>
+          <w:b/>
+          <w:bCs/>
+          <w:sz w:val="24"/>
+          <w:szCs w:val="24"/>
+          <w:lang w:val="en-US"/>
+        </w:rPr>
+      </w:pPr>
+      <w:r>
+        <w:rPr>
+          <w:b/>
+          <w:bCs/>
+          <w:sz w:val="24"/>
+          <w:szCs w:val="24"/>
+          <w:lang w:val="en-US"/>
+        </w:rPr>
+        <w:t>Add the final Performance Table</w:t>
+      </w:r>
+    </w:p>
+    <w:p>
+      <w:pPr>
+        <w:jc w:val="both"/>
+        <w:rPr>
+          <w:b/>
+          <w:bCs/>
+          <w:sz w:val="24"/>
+          <w:szCs w:val="24"/>
+          <w:lang w:val="en-US"/>
+        </w:rPr>
+      </w:pPr>
+      <w:r>
+        <w:rPr>
+          <w:b/>
+          <w:bCs/>
+          <w:sz w:val="24"/>
+          <w:szCs w:val="24"/>
+          <w:lang w:val="en-US"/>
+        </w:rPr>
+        <w:t>Plot the performance comparing histogram of VGG16 and VGG19</w:t>
+      </w:r>
+    </w:p>
+    <w:p>
+      <w:pPr>
+        <w:jc w:val="both"/>
+        <w:rPr>
           <w:sz w:val="44"/>
           <w:szCs w:val="44"/>
           <w:u w:val="single"/>
@@ -2100,7 +2504,6 @@
           <w:szCs w:val="44"/>
           <w:u w:val="single"/>
         </w:rPr>
-        <w:lastRenderedPageBreak/>
         <w:t>Lab 10</w:t>
       </w:r>
     </w:p>
@@ -2763,7 +3166,6 @@
   <w:style w:type="character" w:default="1" w:styleId="DefaultParagraphFont">
     <w:name w:val="Default Paragraph Font"/>
     <w:uiPriority w:val="1"/>
-    <w:semiHidden/>
     <w:unhideWhenUsed/>
   </w:style>
   <w:style w:type="table" w:default="1" w:styleId="TableNormal">

</xml_diff>

<commit_message>
Week 08 Excercises added
</commit_message>
<xml_diff>
--- a/LABlogbook_2523747_Neural Computing and Deep Learning (2025 MOD006568 TRI2 F01CIN).docx
+++ b/LABlogbook_2523747_Neural Computing and Deep Learning (2025 MOD006568 TRI2 F01CIN).docx
@@ -291,81 +291,72 @@
       <w:pPr>
         <w:jc w:val="both"/>
         <w:rPr>
-          <w:sz w:val="44"/>
-          <w:szCs w:val="44"/>
-          <w:u w:val="single"/>
-        </w:rPr>
-      </w:pPr>
-    </w:p>
-    <w:p>
-      <w:pPr>
-        <w:jc w:val="both"/>
-        <w:rPr>
-          <w:sz w:val="44"/>
-          <w:szCs w:val="44"/>
-          <w:u w:val="single"/>
-        </w:rPr>
-      </w:pPr>
-    </w:p>
-    <w:p>
-      <w:pPr>
-        <w:jc w:val="both"/>
-        <w:rPr>
-          <w:sz w:val="44"/>
-          <w:szCs w:val="44"/>
-          <w:u w:val="single"/>
-        </w:rPr>
-      </w:pPr>
-    </w:p>
-    <w:p>
-      <w:pPr>
-        <w:jc w:val="both"/>
-        <w:rPr>
-          <w:sz w:val="44"/>
-          <w:szCs w:val="44"/>
-          <w:u w:val="single"/>
-        </w:rPr>
-      </w:pPr>
-    </w:p>
-    <w:p>
-      <w:pPr>
-        <w:jc w:val="both"/>
-        <w:rPr>
-          <w:sz w:val="44"/>
-          <w:szCs w:val="44"/>
-          <w:u w:val="single"/>
-        </w:rPr>
-      </w:pPr>
-    </w:p>
-    <w:p>
-      <w:pPr>
-        <w:jc w:val="both"/>
-        <w:rPr>
-          <w:sz w:val="44"/>
-          <w:szCs w:val="44"/>
-          <w:u w:val="single"/>
-        </w:rPr>
-      </w:pPr>
-    </w:p>
-    <w:p>
-      <w:pPr>
-        <w:jc w:val="both"/>
-        <w:rPr>
-          <w:sz w:val="44"/>
-          <w:szCs w:val="44"/>
-          <w:u w:val="single"/>
-        </w:rPr>
-      </w:pPr>
-    </w:p>
-    <w:p>
-      <w:pPr>
-        <w:jc w:val="both"/>
-        <w:rPr>
-          <w:sz w:val="44"/>
-          <w:szCs w:val="44"/>
-          <w:u w:val="single"/>
-        </w:rPr>
-      </w:pPr>
+          <w:sz w:val="24"/>
+          <w:szCs w:val="24"/>
+          <w:lang w:val="en-US"/>
+        </w:rPr>
+      </w:pPr>
+      <w:r>
+        <w:rPr>
+          <w:sz w:val="24"/>
+          <w:szCs w:val="24"/>
+          <w:lang w:val="en-US"/>
+        </w:rPr>
+        <w:t>Model summary</w:t>
+      </w:r>
+    </w:p>
+    <w:p>
+      <w:pPr>
+        <w:jc w:val="both"/>
+        <w:rPr>
+          <w:sz w:val="44"/>
+          <w:szCs w:val="44"/>
+          <w:u w:val="single"/>
+        </w:rPr>
+      </w:pPr>
+      <w:r>
+        <w:rPr>
+          <w:noProof/>
+          <w:sz w:val="44"/>
+          <w:szCs w:val="44"/>
+          <w:u w:val="single"/>
+        </w:rPr>
+        <w:drawing>
+          <wp:inline distT="0" distB="0" distL="0" distR="0" wp14:anchorId="29CBF173" wp14:editId="1300DB8A">
+            <wp:extent cx="5731510" cy="3279775"/>
+            <wp:effectExtent l="0" t="0" r="2540" b="0"/>
+            <wp:docPr id="1622149109" name="Picture 1"/>
+            <wp:cNvGraphicFramePr>
+              <a:graphicFrameLocks xmlns:a="http://schemas.openxmlformats.org/drawingml/2006/main" noChangeAspect="1"/>
+            </wp:cNvGraphicFramePr>
+            <a:graphic xmlns:a="http://schemas.openxmlformats.org/drawingml/2006/main">
+              <a:graphicData uri="http://schemas.openxmlformats.org/drawingml/2006/picture">
+                <pic:pic xmlns:pic="http://schemas.openxmlformats.org/drawingml/2006/picture">
+                  <pic:nvPicPr>
+                    <pic:cNvPr id="1622149109" name=""/>
+                    <pic:cNvPicPr/>
+                  </pic:nvPicPr>
+                  <pic:blipFill>
+                    <a:blip r:embed="rId6"/>
+                    <a:stretch>
+                      <a:fillRect/>
+                    </a:stretch>
+                  </pic:blipFill>
+                  <pic:spPr>
+                    <a:xfrm>
+                      <a:off x="0" y="0"/>
+                      <a:ext cx="5731510" cy="3279775"/>
+                    </a:xfrm>
+                    <a:prstGeom prst="rect">
+                      <a:avLst/>
+                    </a:prstGeom>
+                  </pic:spPr>
+                </pic:pic>
+              </a:graphicData>
+            </a:graphic>
+          </wp:inline>
+        </w:drawing>
+      </w:r>
     </w:p>
     <w:p>
       <w:pPr>
@@ -1135,7 +1126,7 @@
                     </pic:cNvPicPr>
                   </pic:nvPicPr>
                   <pic:blipFill>
-                    <a:blip r:embed="rId6">
+                    <a:blip r:embed="rId7">
                       <a:extLst>
                         <a:ext uri="{28A0092B-C50C-407E-A947-70E740481C1C}">
                           <a14:useLocalDpi xmlns:a14="http://schemas.microsoft.com/office/drawing/2010/main" val="0"/>
@@ -1705,214 +1696,230 @@
           <w:u w:val="single"/>
         </w:rPr>
       </w:pPr>
-    </w:p>
-    <w:p>
-      <w:pPr>
-        <w:jc w:val="both"/>
-        <w:rPr>
-          <w:sz w:val="44"/>
-          <w:szCs w:val="44"/>
-          <w:u w:val="single"/>
-        </w:rPr>
-      </w:pPr>
-      <w:r>
-        <w:rPr>
-          <w:sz w:val="44"/>
-          <w:szCs w:val="44"/>
-          <w:u w:val="single"/>
-        </w:rPr>
+      <w:r>
+        <w:rPr>
+          <w:sz w:val="44"/>
+          <w:szCs w:val="44"/>
+          <w:u w:val="single"/>
+        </w:rPr>
+        <w:lastRenderedPageBreak/>
         <w:t>Lab 5</w:t>
       </w:r>
     </w:p>
     <w:p>
       <w:pPr>
-        <w:jc w:val="both"/>
-        <w:rPr>
-          <w:sz w:val="44"/>
-          <w:szCs w:val="44"/>
-          <w:u w:val="single"/>
-        </w:rPr>
-      </w:pPr>
-      <w:r>
-        <w:rPr>
-          <w:b/>
-          <w:bCs/>
-          <w:sz w:val="24"/>
-          <w:szCs w:val="24"/>
-          <w:lang w:val="en-US"/>
-        </w:rPr>
-        <w:t xml:space="preserve">Test </w:t>
-      </w:r>
-      <w:r>
-        <w:rPr>
-          <w:b/>
-          <w:bCs/>
-          <w:sz w:val="24"/>
-          <w:szCs w:val="24"/>
-          <w:lang w:val="en-US"/>
-        </w:rPr>
-        <w:t>A</w:t>
-      </w:r>
-      <w:r>
-        <w:rPr>
-          <w:b/>
-          <w:bCs/>
-          <w:sz w:val="24"/>
-          <w:szCs w:val="24"/>
-          <w:lang w:val="en-US"/>
-        </w:rPr>
-        <w:t>ccuracy</w:t>
-      </w:r>
-    </w:p>
-    <w:p>
-      <w:pPr>
-        <w:jc w:val="both"/>
-        <w:rPr>
-          <w:sz w:val="44"/>
-          <w:szCs w:val="44"/>
-          <w:u w:val="single"/>
-        </w:rPr>
-      </w:pPr>
-    </w:p>
-    <w:p>
-      <w:pPr>
-        <w:jc w:val="both"/>
-        <w:rPr>
-          <w:sz w:val="44"/>
-          <w:szCs w:val="44"/>
-          <w:u w:val="single"/>
-        </w:rPr>
-      </w:pPr>
-    </w:p>
-    <w:p>
-      <w:pPr>
-        <w:jc w:val="both"/>
-        <w:rPr>
-          <w:sz w:val="44"/>
-          <w:szCs w:val="44"/>
-          <w:u w:val="single"/>
-        </w:rPr>
-      </w:pPr>
-    </w:p>
-    <w:p>
-      <w:pPr>
-        <w:jc w:val="both"/>
-        <w:rPr>
-          <w:sz w:val="44"/>
-          <w:szCs w:val="44"/>
-          <w:u w:val="single"/>
-        </w:rPr>
-      </w:pPr>
-    </w:p>
-    <w:p>
-      <w:pPr>
-        <w:jc w:val="both"/>
-        <w:rPr>
-          <w:sz w:val="44"/>
-          <w:szCs w:val="44"/>
-          <w:u w:val="single"/>
-        </w:rPr>
-      </w:pPr>
-    </w:p>
-    <w:p>
-      <w:pPr>
-        <w:jc w:val="both"/>
-        <w:rPr>
-          <w:sz w:val="44"/>
-          <w:szCs w:val="44"/>
-          <w:u w:val="single"/>
-        </w:rPr>
-      </w:pPr>
-    </w:p>
-    <w:p>
-      <w:pPr>
-        <w:jc w:val="both"/>
-        <w:rPr>
-          <w:sz w:val="44"/>
-          <w:szCs w:val="44"/>
-          <w:u w:val="single"/>
-        </w:rPr>
-      </w:pPr>
-    </w:p>
-    <w:p>
-      <w:pPr>
-        <w:jc w:val="both"/>
-        <w:rPr>
-          <w:sz w:val="44"/>
-          <w:szCs w:val="44"/>
-          <w:u w:val="single"/>
-        </w:rPr>
-      </w:pPr>
-    </w:p>
-    <w:p>
-      <w:pPr>
-        <w:jc w:val="both"/>
-        <w:rPr>
-          <w:sz w:val="44"/>
-          <w:szCs w:val="44"/>
-          <w:u w:val="single"/>
-        </w:rPr>
-      </w:pPr>
-    </w:p>
-    <w:p>
-      <w:pPr>
-        <w:jc w:val="both"/>
-        <w:rPr>
-          <w:sz w:val="44"/>
-          <w:szCs w:val="44"/>
-          <w:u w:val="single"/>
-        </w:rPr>
-      </w:pPr>
-    </w:p>
-    <w:p>
-      <w:pPr>
-        <w:jc w:val="both"/>
-        <w:rPr>
-          <w:sz w:val="44"/>
-          <w:szCs w:val="44"/>
-          <w:u w:val="single"/>
-        </w:rPr>
-      </w:pPr>
-    </w:p>
-    <w:p>
-      <w:pPr>
-        <w:jc w:val="both"/>
-        <w:rPr>
-          <w:sz w:val="44"/>
-          <w:szCs w:val="44"/>
-          <w:u w:val="single"/>
-        </w:rPr>
-      </w:pPr>
-    </w:p>
-    <w:p>
-      <w:pPr>
-        <w:jc w:val="both"/>
-        <w:rPr>
-          <w:sz w:val="44"/>
-          <w:szCs w:val="44"/>
-          <w:u w:val="single"/>
-        </w:rPr>
-      </w:pPr>
-    </w:p>
-    <w:p>
-      <w:pPr>
-        <w:jc w:val="both"/>
-        <w:rPr>
-          <w:sz w:val="44"/>
-          <w:szCs w:val="44"/>
-          <w:u w:val="single"/>
-        </w:rPr>
-      </w:pPr>
-    </w:p>
-    <w:p>
-      <w:pPr>
-        <w:jc w:val="both"/>
-        <w:rPr>
-          <w:sz w:val="44"/>
-          <w:szCs w:val="44"/>
-          <w:u w:val="single"/>
-        </w:rPr>
-      </w:pPr>
+        <w:pStyle w:val="ListParagraph"/>
+        <w:numPr>
+          <w:ilvl w:val="0"/>
+          <w:numId w:val="12"/>
+        </w:numPr>
+        <w:jc w:val="both"/>
+        <w:rPr>
+          <w:sz w:val="24"/>
+          <w:szCs w:val="24"/>
+          <w:lang w:val="en-US"/>
+        </w:rPr>
+      </w:pPr>
+      <w:r>
+        <w:rPr>
+          <w:sz w:val="24"/>
+          <w:szCs w:val="24"/>
+          <w:lang w:val="en-US"/>
+        </w:rPr>
+        <w:t>Model summary</w:t>
+      </w:r>
+    </w:p>
+    <w:p>
+      <w:pPr>
+        <w:pStyle w:val="ListParagraph"/>
+        <w:jc w:val="both"/>
+        <w:rPr>
+          <w:b/>
+          <w:bCs/>
+          <w:sz w:val="24"/>
+          <w:szCs w:val="24"/>
+          <w:lang w:val="en-US"/>
+        </w:rPr>
+      </w:pPr>
+      <w:r>
+        <w:rPr>
+          <w:b/>
+          <w:bCs/>
+          <w:noProof/>
+          <w:sz w:val="24"/>
+          <w:szCs w:val="24"/>
+          <w:lang w:val="en-US"/>
+        </w:rPr>
+        <w:drawing>
+          <wp:inline distT="0" distB="0" distL="0" distR="0" wp14:anchorId="19523FAC" wp14:editId="383AC89E">
+            <wp:extent cx="4835236" cy="2807073"/>
+            <wp:effectExtent l="0" t="0" r="3810" b="0"/>
+            <wp:docPr id="1339606498" name="Picture 1"/>
+            <wp:cNvGraphicFramePr>
+              <a:graphicFrameLocks xmlns:a="http://schemas.openxmlformats.org/drawingml/2006/main" noChangeAspect="1"/>
+            </wp:cNvGraphicFramePr>
+            <a:graphic xmlns:a="http://schemas.openxmlformats.org/drawingml/2006/main">
+              <a:graphicData uri="http://schemas.openxmlformats.org/drawingml/2006/picture">
+                <pic:pic xmlns:pic="http://schemas.openxmlformats.org/drawingml/2006/picture">
+                  <pic:nvPicPr>
+                    <pic:cNvPr id="1339606498" name=""/>
+                    <pic:cNvPicPr/>
+                  </pic:nvPicPr>
+                  <pic:blipFill>
+                    <a:blip r:embed="rId8"/>
+                    <a:stretch>
+                      <a:fillRect/>
+                    </a:stretch>
+                  </pic:blipFill>
+                  <pic:spPr>
+                    <a:xfrm>
+                      <a:off x="0" y="0"/>
+                      <a:ext cx="4847149" cy="2813989"/>
+                    </a:xfrm>
+                    <a:prstGeom prst="rect">
+                      <a:avLst/>
+                    </a:prstGeom>
+                  </pic:spPr>
+                </pic:pic>
+              </a:graphicData>
+            </a:graphic>
+          </wp:inline>
+        </w:drawing>
+      </w:r>
+    </w:p>
+    <w:p>
+      <w:pPr>
+        <w:pStyle w:val="ListParagraph"/>
+        <w:jc w:val="both"/>
+        <w:rPr>
+          <w:b/>
+          <w:bCs/>
+          <w:sz w:val="24"/>
+          <w:szCs w:val="24"/>
+          <w:lang w:val="en-US"/>
+        </w:rPr>
+      </w:pPr>
+    </w:p>
+    <w:p>
+      <w:pPr>
+        <w:pStyle w:val="ListParagraph"/>
+        <w:numPr>
+          <w:ilvl w:val="0"/>
+          <w:numId w:val="12"/>
+        </w:numPr>
+        <w:jc w:val="both"/>
+        <w:rPr>
+          <w:sz w:val="24"/>
+          <w:szCs w:val="24"/>
+          <w:lang w:val="en-US"/>
+        </w:rPr>
+      </w:pPr>
+      <w:r>
+        <w:rPr>
+          <w:sz w:val="24"/>
+          <w:szCs w:val="24"/>
+          <w:lang w:val="en-US"/>
+        </w:rPr>
+        <w:t>G</w:t>
+      </w:r>
+      <w:r>
+        <w:rPr>
+          <w:sz w:val="24"/>
+          <w:szCs w:val="24"/>
+          <w:lang w:val="en-US"/>
+        </w:rPr>
+        <w:t>raphical representation depicting the train loss and validation loss trends</w:t>
+      </w:r>
+    </w:p>
+    <w:p>
+      <w:pPr>
+        <w:jc w:val="both"/>
+        <w:rPr>
+          <w:sz w:val="44"/>
+          <w:szCs w:val="44"/>
+          <w:u w:val="single"/>
+        </w:rPr>
+      </w:pPr>
+      <w:r>
+        <w:rPr>
+          <w:noProof/>
+          <w:sz w:val="44"/>
+          <w:szCs w:val="44"/>
+          <w:u w:val="single"/>
+        </w:rPr>
+        <w:drawing>
+          <wp:inline distT="0" distB="0" distL="0" distR="0" wp14:anchorId="22DDD893" wp14:editId="27338902">
+            <wp:extent cx="5731510" cy="3695065"/>
+            <wp:effectExtent l="0" t="0" r="2540" b="635"/>
+            <wp:docPr id="2040111739" name="Picture 1"/>
+            <wp:cNvGraphicFramePr>
+              <a:graphicFrameLocks xmlns:a="http://schemas.openxmlformats.org/drawingml/2006/main" noChangeAspect="1"/>
+            </wp:cNvGraphicFramePr>
+            <a:graphic xmlns:a="http://schemas.openxmlformats.org/drawingml/2006/main">
+              <a:graphicData uri="http://schemas.openxmlformats.org/drawingml/2006/picture">
+                <pic:pic xmlns:pic="http://schemas.openxmlformats.org/drawingml/2006/picture">
+                  <pic:nvPicPr>
+                    <pic:cNvPr id="2040111739" name=""/>
+                    <pic:cNvPicPr/>
+                  </pic:nvPicPr>
+                  <pic:blipFill>
+                    <a:blip r:embed="rId9"/>
+                    <a:stretch>
+                      <a:fillRect/>
+                    </a:stretch>
+                  </pic:blipFill>
+                  <pic:spPr>
+                    <a:xfrm>
+                      <a:off x="0" y="0"/>
+                      <a:ext cx="5731510" cy="3695065"/>
+                    </a:xfrm>
+                    <a:prstGeom prst="rect">
+                      <a:avLst/>
+                    </a:prstGeom>
+                  </pic:spPr>
+                </pic:pic>
+              </a:graphicData>
+            </a:graphic>
+          </wp:inline>
+        </w:drawing>
+      </w:r>
+    </w:p>
+    <w:p>
+      <w:pPr>
+        <w:pStyle w:val="ListParagraph"/>
+        <w:numPr>
+          <w:ilvl w:val="0"/>
+          <w:numId w:val="12"/>
+        </w:numPr>
+        <w:jc w:val="both"/>
+        <w:rPr>
+          <w:sz w:val="24"/>
+          <w:szCs w:val="24"/>
+        </w:rPr>
+      </w:pPr>
+      <w:r>
+        <w:rPr>
+          <w:sz w:val="24"/>
+          <w:szCs w:val="24"/>
+        </w:rPr>
+        <w:t>Optimal number of epochs to train the model</w:t>
+      </w:r>
+      <w:r>
+        <w:rPr>
+          <w:sz w:val="24"/>
+          <w:szCs w:val="24"/>
+        </w:rPr>
+        <w:t xml:space="preserve"> </w:t>
+      </w:r>
+      <w:proofErr w:type="gramStart"/>
+      <w:r>
+        <w:rPr>
+          <w:sz w:val="24"/>
+          <w:szCs w:val="24"/>
+        </w:rPr>
+        <w:t>=  5</w:t>
+      </w:r>
+      <w:proofErr w:type="gramEnd"/>
     </w:p>
     <w:p>
       <w:pPr>
@@ -2009,7 +2016,7 @@
                     <pic:cNvPicPr/>
                   </pic:nvPicPr>
                   <pic:blipFill>
-                    <a:blip r:embed="rId7"/>
+                    <a:blip r:embed="rId10"/>
                     <a:stretch>
                       <a:fillRect/>
                     </a:stretch>
@@ -2273,7 +2280,7 @@
                     <pic:cNvPicPr/>
                   </pic:nvPicPr>
                   <pic:blipFill>
-                    <a:blip r:embed="rId8"/>
+                    <a:blip r:embed="rId11"/>
                     <a:stretch>
                       <a:fillRect/>
                     </a:stretch>
@@ -2315,252 +2322,1819 @@
     </w:p>
     <w:p>
       <w:pPr>
-        <w:jc w:val="both"/>
-        <w:rPr>
-          <w:b/>
-          <w:bCs/>
-          <w:sz w:val="24"/>
-          <w:szCs w:val="24"/>
-          <w:lang w:val="en-US"/>
-        </w:rPr>
-      </w:pPr>
-      <w:r>
-        <w:rPr>
-          <w:b/>
-          <w:bCs/>
-          <w:sz w:val="24"/>
-          <w:szCs w:val="24"/>
-          <w:lang w:val="en-US"/>
-        </w:rPr>
-        <w:t>Plot graphs for Accuracy and Loss Function for VGG16 and VGG19</w:t>
-      </w:r>
-    </w:p>
-    <w:p>
-      <w:pPr>
-        <w:jc w:val="both"/>
-        <w:rPr>
-          <w:b/>
-          <w:bCs/>
-          <w:sz w:val="24"/>
-          <w:szCs w:val="24"/>
-        </w:rPr>
-      </w:pPr>
-    </w:p>
-    <w:p>
-      <w:pPr>
-        <w:jc w:val="both"/>
-        <w:rPr>
-          <w:b/>
-          <w:bCs/>
-          <w:sz w:val="24"/>
-          <w:szCs w:val="24"/>
-          <w:lang w:val="en-US"/>
-        </w:rPr>
-      </w:pPr>
-      <w:r>
-        <w:rPr>
-          <w:b/>
-          <w:bCs/>
-          <w:sz w:val="24"/>
-          <w:szCs w:val="24"/>
-          <w:lang w:val="en-US"/>
-        </w:rPr>
-        <w:t>optimal number of epochs for training your VGG16 model.</w:t>
-      </w:r>
-    </w:p>
-    <w:p>
-      <w:pPr>
-        <w:jc w:val="both"/>
-        <w:rPr>
-          <w:b/>
-          <w:bCs/>
-          <w:sz w:val="24"/>
-          <w:szCs w:val="24"/>
-        </w:rPr>
-      </w:pPr>
-    </w:p>
-    <w:p>
-      <w:pPr>
-        <w:jc w:val="both"/>
-        <w:rPr>
-          <w:b/>
-          <w:bCs/>
-          <w:sz w:val="24"/>
-          <w:szCs w:val="24"/>
-          <w:lang w:val="en-US"/>
-        </w:rPr>
-      </w:pPr>
-      <w:r>
-        <w:rPr>
-          <w:b/>
-          <w:bCs/>
-          <w:sz w:val="24"/>
-          <w:szCs w:val="24"/>
-          <w:lang w:val="en-US"/>
-        </w:rPr>
-        <w:t>Add the final Performance Table</w:t>
-      </w:r>
-    </w:p>
-    <w:p>
-      <w:pPr>
-        <w:jc w:val="both"/>
-        <w:rPr>
-          <w:b/>
-          <w:bCs/>
-          <w:sz w:val="24"/>
-          <w:szCs w:val="24"/>
-          <w:lang w:val="en-US"/>
-        </w:rPr>
-      </w:pPr>
-      <w:r>
-        <w:rPr>
-          <w:b/>
-          <w:bCs/>
-          <w:sz w:val="24"/>
-          <w:szCs w:val="24"/>
-          <w:lang w:val="en-US"/>
-        </w:rPr>
-        <w:t>Plot the performance comparing histogram of VGG16 and VGG19</w:t>
-      </w:r>
-    </w:p>
-    <w:p>
-      <w:pPr>
-        <w:jc w:val="both"/>
-        <w:rPr>
-          <w:sz w:val="44"/>
-          <w:szCs w:val="44"/>
-          <w:u w:val="single"/>
-        </w:rPr>
-      </w:pPr>
-    </w:p>
-    <w:p>
-      <w:pPr>
-        <w:jc w:val="both"/>
-        <w:rPr>
-          <w:sz w:val="44"/>
-          <w:szCs w:val="44"/>
-          <w:u w:val="single"/>
-        </w:rPr>
-      </w:pPr>
-      <w:r>
-        <w:rPr>
-          <w:sz w:val="44"/>
-          <w:szCs w:val="44"/>
-          <w:u w:val="single"/>
-        </w:rPr>
+        <w:pStyle w:val="ListParagraph"/>
+        <w:numPr>
+          <w:ilvl w:val="0"/>
+          <w:numId w:val="3"/>
+        </w:numPr>
+        <w:jc w:val="both"/>
+        <w:rPr>
+          <w:b/>
+          <w:bCs/>
+          <w:sz w:val="24"/>
+          <w:szCs w:val="24"/>
+          <w:lang w:val="en-US"/>
+        </w:rPr>
+      </w:pPr>
+    </w:p>
+    <w:p>
+      <w:pPr>
+        <w:pStyle w:val="ListParagraph"/>
+        <w:numPr>
+          <w:ilvl w:val="0"/>
+          <w:numId w:val="4"/>
+        </w:numPr>
+        <w:jc w:val="both"/>
+        <w:rPr>
+          <w:b/>
+          <w:bCs/>
+          <w:sz w:val="24"/>
+          <w:szCs w:val="24"/>
+          <w:lang w:val="en-US"/>
+        </w:rPr>
+      </w:pPr>
+      <w:r>
+        <w:rPr>
+          <w:b/>
+          <w:bCs/>
+          <w:sz w:val="24"/>
+          <w:szCs w:val="24"/>
+          <w:lang w:val="en-US"/>
+        </w:rPr>
+        <w:t>G</w:t>
+      </w:r>
+      <w:r>
+        <w:rPr>
+          <w:b/>
+          <w:bCs/>
+          <w:sz w:val="24"/>
+          <w:szCs w:val="24"/>
+          <w:lang w:val="en-US"/>
+        </w:rPr>
+        <w:t>raphs for Accuracy for VGG16</w:t>
+      </w:r>
+      <w:r>
+        <w:rPr>
+          <w:b/>
+          <w:bCs/>
+          <w:sz w:val="24"/>
+          <w:szCs w:val="24"/>
+          <w:lang w:val="en-US"/>
+        </w:rPr>
+        <w:t xml:space="preserve"> model</w:t>
+      </w:r>
+    </w:p>
+    <w:p>
+      <w:pPr>
+        <w:jc w:val="both"/>
+        <w:rPr>
+          <w:b/>
+          <w:bCs/>
+          <w:sz w:val="24"/>
+          <w:szCs w:val="24"/>
+          <w:lang w:val="en-US"/>
+        </w:rPr>
+      </w:pPr>
+      <w:r>
+        <w:rPr>
+          <w:b/>
+          <w:bCs/>
+          <w:noProof/>
+          <w:sz w:val="24"/>
+          <w:szCs w:val="24"/>
+          <w:lang w:val="en-US"/>
+        </w:rPr>
+        <w:drawing>
+          <wp:inline distT="0" distB="0" distL="0" distR="0" wp14:anchorId="4D663FC0" wp14:editId="6C5C38AD">
+            <wp:extent cx="4218284" cy="3200400"/>
+            <wp:effectExtent l="0" t="0" r="0" b="0"/>
+            <wp:docPr id="1463047120" name="Picture 1"/>
+            <wp:cNvGraphicFramePr>
+              <a:graphicFrameLocks xmlns:a="http://schemas.openxmlformats.org/drawingml/2006/main" noChangeAspect="1"/>
+            </wp:cNvGraphicFramePr>
+            <a:graphic xmlns:a="http://schemas.openxmlformats.org/drawingml/2006/main">
+              <a:graphicData uri="http://schemas.openxmlformats.org/drawingml/2006/picture">
+                <pic:pic xmlns:pic="http://schemas.openxmlformats.org/drawingml/2006/picture">
+                  <pic:nvPicPr>
+                    <pic:cNvPr id="1463047120" name=""/>
+                    <pic:cNvPicPr/>
+                  </pic:nvPicPr>
+                  <pic:blipFill>
+                    <a:blip r:embed="rId12"/>
+                    <a:stretch>
+                      <a:fillRect/>
+                    </a:stretch>
+                  </pic:blipFill>
+                  <pic:spPr>
+                    <a:xfrm>
+                      <a:off x="0" y="0"/>
+                      <a:ext cx="4227269" cy="3207217"/>
+                    </a:xfrm>
+                    <a:prstGeom prst="rect">
+                      <a:avLst/>
+                    </a:prstGeom>
+                  </pic:spPr>
+                </pic:pic>
+              </a:graphicData>
+            </a:graphic>
+          </wp:inline>
+        </w:drawing>
+      </w:r>
+    </w:p>
+    <w:p>
+      <w:pPr>
+        <w:pStyle w:val="ListParagraph"/>
+        <w:numPr>
+          <w:ilvl w:val="0"/>
+          <w:numId w:val="4"/>
+        </w:numPr>
+        <w:jc w:val="both"/>
+        <w:rPr>
+          <w:b/>
+          <w:bCs/>
+          <w:sz w:val="24"/>
+          <w:szCs w:val="24"/>
+          <w:lang w:val="en-US"/>
+        </w:rPr>
+      </w:pPr>
+      <w:r>
+        <w:rPr>
+          <w:b/>
+          <w:bCs/>
+          <w:sz w:val="24"/>
+          <w:szCs w:val="24"/>
+          <w:lang w:val="en-US"/>
+        </w:rPr>
+        <w:t>Graph for loss function for VGG16 model</w:t>
+      </w:r>
+    </w:p>
+    <w:p>
+      <w:pPr>
+        <w:jc w:val="both"/>
+        <w:rPr>
+          <w:b/>
+          <w:bCs/>
+          <w:sz w:val="24"/>
+          <w:szCs w:val="24"/>
+          <w:lang w:val="en-US"/>
+        </w:rPr>
+      </w:pPr>
+      <w:r>
+        <w:rPr>
+          <w:b/>
+          <w:bCs/>
+          <w:noProof/>
+          <w:sz w:val="24"/>
+          <w:szCs w:val="24"/>
+          <w:lang w:val="en-US"/>
+        </w:rPr>
+        <w:drawing>
+          <wp:inline distT="0" distB="0" distL="0" distR="0" wp14:anchorId="528D45A6" wp14:editId="2800217E">
+            <wp:extent cx="3810000" cy="3135462"/>
+            <wp:effectExtent l="0" t="0" r="0" b="8255"/>
+            <wp:docPr id="24094491" name="Picture 1"/>
+            <wp:cNvGraphicFramePr>
+              <a:graphicFrameLocks xmlns:a="http://schemas.openxmlformats.org/drawingml/2006/main" noChangeAspect="1"/>
+            </wp:cNvGraphicFramePr>
+            <a:graphic xmlns:a="http://schemas.openxmlformats.org/drawingml/2006/main">
+              <a:graphicData uri="http://schemas.openxmlformats.org/drawingml/2006/picture">
+                <pic:pic xmlns:pic="http://schemas.openxmlformats.org/drawingml/2006/picture">
+                  <pic:nvPicPr>
+                    <pic:cNvPr id="24094491" name=""/>
+                    <pic:cNvPicPr/>
+                  </pic:nvPicPr>
+                  <pic:blipFill>
+                    <a:blip r:embed="rId13"/>
+                    <a:stretch>
+                      <a:fillRect/>
+                    </a:stretch>
+                  </pic:blipFill>
+                  <pic:spPr>
+                    <a:xfrm>
+                      <a:off x="0" y="0"/>
+                      <a:ext cx="3815601" cy="3140072"/>
+                    </a:xfrm>
+                    <a:prstGeom prst="rect">
+                      <a:avLst/>
+                    </a:prstGeom>
+                  </pic:spPr>
+                </pic:pic>
+              </a:graphicData>
+            </a:graphic>
+          </wp:inline>
+        </w:drawing>
+      </w:r>
+    </w:p>
+    <w:p>
+      <w:pPr>
+        <w:jc w:val="both"/>
+        <w:rPr>
+          <w:b/>
+          <w:bCs/>
+          <w:sz w:val="24"/>
+          <w:szCs w:val="24"/>
+          <w:lang w:val="en-US"/>
+        </w:rPr>
+      </w:pPr>
+    </w:p>
+    <w:p>
+      <w:pPr>
+        <w:jc w:val="both"/>
+        <w:rPr>
+          <w:b/>
+          <w:bCs/>
+          <w:sz w:val="24"/>
+          <w:szCs w:val="24"/>
+          <w:lang w:val="en-US"/>
+        </w:rPr>
+      </w:pPr>
+    </w:p>
+    <w:p>
+      <w:pPr>
+        <w:jc w:val="both"/>
+        <w:rPr>
+          <w:b/>
+          <w:bCs/>
+          <w:sz w:val="24"/>
+          <w:szCs w:val="24"/>
+          <w:lang w:val="en-US"/>
+        </w:rPr>
+      </w:pPr>
+    </w:p>
+    <w:p>
+      <w:pPr>
+        <w:pStyle w:val="ListParagraph"/>
+        <w:numPr>
+          <w:ilvl w:val="0"/>
+          <w:numId w:val="4"/>
+        </w:numPr>
+        <w:jc w:val="both"/>
+        <w:rPr>
+          <w:b/>
+          <w:bCs/>
+          <w:sz w:val="24"/>
+          <w:szCs w:val="24"/>
+          <w:lang w:val="en-US"/>
+        </w:rPr>
+      </w:pPr>
+      <w:r>
+        <w:rPr>
+          <w:b/>
+          <w:bCs/>
+          <w:sz w:val="24"/>
+          <w:szCs w:val="24"/>
+          <w:lang w:val="en-US"/>
+        </w:rPr>
+        <w:lastRenderedPageBreak/>
+        <w:t>Graphs for Accuracy for</w:t>
+      </w:r>
+      <w:r>
+        <w:rPr>
+          <w:b/>
+          <w:bCs/>
+          <w:sz w:val="24"/>
+          <w:szCs w:val="24"/>
+          <w:lang w:val="en-US"/>
+        </w:rPr>
+        <w:t xml:space="preserve"> VGG19</w:t>
+      </w:r>
+      <w:r>
+        <w:rPr>
+          <w:b/>
+          <w:bCs/>
+          <w:sz w:val="24"/>
+          <w:szCs w:val="24"/>
+          <w:lang w:val="en-US"/>
+        </w:rPr>
+        <w:t xml:space="preserve"> model</w:t>
+      </w:r>
+    </w:p>
+    <w:p>
+      <w:pPr>
+        <w:jc w:val="both"/>
+        <w:rPr>
+          <w:b/>
+          <w:bCs/>
+          <w:sz w:val="24"/>
+          <w:szCs w:val="24"/>
+          <w:lang w:val="en-US"/>
+        </w:rPr>
+      </w:pPr>
+      <w:r>
+        <w:rPr>
+          <w:b/>
+          <w:bCs/>
+          <w:noProof/>
+          <w:sz w:val="24"/>
+          <w:szCs w:val="24"/>
+          <w:lang w:val="en-US"/>
+        </w:rPr>
+        <w:drawing>
+          <wp:inline distT="0" distB="0" distL="0" distR="0" wp14:anchorId="537785E7" wp14:editId="3DC46C9A">
+            <wp:extent cx="4468091" cy="3353792"/>
+            <wp:effectExtent l="0" t="0" r="8890" b="0"/>
+            <wp:docPr id="866647758" name="Picture 1"/>
+            <wp:cNvGraphicFramePr>
+              <a:graphicFrameLocks xmlns:a="http://schemas.openxmlformats.org/drawingml/2006/main" noChangeAspect="1"/>
+            </wp:cNvGraphicFramePr>
+            <a:graphic xmlns:a="http://schemas.openxmlformats.org/drawingml/2006/main">
+              <a:graphicData uri="http://schemas.openxmlformats.org/drawingml/2006/picture">
+                <pic:pic xmlns:pic="http://schemas.openxmlformats.org/drawingml/2006/picture">
+                  <pic:nvPicPr>
+                    <pic:cNvPr id="866647758" name=""/>
+                    <pic:cNvPicPr/>
+                  </pic:nvPicPr>
+                  <pic:blipFill>
+                    <a:blip r:embed="rId14"/>
+                    <a:stretch>
+                      <a:fillRect/>
+                    </a:stretch>
+                  </pic:blipFill>
+                  <pic:spPr>
+                    <a:xfrm>
+                      <a:off x="0" y="0"/>
+                      <a:ext cx="4481981" cy="3364218"/>
+                    </a:xfrm>
+                    <a:prstGeom prst="rect">
+                      <a:avLst/>
+                    </a:prstGeom>
+                  </pic:spPr>
+                </pic:pic>
+              </a:graphicData>
+            </a:graphic>
+          </wp:inline>
+        </w:drawing>
+      </w:r>
+    </w:p>
+    <w:p>
+      <w:pPr>
+        <w:pStyle w:val="ListParagraph"/>
+        <w:numPr>
+          <w:ilvl w:val="0"/>
+          <w:numId w:val="4"/>
+        </w:numPr>
+        <w:jc w:val="both"/>
+        <w:rPr>
+          <w:b/>
+          <w:bCs/>
+          <w:sz w:val="24"/>
+          <w:szCs w:val="24"/>
+          <w:lang w:val="en-US"/>
+        </w:rPr>
+      </w:pPr>
+      <w:r>
+        <w:rPr>
+          <w:b/>
+          <w:bCs/>
+          <w:sz w:val="24"/>
+          <w:szCs w:val="24"/>
+          <w:lang w:val="en-US"/>
+        </w:rPr>
+        <w:t>Graph for loss function for VGG19 model</w:t>
+      </w:r>
+    </w:p>
+    <w:p>
+      <w:pPr>
+        <w:jc w:val="both"/>
+        <w:rPr>
+          <w:b/>
+          <w:bCs/>
+          <w:sz w:val="24"/>
+          <w:szCs w:val="24"/>
+          <w:lang w:val="en-US"/>
+        </w:rPr>
+      </w:pPr>
+      <w:r>
+        <w:rPr>
+          <w:b/>
+          <w:bCs/>
+          <w:noProof/>
+          <w:sz w:val="24"/>
+          <w:szCs w:val="24"/>
+          <w:lang w:val="en-US"/>
+        </w:rPr>
+        <w:drawing>
+          <wp:inline distT="0" distB="0" distL="0" distR="0" wp14:anchorId="47FFE22F" wp14:editId="1B606F33">
+            <wp:extent cx="3671919" cy="2964873"/>
+            <wp:effectExtent l="0" t="0" r="5080" b="6985"/>
+            <wp:docPr id="1204069242" name="Picture 1"/>
+            <wp:cNvGraphicFramePr>
+              <a:graphicFrameLocks xmlns:a="http://schemas.openxmlformats.org/drawingml/2006/main" noChangeAspect="1"/>
+            </wp:cNvGraphicFramePr>
+            <a:graphic xmlns:a="http://schemas.openxmlformats.org/drawingml/2006/main">
+              <a:graphicData uri="http://schemas.openxmlformats.org/drawingml/2006/picture">
+                <pic:pic xmlns:pic="http://schemas.openxmlformats.org/drawingml/2006/picture">
+                  <pic:nvPicPr>
+                    <pic:cNvPr id="1204069242" name=""/>
+                    <pic:cNvPicPr/>
+                  </pic:nvPicPr>
+                  <pic:blipFill>
+                    <a:blip r:embed="rId15"/>
+                    <a:stretch>
+                      <a:fillRect/>
+                    </a:stretch>
+                  </pic:blipFill>
+                  <pic:spPr>
+                    <a:xfrm>
+                      <a:off x="0" y="0"/>
+                      <a:ext cx="3682246" cy="2973211"/>
+                    </a:xfrm>
+                    <a:prstGeom prst="rect">
+                      <a:avLst/>
+                    </a:prstGeom>
+                  </pic:spPr>
+                </pic:pic>
+              </a:graphicData>
+            </a:graphic>
+          </wp:inline>
+        </w:drawing>
+      </w:r>
+    </w:p>
+    <w:p>
+      <w:pPr>
+        <w:jc w:val="both"/>
+        <w:rPr>
+          <w:b/>
+          <w:bCs/>
+          <w:sz w:val="24"/>
+          <w:szCs w:val="24"/>
+        </w:rPr>
+      </w:pPr>
+    </w:p>
+    <w:p>
+      <w:pPr>
+        <w:pStyle w:val="ListParagraph"/>
+        <w:numPr>
+          <w:ilvl w:val="0"/>
+          <w:numId w:val="3"/>
+        </w:numPr>
+        <w:jc w:val="both"/>
+        <w:rPr>
+          <w:sz w:val="24"/>
+          <w:szCs w:val="24"/>
+        </w:rPr>
+      </w:pPr>
+      <w:r>
+        <w:rPr>
+          <w:sz w:val="24"/>
+          <w:szCs w:val="24"/>
+        </w:rPr>
+        <w:t xml:space="preserve">Optimal number of epochs for training the VGG16 model is approximately </w:t>
+      </w:r>
+      <w:r>
+        <w:rPr>
+          <w:b/>
+          <w:bCs/>
+          <w:sz w:val="24"/>
+          <w:szCs w:val="24"/>
+        </w:rPr>
+        <w:t>30–35 epochs.</w:t>
+      </w:r>
+    </w:p>
+    <w:p>
+      <w:pPr>
+        <w:jc w:val="both"/>
+        <w:rPr>
+          <w:b/>
+          <w:bCs/>
+          <w:sz w:val="24"/>
+          <w:szCs w:val="24"/>
+        </w:rPr>
+      </w:pPr>
+    </w:p>
+    <w:p>
+      <w:pPr>
+        <w:jc w:val="both"/>
+        <w:rPr>
+          <w:b/>
+          <w:bCs/>
+          <w:sz w:val="24"/>
+          <w:szCs w:val="24"/>
+        </w:rPr>
+      </w:pPr>
+    </w:p>
+    <w:p>
+      <w:pPr>
+        <w:jc w:val="both"/>
+        <w:rPr>
+          <w:b/>
+          <w:bCs/>
+          <w:sz w:val="24"/>
+          <w:szCs w:val="24"/>
+        </w:rPr>
+      </w:pPr>
+    </w:p>
+    <w:p>
+      <w:pPr>
+        <w:pStyle w:val="ListParagraph"/>
+        <w:numPr>
+          <w:ilvl w:val="0"/>
+          <w:numId w:val="3"/>
+        </w:numPr>
+        <w:jc w:val="both"/>
+        <w:rPr>
+          <w:sz w:val="24"/>
+          <w:szCs w:val="24"/>
+          <w:lang w:val="en-US"/>
+        </w:rPr>
+      </w:pPr>
+      <w:r>
+        <w:rPr>
+          <w:sz w:val="24"/>
+          <w:szCs w:val="24"/>
+          <w:lang w:val="en-US"/>
+        </w:rPr>
+        <w:lastRenderedPageBreak/>
+        <w:t>Final</w:t>
+      </w:r>
+      <w:r>
+        <w:rPr>
+          <w:sz w:val="24"/>
+          <w:szCs w:val="24"/>
+          <w:lang w:val="en-US"/>
+        </w:rPr>
+        <w:t xml:space="preserve"> Performance Table</w:t>
+      </w:r>
+    </w:p>
+    <w:p>
+      <w:pPr>
+        <w:pStyle w:val="ListParagraph"/>
+        <w:jc w:val="both"/>
+        <w:rPr>
+          <w:b/>
+          <w:bCs/>
+          <w:sz w:val="24"/>
+          <w:szCs w:val="24"/>
+          <w:lang w:val="en-US"/>
+        </w:rPr>
+      </w:pPr>
+    </w:p>
+    <w:p>
+      <w:pPr>
+        <w:pStyle w:val="ListParagraph"/>
+        <w:jc w:val="both"/>
+        <w:rPr>
+          <w:sz w:val="24"/>
+          <w:szCs w:val="24"/>
+          <w:lang w:val="en-US"/>
+        </w:rPr>
+      </w:pPr>
+      <w:r>
+        <w:rPr>
+          <w:sz w:val="24"/>
+          <w:szCs w:val="24"/>
+          <w:lang w:val="en-US"/>
+        </w:rPr>
+        <w:t>Performance table – VGG16</w:t>
+      </w:r>
+    </w:p>
+    <w:p>
+      <w:pPr>
+        <w:pStyle w:val="ListParagraph"/>
+        <w:jc w:val="both"/>
+        <w:rPr>
+          <w:b/>
+          <w:bCs/>
+          <w:sz w:val="24"/>
+          <w:szCs w:val="24"/>
+          <w:lang w:val="en-US"/>
+        </w:rPr>
+      </w:pPr>
+      <w:r>
+        <w:rPr>
+          <w:b/>
+          <w:bCs/>
+          <w:noProof/>
+          <w:sz w:val="24"/>
+          <w:szCs w:val="24"/>
+          <w:lang w:val="en-US"/>
+        </w:rPr>
+        <w:drawing>
+          <wp:inline distT="0" distB="0" distL="0" distR="0" wp14:anchorId="0FC2EAEC" wp14:editId="4C4C4258">
+            <wp:extent cx="4048224" cy="2680854"/>
+            <wp:effectExtent l="0" t="0" r="0" b="5715"/>
+            <wp:docPr id="1158770417" name="Picture 1"/>
+            <wp:cNvGraphicFramePr>
+              <a:graphicFrameLocks xmlns:a="http://schemas.openxmlformats.org/drawingml/2006/main" noChangeAspect="1"/>
+            </wp:cNvGraphicFramePr>
+            <a:graphic xmlns:a="http://schemas.openxmlformats.org/drawingml/2006/main">
+              <a:graphicData uri="http://schemas.openxmlformats.org/drawingml/2006/picture">
+                <pic:pic xmlns:pic="http://schemas.openxmlformats.org/drawingml/2006/picture">
+                  <pic:nvPicPr>
+                    <pic:cNvPr id="1158770417" name=""/>
+                    <pic:cNvPicPr/>
+                  </pic:nvPicPr>
+                  <pic:blipFill>
+                    <a:blip r:embed="rId16"/>
+                    <a:stretch>
+                      <a:fillRect/>
+                    </a:stretch>
+                  </pic:blipFill>
+                  <pic:spPr>
+                    <a:xfrm>
+                      <a:off x="0" y="0"/>
+                      <a:ext cx="4062652" cy="2690409"/>
+                    </a:xfrm>
+                    <a:prstGeom prst="rect">
+                      <a:avLst/>
+                    </a:prstGeom>
+                  </pic:spPr>
+                </pic:pic>
+              </a:graphicData>
+            </a:graphic>
+          </wp:inline>
+        </w:drawing>
+      </w:r>
+    </w:p>
+    <w:p>
+      <w:pPr>
+        <w:pStyle w:val="ListParagraph"/>
+        <w:jc w:val="both"/>
+        <w:rPr>
+          <w:b/>
+          <w:bCs/>
+          <w:sz w:val="24"/>
+          <w:szCs w:val="24"/>
+          <w:lang w:val="en-US"/>
+        </w:rPr>
+      </w:pPr>
+    </w:p>
+    <w:p>
+      <w:pPr>
+        <w:pStyle w:val="ListParagraph"/>
+        <w:jc w:val="both"/>
+        <w:rPr>
+          <w:sz w:val="24"/>
+          <w:szCs w:val="24"/>
+          <w:lang w:val="en-US"/>
+        </w:rPr>
+      </w:pPr>
+      <w:r>
+        <w:rPr>
+          <w:sz w:val="24"/>
+          <w:szCs w:val="24"/>
+          <w:lang w:val="en-US"/>
+        </w:rPr>
+        <w:t>Performance table – VGG1</w:t>
+      </w:r>
+      <w:r>
+        <w:rPr>
+          <w:sz w:val="24"/>
+          <w:szCs w:val="24"/>
+          <w:lang w:val="en-US"/>
+        </w:rPr>
+        <w:t>9</w:t>
+      </w:r>
+    </w:p>
+    <w:p>
+      <w:pPr>
+        <w:pStyle w:val="ListParagraph"/>
+        <w:jc w:val="both"/>
+        <w:rPr>
+          <w:sz w:val="24"/>
+          <w:szCs w:val="24"/>
+          <w:lang w:val="en-US"/>
+        </w:rPr>
+      </w:pPr>
+      <w:r>
+        <w:rPr>
+          <w:noProof/>
+          <w:sz w:val="24"/>
+          <w:szCs w:val="24"/>
+          <w:lang w:val="en-US"/>
+        </w:rPr>
+        <w:drawing>
+          <wp:inline distT="0" distB="0" distL="0" distR="0" wp14:anchorId="1433AC8C" wp14:editId="127D20BC">
+            <wp:extent cx="4076762" cy="2715491"/>
+            <wp:effectExtent l="0" t="0" r="0" b="8890"/>
+            <wp:docPr id="1475997218" name="Picture 1"/>
+            <wp:cNvGraphicFramePr>
+              <a:graphicFrameLocks xmlns:a="http://schemas.openxmlformats.org/drawingml/2006/main" noChangeAspect="1"/>
+            </wp:cNvGraphicFramePr>
+            <a:graphic xmlns:a="http://schemas.openxmlformats.org/drawingml/2006/main">
+              <a:graphicData uri="http://schemas.openxmlformats.org/drawingml/2006/picture">
+                <pic:pic xmlns:pic="http://schemas.openxmlformats.org/drawingml/2006/picture">
+                  <pic:nvPicPr>
+                    <pic:cNvPr id="1475997218" name=""/>
+                    <pic:cNvPicPr/>
+                  </pic:nvPicPr>
+                  <pic:blipFill>
+                    <a:blip r:embed="rId17"/>
+                    <a:stretch>
+                      <a:fillRect/>
+                    </a:stretch>
+                  </pic:blipFill>
+                  <pic:spPr>
+                    <a:xfrm>
+                      <a:off x="0" y="0"/>
+                      <a:ext cx="4085592" cy="2721373"/>
+                    </a:xfrm>
+                    <a:prstGeom prst="rect">
+                      <a:avLst/>
+                    </a:prstGeom>
+                  </pic:spPr>
+                </pic:pic>
+              </a:graphicData>
+            </a:graphic>
+          </wp:inline>
+        </w:drawing>
+      </w:r>
+    </w:p>
+    <w:p>
+      <w:pPr>
+        <w:pStyle w:val="ListParagraph"/>
+        <w:jc w:val="both"/>
+        <w:rPr>
+          <w:b/>
+          <w:bCs/>
+          <w:sz w:val="24"/>
+          <w:szCs w:val="24"/>
+          <w:lang w:val="en-US"/>
+        </w:rPr>
+      </w:pPr>
+    </w:p>
+    <w:p>
+      <w:pPr>
+        <w:ind w:left="360"/>
+        <w:jc w:val="both"/>
+        <w:rPr>
+          <w:b/>
+          <w:bCs/>
+          <w:sz w:val="24"/>
+          <w:szCs w:val="24"/>
+          <w:lang w:val="en-US"/>
+        </w:rPr>
+      </w:pPr>
+    </w:p>
+    <w:p>
+      <w:pPr>
+        <w:ind w:left="360"/>
+        <w:jc w:val="both"/>
+        <w:rPr>
+          <w:b/>
+          <w:bCs/>
+          <w:sz w:val="24"/>
+          <w:szCs w:val="24"/>
+          <w:lang w:val="en-US"/>
+        </w:rPr>
+      </w:pPr>
+    </w:p>
+    <w:p>
+      <w:pPr>
+        <w:ind w:left="360"/>
+        <w:jc w:val="both"/>
+        <w:rPr>
+          <w:b/>
+          <w:bCs/>
+          <w:sz w:val="24"/>
+          <w:szCs w:val="24"/>
+          <w:lang w:val="en-US"/>
+        </w:rPr>
+      </w:pPr>
+    </w:p>
+    <w:p>
+      <w:pPr>
+        <w:ind w:left="360"/>
+        <w:jc w:val="both"/>
+        <w:rPr>
+          <w:b/>
+          <w:bCs/>
+          <w:sz w:val="24"/>
+          <w:szCs w:val="24"/>
+          <w:lang w:val="en-US"/>
+        </w:rPr>
+      </w:pPr>
+    </w:p>
+    <w:p>
+      <w:pPr>
+        <w:ind w:left="360"/>
+        <w:jc w:val="both"/>
+        <w:rPr>
+          <w:b/>
+          <w:bCs/>
+          <w:sz w:val="24"/>
+          <w:szCs w:val="24"/>
+          <w:lang w:val="en-US"/>
+        </w:rPr>
+      </w:pPr>
+    </w:p>
+    <w:p>
+      <w:pPr>
+        <w:ind w:left="360"/>
+        <w:jc w:val="both"/>
+        <w:rPr>
+          <w:b/>
+          <w:bCs/>
+          <w:sz w:val="24"/>
+          <w:szCs w:val="24"/>
+          <w:lang w:val="en-US"/>
+        </w:rPr>
+      </w:pPr>
+    </w:p>
+    <w:p>
+      <w:pPr>
+        <w:ind w:left="360"/>
+        <w:jc w:val="both"/>
+        <w:rPr>
+          <w:b/>
+          <w:bCs/>
+          <w:sz w:val="24"/>
+          <w:szCs w:val="24"/>
+          <w:lang w:val="en-US"/>
+        </w:rPr>
+      </w:pPr>
+    </w:p>
+    <w:p>
+      <w:pPr>
+        <w:pStyle w:val="ListParagraph"/>
+        <w:numPr>
+          <w:ilvl w:val="0"/>
+          <w:numId w:val="3"/>
+        </w:numPr>
+        <w:jc w:val="both"/>
+        <w:rPr>
+          <w:sz w:val="24"/>
+          <w:szCs w:val="24"/>
+          <w:lang w:val="en-US"/>
+        </w:rPr>
+      </w:pPr>
+      <w:r>
+        <w:rPr>
+          <w:sz w:val="24"/>
+          <w:szCs w:val="24"/>
+          <w:lang w:val="en-US"/>
+        </w:rPr>
+        <w:lastRenderedPageBreak/>
+        <w:t xml:space="preserve">Plot </w:t>
+      </w:r>
+      <w:r>
+        <w:rPr>
+          <w:sz w:val="24"/>
+          <w:szCs w:val="24"/>
+          <w:lang w:val="en-US"/>
+        </w:rPr>
+        <w:t>of the</w:t>
+      </w:r>
+      <w:r>
+        <w:rPr>
+          <w:sz w:val="24"/>
+          <w:szCs w:val="24"/>
+          <w:lang w:val="en-US"/>
+        </w:rPr>
+        <w:t xml:space="preserve"> performance comparing histogram of VGG16 and VGG19</w:t>
+      </w:r>
+    </w:p>
+    <w:p>
+      <w:pPr>
+        <w:pStyle w:val="ListParagraph"/>
+        <w:jc w:val="both"/>
+        <w:rPr>
+          <w:sz w:val="24"/>
+          <w:szCs w:val="24"/>
+          <w:lang w:val="en-US"/>
+        </w:rPr>
+      </w:pPr>
+    </w:p>
+    <w:p>
+      <w:pPr>
+        <w:jc w:val="both"/>
+        <w:rPr>
+          <w:sz w:val="44"/>
+          <w:szCs w:val="44"/>
+          <w:u w:val="single"/>
+        </w:rPr>
+      </w:pPr>
+      <w:r>
+        <w:rPr>
+          <w:noProof/>
+          <w:sz w:val="44"/>
+          <w:szCs w:val="44"/>
+          <w:u w:val="single"/>
+        </w:rPr>
+        <w:drawing>
+          <wp:inline distT="0" distB="0" distL="0" distR="0" wp14:anchorId="7659B8DE" wp14:editId="0782BB87">
+            <wp:extent cx="6219825" cy="3006436"/>
+            <wp:effectExtent l="0" t="0" r="0" b="3810"/>
+            <wp:docPr id="1229608882" name="Picture 1"/>
+            <wp:cNvGraphicFramePr>
+              <a:graphicFrameLocks xmlns:a="http://schemas.openxmlformats.org/drawingml/2006/main" noChangeAspect="1"/>
+            </wp:cNvGraphicFramePr>
+            <a:graphic xmlns:a="http://schemas.openxmlformats.org/drawingml/2006/main">
+              <a:graphicData uri="http://schemas.openxmlformats.org/drawingml/2006/picture">
+                <pic:pic xmlns:pic="http://schemas.openxmlformats.org/drawingml/2006/picture">
+                  <pic:nvPicPr>
+                    <pic:cNvPr id="1229608882" name=""/>
+                    <pic:cNvPicPr/>
+                  </pic:nvPicPr>
+                  <pic:blipFill>
+                    <a:blip r:embed="rId18"/>
+                    <a:stretch>
+                      <a:fillRect/>
+                    </a:stretch>
+                  </pic:blipFill>
+                  <pic:spPr>
+                    <a:xfrm>
+                      <a:off x="0" y="0"/>
+                      <a:ext cx="6253034" cy="3022488"/>
+                    </a:xfrm>
+                    <a:prstGeom prst="rect">
+                      <a:avLst/>
+                    </a:prstGeom>
+                  </pic:spPr>
+                </pic:pic>
+              </a:graphicData>
+            </a:graphic>
+          </wp:inline>
+        </w:drawing>
+      </w:r>
+    </w:p>
+    <w:p>
+      <w:pPr>
+        <w:jc w:val="both"/>
+        <w:rPr>
+          <w:sz w:val="44"/>
+          <w:szCs w:val="44"/>
+          <w:u w:val="single"/>
+        </w:rPr>
+      </w:pPr>
+    </w:p>
+    <w:p>
+      <w:pPr>
+        <w:jc w:val="both"/>
+        <w:rPr>
+          <w:sz w:val="44"/>
+          <w:szCs w:val="44"/>
+          <w:u w:val="single"/>
+        </w:rPr>
+      </w:pPr>
+    </w:p>
+    <w:p>
+      <w:pPr>
+        <w:jc w:val="both"/>
+        <w:rPr>
+          <w:sz w:val="44"/>
+          <w:szCs w:val="44"/>
+          <w:u w:val="single"/>
+        </w:rPr>
+      </w:pPr>
+    </w:p>
+    <w:p>
+      <w:pPr>
+        <w:jc w:val="both"/>
+        <w:rPr>
+          <w:sz w:val="44"/>
+          <w:szCs w:val="44"/>
+          <w:u w:val="single"/>
+        </w:rPr>
+      </w:pPr>
+    </w:p>
+    <w:p>
+      <w:pPr>
+        <w:jc w:val="both"/>
+        <w:rPr>
+          <w:sz w:val="44"/>
+          <w:szCs w:val="44"/>
+          <w:u w:val="single"/>
+        </w:rPr>
+      </w:pPr>
+    </w:p>
+    <w:p>
+      <w:pPr>
+        <w:jc w:val="both"/>
+        <w:rPr>
+          <w:sz w:val="44"/>
+          <w:szCs w:val="44"/>
+          <w:u w:val="single"/>
+        </w:rPr>
+      </w:pPr>
+    </w:p>
+    <w:p>
+      <w:pPr>
+        <w:jc w:val="both"/>
+        <w:rPr>
+          <w:sz w:val="44"/>
+          <w:szCs w:val="44"/>
+          <w:u w:val="single"/>
+        </w:rPr>
+      </w:pPr>
+    </w:p>
+    <w:p>
+      <w:pPr>
+        <w:jc w:val="both"/>
+        <w:rPr>
+          <w:sz w:val="44"/>
+          <w:szCs w:val="44"/>
+          <w:u w:val="single"/>
+        </w:rPr>
+      </w:pPr>
+    </w:p>
+    <w:p>
+      <w:pPr>
+        <w:jc w:val="both"/>
+        <w:rPr>
+          <w:sz w:val="44"/>
+          <w:szCs w:val="44"/>
+          <w:u w:val="single"/>
+        </w:rPr>
+      </w:pPr>
+    </w:p>
+    <w:p>
+      <w:pPr>
+        <w:jc w:val="both"/>
+        <w:rPr>
+          <w:sz w:val="44"/>
+          <w:szCs w:val="44"/>
+          <w:u w:val="single"/>
+        </w:rPr>
+      </w:pPr>
+    </w:p>
+    <w:p>
+      <w:pPr>
+        <w:jc w:val="both"/>
+        <w:rPr>
+          <w:sz w:val="44"/>
+          <w:szCs w:val="44"/>
+          <w:u w:val="single"/>
+        </w:rPr>
+      </w:pPr>
+    </w:p>
+    <w:p>
+      <w:pPr>
+        <w:jc w:val="both"/>
+        <w:rPr>
+          <w:sz w:val="44"/>
+          <w:szCs w:val="44"/>
+          <w:u w:val="single"/>
+        </w:rPr>
+      </w:pPr>
+      <w:r>
+        <w:rPr>
+          <w:sz w:val="44"/>
+          <w:szCs w:val="44"/>
+          <w:u w:val="single"/>
+        </w:rPr>
+        <w:lastRenderedPageBreak/>
         <w:t>Lab 8</w:t>
       </w:r>
     </w:p>
     <w:p>
       <w:pPr>
-        <w:jc w:val="both"/>
-        <w:rPr>
-          <w:sz w:val="44"/>
-          <w:szCs w:val="44"/>
-          <w:u w:val="single"/>
-        </w:rPr>
-      </w:pPr>
-    </w:p>
-    <w:p>
-      <w:pPr>
-        <w:jc w:val="both"/>
-        <w:rPr>
-          <w:sz w:val="44"/>
-          <w:szCs w:val="44"/>
-          <w:u w:val="single"/>
-        </w:rPr>
-      </w:pPr>
-      <w:r>
-        <w:rPr>
-          <w:sz w:val="44"/>
-          <w:szCs w:val="44"/>
-          <w:u w:val="single"/>
-        </w:rPr>
-        <w:t xml:space="preserve">Lab 9 </w:t>
-      </w:r>
-    </w:p>
-    <w:p>
-      <w:pPr>
-        <w:jc w:val="both"/>
-        <w:rPr>
-          <w:sz w:val="44"/>
-          <w:szCs w:val="44"/>
-          <w:u w:val="single"/>
-        </w:rPr>
-      </w:pPr>
-    </w:p>
-    <w:p>
-      <w:pPr>
-        <w:jc w:val="both"/>
-        <w:rPr>
-          <w:sz w:val="44"/>
-          <w:szCs w:val="44"/>
-          <w:u w:val="single"/>
-        </w:rPr>
-      </w:pPr>
-      <w:r>
-        <w:rPr>
-          <w:sz w:val="44"/>
-          <w:szCs w:val="44"/>
-          <w:u w:val="single"/>
-        </w:rPr>
-        <w:t>Lab 10</w:t>
-      </w:r>
-    </w:p>
-    <w:p>
-      <w:pPr>
-        <w:jc w:val="both"/>
-        <w:rPr>
-          <w:sz w:val="44"/>
-          <w:szCs w:val="44"/>
-          <w:u w:val="single"/>
-        </w:rPr>
-      </w:pPr>
-    </w:p>
-    <w:p>
-      <w:pPr>
-        <w:jc w:val="both"/>
-        <w:rPr>
-          <w:sz w:val="44"/>
-          <w:szCs w:val="44"/>
-          <w:u w:val="single"/>
-        </w:rPr>
-      </w:pPr>
-      <w:r>
-        <w:rPr>
-          <w:sz w:val="44"/>
-          <w:szCs w:val="44"/>
-          <w:u w:val="single"/>
-        </w:rPr>
-        <w:t>Lab 11</w:t>
-      </w:r>
-    </w:p>
-    <w:p>
-      <w:pPr>
-        <w:jc w:val="both"/>
-        <w:rPr>
-          <w:sz w:val="44"/>
-          <w:szCs w:val="44"/>
-        </w:rPr>
-      </w:pPr>
-    </w:p>
-    <w:p>
-      <w:pPr>
-        <w:jc w:val="both"/>
-        <w:rPr>
-          <w:sz w:val="44"/>
-          <w:szCs w:val="44"/>
-          <w:u w:val="single"/>
-        </w:rPr>
-      </w:pPr>
-      <w:r>
-        <w:rPr>
-          <w:sz w:val="44"/>
-          <w:szCs w:val="44"/>
-          <w:u w:val="single"/>
-        </w:rPr>
-        <w:t>Lab 12</w:t>
-      </w:r>
+        <w:pStyle w:val="ListParagraph"/>
+        <w:numPr>
+          <w:ilvl w:val="0"/>
+          <w:numId w:val="5"/>
+        </w:numPr>
+        <w:jc w:val="both"/>
+        <w:rPr>
+          <w:sz w:val="24"/>
+          <w:szCs w:val="24"/>
+        </w:rPr>
+      </w:pPr>
+      <w:r>
+        <w:rPr>
+          <w:sz w:val="24"/>
+          <w:szCs w:val="24"/>
+        </w:rPr>
+        <w:t xml:space="preserve">LSTM </w:t>
+      </w:r>
+      <w:proofErr w:type="spellStart"/>
+      <w:r>
+        <w:rPr>
+          <w:sz w:val="24"/>
+          <w:szCs w:val="24"/>
+        </w:rPr>
+        <w:t>Archtecture</w:t>
+      </w:r>
+      <w:proofErr w:type="spellEnd"/>
+      <w:r>
+        <w:rPr>
+          <w:sz w:val="24"/>
+          <w:szCs w:val="24"/>
+        </w:rPr>
+        <w:t xml:space="preserve"> using </w:t>
+      </w:r>
+      <w:proofErr w:type="spellStart"/>
+      <w:proofErr w:type="gramStart"/>
+      <w:r>
+        <w:rPr>
+          <w:sz w:val="24"/>
+          <w:szCs w:val="24"/>
+        </w:rPr>
+        <w:t>model.summary</w:t>
+      </w:r>
+      <w:proofErr w:type="spellEnd"/>
+      <w:proofErr w:type="gramEnd"/>
+      <w:r>
+        <w:rPr>
+          <w:sz w:val="24"/>
+          <w:szCs w:val="24"/>
+        </w:rPr>
+        <w:t>()</w:t>
+      </w:r>
+    </w:p>
+    <w:p>
+      <w:pPr>
+        <w:jc w:val="both"/>
+        <w:rPr>
+          <w:sz w:val="44"/>
+          <w:szCs w:val="44"/>
+          <w:u w:val="single"/>
+        </w:rPr>
+      </w:pPr>
+      <w:r>
+        <w:rPr>
+          <w:noProof/>
+          <w:sz w:val="44"/>
+          <w:szCs w:val="44"/>
+          <w:u w:val="single"/>
+        </w:rPr>
+        <w:drawing>
+          <wp:inline distT="0" distB="0" distL="0" distR="0" wp14:anchorId="02489707" wp14:editId="5095EC21">
+            <wp:extent cx="4017818" cy="1792127"/>
+            <wp:effectExtent l="0" t="0" r="1905" b="0"/>
+            <wp:docPr id="1387222897" name="Picture 1"/>
+            <wp:cNvGraphicFramePr>
+              <a:graphicFrameLocks xmlns:a="http://schemas.openxmlformats.org/drawingml/2006/main" noChangeAspect="1"/>
+            </wp:cNvGraphicFramePr>
+            <a:graphic xmlns:a="http://schemas.openxmlformats.org/drawingml/2006/main">
+              <a:graphicData uri="http://schemas.openxmlformats.org/drawingml/2006/picture">
+                <pic:pic xmlns:pic="http://schemas.openxmlformats.org/drawingml/2006/picture">
+                  <pic:nvPicPr>
+                    <pic:cNvPr id="1387222897" name=""/>
+                    <pic:cNvPicPr/>
+                  </pic:nvPicPr>
+                  <pic:blipFill>
+                    <a:blip r:embed="rId19"/>
+                    <a:stretch>
+                      <a:fillRect/>
+                    </a:stretch>
+                  </pic:blipFill>
+                  <pic:spPr>
+                    <a:xfrm>
+                      <a:off x="0" y="0"/>
+                      <a:ext cx="4030827" cy="1797930"/>
+                    </a:xfrm>
+                    <a:prstGeom prst="rect">
+                      <a:avLst/>
+                    </a:prstGeom>
+                  </pic:spPr>
+                </pic:pic>
+              </a:graphicData>
+            </a:graphic>
+          </wp:inline>
+        </w:drawing>
+      </w:r>
+    </w:p>
+    <w:p>
+      <w:pPr>
+        <w:pStyle w:val="ListParagraph"/>
+        <w:numPr>
+          <w:ilvl w:val="0"/>
+          <w:numId w:val="5"/>
+        </w:numPr>
+        <w:jc w:val="both"/>
+        <w:rPr>
+          <w:sz w:val="24"/>
+          <w:szCs w:val="24"/>
+        </w:rPr>
+      </w:pPr>
+      <w:r>
+        <w:rPr>
+          <w:sz w:val="24"/>
+          <w:szCs w:val="24"/>
+        </w:rPr>
+        <w:t xml:space="preserve">Code and training result using </w:t>
+      </w:r>
+      <w:proofErr w:type="spellStart"/>
+      <w:proofErr w:type="gramStart"/>
+      <w:r>
+        <w:rPr>
+          <w:sz w:val="24"/>
+          <w:szCs w:val="24"/>
+        </w:rPr>
+        <w:t>model.fit</w:t>
+      </w:r>
+      <w:proofErr w:type="spellEnd"/>
+      <w:r>
+        <w:rPr>
+          <w:sz w:val="24"/>
+          <w:szCs w:val="24"/>
+        </w:rPr>
+        <w:t>(</w:t>
+      </w:r>
+      <w:proofErr w:type="gramEnd"/>
+      <w:r>
+        <w:rPr>
+          <w:sz w:val="24"/>
+          <w:szCs w:val="24"/>
+        </w:rPr>
+        <w:t>)</w:t>
+      </w:r>
+    </w:p>
+    <w:p>
+      <w:pPr>
+        <w:pStyle w:val="ListParagraph"/>
+        <w:ind w:left="924"/>
+        <w:jc w:val="both"/>
+        <w:rPr>
+          <w:sz w:val="24"/>
+          <w:szCs w:val="24"/>
+        </w:rPr>
+      </w:pPr>
+    </w:p>
+    <w:p>
+      <w:pPr>
+        <w:pStyle w:val="ListParagraph"/>
+        <w:numPr>
+          <w:ilvl w:val="0"/>
+          <w:numId w:val="6"/>
+        </w:numPr>
+        <w:jc w:val="both"/>
+        <w:rPr>
+          <w:b/>
+          <w:bCs/>
+          <w:sz w:val="24"/>
+          <w:szCs w:val="24"/>
+        </w:rPr>
+      </w:pPr>
+      <w:r>
+        <w:rPr>
+          <w:b/>
+          <w:bCs/>
+          <w:sz w:val="24"/>
+          <w:szCs w:val="24"/>
+        </w:rPr>
+        <w:t>C</w:t>
+      </w:r>
+      <w:r>
+        <w:rPr>
+          <w:b/>
+          <w:bCs/>
+          <w:sz w:val="24"/>
+          <w:szCs w:val="24"/>
+        </w:rPr>
+        <w:t>ode</w:t>
+      </w:r>
+    </w:p>
+    <w:p>
+      <w:pPr>
+        <w:spacing w:line="240" w:lineRule="auto"/>
+        <w:jc w:val="both"/>
+        <w:rPr>
+          <w:sz w:val="20"/>
+          <w:szCs w:val="20"/>
+        </w:rPr>
+      </w:pPr>
+      <w:r>
+        <w:rPr>
+          <w:sz w:val="20"/>
+          <w:szCs w:val="20"/>
+        </w:rPr>
+        <w:t xml:space="preserve">history2 = </w:t>
+      </w:r>
+      <w:proofErr w:type="gramStart"/>
+      <w:r>
+        <w:rPr>
+          <w:sz w:val="20"/>
+          <w:szCs w:val="20"/>
+        </w:rPr>
+        <w:t>model2.fit(</w:t>
+      </w:r>
+      <w:proofErr w:type="gramEnd"/>
+    </w:p>
+    <w:p>
+      <w:pPr>
+        <w:spacing w:line="240" w:lineRule="auto"/>
+        <w:jc w:val="both"/>
+        <w:rPr>
+          <w:sz w:val="20"/>
+          <w:szCs w:val="20"/>
+        </w:rPr>
+      </w:pPr>
+      <w:r>
+        <w:rPr>
+          <w:sz w:val="20"/>
+          <w:szCs w:val="20"/>
+        </w:rPr>
+        <w:t xml:space="preserve">    </w:t>
+      </w:r>
+      <w:proofErr w:type="spellStart"/>
+      <w:r>
+        <w:rPr>
+          <w:sz w:val="20"/>
+          <w:szCs w:val="20"/>
+        </w:rPr>
+        <w:t>X_train</w:t>
+      </w:r>
+      <w:proofErr w:type="spellEnd"/>
+      <w:r>
+        <w:rPr>
+          <w:sz w:val="20"/>
+          <w:szCs w:val="20"/>
+        </w:rPr>
+        <w:t xml:space="preserve">, </w:t>
+      </w:r>
+      <w:proofErr w:type="spellStart"/>
+      <w:r>
+        <w:rPr>
+          <w:sz w:val="20"/>
+          <w:szCs w:val="20"/>
+        </w:rPr>
+        <w:t>y_train</w:t>
+      </w:r>
+      <w:proofErr w:type="spellEnd"/>
+      <w:r>
+        <w:rPr>
+          <w:sz w:val="20"/>
+          <w:szCs w:val="20"/>
+        </w:rPr>
+        <w:t>,</w:t>
+      </w:r>
+    </w:p>
+    <w:p>
+      <w:pPr>
+        <w:spacing w:line="240" w:lineRule="auto"/>
+        <w:jc w:val="both"/>
+        <w:rPr>
+          <w:sz w:val="20"/>
+          <w:szCs w:val="20"/>
+        </w:rPr>
+      </w:pPr>
+      <w:r>
+        <w:rPr>
+          <w:sz w:val="20"/>
+          <w:szCs w:val="20"/>
+        </w:rPr>
+        <w:t xml:space="preserve">    </w:t>
+      </w:r>
+      <w:proofErr w:type="spellStart"/>
+      <w:r>
+        <w:rPr>
+          <w:sz w:val="20"/>
+          <w:szCs w:val="20"/>
+        </w:rPr>
+        <w:t>validation_data</w:t>
+      </w:r>
+      <w:proofErr w:type="spellEnd"/>
+      <w:proofErr w:type="gramStart"/>
+      <w:r>
+        <w:rPr>
+          <w:sz w:val="20"/>
+          <w:szCs w:val="20"/>
+        </w:rPr>
+        <w:t>=(</w:t>
+      </w:r>
+      <w:proofErr w:type="spellStart"/>
+      <w:proofErr w:type="gramEnd"/>
+      <w:r>
+        <w:rPr>
+          <w:sz w:val="20"/>
+          <w:szCs w:val="20"/>
+        </w:rPr>
+        <w:t>X_test</w:t>
+      </w:r>
+      <w:proofErr w:type="spellEnd"/>
+      <w:r>
+        <w:rPr>
+          <w:sz w:val="20"/>
+          <w:szCs w:val="20"/>
+        </w:rPr>
+        <w:t xml:space="preserve">, </w:t>
+      </w:r>
+      <w:proofErr w:type="spellStart"/>
+      <w:r>
+        <w:rPr>
+          <w:sz w:val="20"/>
+          <w:szCs w:val="20"/>
+        </w:rPr>
+        <w:t>y_test</w:t>
+      </w:r>
+      <w:proofErr w:type="spellEnd"/>
+      <w:r>
+        <w:rPr>
+          <w:sz w:val="20"/>
+          <w:szCs w:val="20"/>
+        </w:rPr>
+        <w:t>),</w:t>
+      </w:r>
+    </w:p>
+    <w:p>
+      <w:pPr>
+        <w:spacing w:line="240" w:lineRule="auto"/>
+        <w:jc w:val="both"/>
+        <w:rPr>
+          <w:sz w:val="20"/>
+          <w:szCs w:val="20"/>
+        </w:rPr>
+      </w:pPr>
+      <w:r>
+        <w:rPr>
+          <w:sz w:val="20"/>
+          <w:szCs w:val="20"/>
+        </w:rPr>
+        <w:t xml:space="preserve">    epochs=10,</w:t>
+      </w:r>
+    </w:p>
+    <w:p>
+      <w:pPr>
+        <w:spacing w:line="240" w:lineRule="auto"/>
+        <w:jc w:val="both"/>
+        <w:rPr>
+          <w:sz w:val="20"/>
+          <w:szCs w:val="20"/>
+        </w:rPr>
+      </w:pPr>
+      <w:r>
+        <w:rPr>
+          <w:sz w:val="20"/>
+          <w:szCs w:val="20"/>
+        </w:rPr>
+        <w:t xml:space="preserve">    callbacks=[</w:t>
+      </w:r>
+      <w:proofErr w:type="spellStart"/>
+      <w:r>
+        <w:rPr>
+          <w:sz w:val="20"/>
+          <w:szCs w:val="20"/>
+        </w:rPr>
+        <w:t>early_stopping</w:t>
+      </w:r>
+      <w:proofErr w:type="spellEnd"/>
+      <w:r>
+        <w:rPr>
+          <w:sz w:val="20"/>
+          <w:szCs w:val="20"/>
+        </w:rPr>
+        <w:t>],</w:t>
+      </w:r>
+    </w:p>
+    <w:p>
+      <w:pPr>
+        <w:spacing w:line="240" w:lineRule="auto"/>
+        <w:jc w:val="both"/>
+        <w:rPr>
+          <w:sz w:val="20"/>
+          <w:szCs w:val="20"/>
+        </w:rPr>
+      </w:pPr>
+      <w:r>
+        <w:rPr>
+          <w:sz w:val="20"/>
+          <w:szCs w:val="20"/>
+        </w:rPr>
+        <w:t xml:space="preserve">    verbose=1</w:t>
+      </w:r>
+    </w:p>
+    <w:p>
+      <w:pPr>
+        <w:spacing w:line="240" w:lineRule="auto"/>
+        <w:jc w:val="both"/>
+        <w:rPr>
+          <w:sz w:val="20"/>
+          <w:szCs w:val="20"/>
+        </w:rPr>
+      </w:pPr>
+      <w:r>
+        <w:rPr>
+          <w:sz w:val="20"/>
+          <w:szCs w:val="20"/>
+        </w:rPr>
+        <w:t>)</w:t>
+      </w:r>
+    </w:p>
+    <w:p>
+      <w:pPr>
+        <w:pStyle w:val="ListParagraph"/>
+        <w:numPr>
+          <w:ilvl w:val="0"/>
+          <w:numId w:val="6"/>
+        </w:numPr>
+        <w:jc w:val="both"/>
+        <w:rPr>
+          <w:b/>
+          <w:bCs/>
+          <w:sz w:val="24"/>
+          <w:szCs w:val="24"/>
+        </w:rPr>
+      </w:pPr>
+      <w:r>
+        <w:rPr>
+          <w:b/>
+          <w:bCs/>
+          <w:sz w:val="24"/>
+          <w:szCs w:val="24"/>
+        </w:rPr>
+        <w:t>Result</w:t>
+      </w:r>
+    </w:p>
+    <w:p>
+      <w:pPr>
+        <w:jc w:val="both"/>
+        <w:rPr>
+          <w:sz w:val="44"/>
+          <w:szCs w:val="44"/>
+          <w:u w:val="single"/>
+        </w:rPr>
+      </w:pPr>
+      <w:r>
+        <w:rPr>
+          <w:noProof/>
+          <w:sz w:val="44"/>
+          <w:szCs w:val="44"/>
+          <w:u w:val="single"/>
+        </w:rPr>
+        <w:drawing>
+          <wp:inline distT="0" distB="0" distL="0" distR="0" wp14:anchorId="406AD4FB" wp14:editId="63B1646E">
+            <wp:extent cx="5731510" cy="2744470"/>
+            <wp:effectExtent l="0" t="0" r="2540" b="0"/>
+            <wp:docPr id="1953702596" name="Picture 1"/>
+            <wp:cNvGraphicFramePr>
+              <a:graphicFrameLocks xmlns:a="http://schemas.openxmlformats.org/drawingml/2006/main" noChangeAspect="1"/>
+            </wp:cNvGraphicFramePr>
+            <a:graphic xmlns:a="http://schemas.openxmlformats.org/drawingml/2006/main">
+              <a:graphicData uri="http://schemas.openxmlformats.org/drawingml/2006/picture">
+                <pic:pic xmlns:pic="http://schemas.openxmlformats.org/drawingml/2006/picture">
+                  <pic:nvPicPr>
+                    <pic:cNvPr id="1953702596" name=""/>
+                    <pic:cNvPicPr/>
+                  </pic:nvPicPr>
+                  <pic:blipFill>
+                    <a:blip r:embed="rId20"/>
+                    <a:stretch>
+                      <a:fillRect/>
+                    </a:stretch>
+                  </pic:blipFill>
+                  <pic:spPr>
+                    <a:xfrm>
+                      <a:off x="0" y="0"/>
+                      <a:ext cx="5731510" cy="2744470"/>
+                    </a:xfrm>
+                    <a:prstGeom prst="rect">
+                      <a:avLst/>
+                    </a:prstGeom>
+                  </pic:spPr>
+                </pic:pic>
+              </a:graphicData>
+            </a:graphic>
+          </wp:inline>
+        </w:drawing>
+      </w:r>
+    </w:p>
+    <w:p>
+      <w:pPr>
+        <w:jc w:val="both"/>
+        <w:rPr>
+          <w:sz w:val="44"/>
+          <w:szCs w:val="44"/>
+          <w:u w:val="single"/>
+        </w:rPr>
+      </w:pPr>
+    </w:p>
+    <w:p>
+      <w:pPr>
+        <w:pStyle w:val="ListParagraph"/>
+        <w:numPr>
+          <w:ilvl w:val="0"/>
+          <w:numId w:val="5"/>
+        </w:numPr>
+        <w:jc w:val="both"/>
+        <w:rPr>
+          <w:sz w:val="24"/>
+          <w:szCs w:val="24"/>
+        </w:rPr>
+      </w:pPr>
+      <w:r>
+        <w:rPr>
+          <w:sz w:val="24"/>
+          <w:szCs w:val="24"/>
+        </w:rPr>
+        <w:lastRenderedPageBreak/>
+        <w:t>R</w:t>
+      </w:r>
+      <w:r>
+        <w:rPr>
+          <w:sz w:val="24"/>
+          <w:szCs w:val="24"/>
+        </w:rPr>
+        <w:t>esulting test MSE &amp; MAE</w:t>
+      </w:r>
+    </w:p>
+    <w:p>
+      <w:pPr>
+        <w:jc w:val="both"/>
+        <w:rPr>
+          <w:sz w:val="44"/>
+          <w:szCs w:val="44"/>
+          <w:u w:val="single"/>
+        </w:rPr>
+      </w:pPr>
+      <w:r>
+        <w:rPr>
+          <w:noProof/>
+          <w:sz w:val="44"/>
+          <w:szCs w:val="44"/>
+          <w:u w:val="single"/>
+        </w:rPr>
+        <w:drawing>
+          <wp:inline distT="0" distB="0" distL="0" distR="0" wp14:anchorId="31ED7606" wp14:editId="7DD58870">
+            <wp:extent cx="3362794" cy="590632"/>
+            <wp:effectExtent l="0" t="0" r="9525" b="0"/>
+            <wp:docPr id="868922651" name="Picture 1"/>
+            <wp:cNvGraphicFramePr>
+              <a:graphicFrameLocks xmlns:a="http://schemas.openxmlformats.org/drawingml/2006/main" noChangeAspect="1"/>
+            </wp:cNvGraphicFramePr>
+            <a:graphic xmlns:a="http://schemas.openxmlformats.org/drawingml/2006/main">
+              <a:graphicData uri="http://schemas.openxmlformats.org/drawingml/2006/picture">
+                <pic:pic xmlns:pic="http://schemas.openxmlformats.org/drawingml/2006/picture">
+                  <pic:nvPicPr>
+                    <pic:cNvPr id="868922651" name=""/>
+                    <pic:cNvPicPr/>
+                  </pic:nvPicPr>
+                  <pic:blipFill>
+                    <a:blip r:embed="rId21"/>
+                    <a:stretch>
+                      <a:fillRect/>
+                    </a:stretch>
+                  </pic:blipFill>
+                  <pic:spPr>
+                    <a:xfrm>
+                      <a:off x="0" y="0"/>
+                      <a:ext cx="3362794" cy="590632"/>
+                    </a:xfrm>
+                    <a:prstGeom prst="rect">
+                      <a:avLst/>
+                    </a:prstGeom>
+                  </pic:spPr>
+                </pic:pic>
+              </a:graphicData>
+            </a:graphic>
+          </wp:inline>
+        </w:drawing>
+      </w:r>
+    </w:p>
+    <w:p>
+      <w:pPr>
+        <w:jc w:val="both"/>
+        <w:rPr>
+          <w:sz w:val="44"/>
+          <w:szCs w:val="44"/>
+          <w:u w:val="single"/>
+        </w:rPr>
+      </w:pPr>
+    </w:p>
+    <w:p>
+      <w:pPr>
+        <w:pStyle w:val="ListParagraph"/>
+        <w:numPr>
+          <w:ilvl w:val="0"/>
+          <w:numId w:val="5"/>
+        </w:numPr>
+        <w:jc w:val="both"/>
+        <w:rPr>
+          <w:sz w:val="24"/>
+          <w:szCs w:val="24"/>
+        </w:rPr>
+      </w:pPr>
+      <w:r>
+        <w:rPr>
+          <w:sz w:val="24"/>
+          <w:szCs w:val="24"/>
+        </w:rPr>
+        <w:t>MAE detailed graph</w:t>
+      </w:r>
+    </w:p>
+    <w:p>
+      <w:pPr>
+        <w:jc w:val="both"/>
+        <w:rPr>
+          <w:sz w:val="44"/>
+          <w:szCs w:val="44"/>
+          <w:u w:val="single"/>
+        </w:rPr>
+      </w:pPr>
+    </w:p>
+    <w:p>
+      <w:pPr>
+        <w:jc w:val="both"/>
+        <w:rPr>
+          <w:sz w:val="44"/>
+          <w:szCs w:val="44"/>
+          <w:u w:val="single"/>
+        </w:rPr>
+      </w:pPr>
+      <w:r>
+        <w:rPr>
+          <w:noProof/>
+          <w:sz w:val="44"/>
+          <w:szCs w:val="44"/>
+          <w:u w:val="single"/>
+        </w:rPr>
+        <w:drawing>
+          <wp:inline distT="0" distB="0" distL="0" distR="0" wp14:anchorId="7BF12301" wp14:editId="67B69216">
+            <wp:extent cx="5939701" cy="2722418"/>
+            <wp:effectExtent l="0" t="0" r="4445" b="1905"/>
+            <wp:docPr id="832424449" name="Picture 1"/>
+            <wp:cNvGraphicFramePr>
+              <a:graphicFrameLocks xmlns:a="http://schemas.openxmlformats.org/drawingml/2006/main" noChangeAspect="1"/>
+            </wp:cNvGraphicFramePr>
+            <a:graphic xmlns:a="http://schemas.openxmlformats.org/drawingml/2006/main">
+              <a:graphicData uri="http://schemas.openxmlformats.org/drawingml/2006/picture">
+                <pic:pic xmlns:pic="http://schemas.openxmlformats.org/drawingml/2006/picture">
+                  <pic:nvPicPr>
+                    <pic:cNvPr id="832424449" name=""/>
+                    <pic:cNvPicPr/>
+                  </pic:nvPicPr>
+                  <pic:blipFill>
+                    <a:blip r:embed="rId22"/>
+                    <a:stretch>
+                      <a:fillRect/>
+                    </a:stretch>
+                  </pic:blipFill>
+                  <pic:spPr>
+                    <a:xfrm>
+                      <a:off x="0" y="0"/>
+                      <a:ext cx="5943186" cy="2724015"/>
+                    </a:xfrm>
+                    <a:prstGeom prst="rect">
+                      <a:avLst/>
+                    </a:prstGeom>
+                  </pic:spPr>
+                </pic:pic>
+              </a:graphicData>
+            </a:graphic>
+          </wp:inline>
+        </w:drawing>
+      </w:r>
+    </w:p>
+    <w:p>
+      <w:pPr>
+        <w:jc w:val="both"/>
+        <w:rPr>
+          <w:sz w:val="44"/>
+          <w:szCs w:val="44"/>
+          <w:u w:val="single"/>
+        </w:rPr>
+      </w:pPr>
+    </w:p>
+    <w:p>
+      <w:pPr>
+        <w:jc w:val="both"/>
+        <w:rPr>
+          <w:sz w:val="44"/>
+          <w:szCs w:val="44"/>
+          <w:u w:val="single"/>
+        </w:rPr>
+      </w:pPr>
+    </w:p>
+    <w:p>
+      <w:pPr>
+        <w:jc w:val="both"/>
+        <w:rPr>
+          <w:sz w:val="44"/>
+          <w:szCs w:val="44"/>
+          <w:u w:val="single"/>
+        </w:rPr>
+      </w:pPr>
+    </w:p>
+    <w:p>
+      <w:pPr>
+        <w:jc w:val="both"/>
+        <w:rPr>
+          <w:sz w:val="44"/>
+          <w:szCs w:val="44"/>
+          <w:u w:val="single"/>
+        </w:rPr>
+      </w:pPr>
+    </w:p>
+    <w:p>
+      <w:pPr>
+        <w:jc w:val="both"/>
+        <w:rPr>
+          <w:sz w:val="44"/>
+          <w:szCs w:val="44"/>
+          <w:u w:val="single"/>
+        </w:rPr>
+      </w:pPr>
+    </w:p>
+    <w:p>
+      <w:pPr>
+        <w:jc w:val="both"/>
+        <w:rPr>
+          <w:sz w:val="44"/>
+          <w:szCs w:val="44"/>
+          <w:u w:val="single"/>
+        </w:rPr>
+      </w:pPr>
+    </w:p>
+    <w:p>
+      <w:pPr>
+        <w:jc w:val="both"/>
+        <w:rPr>
+          <w:sz w:val="44"/>
+          <w:szCs w:val="44"/>
+          <w:u w:val="single"/>
+        </w:rPr>
+      </w:pPr>
     </w:p>
     <w:sectPr>
       <w:pgSz w:w="11906" w:h="16838"/>
@@ -2575,6 +4149,189 @@
 <file path=word/numbering.xml><?xml version="1.0" encoding="utf-8"?>
 <w:numbering xmlns:wpc="http://schemas.microsoft.com/office/word/2010/wordprocessingCanvas" xmlns:cx="http://schemas.microsoft.com/office/drawing/2014/chartex" xmlns:cx1="http://schemas.microsoft.com/office/drawing/2015/9/8/chartex" xmlns:cx2="http://schemas.microsoft.com/office/drawing/2015/10/21/chartex" xmlns:cx3="http://schemas.microsoft.com/office/drawing/2016/5/9/chartex" xmlns:cx4="http://schemas.microsoft.com/office/drawing/2016/5/10/chartex" xmlns:cx5="http://schemas.microsoft.com/office/drawing/2016/5/11/chartex" xmlns:cx6="http://schemas.microsoft.com/office/drawing/2016/5/12/chartex" xmlns:cx7="http://schemas.microsoft.com/office/drawing/2016/5/13/chartex" xmlns:cx8="http://schemas.microsoft.com/office/drawing/2016/5/14/chartex" xmlns:mc="http://schemas.openxmlformats.org/markup-compatibility/2006" xmlns:aink="http://schemas.microsoft.com/office/drawing/2016/ink" xmlns:am3d="http://schemas.microsoft.com/office/drawing/2017/model3d" xmlns:o="urn:schemas-microsoft-com:office:office" xmlns:oel="http://schemas.microsoft.com/office/2019/extlst" xmlns:r="http://schemas.openxmlformats.org/officeDocument/2006/relationships" xmlns:m="http://schemas.openxmlformats.org/officeDocument/2006/math" xmlns:v="urn:schemas-microsoft-com:vml" xmlns:wp14="http://schemas.microsoft.com/office/word/2010/wordprocessingDrawing" xmlns:wp="http://schemas.openxmlformats.org/drawingml/2006/wordprocessingDrawing" xmlns:w10="urn:schemas-microsoft-com:office:word" xmlns:w="http://schemas.openxmlformats.org/wordprocessingml/2006/main" xmlns:w14="http://schemas.microsoft.com/office/word/2010/wordml" xmlns:w15="http://schemas.microsoft.com/office/word/2012/wordml" xmlns:w16cex="http://schemas.microsoft.com/office/word/2018/wordml/cex" xmlns:w16cid="http://schemas.microsoft.com/office/word/2016/wordml/cid" xmlns:w16="http://schemas.microsoft.com/office/word/2018/wordml" xmlns:w16du="http://schemas.microsoft.com/office/word/2023/wordml/word16du" xmlns:w16sdtdh="http://schemas.microsoft.com/office/word/2020/wordml/sdtdatahash" xmlns:w16sdtfl="http://schemas.microsoft.com/office/word/2024/wordml/sdtformatlock" xmlns:w16se="http://schemas.microsoft.com/office/word/2015/wordml/symex" xmlns:wpg="http://schemas.microsoft.com/office/word/2010/wordprocessingGroup" xmlns:wpi="http://schemas.microsoft.com/office/word/2010/wordprocessingInk" xmlns:wne="http://schemas.microsoft.com/office/word/2006/wordml" xmlns:wps="http://schemas.microsoft.com/office/word/2010/wordprocessingShape" mc:Ignorable="w14 w15 w16se w16cid w16 w16cex w16sdtdh w16sdtfl w16du wp14">
   <w:abstractNum w:abstractNumId="0" w15:restartNumberingAfterBreak="0">
+    <w:nsid w:val="1170368D"/>
+    <w:multiLevelType w:val="hybridMultilevel"/>
+    <w:tmpl w:val="67F20482"/>
+    <w:lvl w:ilvl="0" w:tplc="343421AE">
+      <w:start w:val="1"/>
+      <w:numFmt w:val="decimalZero"/>
+      <w:lvlText w:val="%1."/>
+      <w:lvlJc w:val="left"/>
+      <w:pPr>
+        <w:ind w:left="924" w:hanging="564"/>
+      </w:pPr>
+      <w:rPr>
+        <w:rFonts w:hint="default"/>
+        <w:b w:val="0"/>
+        <w:bCs/>
+        <w:sz w:val="24"/>
+        <w:szCs w:val="24"/>
+        <w:u w:val="none"/>
+      </w:rPr>
+    </w:lvl>
+    <w:lvl w:ilvl="1" w:tplc="04090019" w:tentative="1">
+      <w:start w:val="1"/>
+      <w:numFmt w:val="lowerLetter"/>
+      <w:lvlText w:val="%2."/>
+      <w:lvlJc w:val="left"/>
+      <w:pPr>
+        <w:ind w:left="1440" w:hanging="360"/>
+      </w:pPr>
+    </w:lvl>
+    <w:lvl w:ilvl="2" w:tplc="0409001B" w:tentative="1">
+      <w:start w:val="1"/>
+      <w:numFmt w:val="lowerRoman"/>
+      <w:lvlText w:val="%3."/>
+      <w:lvlJc w:val="right"/>
+      <w:pPr>
+        <w:ind w:left="2160" w:hanging="180"/>
+      </w:pPr>
+    </w:lvl>
+    <w:lvl w:ilvl="3" w:tplc="0409000F" w:tentative="1">
+      <w:start w:val="1"/>
+      <w:numFmt w:val="decimal"/>
+      <w:lvlText w:val="%4."/>
+      <w:lvlJc w:val="left"/>
+      <w:pPr>
+        <w:ind w:left="2880" w:hanging="360"/>
+      </w:pPr>
+    </w:lvl>
+    <w:lvl w:ilvl="4" w:tplc="04090019" w:tentative="1">
+      <w:start w:val="1"/>
+      <w:numFmt w:val="lowerLetter"/>
+      <w:lvlText w:val="%5."/>
+      <w:lvlJc w:val="left"/>
+      <w:pPr>
+        <w:ind w:left="3600" w:hanging="360"/>
+      </w:pPr>
+    </w:lvl>
+    <w:lvl w:ilvl="5" w:tplc="0409001B" w:tentative="1">
+      <w:start w:val="1"/>
+      <w:numFmt w:val="lowerRoman"/>
+      <w:lvlText w:val="%6."/>
+      <w:lvlJc w:val="right"/>
+      <w:pPr>
+        <w:ind w:left="4320" w:hanging="180"/>
+      </w:pPr>
+    </w:lvl>
+    <w:lvl w:ilvl="6" w:tplc="0409000F" w:tentative="1">
+      <w:start w:val="1"/>
+      <w:numFmt w:val="decimal"/>
+      <w:lvlText w:val="%7."/>
+      <w:lvlJc w:val="left"/>
+      <w:pPr>
+        <w:ind w:left="5040" w:hanging="360"/>
+      </w:pPr>
+    </w:lvl>
+    <w:lvl w:ilvl="7" w:tplc="04090019" w:tentative="1">
+      <w:start w:val="1"/>
+      <w:numFmt w:val="lowerLetter"/>
+      <w:lvlText w:val="%8."/>
+      <w:lvlJc w:val="left"/>
+      <w:pPr>
+        <w:ind w:left="5760" w:hanging="360"/>
+      </w:pPr>
+    </w:lvl>
+    <w:lvl w:ilvl="8" w:tplc="0409001B" w:tentative="1">
+      <w:start w:val="1"/>
+      <w:numFmt w:val="lowerRoman"/>
+      <w:lvlText w:val="%9."/>
+      <w:lvlJc w:val="right"/>
+      <w:pPr>
+        <w:ind w:left="6480" w:hanging="180"/>
+      </w:pPr>
+    </w:lvl>
+  </w:abstractNum>
+  <w:abstractNum w:abstractNumId="1" w15:restartNumberingAfterBreak="0">
+    <w:nsid w:val="14611364"/>
+    <w:multiLevelType w:val="hybridMultilevel"/>
+    <w:tmpl w:val="73446F00"/>
+    <w:lvl w:ilvl="0" w:tplc="8F0C5D7A">
+      <w:start w:val="1"/>
+      <w:numFmt w:val="decimalZero"/>
+      <w:lvlText w:val="%1."/>
+      <w:lvlJc w:val="left"/>
+      <w:pPr>
+        <w:ind w:left="924" w:hanging="564"/>
+      </w:pPr>
+      <w:rPr>
+        <w:rFonts w:hint="default"/>
+      </w:rPr>
+    </w:lvl>
+    <w:lvl w:ilvl="1" w:tplc="04090019" w:tentative="1">
+      <w:start w:val="1"/>
+      <w:numFmt w:val="lowerLetter"/>
+      <w:lvlText w:val="%2."/>
+      <w:lvlJc w:val="left"/>
+      <w:pPr>
+        <w:ind w:left="1440" w:hanging="360"/>
+      </w:pPr>
+    </w:lvl>
+    <w:lvl w:ilvl="2" w:tplc="0409001B" w:tentative="1">
+      <w:start w:val="1"/>
+      <w:numFmt w:val="lowerRoman"/>
+      <w:lvlText w:val="%3."/>
+      <w:lvlJc w:val="right"/>
+      <w:pPr>
+        <w:ind w:left="2160" w:hanging="180"/>
+      </w:pPr>
+    </w:lvl>
+    <w:lvl w:ilvl="3" w:tplc="0409000F" w:tentative="1">
+      <w:start w:val="1"/>
+      <w:numFmt w:val="decimal"/>
+      <w:lvlText w:val="%4."/>
+      <w:lvlJc w:val="left"/>
+      <w:pPr>
+        <w:ind w:left="2880" w:hanging="360"/>
+      </w:pPr>
+    </w:lvl>
+    <w:lvl w:ilvl="4" w:tplc="04090019" w:tentative="1">
+      <w:start w:val="1"/>
+      <w:numFmt w:val="lowerLetter"/>
+      <w:lvlText w:val="%5."/>
+      <w:lvlJc w:val="left"/>
+      <w:pPr>
+        <w:ind w:left="3600" w:hanging="360"/>
+      </w:pPr>
+    </w:lvl>
+    <w:lvl w:ilvl="5" w:tplc="0409001B" w:tentative="1">
+      <w:start w:val="1"/>
+      <w:numFmt w:val="lowerRoman"/>
+      <w:lvlText w:val="%6."/>
+      <w:lvlJc w:val="right"/>
+      <w:pPr>
+        <w:ind w:left="4320" w:hanging="180"/>
+      </w:pPr>
+    </w:lvl>
+    <w:lvl w:ilvl="6" w:tplc="0409000F" w:tentative="1">
+      <w:start w:val="1"/>
+      <w:numFmt w:val="decimal"/>
+      <w:lvlText w:val="%7."/>
+      <w:lvlJc w:val="left"/>
+      <w:pPr>
+        <w:ind w:left="5040" w:hanging="360"/>
+      </w:pPr>
+    </w:lvl>
+    <w:lvl w:ilvl="7" w:tplc="04090019" w:tentative="1">
+      <w:start w:val="1"/>
+      <w:numFmt w:val="lowerLetter"/>
+      <w:lvlText w:val="%8."/>
+      <w:lvlJc w:val="left"/>
+      <w:pPr>
+        <w:ind w:left="5760" w:hanging="360"/>
+      </w:pPr>
+    </w:lvl>
+    <w:lvl w:ilvl="8" w:tplc="0409001B" w:tentative="1">
+      <w:start w:val="1"/>
+      <w:numFmt w:val="lowerRoman"/>
+      <w:lvlText w:val="%9."/>
+      <w:lvlJc w:val="right"/>
+      <w:pPr>
+        <w:ind w:left="6480" w:hanging="180"/>
+      </w:pPr>
+    </w:lvl>
+  </w:abstractNum>
+  <w:abstractNum w:abstractNumId="2" w15:restartNumberingAfterBreak="0">
     <w:nsid w:val="163D5A14"/>
     <w:multiLevelType w:val="hybridMultilevel"/>
     <w:tmpl w:val="B5E0D7F0"/>
@@ -2663,7 +4420,98 @@
       </w:pPr>
     </w:lvl>
   </w:abstractNum>
-  <w:abstractNum w:abstractNumId="1" w15:restartNumberingAfterBreak="0">
+  <w:abstractNum w:abstractNumId="3" w15:restartNumberingAfterBreak="0">
+    <w:nsid w:val="16CA6B08"/>
+    <w:multiLevelType w:val="hybridMultilevel"/>
+    <w:tmpl w:val="B4886466"/>
+    <w:lvl w:ilvl="0" w:tplc="108ABF44">
+      <w:start w:val="1"/>
+      <w:numFmt w:val="lowerRoman"/>
+      <w:lvlText w:val="%1)"/>
+      <w:lvlJc w:val="left"/>
+      <w:pPr>
+        <w:ind w:left="1080" w:hanging="720"/>
+      </w:pPr>
+      <w:rPr>
+        <w:rFonts w:hint="default"/>
+        <w:b/>
+        <w:bCs/>
+      </w:rPr>
+    </w:lvl>
+    <w:lvl w:ilvl="1" w:tplc="04090019" w:tentative="1">
+      <w:start w:val="1"/>
+      <w:numFmt w:val="lowerLetter"/>
+      <w:lvlText w:val="%2."/>
+      <w:lvlJc w:val="left"/>
+      <w:pPr>
+        <w:ind w:left="1440" w:hanging="360"/>
+      </w:pPr>
+    </w:lvl>
+    <w:lvl w:ilvl="2" w:tplc="0409001B" w:tentative="1">
+      <w:start w:val="1"/>
+      <w:numFmt w:val="lowerRoman"/>
+      <w:lvlText w:val="%3."/>
+      <w:lvlJc w:val="right"/>
+      <w:pPr>
+        <w:ind w:left="2160" w:hanging="180"/>
+      </w:pPr>
+    </w:lvl>
+    <w:lvl w:ilvl="3" w:tplc="0409000F" w:tentative="1">
+      <w:start w:val="1"/>
+      <w:numFmt w:val="decimal"/>
+      <w:lvlText w:val="%4."/>
+      <w:lvlJc w:val="left"/>
+      <w:pPr>
+        <w:ind w:left="2880" w:hanging="360"/>
+      </w:pPr>
+    </w:lvl>
+    <w:lvl w:ilvl="4" w:tplc="04090019" w:tentative="1">
+      <w:start w:val="1"/>
+      <w:numFmt w:val="lowerLetter"/>
+      <w:lvlText w:val="%5."/>
+      <w:lvlJc w:val="left"/>
+      <w:pPr>
+        <w:ind w:left="3600" w:hanging="360"/>
+      </w:pPr>
+    </w:lvl>
+    <w:lvl w:ilvl="5" w:tplc="0409001B" w:tentative="1">
+      <w:start w:val="1"/>
+      <w:numFmt w:val="lowerRoman"/>
+      <w:lvlText w:val="%6."/>
+      <w:lvlJc w:val="right"/>
+      <w:pPr>
+        <w:ind w:left="4320" w:hanging="180"/>
+      </w:pPr>
+    </w:lvl>
+    <w:lvl w:ilvl="6" w:tplc="0409000F" w:tentative="1">
+      <w:start w:val="1"/>
+      <w:numFmt w:val="decimal"/>
+      <w:lvlText w:val="%7."/>
+      <w:lvlJc w:val="left"/>
+      <w:pPr>
+        <w:ind w:left="5040" w:hanging="360"/>
+      </w:pPr>
+    </w:lvl>
+    <w:lvl w:ilvl="7" w:tplc="04090019" w:tentative="1">
+      <w:start w:val="1"/>
+      <w:numFmt w:val="lowerLetter"/>
+      <w:lvlText w:val="%8."/>
+      <w:lvlJc w:val="left"/>
+      <w:pPr>
+        <w:ind w:left="5760" w:hanging="360"/>
+      </w:pPr>
+    </w:lvl>
+    <w:lvl w:ilvl="8" w:tplc="0409001B" w:tentative="1">
+      <w:start w:val="1"/>
+      <w:numFmt w:val="lowerRoman"/>
+      <w:lvlText w:val="%9."/>
+      <w:lvlJc w:val="right"/>
+      <w:pPr>
+        <w:ind w:left="6480" w:hanging="180"/>
+      </w:pPr>
+    </w:lvl>
+  </w:abstractNum>
+  <w:abstractNum w:abstractNumId="4" w15:restartNumberingAfterBreak="0">
     <w:nsid w:val="2FB85469"/>
     <w:multiLevelType w:val="hybridMultilevel"/>
     <w:tmpl w:val="93F2464C"/>
@@ -2752,11 +4600,668 @@
       </w:pPr>
     </w:lvl>
   </w:abstractNum>
+  <w:abstractNum w:abstractNumId="5" w15:restartNumberingAfterBreak="0">
+    <w:nsid w:val="3D2039ED"/>
+    <w:multiLevelType w:val="hybridMultilevel"/>
+    <w:tmpl w:val="6AD012C2"/>
+    <w:lvl w:ilvl="0" w:tplc="AF143C30">
+      <w:start w:val="1"/>
+      <w:numFmt w:val="decimalZero"/>
+      <w:lvlText w:val="%1."/>
+      <w:lvlJc w:val="left"/>
+      <w:pPr>
+        <w:ind w:left="720" w:hanging="360"/>
+      </w:pPr>
+      <w:rPr>
+        <w:rFonts w:hint="default"/>
+      </w:rPr>
+    </w:lvl>
+    <w:lvl w:ilvl="1" w:tplc="04090019" w:tentative="1">
+      <w:start w:val="1"/>
+      <w:numFmt w:val="lowerLetter"/>
+      <w:lvlText w:val="%2."/>
+      <w:lvlJc w:val="left"/>
+      <w:pPr>
+        <w:ind w:left="1440" w:hanging="360"/>
+      </w:pPr>
+    </w:lvl>
+    <w:lvl w:ilvl="2" w:tplc="0409001B" w:tentative="1">
+      <w:start w:val="1"/>
+      <w:numFmt w:val="lowerRoman"/>
+      <w:lvlText w:val="%3."/>
+      <w:lvlJc w:val="right"/>
+      <w:pPr>
+        <w:ind w:left="2160" w:hanging="180"/>
+      </w:pPr>
+    </w:lvl>
+    <w:lvl w:ilvl="3" w:tplc="0409000F" w:tentative="1">
+      <w:start w:val="1"/>
+      <w:numFmt w:val="decimal"/>
+      <w:lvlText w:val="%4."/>
+      <w:lvlJc w:val="left"/>
+      <w:pPr>
+        <w:ind w:left="2880" w:hanging="360"/>
+      </w:pPr>
+    </w:lvl>
+    <w:lvl w:ilvl="4" w:tplc="04090019" w:tentative="1">
+      <w:start w:val="1"/>
+      <w:numFmt w:val="lowerLetter"/>
+      <w:lvlText w:val="%5."/>
+      <w:lvlJc w:val="left"/>
+      <w:pPr>
+        <w:ind w:left="3600" w:hanging="360"/>
+      </w:pPr>
+    </w:lvl>
+    <w:lvl w:ilvl="5" w:tplc="0409001B" w:tentative="1">
+      <w:start w:val="1"/>
+      <w:numFmt w:val="lowerRoman"/>
+      <w:lvlText w:val="%6."/>
+      <w:lvlJc w:val="right"/>
+      <w:pPr>
+        <w:ind w:left="4320" w:hanging="180"/>
+      </w:pPr>
+    </w:lvl>
+    <w:lvl w:ilvl="6" w:tplc="0409000F" w:tentative="1">
+      <w:start w:val="1"/>
+      <w:numFmt w:val="decimal"/>
+      <w:lvlText w:val="%7."/>
+      <w:lvlJc w:val="left"/>
+      <w:pPr>
+        <w:ind w:left="5040" w:hanging="360"/>
+      </w:pPr>
+    </w:lvl>
+    <w:lvl w:ilvl="7" w:tplc="04090019" w:tentative="1">
+      <w:start w:val="1"/>
+      <w:numFmt w:val="lowerLetter"/>
+      <w:lvlText w:val="%8."/>
+      <w:lvlJc w:val="left"/>
+      <w:pPr>
+        <w:ind w:left="5760" w:hanging="360"/>
+      </w:pPr>
+    </w:lvl>
+    <w:lvl w:ilvl="8" w:tplc="0409001B" w:tentative="1">
+      <w:start w:val="1"/>
+      <w:numFmt w:val="lowerRoman"/>
+      <w:lvlText w:val="%9."/>
+      <w:lvlJc w:val="right"/>
+      <w:pPr>
+        <w:ind w:left="6480" w:hanging="180"/>
+      </w:pPr>
+    </w:lvl>
+  </w:abstractNum>
+  <w:abstractNum w:abstractNumId="6" w15:restartNumberingAfterBreak="0">
+    <w:nsid w:val="3D9B26E2"/>
+    <w:multiLevelType w:val="hybridMultilevel"/>
+    <w:tmpl w:val="7F067364"/>
+    <w:lvl w:ilvl="0" w:tplc="52F85710">
+      <w:start w:val="1"/>
+      <w:numFmt w:val="decimalZero"/>
+      <w:lvlText w:val="%1."/>
+      <w:lvlJc w:val="left"/>
+      <w:pPr>
+        <w:ind w:left="924" w:hanging="564"/>
+      </w:pPr>
+      <w:rPr>
+        <w:rFonts w:hint="default"/>
+        <w:b w:val="0"/>
+        <w:bCs w:val="0"/>
+        <w:sz w:val="24"/>
+        <w:szCs w:val="24"/>
+      </w:rPr>
+    </w:lvl>
+    <w:lvl w:ilvl="1" w:tplc="04090019" w:tentative="1">
+      <w:start w:val="1"/>
+      <w:numFmt w:val="lowerLetter"/>
+      <w:lvlText w:val="%2."/>
+      <w:lvlJc w:val="left"/>
+      <w:pPr>
+        <w:ind w:left="1440" w:hanging="360"/>
+      </w:pPr>
+    </w:lvl>
+    <w:lvl w:ilvl="2" w:tplc="0409001B" w:tentative="1">
+      <w:start w:val="1"/>
+      <w:numFmt w:val="lowerRoman"/>
+      <w:lvlText w:val="%3."/>
+      <w:lvlJc w:val="right"/>
+      <w:pPr>
+        <w:ind w:left="2160" w:hanging="180"/>
+      </w:pPr>
+    </w:lvl>
+    <w:lvl w:ilvl="3" w:tplc="0409000F" w:tentative="1">
+      <w:start w:val="1"/>
+      <w:numFmt w:val="decimal"/>
+      <w:lvlText w:val="%4."/>
+      <w:lvlJc w:val="left"/>
+      <w:pPr>
+        <w:ind w:left="2880" w:hanging="360"/>
+      </w:pPr>
+    </w:lvl>
+    <w:lvl w:ilvl="4" w:tplc="04090019" w:tentative="1">
+      <w:start w:val="1"/>
+      <w:numFmt w:val="lowerLetter"/>
+      <w:lvlText w:val="%5."/>
+      <w:lvlJc w:val="left"/>
+      <w:pPr>
+        <w:ind w:left="3600" w:hanging="360"/>
+      </w:pPr>
+    </w:lvl>
+    <w:lvl w:ilvl="5" w:tplc="0409001B" w:tentative="1">
+      <w:start w:val="1"/>
+      <w:numFmt w:val="lowerRoman"/>
+      <w:lvlText w:val="%6."/>
+      <w:lvlJc w:val="right"/>
+      <w:pPr>
+        <w:ind w:left="4320" w:hanging="180"/>
+      </w:pPr>
+    </w:lvl>
+    <w:lvl w:ilvl="6" w:tplc="0409000F" w:tentative="1">
+      <w:start w:val="1"/>
+      <w:numFmt w:val="decimal"/>
+      <w:lvlText w:val="%7."/>
+      <w:lvlJc w:val="left"/>
+      <w:pPr>
+        <w:ind w:left="5040" w:hanging="360"/>
+      </w:pPr>
+    </w:lvl>
+    <w:lvl w:ilvl="7" w:tplc="04090019" w:tentative="1">
+      <w:start w:val="1"/>
+      <w:numFmt w:val="lowerLetter"/>
+      <w:lvlText w:val="%8."/>
+      <w:lvlJc w:val="left"/>
+      <w:pPr>
+        <w:ind w:left="5760" w:hanging="360"/>
+      </w:pPr>
+    </w:lvl>
+    <w:lvl w:ilvl="8" w:tplc="0409001B" w:tentative="1">
+      <w:start w:val="1"/>
+      <w:numFmt w:val="lowerRoman"/>
+      <w:lvlText w:val="%9."/>
+      <w:lvlJc w:val="right"/>
+      <w:pPr>
+        <w:ind w:left="6480" w:hanging="180"/>
+      </w:pPr>
+    </w:lvl>
+  </w:abstractNum>
+  <w:abstractNum w:abstractNumId="7" w15:restartNumberingAfterBreak="0">
+    <w:nsid w:val="4F3D0D38"/>
+    <w:multiLevelType w:val="hybridMultilevel"/>
+    <w:tmpl w:val="978A0BF8"/>
+    <w:lvl w:ilvl="0" w:tplc="13D8B7DA">
+      <w:start w:val="1"/>
+      <w:numFmt w:val="lowerRoman"/>
+      <w:lvlText w:val="%1)"/>
+      <w:lvlJc w:val="left"/>
+      <w:pPr>
+        <w:ind w:left="1080" w:hanging="720"/>
+      </w:pPr>
+      <w:rPr>
+        <w:rFonts w:hint="default"/>
+      </w:rPr>
+    </w:lvl>
+    <w:lvl w:ilvl="1" w:tplc="04090019" w:tentative="1">
+      <w:start w:val="1"/>
+      <w:numFmt w:val="lowerLetter"/>
+      <w:lvlText w:val="%2."/>
+      <w:lvlJc w:val="left"/>
+      <w:pPr>
+        <w:ind w:left="1440" w:hanging="360"/>
+      </w:pPr>
+    </w:lvl>
+    <w:lvl w:ilvl="2" w:tplc="0409001B" w:tentative="1">
+      <w:start w:val="1"/>
+      <w:numFmt w:val="lowerRoman"/>
+      <w:lvlText w:val="%3."/>
+      <w:lvlJc w:val="right"/>
+      <w:pPr>
+        <w:ind w:left="2160" w:hanging="180"/>
+      </w:pPr>
+    </w:lvl>
+    <w:lvl w:ilvl="3" w:tplc="0409000F" w:tentative="1">
+      <w:start w:val="1"/>
+      <w:numFmt w:val="decimal"/>
+      <w:lvlText w:val="%4."/>
+      <w:lvlJc w:val="left"/>
+      <w:pPr>
+        <w:ind w:left="2880" w:hanging="360"/>
+      </w:pPr>
+    </w:lvl>
+    <w:lvl w:ilvl="4" w:tplc="04090019" w:tentative="1">
+      <w:start w:val="1"/>
+      <w:numFmt w:val="lowerLetter"/>
+      <w:lvlText w:val="%5."/>
+      <w:lvlJc w:val="left"/>
+      <w:pPr>
+        <w:ind w:left="3600" w:hanging="360"/>
+      </w:pPr>
+    </w:lvl>
+    <w:lvl w:ilvl="5" w:tplc="0409001B" w:tentative="1">
+      <w:start w:val="1"/>
+      <w:numFmt w:val="lowerRoman"/>
+      <w:lvlText w:val="%6."/>
+      <w:lvlJc w:val="right"/>
+      <w:pPr>
+        <w:ind w:left="4320" w:hanging="180"/>
+      </w:pPr>
+    </w:lvl>
+    <w:lvl w:ilvl="6" w:tplc="0409000F" w:tentative="1">
+      <w:start w:val="1"/>
+      <w:numFmt w:val="decimal"/>
+      <w:lvlText w:val="%7."/>
+      <w:lvlJc w:val="left"/>
+      <w:pPr>
+        <w:ind w:left="5040" w:hanging="360"/>
+      </w:pPr>
+    </w:lvl>
+    <w:lvl w:ilvl="7" w:tplc="04090019" w:tentative="1">
+      <w:start w:val="1"/>
+      <w:numFmt w:val="lowerLetter"/>
+      <w:lvlText w:val="%8."/>
+      <w:lvlJc w:val="left"/>
+      <w:pPr>
+        <w:ind w:left="5760" w:hanging="360"/>
+      </w:pPr>
+    </w:lvl>
+    <w:lvl w:ilvl="8" w:tplc="0409001B" w:tentative="1">
+      <w:start w:val="1"/>
+      <w:numFmt w:val="lowerRoman"/>
+      <w:lvlText w:val="%9."/>
+      <w:lvlJc w:val="right"/>
+      <w:pPr>
+        <w:ind w:left="6480" w:hanging="180"/>
+      </w:pPr>
+    </w:lvl>
+  </w:abstractNum>
+  <w:abstractNum w:abstractNumId="8" w15:restartNumberingAfterBreak="0">
+    <w:nsid w:val="522640DC"/>
+    <w:multiLevelType w:val="hybridMultilevel"/>
+    <w:tmpl w:val="84AE9930"/>
+    <w:lvl w:ilvl="0" w:tplc="E2821972">
+      <w:start w:val="1"/>
+      <w:numFmt w:val="decimalZero"/>
+      <w:lvlText w:val="%1."/>
+      <w:lvlJc w:val="left"/>
+      <w:pPr>
+        <w:ind w:left="720" w:hanging="360"/>
+      </w:pPr>
+      <w:rPr>
+        <w:rFonts w:hint="default"/>
+      </w:rPr>
+    </w:lvl>
+    <w:lvl w:ilvl="1" w:tplc="04090019" w:tentative="1">
+      <w:start w:val="1"/>
+      <w:numFmt w:val="lowerLetter"/>
+      <w:lvlText w:val="%2."/>
+      <w:lvlJc w:val="left"/>
+      <w:pPr>
+        <w:ind w:left="1440" w:hanging="360"/>
+      </w:pPr>
+    </w:lvl>
+    <w:lvl w:ilvl="2" w:tplc="0409001B" w:tentative="1">
+      <w:start w:val="1"/>
+      <w:numFmt w:val="lowerRoman"/>
+      <w:lvlText w:val="%3."/>
+      <w:lvlJc w:val="right"/>
+      <w:pPr>
+        <w:ind w:left="2160" w:hanging="180"/>
+      </w:pPr>
+    </w:lvl>
+    <w:lvl w:ilvl="3" w:tplc="0409000F" w:tentative="1">
+      <w:start w:val="1"/>
+      <w:numFmt w:val="decimal"/>
+      <w:lvlText w:val="%4."/>
+      <w:lvlJc w:val="left"/>
+      <w:pPr>
+        <w:ind w:left="2880" w:hanging="360"/>
+      </w:pPr>
+    </w:lvl>
+    <w:lvl w:ilvl="4" w:tplc="04090019" w:tentative="1">
+      <w:start w:val="1"/>
+      <w:numFmt w:val="lowerLetter"/>
+      <w:lvlText w:val="%5."/>
+      <w:lvlJc w:val="left"/>
+      <w:pPr>
+        <w:ind w:left="3600" w:hanging="360"/>
+      </w:pPr>
+    </w:lvl>
+    <w:lvl w:ilvl="5" w:tplc="0409001B" w:tentative="1">
+      <w:start w:val="1"/>
+      <w:numFmt w:val="lowerRoman"/>
+      <w:lvlText w:val="%6."/>
+      <w:lvlJc w:val="right"/>
+      <w:pPr>
+        <w:ind w:left="4320" w:hanging="180"/>
+      </w:pPr>
+    </w:lvl>
+    <w:lvl w:ilvl="6" w:tplc="0409000F" w:tentative="1">
+      <w:start w:val="1"/>
+      <w:numFmt w:val="decimal"/>
+      <w:lvlText w:val="%7."/>
+      <w:lvlJc w:val="left"/>
+      <w:pPr>
+        <w:ind w:left="5040" w:hanging="360"/>
+      </w:pPr>
+    </w:lvl>
+    <w:lvl w:ilvl="7" w:tplc="04090019" w:tentative="1">
+      <w:start w:val="1"/>
+      <w:numFmt w:val="lowerLetter"/>
+      <w:lvlText w:val="%8."/>
+      <w:lvlJc w:val="left"/>
+      <w:pPr>
+        <w:ind w:left="5760" w:hanging="360"/>
+      </w:pPr>
+    </w:lvl>
+    <w:lvl w:ilvl="8" w:tplc="0409001B" w:tentative="1">
+      <w:start w:val="1"/>
+      <w:numFmt w:val="lowerRoman"/>
+      <w:lvlText w:val="%9."/>
+      <w:lvlJc w:val="right"/>
+      <w:pPr>
+        <w:ind w:left="6480" w:hanging="180"/>
+      </w:pPr>
+    </w:lvl>
+  </w:abstractNum>
+  <w:abstractNum w:abstractNumId="9" w15:restartNumberingAfterBreak="0">
+    <w:nsid w:val="613453F1"/>
+    <w:multiLevelType w:val="hybridMultilevel"/>
+    <w:tmpl w:val="6E006224"/>
+    <w:lvl w:ilvl="0" w:tplc="64E4D7EE">
+      <w:start w:val="1"/>
+      <w:numFmt w:val="lowerRoman"/>
+      <w:lvlText w:val="%1."/>
+      <w:lvlJc w:val="left"/>
+      <w:pPr>
+        <w:ind w:left="1080" w:hanging="720"/>
+      </w:pPr>
+      <w:rPr>
+        <w:rFonts w:hint="default"/>
+      </w:rPr>
+    </w:lvl>
+    <w:lvl w:ilvl="1" w:tplc="04090019" w:tentative="1">
+      <w:start w:val="1"/>
+      <w:numFmt w:val="lowerLetter"/>
+      <w:lvlText w:val="%2."/>
+      <w:lvlJc w:val="left"/>
+      <w:pPr>
+        <w:ind w:left="1440" w:hanging="360"/>
+      </w:pPr>
+    </w:lvl>
+    <w:lvl w:ilvl="2" w:tplc="0409001B" w:tentative="1">
+      <w:start w:val="1"/>
+      <w:numFmt w:val="lowerRoman"/>
+      <w:lvlText w:val="%3."/>
+      <w:lvlJc w:val="right"/>
+      <w:pPr>
+        <w:ind w:left="2160" w:hanging="180"/>
+      </w:pPr>
+    </w:lvl>
+    <w:lvl w:ilvl="3" w:tplc="0409000F" w:tentative="1">
+      <w:start w:val="1"/>
+      <w:numFmt w:val="decimal"/>
+      <w:lvlText w:val="%4."/>
+      <w:lvlJc w:val="left"/>
+      <w:pPr>
+        <w:ind w:left="2880" w:hanging="360"/>
+      </w:pPr>
+    </w:lvl>
+    <w:lvl w:ilvl="4" w:tplc="04090019" w:tentative="1">
+      <w:start w:val="1"/>
+      <w:numFmt w:val="lowerLetter"/>
+      <w:lvlText w:val="%5."/>
+      <w:lvlJc w:val="left"/>
+      <w:pPr>
+        <w:ind w:left="3600" w:hanging="360"/>
+      </w:pPr>
+    </w:lvl>
+    <w:lvl w:ilvl="5" w:tplc="0409001B" w:tentative="1">
+      <w:start w:val="1"/>
+      <w:numFmt w:val="lowerRoman"/>
+      <w:lvlText w:val="%6."/>
+      <w:lvlJc w:val="right"/>
+      <w:pPr>
+        <w:ind w:left="4320" w:hanging="180"/>
+      </w:pPr>
+    </w:lvl>
+    <w:lvl w:ilvl="6" w:tplc="0409000F" w:tentative="1">
+      <w:start w:val="1"/>
+      <w:numFmt w:val="decimal"/>
+      <w:lvlText w:val="%7."/>
+      <w:lvlJc w:val="left"/>
+      <w:pPr>
+        <w:ind w:left="5040" w:hanging="360"/>
+      </w:pPr>
+    </w:lvl>
+    <w:lvl w:ilvl="7" w:tplc="04090019" w:tentative="1">
+      <w:start w:val="1"/>
+      <w:numFmt w:val="lowerLetter"/>
+      <w:lvlText w:val="%8."/>
+      <w:lvlJc w:val="left"/>
+      <w:pPr>
+        <w:ind w:left="5760" w:hanging="360"/>
+      </w:pPr>
+    </w:lvl>
+    <w:lvl w:ilvl="8" w:tplc="0409001B" w:tentative="1">
+      <w:start w:val="1"/>
+      <w:numFmt w:val="lowerRoman"/>
+      <w:lvlText w:val="%9."/>
+      <w:lvlJc w:val="right"/>
+      <w:pPr>
+        <w:ind w:left="6480" w:hanging="180"/>
+      </w:pPr>
+    </w:lvl>
+  </w:abstractNum>
+  <w:abstractNum w:abstractNumId="10" w15:restartNumberingAfterBreak="0">
+    <w:nsid w:val="68EE45F7"/>
+    <w:multiLevelType w:val="hybridMultilevel"/>
+    <w:tmpl w:val="3D66D53A"/>
+    <w:lvl w:ilvl="0" w:tplc="6F5471FC">
+      <w:start w:val="1"/>
+      <w:numFmt w:val="lowerRoman"/>
+      <w:lvlText w:val="(%1)"/>
+      <w:lvlJc w:val="left"/>
+      <w:pPr>
+        <w:ind w:left="1440" w:hanging="720"/>
+      </w:pPr>
+      <w:rPr>
+        <w:rFonts w:hint="default"/>
+      </w:rPr>
+    </w:lvl>
+    <w:lvl w:ilvl="1" w:tplc="04090019" w:tentative="1">
+      <w:start w:val="1"/>
+      <w:numFmt w:val="lowerLetter"/>
+      <w:lvlText w:val="%2."/>
+      <w:lvlJc w:val="left"/>
+      <w:pPr>
+        <w:ind w:left="1800" w:hanging="360"/>
+      </w:pPr>
+    </w:lvl>
+    <w:lvl w:ilvl="2" w:tplc="0409001B" w:tentative="1">
+      <w:start w:val="1"/>
+      <w:numFmt w:val="lowerRoman"/>
+      <w:lvlText w:val="%3."/>
+      <w:lvlJc w:val="right"/>
+      <w:pPr>
+        <w:ind w:left="2520" w:hanging="180"/>
+      </w:pPr>
+    </w:lvl>
+    <w:lvl w:ilvl="3" w:tplc="0409000F" w:tentative="1">
+      <w:start w:val="1"/>
+      <w:numFmt w:val="decimal"/>
+      <w:lvlText w:val="%4."/>
+      <w:lvlJc w:val="left"/>
+      <w:pPr>
+        <w:ind w:left="3240" w:hanging="360"/>
+      </w:pPr>
+    </w:lvl>
+    <w:lvl w:ilvl="4" w:tplc="04090019" w:tentative="1">
+      <w:start w:val="1"/>
+      <w:numFmt w:val="lowerLetter"/>
+      <w:lvlText w:val="%5."/>
+      <w:lvlJc w:val="left"/>
+      <w:pPr>
+        <w:ind w:left="3960" w:hanging="360"/>
+      </w:pPr>
+    </w:lvl>
+    <w:lvl w:ilvl="5" w:tplc="0409001B" w:tentative="1">
+      <w:start w:val="1"/>
+      <w:numFmt w:val="lowerRoman"/>
+      <w:lvlText w:val="%6."/>
+      <w:lvlJc w:val="right"/>
+      <w:pPr>
+        <w:ind w:left="4680" w:hanging="180"/>
+      </w:pPr>
+    </w:lvl>
+    <w:lvl w:ilvl="6" w:tplc="0409000F" w:tentative="1">
+      <w:start w:val="1"/>
+      <w:numFmt w:val="decimal"/>
+      <w:lvlText w:val="%7."/>
+      <w:lvlJc w:val="left"/>
+      <w:pPr>
+        <w:ind w:left="5400" w:hanging="360"/>
+      </w:pPr>
+    </w:lvl>
+    <w:lvl w:ilvl="7" w:tplc="04090019" w:tentative="1">
+      <w:start w:val="1"/>
+      <w:numFmt w:val="lowerLetter"/>
+      <w:lvlText w:val="%8."/>
+      <w:lvlJc w:val="left"/>
+      <w:pPr>
+        <w:ind w:left="6120" w:hanging="360"/>
+      </w:pPr>
+    </w:lvl>
+    <w:lvl w:ilvl="8" w:tplc="0409001B" w:tentative="1">
+      <w:start w:val="1"/>
+      <w:numFmt w:val="lowerRoman"/>
+      <w:lvlText w:val="%9."/>
+      <w:lvlJc w:val="right"/>
+      <w:pPr>
+        <w:ind w:left="6840" w:hanging="180"/>
+      </w:pPr>
+    </w:lvl>
+  </w:abstractNum>
+  <w:abstractNum w:abstractNumId="11" w15:restartNumberingAfterBreak="0">
+    <w:nsid w:val="7615473D"/>
+    <w:multiLevelType w:val="hybridMultilevel"/>
+    <w:tmpl w:val="5060F2EA"/>
+    <w:lvl w:ilvl="0" w:tplc="E7D684CE">
+      <w:start w:val="1"/>
+      <w:numFmt w:val="decimalZero"/>
+      <w:lvlText w:val="%1."/>
+      <w:lvlJc w:val="left"/>
+      <w:pPr>
+        <w:ind w:left="720" w:hanging="360"/>
+      </w:pPr>
+      <w:rPr>
+        <w:rFonts w:hint="default"/>
+      </w:rPr>
+    </w:lvl>
+    <w:lvl w:ilvl="1" w:tplc="04090019" w:tentative="1">
+      <w:start w:val="1"/>
+      <w:numFmt w:val="lowerLetter"/>
+      <w:lvlText w:val="%2."/>
+      <w:lvlJc w:val="left"/>
+      <w:pPr>
+        <w:ind w:left="1440" w:hanging="360"/>
+      </w:pPr>
+    </w:lvl>
+    <w:lvl w:ilvl="2" w:tplc="0409001B" w:tentative="1">
+      <w:start w:val="1"/>
+      <w:numFmt w:val="lowerRoman"/>
+      <w:lvlText w:val="%3."/>
+      <w:lvlJc w:val="right"/>
+      <w:pPr>
+        <w:ind w:left="2160" w:hanging="180"/>
+      </w:pPr>
+    </w:lvl>
+    <w:lvl w:ilvl="3" w:tplc="0409000F" w:tentative="1">
+      <w:start w:val="1"/>
+      <w:numFmt w:val="decimal"/>
+      <w:lvlText w:val="%4."/>
+      <w:lvlJc w:val="left"/>
+      <w:pPr>
+        <w:ind w:left="2880" w:hanging="360"/>
+      </w:pPr>
+    </w:lvl>
+    <w:lvl w:ilvl="4" w:tplc="04090019" w:tentative="1">
+      <w:start w:val="1"/>
+      <w:numFmt w:val="lowerLetter"/>
+      <w:lvlText w:val="%5."/>
+      <w:lvlJc w:val="left"/>
+      <w:pPr>
+        <w:ind w:left="3600" w:hanging="360"/>
+      </w:pPr>
+    </w:lvl>
+    <w:lvl w:ilvl="5" w:tplc="0409001B" w:tentative="1">
+      <w:start w:val="1"/>
+      <w:numFmt w:val="lowerRoman"/>
+      <w:lvlText w:val="%6."/>
+      <w:lvlJc w:val="right"/>
+      <w:pPr>
+        <w:ind w:left="4320" w:hanging="180"/>
+      </w:pPr>
+    </w:lvl>
+    <w:lvl w:ilvl="6" w:tplc="0409000F" w:tentative="1">
+      <w:start w:val="1"/>
+      <w:numFmt w:val="decimal"/>
+      <w:lvlText w:val="%7."/>
+      <w:lvlJc w:val="left"/>
+      <w:pPr>
+        <w:ind w:left="5040" w:hanging="360"/>
+      </w:pPr>
+    </w:lvl>
+    <w:lvl w:ilvl="7" w:tplc="04090019" w:tentative="1">
+      <w:start w:val="1"/>
+      <w:numFmt w:val="lowerLetter"/>
+      <w:lvlText w:val="%8."/>
+      <w:lvlJc w:val="left"/>
+      <w:pPr>
+        <w:ind w:left="5760" w:hanging="360"/>
+      </w:pPr>
+    </w:lvl>
+    <w:lvl w:ilvl="8" w:tplc="0409001B" w:tentative="1">
+      <w:start w:val="1"/>
+      <w:numFmt w:val="lowerRoman"/>
+      <w:lvlText w:val="%9."/>
+      <w:lvlJc w:val="right"/>
+      <w:pPr>
+        <w:ind w:left="6480" w:hanging="180"/>
+      </w:pPr>
+    </w:lvl>
+  </w:abstractNum>
   <w:num w:numId="1" w16cid:durableId="891575872">
+    <w:abstractNumId w:val="4"/>
+  </w:num>
+  <w:num w:numId="2" w16cid:durableId="1221945619">
+    <w:abstractNumId w:val="2"/>
+  </w:num>
+  <w:num w:numId="3" w16cid:durableId="1975985392">
+    <w:abstractNumId w:val="5"/>
+  </w:num>
+  <w:num w:numId="4" w16cid:durableId="1627657721">
+    <w:abstractNumId w:val="10"/>
+  </w:num>
+  <w:num w:numId="5" w16cid:durableId="899827683">
+    <w:abstractNumId w:val="0"/>
+  </w:num>
+  <w:num w:numId="6" w16cid:durableId="1229070454">
+    <w:abstractNumId w:val="3"/>
+  </w:num>
+  <w:num w:numId="7" w16cid:durableId="934942767">
+    <w:abstractNumId w:val="7"/>
+  </w:num>
+  <w:num w:numId="8" w16cid:durableId="1983074653">
+    <w:abstractNumId w:val="9"/>
+  </w:num>
+  <w:num w:numId="9" w16cid:durableId="246765820">
+    <w:abstractNumId w:val="6"/>
+  </w:num>
+  <w:num w:numId="10" w16cid:durableId="1268931562">
+    <w:abstractNumId w:val="11"/>
+  </w:num>
+  <w:num w:numId="11" w16cid:durableId="535192240">
     <w:abstractNumId w:val="1"/>
   </w:num>
-  <w:num w:numId="2" w16cid:durableId="1221945619">
-    <w:abstractNumId w:val="0"/>
+  <w:num w:numId="12" w16cid:durableId="75057316">
+    <w:abstractNumId w:val="8"/>
   </w:num>
 </w:numbering>
 </file>
@@ -3161,11 +5666,35 @@
   <w:style w:type="paragraph" w:default="1" w:styleId="Normal">
     <w:name w:val="Normal"/>
     <w:qFormat/>
-    <w:rsid w:val="00FC59A5"/>
+    <w:rsid w:val="002B27D1"/>
+  </w:style>
+  <w:style w:type="paragraph" w:styleId="Heading3">
+    <w:name w:val="heading 3"/>
+    <w:basedOn w:val="Normal"/>
+    <w:next w:val="Normal"/>
+    <w:link w:val="Heading3Char"/>
+    <w:uiPriority w:val="9"/>
+    <w:semiHidden/>
+    <w:unhideWhenUsed/>
+    <w:qFormat/>
+    <w:rsid w:val="00BB0FA7"/>
+    <w:pPr>
+      <w:keepNext/>
+      <w:keepLines/>
+      <w:spacing w:before="40" w:after="0"/>
+      <w:outlineLvl w:val="2"/>
+    </w:pPr>
+    <w:rPr>
+      <w:rFonts w:asciiTheme="majorHAnsi" w:eastAsiaTheme="majorEastAsia" w:hAnsiTheme="majorHAnsi" w:cstheme="majorBidi"/>
+      <w:color w:val="1F3763" w:themeColor="accent1" w:themeShade="7F"/>
+      <w:sz w:val="24"/>
+      <w:szCs w:val="24"/>
+    </w:rPr>
   </w:style>
   <w:style w:type="character" w:default="1" w:styleId="DefaultParagraphFont">
     <w:name w:val="Default Paragraph Font"/>
     <w:uiPriority w:val="1"/>
+    <w:semiHidden/>
     <w:unhideWhenUsed/>
   </w:style>
   <w:style w:type="table" w:default="1" w:styleId="TableNormal">
@@ -3199,6 +5728,20 @@
       <w:ind w:left="720"/>
       <w:contextualSpacing/>
     </w:pPr>
+  </w:style>
+  <w:style w:type="character" w:customStyle="1" w:styleId="Heading3Char">
+    <w:name w:val="Heading 3 Char"/>
+    <w:basedOn w:val="DefaultParagraphFont"/>
+    <w:link w:val="Heading3"/>
+    <w:uiPriority w:val="9"/>
+    <w:semiHidden/>
+    <w:rsid w:val="00BB0FA7"/>
+    <w:rPr>
+      <w:rFonts w:asciiTheme="majorHAnsi" w:eastAsiaTheme="majorEastAsia" w:hAnsiTheme="majorHAnsi" w:cstheme="majorBidi"/>
+      <w:color w:val="1F3763" w:themeColor="accent1" w:themeShade="7F"/>
+      <w:sz w:val="24"/>
+      <w:szCs w:val="24"/>
+    </w:rPr>
   </w:style>
 </w:styles>
 </file>

</xml_diff>

<commit_message>
Week 09 Exercises added
</commit_message>
<xml_diff>
--- a/LABlogbook_2523747_Neural Computing and Deep Learning (2025 MOD006568 TRI2 F01CIN).docx
+++ b/LABlogbook_2523747_Neural Computing and Deep Learning (2025 MOD006568 TRI2 F01CIN).docx
@@ -4095,6 +4095,916 @@
           <w:u w:val="single"/>
         </w:rPr>
       </w:pPr>
+    </w:p>
+    <w:p>
+      <w:pPr>
+        <w:jc w:val="both"/>
+        <w:rPr>
+          <w:sz w:val="44"/>
+          <w:szCs w:val="44"/>
+          <w:u w:val="single"/>
+        </w:rPr>
+      </w:pPr>
+    </w:p>
+    <w:p>
+      <w:pPr>
+        <w:jc w:val="both"/>
+        <w:rPr>
+          <w:sz w:val="44"/>
+          <w:szCs w:val="44"/>
+          <w:u w:val="single"/>
+        </w:rPr>
+      </w:pPr>
+    </w:p>
+    <w:p>
+      <w:pPr>
+        <w:jc w:val="both"/>
+        <w:rPr>
+          <w:sz w:val="44"/>
+          <w:szCs w:val="44"/>
+          <w:u w:val="single"/>
+        </w:rPr>
+      </w:pPr>
+    </w:p>
+    <w:p>
+      <w:pPr>
+        <w:jc w:val="both"/>
+        <w:rPr>
+          <w:sz w:val="44"/>
+          <w:szCs w:val="44"/>
+          <w:u w:val="single"/>
+        </w:rPr>
+      </w:pPr>
+    </w:p>
+    <w:p>
+      <w:pPr>
+        <w:jc w:val="both"/>
+        <w:rPr>
+          <w:sz w:val="44"/>
+          <w:szCs w:val="44"/>
+          <w:u w:val="single"/>
+        </w:rPr>
+      </w:pPr>
+      <w:r>
+        <w:rPr>
+          <w:sz w:val="44"/>
+          <w:szCs w:val="44"/>
+          <w:u w:val="single"/>
+        </w:rPr>
+        <w:lastRenderedPageBreak/>
+        <w:t xml:space="preserve">Lab </w:t>
+      </w:r>
+      <w:r>
+        <w:rPr>
+          <w:sz w:val="44"/>
+          <w:szCs w:val="44"/>
+          <w:u w:val="single"/>
+        </w:rPr>
+        <w:t>9</w:t>
+      </w:r>
+    </w:p>
+    <w:p>
+      <w:pPr>
+        <w:pStyle w:val="ListParagraph"/>
+        <w:numPr>
+          <w:ilvl w:val="0"/>
+          <w:numId w:val="7"/>
+        </w:numPr>
+        <w:jc w:val="both"/>
+        <w:rPr>
+          <w:sz w:val="24"/>
+          <w:szCs w:val="24"/>
+          <w:lang w:val="en-US"/>
+        </w:rPr>
+      </w:pPr>
+      <w:r>
+        <w:rPr>
+          <w:sz w:val="24"/>
+          <w:szCs w:val="24"/>
+          <w:lang w:val="en-US"/>
+        </w:rPr>
+        <w:t xml:space="preserve">Code </w:t>
+      </w:r>
+      <w:proofErr w:type="gramStart"/>
+      <w:r>
+        <w:rPr>
+          <w:sz w:val="24"/>
+          <w:szCs w:val="24"/>
+          <w:lang w:val="en-US"/>
+        </w:rPr>
+        <w:t xml:space="preserve">of  </w:t>
+      </w:r>
+      <w:proofErr w:type="spellStart"/>
+      <w:r>
+        <w:rPr>
+          <w:sz w:val="24"/>
+          <w:szCs w:val="24"/>
+          <w:lang w:val="en-US"/>
+        </w:rPr>
+        <w:t>EarlyStopping</w:t>
+      </w:r>
+      <w:proofErr w:type="spellEnd"/>
+      <w:proofErr w:type="gramEnd"/>
+      <w:r>
+        <w:rPr>
+          <w:sz w:val="24"/>
+          <w:szCs w:val="24"/>
+          <w:lang w:val="en-US"/>
+        </w:rPr>
+        <w:t>() function</w:t>
+      </w:r>
+    </w:p>
+    <w:p>
+      <w:pPr>
+        <w:jc w:val="both"/>
+        <w:rPr>
+          <w:sz w:val="24"/>
+          <w:szCs w:val="24"/>
+          <w:lang w:val="en-US"/>
+        </w:rPr>
+      </w:pPr>
+      <w:r>
+        <w:rPr>
+          <w:noProof/>
+          <w:sz w:val="24"/>
+          <w:szCs w:val="24"/>
+          <w:lang w:val="en-US"/>
+        </w:rPr>
+        <w:drawing>
+          <wp:inline distT="0" distB="0" distL="0" distR="0" wp14:anchorId="4D6325F3" wp14:editId="6FB3CA9E">
+            <wp:extent cx="5731510" cy="1360805"/>
+            <wp:effectExtent l="0" t="0" r="2540" b="0"/>
+            <wp:docPr id="235934842" name="Picture 1"/>
+            <wp:cNvGraphicFramePr>
+              <a:graphicFrameLocks xmlns:a="http://schemas.openxmlformats.org/drawingml/2006/main" noChangeAspect="1"/>
+            </wp:cNvGraphicFramePr>
+            <a:graphic xmlns:a="http://schemas.openxmlformats.org/drawingml/2006/main">
+              <a:graphicData uri="http://schemas.openxmlformats.org/drawingml/2006/picture">
+                <pic:pic xmlns:pic="http://schemas.openxmlformats.org/drawingml/2006/picture">
+                  <pic:nvPicPr>
+                    <pic:cNvPr id="235934842" name=""/>
+                    <pic:cNvPicPr/>
+                  </pic:nvPicPr>
+                  <pic:blipFill>
+                    <a:blip r:embed="rId23"/>
+                    <a:stretch>
+                      <a:fillRect/>
+                    </a:stretch>
+                  </pic:blipFill>
+                  <pic:spPr>
+                    <a:xfrm>
+                      <a:off x="0" y="0"/>
+                      <a:ext cx="5731510" cy="1360805"/>
+                    </a:xfrm>
+                    <a:prstGeom prst="rect">
+                      <a:avLst/>
+                    </a:prstGeom>
+                  </pic:spPr>
+                </pic:pic>
+              </a:graphicData>
+            </a:graphic>
+          </wp:inline>
+        </w:drawing>
+      </w:r>
+    </w:p>
+    <w:p>
+      <w:pPr>
+        <w:jc w:val="both"/>
+        <w:rPr>
+          <w:sz w:val="24"/>
+          <w:szCs w:val="24"/>
+          <w:lang w:val="en-US"/>
+        </w:rPr>
+      </w:pPr>
+    </w:p>
+    <w:p>
+      <w:pPr>
+        <w:pStyle w:val="ListParagraph"/>
+        <w:numPr>
+          <w:ilvl w:val="0"/>
+          <w:numId w:val="7"/>
+        </w:numPr>
+        <w:jc w:val="both"/>
+        <w:rPr>
+          <w:sz w:val="24"/>
+          <w:szCs w:val="24"/>
+          <w:lang w:val="en-US"/>
+        </w:rPr>
+      </w:pPr>
+      <w:r>
+        <w:rPr>
+          <w:sz w:val="24"/>
+          <w:szCs w:val="24"/>
+          <w:lang w:val="en-US"/>
+        </w:rPr>
+        <w:t xml:space="preserve"> Code of </w:t>
+      </w:r>
+      <w:proofErr w:type="spellStart"/>
+      <w:proofErr w:type="gramStart"/>
+      <w:r>
+        <w:rPr>
+          <w:sz w:val="24"/>
+          <w:szCs w:val="24"/>
+          <w:lang w:val="en-US"/>
+        </w:rPr>
+        <w:t>ModelCheckpoint</w:t>
+      </w:r>
+      <w:proofErr w:type="spellEnd"/>
+      <w:r>
+        <w:rPr>
+          <w:sz w:val="24"/>
+          <w:szCs w:val="24"/>
+          <w:lang w:val="en-US"/>
+        </w:rPr>
+        <w:t>(</w:t>
+      </w:r>
+      <w:proofErr w:type="gramEnd"/>
+      <w:r>
+        <w:rPr>
+          <w:sz w:val="24"/>
+          <w:szCs w:val="24"/>
+          <w:lang w:val="en-US"/>
+        </w:rPr>
+        <w:t>) function</w:t>
+      </w:r>
+    </w:p>
+    <w:p>
+      <w:pPr>
+        <w:jc w:val="both"/>
+        <w:rPr>
+          <w:sz w:val="44"/>
+          <w:szCs w:val="44"/>
+          <w:u w:val="single"/>
+        </w:rPr>
+      </w:pPr>
+      <w:r>
+        <w:rPr>
+          <w:noProof/>
+          <w:sz w:val="44"/>
+          <w:szCs w:val="44"/>
+          <w:u w:val="single"/>
+        </w:rPr>
+        <w:drawing>
+          <wp:inline distT="0" distB="0" distL="0" distR="0" wp14:anchorId="5F710C74" wp14:editId="0EF79E21">
+            <wp:extent cx="5731510" cy="1217295"/>
+            <wp:effectExtent l="0" t="0" r="2540" b="1905"/>
+            <wp:docPr id="1495966457" name="Picture 1"/>
+            <wp:cNvGraphicFramePr>
+              <a:graphicFrameLocks xmlns:a="http://schemas.openxmlformats.org/drawingml/2006/main" noChangeAspect="1"/>
+            </wp:cNvGraphicFramePr>
+            <a:graphic xmlns:a="http://schemas.openxmlformats.org/drawingml/2006/main">
+              <a:graphicData uri="http://schemas.openxmlformats.org/drawingml/2006/picture">
+                <pic:pic xmlns:pic="http://schemas.openxmlformats.org/drawingml/2006/picture">
+                  <pic:nvPicPr>
+                    <pic:cNvPr id="1495966457" name=""/>
+                    <pic:cNvPicPr/>
+                  </pic:nvPicPr>
+                  <pic:blipFill>
+                    <a:blip r:embed="rId24"/>
+                    <a:stretch>
+                      <a:fillRect/>
+                    </a:stretch>
+                  </pic:blipFill>
+                  <pic:spPr>
+                    <a:xfrm>
+                      <a:off x="0" y="0"/>
+                      <a:ext cx="5731510" cy="1217295"/>
+                    </a:xfrm>
+                    <a:prstGeom prst="rect">
+                      <a:avLst/>
+                    </a:prstGeom>
+                  </pic:spPr>
+                </pic:pic>
+              </a:graphicData>
+            </a:graphic>
+          </wp:inline>
+        </w:drawing>
+      </w:r>
+    </w:p>
+    <w:p>
+      <w:pPr>
+        <w:jc w:val="both"/>
+        <w:rPr>
+          <w:sz w:val="44"/>
+          <w:szCs w:val="44"/>
+          <w:u w:val="single"/>
+        </w:rPr>
+      </w:pPr>
+    </w:p>
+    <w:p>
+      <w:pPr>
+        <w:pStyle w:val="ListParagraph"/>
+        <w:numPr>
+          <w:ilvl w:val="0"/>
+          <w:numId w:val="7"/>
+        </w:numPr>
+        <w:jc w:val="both"/>
+        <w:rPr>
+          <w:sz w:val="24"/>
+          <w:szCs w:val="24"/>
+        </w:rPr>
+      </w:pPr>
+      <w:r>
+        <w:rPr>
+          <w:sz w:val="24"/>
+          <w:szCs w:val="24"/>
+        </w:rPr>
+        <w:t xml:space="preserve">Code of </w:t>
+      </w:r>
+      <w:proofErr w:type="spellStart"/>
+      <w:proofErr w:type="gramStart"/>
+      <w:r>
+        <w:rPr>
+          <w:sz w:val="24"/>
+          <w:szCs w:val="24"/>
+        </w:rPr>
+        <w:t>model.fit</w:t>
+      </w:r>
+      <w:proofErr w:type="spellEnd"/>
+      <w:r>
+        <w:rPr>
+          <w:sz w:val="24"/>
+          <w:szCs w:val="24"/>
+        </w:rPr>
+        <w:t>(</w:t>
+      </w:r>
+      <w:proofErr w:type="gramEnd"/>
+      <w:r>
+        <w:rPr>
+          <w:sz w:val="24"/>
+          <w:szCs w:val="24"/>
+        </w:rPr>
+        <w:t>) function</w:t>
+      </w:r>
+    </w:p>
+    <w:p>
+      <w:pPr>
+        <w:jc w:val="both"/>
+        <w:rPr>
+          <w:sz w:val="24"/>
+          <w:szCs w:val="24"/>
+        </w:rPr>
+      </w:pPr>
+      <w:r>
+        <w:rPr>
+          <w:noProof/>
+        </w:rPr>
+        <w:drawing>
+          <wp:inline distT="0" distB="0" distL="0" distR="0" wp14:anchorId="4C79FF40" wp14:editId="7F421AFB">
+            <wp:extent cx="5731510" cy="1559560"/>
+            <wp:effectExtent l="0" t="0" r="2540" b="2540"/>
+            <wp:docPr id="462324162" name="Picture 1"/>
+            <wp:cNvGraphicFramePr>
+              <a:graphicFrameLocks xmlns:a="http://schemas.openxmlformats.org/drawingml/2006/main" noChangeAspect="1"/>
+            </wp:cNvGraphicFramePr>
+            <a:graphic xmlns:a="http://schemas.openxmlformats.org/drawingml/2006/main">
+              <a:graphicData uri="http://schemas.openxmlformats.org/drawingml/2006/picture">
+                <pic:pic xmlns:pic="http://schemas.openxmlformats.org/drawingml/2006/picture">
+                  <pic:nvPicPr>
+                    <pic:cNvPr id="462324162" name=""/>
+                    <pic:cNvPicPr/>
+                  </pic:nvPicPr>
+                  <pic:blipFill>
+                    <a:blip r:embed="rId25"/>
+                    <a:stretch>
+                      <a:fillRect/>
+                    </a:stretch>
+                  </pic:blipFill>
+                  <pic:spPr>
+                    <a:xfrm>
+                      <a:off x="0" y="0"/>
+                      <a:ext cx="5731510" cy="1559560"/>
+                    </a:xfrm>
+                    <a:prstGeom prst="rect">
+                      <a:avLst/>
+                    </a:prstGeom>
+                  </pic:spPr>
+                </pic:pic>
+              </a:graphicData>
+            </a:graphic>
+          </wp:inline>
+        </w:drawing>
+      </w:r>
+    </w:p>
+    <w:p>
+      <w:pPr>
+        <w:pStyle w:val="ListParagraph"/>
+        <w:ind w:left="1080"/>
+        <w:jc w:val="both"/>
+        <w:rPr>
+          <w:sz w:val="24"/>
+          <w:szCs w:val="24"/>
+        </w:rPr>
+      </w:pPr>
+    </w:p>
+    <w:p>
+      <w:pPr>
+        <w:pStyle w:val="ListParagraph"/>
+        <w:ind w:left="1080"/>
+        <w:jc w:val="both"/>
+        <w:rPr>
+          <w:sz w:val="24"/>
+          <w:szCs w:val="24"/>
+        </w:rPr>
+      </w:pPr>
+    </w:p>
+    <w:p>
+      <w:pPr>
+        <w:pStyle w:val="ListParagraph"/>
+        <w:ind w:left="1080"/>
+        <w:jc w:val="both"/>
+        <w:rPr>
+          <w:sz w:val="24"/>
+          <w:szCs w:val="24"/>
+        </w:rPr>
+      </w:pPr>
+    </w:p>
+    <w:p>
+      <w:pPr>
+        <w:pStyle w:val="ListParagraph"/>
+        <w:ind w:left="1080"/>
+        <w:jc w:val="both"/>
+        <w:rPr>
+          <w:sz w:val="24"/>
+          <w:szCs w:val="24"/>
+        </w:rPr>
+      </w:pPr>
+    </w:p>
+    <w:p>
+      <w:pPr>
+        <w:pStyle w:val="ListParagraph"/>
+        <w:ind w:left="1080"/>
+        <w:jc w:val="both"/>
+        <w:rPr>
+          <w:sz w:val="24"/>
+          <w:szCs w:val="24"/>
+        </w:rPr>
+      </w:pPr>
+    </w:p>
+    <w:p>
+      <w:pPr>
+        <w:pStyle w:val="ListParagraph"/>
+        <w:ind w:left="1080"/>
+        <w:jc w:val="both"/>
+        <w:rPr>
+          <w:sz w:val="24"/>
+          <w:szCs w:val="24"/>
+        </w:rPr>
+      </w:pPr>
+    </w:p>
+    <w:p>
+      <w:pPr>
+        <w:pStyle w:val="ListParagraph"/>
+        <w:ind w:left="1080"/>
+        <w:jc w:val="both"/>
+        <w:rPr>
+          <w:sz w:val="24"/>
+          <w:szCs w:val="24"/>
+        </w:rPr>
+      </w:pPr>
+    </w:p>
+    <w:p>
+      <w:pPr>
+        <w:pStyle w:val="ListParagraph"/>
+        <w:ind w:left="1080"/>
+        <w:jc w:val="both"/>
+        <w:rPr>
+          <w:sz w:val="24"/>
+          <w:szCs w:val="24"/>
+        </w:rPr>
+      </w:pPr>
+    </w:p>
+    <w:p>
+      <w:pPr>
+        <w:pStyle w:val="ListParagraph"/>
+        <w:ind w:left="1080"/>
+        <w:jc w:val="both"/>
+        <w:rPr>
+          <w:sz w:val="24"/>
+          <w:szCs w:val="24"/>
+        </w:rPr>
+      </w:pPr>
+    </w:p>
+    <w:p>
+      <w:pPr>
+        <w:pStyle w:val="ListParagraph"/>
+        <w:ind w:left="1080"/>
+        <w:jc w:val="both"/>
+        <w:rPr>
+          <w:sz w:val="24"/>
+          <w:szCs w:val="24"/>
+        </w:rPr>
+      </w:pPr>
+    </w:p>
+    <w:p>
+      <w:pPr>
+        <w:pStyle w:val="ListParagraph"/>
+        <w:ind w:left="1080"/>
+        <w:jc w:val="both"/>
+        <w:rPr>
+          <w:sz w:val="24"/>
+          <w:szCs w:val="24"/>
+        </w:rPr>
+      </w:pPr>
+    </w:p>
+    <w:p>
+      <w:pPr>
+        <w:ind w:left="720"/>
+        <w:jc w:val="both"/>
+        <w:rPr>
+          <w:sz w:val="24"/>
+          <w:szCs w:val="24"/>
+        </w:rPr>
+      </w:pPr>
+      <w:r>
+        <w:rPr>
+          <w:sz w:val="24"/>
+          <w:szCs w:val="24"/>
+        </w:rPr>
+        <w:t xml:space="preserve">Training result of </w:t>
+      </w:r>
+      <w:proofErr w:type="spellStart"/>
+      <w:proofErr w:type="gramStart"/>
+      <w:r>
+        <w:rPr>
+          <w:sz w:val="24"/>
+          <w:szCs w:val="24"/>
+        </w:rPr>
+        <w:t>model.fit</w:t>
+      </w:r>
+      <w:proofErr w:type="spellEnd"/>
+      <w:r>
+        <w:rPr>
+          <w:sz w:val="24"/>
+          <w:szCs w:val="24"/>
+        </w:rPr>
+        <w:t>(</w:t>
+      </w:r>
+      <w:proofErr w:type="gramEnd"/>
+      <w:r>
+        <w:rPr>
+          <w:sz w:val="24"/>
+          <w:szCs w:val="24"/>
+        </w:rPr>
+        <w:t>) function</w:t>
+      </w:r>
+    </w:p>
+    <w:p>
+      <w:pPr>
+        <w:pStyle w:val="ListParagraph"/>
+        <w:ind w:left="1080"/>
+        <w:jc w:val="both"/>
+        <w:rPr>
+          <w:sz w:val="24"/>
+          <w:szCs w:val="24"/>
+        </w:rPr>
+      </w:pPr>
+    </w:p>
+    <w:p>
+      <w:pPr>
+        <w:rPr>
+          <w:sz w:val="24"/>
+          <w:szCs w:val="24"/>
+        </w:rPr>
+      </w:pPr>
+      <w:r>
+        <w:rPr>
+          <w:noProof/>
+        </w:rPr>
+        <w:drawing>
+          <wp:inline distT="0" distB="0" distL="0" distR="0" wp14:anchorId="2611FC22" wp14:editId="1B025C07">
+            <wp:extent cx="5731510" cy="3538855"/>
+            <wp:effectExtent l="0" t="0" r="2540" b="4445"/>
+            <wp:docPr id="1303297573" name="Picture 1"/>
+            <wp:cNvGraphicFramePr>
+              <a:graphicFrameLocks xmlns:a="http://schemas.openxmlformats.org/drawingml/2006/main" noChangeAspect="1"/>
+            </wp:cNvGraphicFramePr>
+            <a:graphic xmlns:a="http://schemas.openxmlformats.org/drawingml/2006/main">
+              <a:graphicData uri="http://schemas.openxmlformats.org/drawingml/2006/picture">
+                <pic:pic xmlns:pic="http://schemas.openxmlformats.org/drawingml/2006/picture">
+                  <pic:nvPicPr>
+                    <pic:cNvPr id="1303297573" name=""/>
+                    <pic:cNvPicPr/>
+                  </pic:nvPicPr>
+                  <pic:blipFill>
+                    <a:blip r:embed="rId26"/>
+                    <a:stretch>
+                      <a:fillRect/>
+                    </a:stretch>
+                  </pic:blipFill>
+                  <pic:spPr>
+                    <a:xfrm>
+                      <a:off x="0" y="0"/>
+                      <a:ext cx="5731510" cy="3538855"/>
+                    </a:xfrm>
+                    <a:prstGeom prst="rect">
+                      <a:avLst/>
+                    </a:prstGeom>
+                  </pic:spPr>
+                </pic:pic>
+              </a:graphicData>
+            </a:graphic>
+          </wp:inline>
+        </w:drawing>
+      </w:r>
+    </w:p>
+    <w:p>
+      <w:pPr>
+        <w:jc w:val="both"/>
+        <w:rPr>
+          <w:sz w:val="44"/>
+          <w:szCs w:val="44"/>
+          <w:u w:val="single"/>
+        </w:rPr>
+      </w:pPr>
+      <w:r>
+        <w:rPr>
+          <w:noProof/>
+          <w:sz w:val="44"/>
+          <w:szCs w:val="44"/>
+          <w:u w:val="single"/>
+        </w:rPr>
+        <w:drawing>
+          <wp:inline distT="0" distB="0" distL="0" distR="0" wp14:anchorId="44912A72" wp14:editId="10163035">
+            <wp:extent cx="5731510" cy="3387725"/>
+            <wp:effectExtent l="0" t="0" r="2540" b="3175"/>
+            <wp:docPr id="1371738814" name="Picture 1"/>
+            <wp:cNvGraphicFramePr>
+              <a:graphicFrameLocks xmlns:a="http://schemas.openxmlformats.org/drawingml/2006/main" noChangeAspect="1"/>
+            </wp:cNvGraphicFramePr>
+            <a:graphic xmlns:a="http://schemas.openxmlformats.org/drawingml/2006/main">
+              <a:graphicData uri="http://schemas.openxmlformats.org/drawingml/2006/picture">
+                <pic:pic xmlns:pic="http://schemas.openxmlformats.org/drawingml/2006/picture">
+                  <pic:nvPicPr>
+                    <pic:cNvPr id="1371738814" name=""/>
+                    <pic:cNvPicPr/>
+                  </pic:nvPicPr>
+                  <pic:blipFill>
+                    <a:blip r:embed="rId27"/>
+                    <a:stretch>
+                      <a:fillRect/>
+                    </a:stretch>
+                  </pic:blipFill>
+                  <pic:spPr>
+                    <a:xfrm>
+                      <a:off x="0" y="0"/>
+                      <a:ext cx="5731510" cy="3387725"/>
+                    </a:xfrm>
+                    <a:prstGeom prst="rect">
+                      <a:avLst/>
+                    </a:prstGeom>
+                  </pic:spPr>
+                </pic:pic>
+              </a:graphicData>
+            </a:graphic>
+          </wp:inline>
+        </w:drawing>
+      </w:r>
+    </w:p>
+    <w:p>
+      <w:pPr>
+        <w:jc w:val="both"/>
+        <w:rPr>
+          <w:sz w:val="24"/>
+          <w:szCs w:val="24"/>
+        </w:rPr>
+      </w:pPr>
+    </w:p>
+    <w:p>
+      <w:pPr>
+        <w:jc w:val="both"/>
+        <w:rPr>
+          <w:sz w:val="24"/>
+          <w:szCs w:val="24"/>
+        </w:rPr>
+      </w:pPr>
+    </w:p>
+    <w:p>
+      <w:pPr>
+        <w:jc w:val="both"/>
+        <w:rPr>
+          <w:sz w:val="24"/>
+          <w:szCs w:val="24"/>
+          <w:lang w:val="en-US"/>
+        </w:rPr>
+      </w:pPr>
+      <w:r>
+        <w:rPr>
+          <w:sz w:val="24"/>
+          <w:szCs w:val="24"/>
+        </w:rPr>
+        <w:lastRenderedPageBreak/>
+        <w:t xml:space="preserve">(iv) </w:t>
+      </w:r>
+      <w:r>
+        <w:rPr>
+          <w:sz w:val="24"/>
+          <w:szCs w:val="24"/>
+          <w:lang w:val="en-US"/>
+        </w:rPr>
+        <w:t>T</w:t>
+      </w:r>
+      <w:r>
+        <w:rPr>
+          <w:sz w:val="24"/>
+          <w:szCs w:val="24"/>
+          <w:lang w:val="en-US"/>
+        </w:rPr>
+        <w:t xml:space="preserve">est Accuracy and other error metrics for the classification task using </w:t>
+      </w:r>
+      <w:proofErr w:type="spellStart"/>
+      <w:r>
+        <w:rPr>
+          <w:sz w:val="24"/>
+          <w:szCs w:val="24"/>
+          <w:lang w:val="en-US"/>
+        </w:rPr>
+        <w:t>classification_</w:t>
+      </w:r>
+      <w:proofErr w:type="gramStart"/>
+      <w:r>
+        <w:rPr>
+          <w:sz w:val="24"/>
+          <w:szCs w:val="24"/>
+          <w:lang w:val="en-US"/>
+        </w:rPr>
+        <w:t>report</w:t>
+      </w:r>
+      <w:proofErr w:type="spellEnd"/>
+      <w:r>
+        <w:rPr>
+          <w:sz w:val="24"/>
+          <w:szCs w:val="24"/>
+          <w:lang w:val="en-US"/>
+        </w:rPr>
+        <w:t>(</w:t>
+      </w:r>
+      <w:proofErr w:type="gramEnd"/>
+      <w:r>
+        <w:rPr>
+          <w:sz w:val="24"/>
+          <w:szCs w:val="24"/>
+          <w:lang w:val="en-US"/>
+        </w:rPr>
+        <w:t>)</w:t>
+      </w:r>
+    </w:p>
+    <w:p>
+      <w:pPr>
+        <w:jc w:val="both"/>
+        <w:rPr>
+          <w:sz w:val="44"/>
+          <w:szCs w:val="44"/>
+          <w:u w:val="single"/>
+        </w:rPr>
+      </w:pPr>
+    </w:p>
+    <w:p>
+      <w:pPr>
+        <w:jc w:val="both"/>
+        <w:rPr>
+          <w:sz w:val="44"/>
+          <w:szCs w:val="44"/>
+          <w:u w:val="single"/>
+        </w:rPr>
+      </w:pPr>
+      <w:r>
+        <w:rPr>
+          <w:noProof/>
+          <w:sz w:val="44"/>
+          <w:szCs w:val="44"/>
+          <w:u w:val="single"/>
+        </w:rPr>
+        <w:drawing>
+          <wp:inline distT="0" distB="0" distL="0" distR="0" wp14:anchorId="3E441E19" wp14:editId="56436B70">
+            <wp:extent cx="5731510" cy="2042160"/>
+            <wp:effectExtent l="0" t="0" r="2540" b="0"/>
+            <wp:docPr id="1806874566" name="Picture 1"/>
+            <wp:cNvGraphicFramePr>
+              <a:graphicFrameLocks xmlns:a="http://schemas.openxmlformats.org/drawingml/2006/main" noChangeAspect="1"/>
+            </wp:cNvGraphicFramePr>
+            <a:graphic xmlns:a="http://schemas.openxmlformats.org/drawingml/2006/main">
+              <a:graphicData uri="http://schemas.openxmlformats.org/drawingml/2006/picture">
+                <pic:pic xmlns:pic="http://schemas.openxmlformats.org/drawingml/2006/picture">
+                  <pic:nvPicPr>
+                    <pic:cNvPr id="1806874566" name=""/>
+                    <pic:cNvPicPr/>
+                  </pic:nvPicPr>
+                  <pic:blipFill>
+                    <a:blip r:embed="rId28"/>
+                    <a:stretch>
+                      <a:fillRect/>
+                    </a:stretch>
+                  </pic:blipFill>
+                  <pic:spPr>
+                    <a:xfrm>
+                      <a:off x="0" y="0"/>
+                      <a:ext cx="5731510" cy="2042160"/>
+                    </a:xfrm>
+                    <a:prstGeom prst="rect">
+                      <a:avLst/>
+                    </a:prstGeom>
+                  </pic:spPr>
+                </pic:pic>
+              </a:graphicData>
+            </a:graphic>
+          </wp:inline>
+        </w:drawing>
+      </w:r>
+    </w:p>
+    <w:p>
+      <w:pPr>
+        <w:jc w:val="both"/>
+        <w:rPr>
+          <w:sz w:val="24"/>
+          <w:szCs w:val="24"/>
+        </w:rPr>
+      </w:pPr>
+    </w:p>
+    <w:p>
+      <w:pPr>
+        <w:pStyle w:val="ListParagraph"/>
+        <w:numPr>
+          <w:ilvl w:val="0"/>
+          <w:numId w:val="4"/>
+        </w:numPr>
+        <w:jc w:val="both"/>
+        <w:rPr>
+          <w:sz w:val="24"/>
+          <w:szCs w:val="24"/>
+          <w:lang w:val="en-US"/>
+        </w:rPr>
+      </w:pPr>
+      <w:r>
+        <w:rPr>
+          <w:sz w:val="24"/>
+          <w:szCs w:val="24"/>
+          <w:lang w:val="en-US"/>
+        </w:rPr>
+        <w:t>Accuracy detailed graph</w:t>
+      </w:r>
+    </w:p>
+    <w:p>
+      <w:pPr>
+        <w:jc w:val="both"/>
+        <w:rPr>
+          <w:sz w:val="44"/>
+          <w:szCs w:val="44"/>
+          <w:u w:val="single"/>
+        </w:rPr>
+      </w:pPr>
+      <w:r>
+        <w:rPr>
+          <w:noProof/>
+          <w:sz w:val="44"/>
+          <w:szCs w:val="44"/>
+          <w:u w:val="single"/>
+        </w:rPr>
+        <w:drawing>
+          <wp:inline distT="0" distB="0" distL="0" distR="0" wp14:anchorId="737D9707" wp14:editId="3417E499">
+            <wp:extent cx="5730429" cy="2756535"/>
+            <wp:effectExtent l="0" t="0" r="3810" b="5715"/>
+            <wp:docPr id="1414790266" name="Picture 1"/>
+            <wp:cNvGraphicFramePr>
+              <a:graphicFrameLocks xmlns:a="http://schemas.openxmlformats.org/drawingml/2006/main" noChangeAspect="1"/>
+            </wp:cNvGraphicFramePr>
+            <a:graphic xmlns:a="http://schemas.openxmlformats.org/drawingml/2006/main">
+              <a:graphicData uri="http://schemas.openxmlformats.org/drawingml/2006/picture">
+                <pic:pic xmlns:pic="http://schemas.openxmlformats.org/drawingml/2006/picture">
+                  <pic:nvPicPr>
+                    <pic:cNvPr id="1414790266" name=""/>
+                    <pic:cNvPicPr/>
+                  </pic:nvPicPr>
+                  <pic:blipFill rotWithShape="1">
+                    <a:blip r:embed="rId29"/>
+                    <a:srcRect b="1188"/>
+                    <a:stretch>
+                      <a:fillRect/>
+                    </a:stretch>
+                  </pic:blipFill>
+                  <pic:spPr bwMode="auto">
+                    <a:xfrm>
+                      <a:off x="0" y="0"/>
+                      <a:ext cx="5731510" cy="2757055"/>
+                    </a:xfrm>
+                    <a:prstGeom prst="rect">
+                      <a:avLst/>
+                    </a:prstGeom>
+                    <a:ln>
+                      <a:noFill/>
+                    </a:ln>
+                    <a:extLst>
+                      <a:ext uri="{53640926-AAD7-44D8-BBD7-CCE9431645EC}">
+                        <a14:shadowObscured xmlns:a14="http://schemas.microsoft.com/office/drawing/2010/main"/>
+                      </a:ext>
+                    </a:extLst>
+                  </pic:spPr>
+                </pic:pic>
+              </a:graphicData>
+            </a:graphic>
+          </wp:inline>
+        </w:drawing>
+      </w:r>
     </w:p>
     <w:p>
       <w:pPr>
@@ -5666,7 +6576,7 @@
   <w:style w:type="paragraph" w:default="1" w:styleId="Normal">
     <w:name w:val="Normal"/>
     <w:qFormat/>
-    <w:rsid w:val="002B27D1"/>
+    <w:rsid w:val="00975065"/>
   </w:style>
   <w:style w:type="paragraph" w:styleId="Heading3">
     <w:name w:val="heading 3"/>

</xml_diff>

<commit_message>
Week 10 Exercices added
</commit_message>
<xml_diff>
--- a/LABlogbook_2523747_Neural Computing and Deep Learning (2025 MOD006568 TRI2 F01CIN).docx
+++ b/LABlogbook_2523747_Neural Computing and Deep Learning (2025 MOD006568 TRI2 F01CIN).docx
@@ -580,25 +580,7 @@
           <w:szCs w:val="20"/>
           <w:lang w:val="en-US"/>
         </w:rPr>
-        <w:t xml:space="preserve"> Layer (</w:t>
-      </w:r>
-      <w:proofErr w:type="gramStart"/>
-      <w:r>
-        <w:rPr>
-          <w:sz w:val="20"/>
-          <w:szCs w:val="20"/>
-          <w:lang w:val="en-US"/>
-        </w:rPr>
-        <w:t xml:space="preserve">type)   </w:t>
-      </w:r>
-      <w:proofErr w:type="gramEnd"/>
-      <w:r>
-        <w:rPr>
-          <w:sz w:val="20"/>
-          <w:szCs w:val="20"/>
-          <w:lang w:val="en-US"/>
-        </w:rPr>
-        <w:t xml:space="preserve">             Output Shape              Param #   </w:t>
+        <w:t xml:space="preserve"> Layer (type)                Output Shape              Param #   </w:t>
       </w:r>
     </w:p>
     <w:p>
@@ -634,43 +616,7 @@
           <w:szCs w:val="20"/>
           <w:lang w:val="en-US"/>
         </w:rPr>
-        <w:t xml:space="preserve"> flatten (</w:t>
-      </w:r>
-      <w:proofErr w:type="gramStart"/>
-      <w:r>
-        <w:rPr>
-          <w:sz w:val="20"/>
-          <w:szCs w:val="20"/>
-          <w:lang w:val="en-US"/>
-        </w:rPr>
-        <w:t xml:space="preserve">Flatten)   </w:t>
-      </w:r>
-      <w:proofErr w:type="gramEnd"/>
-      <w:r>
-        <w:rPr>
-          <w:sz w:val="20"/>
-          <w:szCs w:val="20"/>
-          <w:lang w:val="en-US"/>
-        </w:rPr>
-        <w:t xml:space="preserve">     </w:t>
-      </w:r>
-      <w:proofErr w:type="gramStart"/>
-      <w:r>
-        <w:rPr>
-          <w:sz w:val="20"/>
-          <w:szCs w:val="20"/>
-          <w:lang w:val="en-US"/>
-        </w:rPr>
-        <w:t xml:space="preserve">   (</w:t>
-      </w:r>
-      <w:proofErr w:type="gramEnd"/>
-      <w:r>
-        <w:rPr>
-          <w:sz w:val="20"/>
-          <w:szCs w:val="20"/>
-          <w:lang w:val="en-US"/>
-        </w:rPr>
-        <w:t xml:space="preserve">None, 784)               0         </w:t>
+        <w:t xml:space="preserve"> flatten (Flatten)           (None, 784)               0         </w:t>
       </w:r>
     </w:p>
     <w:p>
@@ -706,43 +652,7 @@
           <w:szCs w:val="20"/>
           <w:lang w:val="en-US"/>
         </w:rPr>
-        <w:t xml:space="preserve"> dense (</w:t>
-      </w:r>
-      <w:proofErr w:type="gramStart"/>
-      <w:r>
-        <w:rPr>
-          <w:sz w:val="20"/>
-          <w:szCs w:val="20"/>
-          <w:lang w:val="en-US"/>
-        </w:rPr>
-        <w:t xml:space="preserve">Dense)   </w:t>
-      </w:r>
-      <w:proofErr w:type="gramEnd"/>
-      <w:r>
-        <w:rPr>
-          <w:sz w:val="20"/>
-          <w:szCs w:val="20"/>
-          <w:lang w:val="en-US"/>
-        </w:rPr>
-        <w:t xml:space="preserve">         </w:t>
-      </w:r>
-      <w:proofErr w:type="gramStart"/>
-      <w:r>
-        <w:rPr>
-          <w:sz w:val="20"/>
-          <w:szCs w:val="20"/>
-          <w:lang w:val="en-US"/>
-        </w:rPr>
-        <w:t xml:space="preserve">   (</w:t>
-      </w:r>
-      <w:proofErr w:type="gramEnd"/>
-      <w:r>
-        <w:rPr>
-          <w:sz w:val="20"/>
-          <w:szCs w:val="20"/>
-          <w:lang w:val="en-US"/>
-        </w:rPr>
-        <w:t xml:space="preserve">None, 128)               100480    </w:t>
+        <w:t xml:space="preserve"> dense (Dense)               (None, 128)               100480    </w:t>
       </w:r>
     </w:p>
     <w:p>
@@ -778,43 +688,7 @@
           <w:szCs w:val="20"/>
           <w:lang w:val="en-US"/>
         </w:rPr>
-        <w:t xml:space="preserve"> dense_1 (</w:t>
-      </w:r>
-      <w:proofErr w:type="gramStart"/>
-      <w:r>
-        <w:rPr>
-          <w:sz w:val="20"/>
-          <w:szCs w:val="20"/>
-          <w:lang w:val="en-US"/>
-        </w:rPr>
-        <w:t xml:space="preserve">Dense)   </w:t>
-      </w:r>
-      <w:proofErr w:type="gramEnd"/>
-      <w:r>
-        <w:rPr>
-          <w:sz w:val="20"/>
-          <w:szCs w:val="20"/>
-          <w:lang w:val="en-US"/>
-        </w:rPr>
-        <w:t xml:space="preserve">       </w:t>
-      </w:r>
-      <w:proofErr w:type="gramStart"/>
-      <w:r>
-        <w:rPr>
-          <w:sz w:val="20"/>
-          <w:szCs w:val="20"/>
-          <w:lang w:val="en-US"/>
-        </w:rPr>
-        <w:t xml:space="preserve">   (</w:t>
-      </w:r>
-      <w:proofErr w:type="gramEnd"/>
-      <w:r>
-        <w:rPr>
-          <w:sz w:val="20"/>
-          <w:szCs w:val="20"/>
-          <w:lang w:val="en-US"/>
-        </w:rPr>
-        <w:t xml:space="preserve">None, 64)                8256      </w:t>
+        <w:t xml:space="preserve"> dense_1 (Dense)             (None, 64)                8256      </w:t>
       </w:r>
     </w:p>
     <w:p>
@@ -850,43 +724,7 @@
           <w:szCs w:val="20"/>
           <w:lang w:val="en-US"/>
         </w:rPr>
-        <w:t xml:space="preserve"> dense_2 (</w:t>
-      </w:r>
-      <w:proofErr w:type="gramStart"/>
-      <w:r>
-        <w:rPr>
-          <w:sz w:val="20"/>
-          <w:szCs w:val="20"/>
-          <w:lang w:val="en-US"/>
-        </w:rPr>
-        <w:t xml:space="preserve">Dense)   </w:t>
-      </w:r>
-      <w:proofErr w:type="gramEnd"/>
-      <w:r>
-        <w:rPr>
-          <w:sz w:val="20"/>
-          <w:szCs w:val="20"/>
-          <w:lang w:val="en-US"/>
-        </w:rPr>
-        <w:t xml:space="preserve">       </w:t>
-      </w:r>
-      <w:proofErr w:type="gramStart"/>
-      <w:r>
-        <w:rPr>
-          <w:sz w:val="20"/>
-          <w:szCs w:val="20"/>
-          <w:lang w:val="en-US"/>
-        </w:rPr>
-        <w:t xml:space="preserve">   (</w:t>
-      </w:r>
-      <w:proofErr w:type="gramEnd"/>
-      <w:r>
-        <w:rPr>
-          <w:sz w:val="20"/>
-          <w:szCs w:val="20"/>
-          <w:lang w:val="en-US"/>
-        </w:rPr>
-        <w:t xml:space="preserve">None, 10)                650       </w:t>
+        <w:t xml:space="preserve"> dense_2 (Dense)             (None, 10)                650       </w:t>
       </w:r>
     </w:p>
     <w:p>
@@ -1201,25 +1039,7 @@
           <w:szCs w:val="20"/>
           <w:lang w:val="en-US"/>
         </w:rPr>
-        <w:t>Layer (</w:t>
-      </w:r>
-      <w:proofErr w:type="gramStart"/>
-      <w:r>
-        <w:rPr>
-          <w:sz w:val="20"/>
-          <w:szCs w:val="20"/>
-          <w:lang w:val="en-US"/>
-        </w:rPr>
-        <w:t xml:space="preserve">type)   </w:t>
-      </w:r>
-      <w:proofErr w:type="gramEnd"/>
-      <w:r>
-        <w:rPr>
-          <w:sz w:val="20"/>
-          <w:szCs w:val="20"/>
-          <w:lang w:val="en-US"/>
-        </w:rPr>
-        <w:t xml:space="preserve">             Output Shape              Param #   </w:t>
+        <w:t xml:space="preserve">Layer (type)                Output Shape              Param #   </w:t>
       </w:r>
     </w:p>
     <w:p>
@@ -1257,43 +1077,7 @@
           <w:szCs w:val="20"/>
           <w:lang w:val="en-US"/>
         </w:rPr>
-        <w:t xml:space="preserve"> dense (</w:t>
-      </w:r>
-      <w:proofErr w:type="gramStart"/>
-      <w:r>
-        <w:rPr>
-          <w:sz w:val="20"/>
-          <w:szCs w:val="20"/>
-          <w:lang w:val="en-US"/>
-        </w:rPr>
-        <w:t xml:space="preserve">Dense)   </w:t>
-      </w:r>
-      <w:proofErr w:type="gramEnd"/>
-      <w:r>
-        <w:rPr>
-          <w:sz w:val="20"/>
-          <w:szCs w:val="20"/>
-          <w:lang w:val="en-US"/>
-        </w:rPr>
-        <w:t xml:space="preserve">         </w:t>
-      </w:r>
-      <w:proofErr w:type="gramStart"/>
-      <w:r>
-        <w:rPr>
-          <w:sz w:val="20"/>
-          <w:szCs w:val="20"/>
-          <w:lang w:val="en-US"/>
-        </w:rPr>
-        <w:t xml:space="preserve">   (</w:t>
-      </w:r>
-      <w:proofErr w:type="gramEnd"/>
-      <w:r>
-        <w:rPr>
-          <w:sz w:val="20"/>
-          <w:szCs w:val="20"/>
-          <w:lang w:val="en-US"/>
-        </w:rPr>
-        <w:t xml:space="preserve">None, 64)                1280      </w:t>
+        <w:t xml:space="preserve"> dense (Dense)               (None, 64)                1280      </w:t>
       </w:r>
     </w:p>
     <w:p>
@@ -1331,43 +1115,7 @@
           <w:szCs w:val="20"/>
           <w:lang w:val="en-US"/>
         </w:rPr>
-        <w:t xml:space="preserve"> dense_1 (</w:t>
-      </w:r>
-      <w:proofErr w:type="gramStart"/>
-      <w:r>
-        <w:rPr>
-          <w:sz w:val="20"/>
-          <w:szCs w:val="20"/>
-          <w:lang w:val="en-US"/>
-        </w:rPr>
-        <w:t xml:space="preserve">Dense)   </w:t>
-      </w:r>
-      <w:proofErr w:type="gramEnd"/>
-      <w:r>
-        <w:rPr>
-          <w:sz w:val="20"/>
-          <w:szCs w:val="20"/>
-          <w:lang w:val="en-US"/>
-        </w:rPr>
-        <w:t xml:space="preserve">       </w:t>
-      </w:r>
-      <w:proofErr w:type="gramStart"/>
-      <w:r>
-        <w:rPr>
-          <w:sz w:val="20"/>
-          <w:szCs w:val="20"/>
-          <w:lang w:val="en-US"/>
-        </w:rPr>
-        <w:t xml:space="preserve">   (</w:t>
-      </w:r>
-      <w:proofErr w:type="gramEnd"/>
-      <w:r>
-        <w:rPr>
-          <w:sz w:val="20"/>
-          <w:szCs w:val="20"/>
-          <w:lang w:val="en-US"/>
-        </w:rPr>
-        <w:t xml:space="preserve">None, 128)               8320      </w:t>
+        <w:t xml:space="preserve"> dense_1 (Dense)             (None, 128)               8320      </w:t>
       </w:r>
     </w:p>
     <w:p>
@@ -1405,43 +1153,7 @@
           <w:szCs w:val="20"/>
           <w:lang w:val="en-US"/>
         </w:rPr>
-        <w:t xml:space="preserve"> dense_2 (</w:t>
-      </w:r>
-      <w:proofErr w:type="gramStart"/>
-      <w:r>
-        <w:rPr>
-          <w:sz w:val="20"/>
-          <w:szCs w:val="20"/>
-          <w:lang w:val="en-US"/>
-        </w:rPr>
-        <w:t xml:space="preserve">Dense)   </w:t>
-      </w:r>
-      <w:proofErr w:type="gramEnd"/>
-      <w:r>
-        <w:rPr>
-          <w:sz w:val="20"/>
-          <w:szCs w:val="20"/>
-          <w:lang w:val="en-US"/>
-        </w:rPr>
-        <w:t xml:space="preserve">       </w:t>
-      </w:r>
-      <w:proofErr w:type="gramStart"/>
-      <w:r>
-        <w:rPr>
-          <w:sz w:val="20"/>
-          <w:szCs w:val="20"/>
-          <w:lang w:val="en-US"/>
-        </w:rPr>
-        <w:t xml:space="preserve">   (</w:t>
-      </w:r>
-      <w:proofErr w:type="gramEnd"/>
-      <w:r>
-        <w:rPr>
-          <w:sz w:val="20"/>
-          <w:szCs w:val="20"/>
-          <w:lang w:val="en-US"/>
-        </w:rPr>
-        <w:t xml:space="preserve">None, 64)                8256      </w:t>
+        <w:t xml:space="preserve"> dense_2 (Dense)             (None, 64)                8256      </w:t>
       </w:r>
     </w:p>
     <w:p>
@@ -1479,43 +1191,7 @@
           <w:szCs w:val="20"/>
           <w:lang w:val="en-US"/>
         </w:rPr>
-        <w:t xml:space="preserve"> dropout (</w:t>
-      </w:r>
-      <w:proofErr w:type="gramStart"/>
-      <w:r>
-        <w:rPr>
-          <w:sz w:val="20"/>
-          <w:szCs w:val="20"/>
-          <w:lang w:val="en-US"/>
-        </w:rPr>
-        <w:t xml:space="preserve">Dropout)   </w:t>
-      </w:r>
-      <w:proofErr w:type="gramEnd"/>
-      <w:r>
-        <w:rPr>
-          <w:sz w:val="20"/>
-          <w:szCs w:val="20"/>
-          <w:lang w:val="en-US"/>
-        </w:rPr>
-        <w:t xml:space="preserve">     </w:t>
-      </w:r>
-      <w:proofErr w:type="gramStart"/>
-      <w:r>
-        <w:rPr>
-          <w:sz w:val="20"/>
-          <w:szCs w:val="20"/>
-          <w:lang w:val="en-US"/>
-        </w:rPr>
-        <w:t xml:space="preserve">   (</w:t>
-      </w:r>
-      <w:proofErr w:type="gramEnd"/>
-      <w:r>
-        <w:rPr>
-          <w:sz w:val="20"/>
-          <w:szCs w:val="20"/>
-          <w:lang w:val="en-US"/>
-        </w:rPr>
-        <w:t xml:space="preserve">None, 64)                0         </w:t>
+        <w:t xml:space="preserve"> dropout (Dropout)           (None, 64)                0         </w:t>
       </w:r>
     </w:p>
     <w:p>
@@ -1553,43 +1229,7 @@
           <w:szCs w:val="20"/>
           <w:lang w:val="en-US"/>
         </w:rPr>
-        <w:t xml:space="preserve"> dense_3 (</w:t>
-      </w:r>
-      <w:proofErr w:type="gramStart"/>
-      <w:r>
-        <w:rPr>
-          <w:sz w:val="20"/>
-          <w:szCs w:val="20"/>
-          <w:lang w:val="en-US"/>
-        </w:rPr>
-        <w:t xml:space="preserve">Dense)   </w:t>
-      </w:r>
-      <w:proofErr w:type="gramEnd"/>
-      <w:r>
-        <w:rPr>
-          <w:sz w:val="20"/>
-          <w:szCs w:val="20"/>
-          <w:lang w:val="en-US"/>
-        </w:rPr>
-        <w:t xml:space="preserve">       </w:t>
-      </w:r>
-      <w:proofErr w:type="gramStart"/>
-      <w:r>
-        <w:rPr>
-          <w:sz w:val="20"/>
-          <w:szCs w:val="20"/>
-          <w:lang w:val="en-US"/>
-        </w:rPr>
-        <w:t xml:space="preserve">   (</w:t>
-      </w:r>
-      <w:proofErr w:type="gramEnd"/>
-      <w:r>
-        <w:rPr>
-          <w:sz w:val="20"/>
-          <w:szCs w:val="20"/>
-          <w:lang w:val="en-US"/>
-        </w:rPr>
-        <w:t xml:space="preserve">None, 1)                 65        </w:t>
+        <w:t xml:space="preserve"> dense_3 (Dense)             (None, 1)                 65        </w:t>
       </w:r>
     </w:p>
     <w:p>
@@ -1909,17 +1549,8 @@
           <w:sz w:val="24"/>
           <w:szCs w:val="24"/>
         </w:rPr>
-        <w:t xml:space="preserve"> </w:t>
-      </w:r>
-      <w:proofErr w:type="gramStart"/>
-      <w:r>
-        <w:rPr>
-          <w:sz w:val="24"/>
-          <w:szCs w:val="24"/>
-        </w:rPr>
-        <w:t>=  5</w:t>
-      </w:r>
-      <w:proofErr w:type="gramEnd"/>
+        <w:t xml:space="preserve"> =  5</w:t>
+      </w:r>
     </w:p>
     <w:p>
       <w:pPr>
@@ -2097,39 +1728,8 @@
       <w:pPr>
         <w:jc w:val="both"/>
       </w:pPr>
-      <w:proofErr w:type="spellStart"/>
-      <w:r>
-        <w:t>early_stop</w:t>
-      </w:r>
-      <w:proofErr w:type="spellEnd"/>
-      <w:r>
-        <w:t xml:space="preserve"> = </w:t>
-      </w:r>
-      <w:proofErr w:type="spellStart"/>
-      <w:proofErr w:type="gramStart"/>
-      <w:r>
-        <w:t>EarlyStopping</w:t>
-      </w:r>
-      <w:proofErr w:type="spellEnd"/>
-      <w:r>
-        <w:t>(</w:t>
-      </w:r>
-      <w:proofErr w:type="gramEnd"/>
-      <w:r>
-        <w:t>monitor='</w:t>
-      </w:r>
-      <w:proofErr w:type="spellStart"/>
-      <w:r>
-        <w:t>val_loss</w:t>
-      </w:r>
-      <w:proofErr w:type="gramStart"/>
-      <w:r>
-        <w:t>',patience</w:t>
-      </w:r>
-      <w:proofErr w:type="spellEnd"/>
-      <w:proofErr w:type="gramEnd"/>
-      <w:r>
-        <w:t xml:space="preserve"> = LAST_DIGIT_IN_YOUR_SID)</w:t>
+      <w:r>
+        <w:t>early_stop = EarlyStopping(monitor='val_loss',patience = LAST_DIGIT_IN_YOUR_SID)</w:t>
       </w:r>
     </w:p>
     <w:p>
@@ -2180,47 +1780,15 @@
         <w:jc w:val="both"/>
       </w:pPr>
       <w:r>
-        <w:t xml:space="preserve">history_2 </w:t>
-      </w:r>
-      <w:proofErr w:type="gramStart"/>
-      <w:r>
-        <w:t>=  model2.fit</w:t>
-      </w:r>
-      <w:proofErr w:type="gramEnd"/>
-      <w:r>
-        <w:t>(</w:t>
-      </w:r>
-      <w:proofErr w:type="gramStart"/>
-      <w:r>
-        <w:t>generator,  epochs</w:t>
-      </w:r>
-      <w:proofErr w:type="gramEnd"/>
-      <w:r>
-        <w:t>=30,</w:t>
-      </w:r>
-    </w:p>
-    <w:p>
-      <w:pPr>
-        <w:jc w:val="both"/>
-      </w:pPr>
-      <w:r>
-        <w:t xml:space="preserve">                    </w:t>
-      </w:r>
-      <w:proofErr w:type="spellStart"/>
-      <w:r>
-        <w:t>validation_data</w:t>
-      </w:r>
-      <w:proofErr w:type="spellEnd"/>
-      <w:r>
-        <w:t>=</w:t>
-      </w:r>
-      <w:proofErr w:type="spellStart"/>
-      <w:r>
-        <w:t>validation_generator</w:t>
-      </w:r>
-      <w:proofErr w:type="spellEnd"/>
-      <w:r>
-        <w:t>)</w:t>
+        <w:t>history_2 =  model2.fit(generator,  epochs=30,</w:t>
+      </w:r>
+    </w:p>
+    <w:p>
+      <w:pPr>
+        <w:jc w:val="both"/>
+      </w:pPr>
+      <w:r>
+        <w:t xml:space="preserve">                    validation_data=validation_generator)</w:t>
       </w:r>
     </w:p>
     <w:p>
@@ -3395,41 +2963,7 @@
           <w:sz w:val="24"/>
           <w:szCs w:val="24"/>
         </w:rPr>
-        <w:t xml:space="preserve">LSTM </w:t>
-      </w:r>
-      <w:proofErr w:type="spellStart"/>
-      <w:r>
-        <w:rPr>
-          <w:sz w:val="24"/>
-          <w:szCs w:val="24"/>
-        </w:rPr>
-        <w:t>Archtecture</w:t>
-      </w:r>
-      <w:proofErr w:type="spellEnd"/>
-      <w:r>
-        <w:rPr>
-          <w:sz w:val="24"/>
-          <w:szCs w:val="24"/>
-        </w:rPr>
-        <w:t xml:space="preserve"> using </w:t>
-      </w:r>
-      <w:proofErr w:type="spellStart"/>
-      <w:proofErr w:type="gramStart"/>
-      <w:r>
-        <w:rPr>
-          <w:sz w:val="24"/>
-          <w:szCs w:val="24"/>
-        </w:rPr>
-        <w:t>model.summary</w:t>
-      </w:r>
-      <w:proofErr w:type="spellEnd"/>
-      <w:proofErr w:type="gramEnd"/>
-      <w:r>
-        <w:rPr>
-          <w:sz w:val="24"/>
-          <w:szCs w:val="24"/>
-        </w:rPr>
-        <w:t>()</w:t>
+        <w:t>LSTM Archtecture using model.summary()</w:t>
       </w:r>
     </w:p>
     <w:p>
@@ -3505,30 +3039,12 @@
         </w:rPr>
         <w:t xml:space="preserve">Code and training result using </w:t>
       </w:r>
-      <w:proofErr w:type="spellStart"/>
-      <w:proofErr w:type="gramStart"/>
-      <w:r>
-        <w:rPr>
-          <w:sz w:val="24"/>
-          <w:szCs w:val="24"/>
-        </w:rPr>
-        <w:t>model.fit</w:t>
-      </w:r>
-      <w:proofErr w:type="spellEnd"/>
-      <w:r>
-        <w:rPr>
-          <w:sz w:val="24"/>
-          <w:szCs w:val="24"/>
-        </w:rPr>
-        <w:t>(</w:t>
-      </w:r>
-      <w:proofErr w:type="gramEnd"/>
-      <w:r>
-        <w:rPr>
-          <w:sz w:val="24"/>
-          <w:szCs w:val="24"/>
-        </w:rPr>
-        <w:t>)</w:t>
+      <w:r>
+        <w:rPr>
+          <w:sz w:val="24"/>
+          <w:szCs w:val="24"/>
+        </w:rPr>
+        <w:t>model.fit()</w:t>
       </w:r>
     </w:p>
     <w:p>
@@ -3590,17 +3106,8 @@
           <w:sz w:val="20"/>
           <w:szCs w:val="20"/>
         </w:rPr>
-        <w:t xml:space="preserve">history2 = </w:t>
-      </w:r>
-      <w:proofErr w:type="gramStart"/>
-      <w:r>
-        <w:rPr>
-          <w:sz w:val="20"/>
-          <w:szCs w:val="20"/>
-        </w:rPr>
-        <w:t>model2.fit(</w:t>
-      </w:r>
-      <w:proofErr w:type="gramEnd"/>
+        <w:t>history2 = model2.fit(</w:t>
+      </w:r>
     </w:p>
     <w:p>
       <w:pPr>
@@ -3616,39 +3123,7 @@
           <w:sz w:val="20"/>
           <w:szCs w:val="20"/>
         </w:rPr>
-        <w:t xml:space="preserve">    </w:t>
-      </w:r>
-      <w:proofErr w:type="spellStart"/>
-      <w:r>
-        <w:rPr>
-          <w:sz w:val="20"/>
-          <w:szCs w:val="20"/>
-        </w:rPr>
-        <w:t>X_train</w:t>
-      </w:r>
-      <w:proofErr w:type="spellEnd"/>
-      <w:r>
-        <w:rPr>
-          <w:sz w:val="20"/>
-          <w:szCs w:val="20"/>
-        </w:rPr>
-        <w:t xml:space="preserve">, </w:t>
-      </w:r>
-      <w:proofErr w:type="spellStart"/>
-      <w:r>
-        <w:rPr>
-          <w:sz w:val="20"/>
-          <w:szCs w:val="20"/>
-        </w:rPr>
-        <w:t>y_train</w:t>
-      </w:r>
-      <w:proofErr w:type="spellEnd"/>
-      <w:r>
-        <w:rPr>
-          <w:sz w:val="20"/>
-          <w:szCs w:val="20"/>
-        </w:rPr>
-        <w:t>,</w:t>
+        <w:t xml:space="preserve">    X_train, y_train,</w:t>
       </w:r>
     </w:p>
     <w:p>
@@ -3665,57 +3140,7 @@
           <w:sz w:val="20"/>
           <w:szCs w:val="20"/>
         </w:rPr>
-        <w:t xml:space="preserve">    </w:t>
-      </w:r>
-      <w:proofErr w:type="spellStart"/>
-      <w:r>
-        <w:rPr>
-          <w:sz w:val="20"/>
-          <w:szCs w:val="20"/>
-        </w:rPr>
-        <w:t>validation_data</w:t>
-      </w:r>
-      <w:proofErr w:type="spellEnd"/>
-      <w:proofErr w:type="gramStart"/>
-      <w:r>
-        <w:rPr>
-          <w:sz w:val="20"/>
-          <w:szCs w:val="20"/>
-        </w:rPr>
-        <w:t>=(</w:t>
-      </w:r>
-      <w:proofErr w:type="spellStart"/>
-      <w:proofErr w:type="gramEnd"/>
-      <w:r>
-        <w:rPr>
-          <w:sz w:val="20"/>
-          <w:szCs w:val="20"/>
-        </w:rPr>
-        <w:t>X_test</w:t>
-      </w:r>
-      <w:proofErr w:type="spellEnd"/>
-      <w:r>
-        <w:rPr>
-          <w:sz w:val="20"/>
-          <w:szCs w:val="20"/>
-        </w:rPr>
-        <w:t xml:space="preserve">, </w:t>
-      </w:r>
-      <w:proofErr w:type="spellStart"/>
-      <w:r>
-        <w:rPr>
-          <w:sz w:val="20"/>
-          <w:szCs w:val="20"/>
-        </w:rPr>
-        <w:t>y_test</w:t>
-      </w:r>
-      <w:proofErr w:type="spellEnd"/>
-      <w:r>
-        <w:rPr>
-          <w:sz w:val="20"/>
-          <w:szCs w:val="20"/>
-        </w:rPr>
-        <w:t>),</w:t>
+        <w:t xml:space="preserve">    validation_data=(X_test, y_test),</w:t>
       </w:r>
     </w:p>
     <w:p>
@@ -3749,23 +3174,7 @@
           <w:sz w:val="20"/>
           <w:szCs w:val="20"/>
         </w:rPr>
-        <w:t xml:space="preserve">    callbacks=[</w:t>
-      </w:r>
-      <w:proofErr w:type="spellStart"/>
-      <w:r>
-        <w:rPr>
-          <w:sz w:val="20"/>
-          <w:szCs w:val="20"/>
-        </w:rPr>
-        <w:t>early_stopping</w:t>
-      </w:r>
-      <w:proofErr w:type="spellEnd"/>
-      <w:r>
-        <w:rPr>
-          <w:sz w:val="20"/>
-          <w:szCs w:val="20"/>
-        </w:rPr>
-        <w:t>],</w:t>
+        <w:t xml:space="preserve">    callbacks=[early_stopping],</w:t>
       </w:r>
     </w:p>
     <w:p>
@@ -4183,35 +3592,7 @@
           <w:szCs w:val="24"/>
           <w:lang w:val="en-US"/>
         </w:rPr>
-        <w:t xml:space="preserve">Code </w:t>
-      </w:r>
-      <w:proofErr w:type="gramStart"/>
-      <w:r>
-        <w:rPr>
-          <w:sz w:val="24"/>
-          <w:szCs w:val="24"/>
-          <w:lang w:val="en-US"/>
-        </w:rPr>
-        <w:t xml:space="preserve">of  </w:t>
-      </w:r>
-      <w:proofErr w:type="spellStart"/>
-      <w:r>
-        <w:rPr>
-          <w:sz w:val="24"/>
-          <w:szCs w:val="24"/>
-          <w:lang w:val="en-US"/>
-        </w:rPr>
-        <w:t>EarlyStopping</w:t>
-      </w:r>
-      <w:proofErr w:type="spellEnd"/>
-      <w:proofErr w:type="gramEnd"/>
-      <w:r>
-        <w:rPr>
-          <w:sz w:val="24"/>
-          <w:szCs w:val="24"/>
-          <w:lang w:val="en-US"/>
-        </w:rPr>
-        <w:t>() function</w:t>
+        <w:t>Code of  EarlyStopping() function</w:t>
       </w:r>
     </w:p>
     <w:p>
@@ -4297,35 +3678,7 @@
           <w:szCs w:val="24"/>
           <w:lang w:val="en-US"/>
         </w:rPr>
-        <w:t xml:space="preserve"> Code of </w:t>
-      </w:r>
-      <w:proofErr w:type="spellStart"/>
-      <w:proofErr w:type="gramStart"/>
-      <w:r>
-        <w:rPr>
-          <w:sz w:val="24"/>
-          <w:szCs w:val="24"/>
-          <w:lang w:val="en-US"/>
-        </w:rPr>
-        <w:t>ModelCheckpoint</w:t>
-      </w:r>
-      <w:proofErr w:type="spellEnd"/>
-      <w:r>
-        <w:rPr>
-          <w:sz w:val="24"/>
-          <w:szCs w:val="24"/>
-          <w:lang w:val="en-US"/>
-        </w:rPr>
-        <w:t>(</w:t>
-      </w:r>
-      <w:proofErr w:type="gramEnd"/>
-      <w:r>
-        <w:rPr>
-          <w:sz w:val="24"/>
-          <w:szCs w:val="24"/>
-          <w:lang w:val="en-US"/>
-        </w:rPr>
-        <w:t>) function</w:t>
+        <w:t xml:space="preserve"> Code of ModelCheckpoint() function</w:t>
       </w:r>
     </w:p>
     <w:p>
@@ -4409,32 +3762,7 @@
           <w:sz w:val="24"/>
           <w:szCs w:val="24"/>
         </w:rPr>
-        <w:t xml:space="preserve">Code of </w:t>
-      </w:r>
-      <w:proofErr w:type="spellStart"/>
-      <w:proofErr w:type="gramStart"/>
-      <w:r>
-        <w:rPr>
-          <w:sz w:val="24"/>
-          <w:szCs w:val="24"/>
-        </w:rPr>
-        <w:t>model.fit</w:t>
-      </w:r>
-      <w:proofErr w:type="spellEnd"/>
-      <w:r>
-        <w:rPr>
-          <w:sz w:val="24"/>
-          <w:szCs w:val="24"/>
-        </w:rPr>
-        <w:t>(</w:t>
-      </w:r>
-      <w:proofErr w:type="gramEnd"/>
-      <w:r>
-        <w:rPr>
-          <w:sz w:val="24"/>
-          <w:szCs w:val="24"/>
-        </w:rPr>
-        <w:t>) function</w:t>
+        <w:t>Code of model.fit() function</w:t>
       </w:r>
     </w:p>
     <w:p>
@@ -4621,32 +3949,7 @@
           <w:sz w:val="24"/>
           <w:szCs w:val="24"/>
         </w:rPr>
-        <w:t xml:space="preserve">Training result of </w:t>
-      </w:r>
-      <w:proofErr w:type="spellStart"/>
-      <w:proofErr w:type="gramStart"/>
-      <w:r>
-        <w:rPr>
-          <w:sz w:val="24"/>
-          <w:szCs w:val="24"/>
-        </w:rPr>
-        <w:t>model.fit</w:t>
-      </w:r>
-      <w:proofErr w:type="spellEnd"/>
-      <w:r>
-        <w:rPr>
-          <w:sz w:val="24"/>
-          <w:szCs w:val="24"/>
-        </w:rPr>
-        <w:t>(</w:t>
-      </w:r>
-      <w:proofErr w:type="gramEnd"/>
-      <w:r>
-        <w:rPr>
-          <w:sz w:val="24"/>
-          <w:szCs w:val="24"/>
-        </w:rPr>
-        <w:t>) function</w:t>
+        <w:t>Training result of model.fit() function</w:t>
       </w:r>
     </w:p>
     <w:p>
@@ -4810,43 +4113,7 @@
           <w:szCs w:val="24"/>
           <w:lang w:val="en-US"/>
         </w:rPr>
-        <w:t xml:space="preserve">est Accuracy and other error metrics for the classification task using </w:t>
-      </w:r>
-      <w:proofErr w:type="spellStart"/>
-      <w:r>
-        <w:rPr>
-          <w:sz w:val="24"/>
-          <w:szCs w:val="24"/>
-          <w:lang w:val="en-US"/>
-        </w:rPr>
-        <w:t>classification_</w:t>
-      </w:r>
-      <w:proofErr w:type="gramStart"/>
-      <w:r>
-        <w:rPr>
-          <w:sz w:val="24"/>
-          <w:szCs w:val="24"/>
-          <w:lang w:val="en-US"/>
-        </w:rPr>
-        <w:t>report</w:t>
-      </w:r>
-      <w:proofErr w:type="spellEnd"/>
-      <w:r>
-        <w:rPr>
-          <w:sz w:val="24"/>
-          <w:szCs w:val="24"/>
-          <w:lang w:val="en-US"/>
-        </w:rPr>
-        <w:t>(</w:t>
-      </w:r>
-      <w:proofErr w:type="gramEnd"/>
-      <w:r>
-        <w:rPr>
-          <w:sz w:val="24"/>
-          <w:szCs w:val="24"/>
-          <w:lang w:val="en-US"/>
-        </w:rPr>
-        <w:t>)</w:t>
+        <w:t>est Accuracy and other error metrics for the classification task using classification_report()</w:t>
       </w:r>
     </w:p>
     <w:p>
@@ -5025,6 +4292,216 @@
           <w:u w:val="single"/>
         </w:rPr>
       </w:pPr>
+    </w:p>
+    <w:p>
+      <w:pPr>
+        <w:jc w:val="both"/>
+        <w:rPr>
+          <w:sz w:val="44"/>
+          <w:szCs w:val="44"/>
+          <w:u w:val="single"/>
+        </w:rPr>
+      </w:pPr>
+    </w:p>
+    <w:p>
+      <w:pPr>
+        <w:jc w:val="both"/>
+        <w:rPr>
+          <w:sz w:val="44"/>
+          <w:szCs w:val="44"/>
+          <w:u w:val="single"/>
+        </w:rPr>
+      </w:pPr>
+    </w:p>
+    <w:p>
+      <w:pPr>
+        <w:jc w:val="both"/>
+        <w:rPr>
+          <w:sz w:val="44"/>
+          <w:szCs w:val="44"/>
+          <w:u w:val="single"/>
+        </w:rPr>
+      </w:pPr>
+      <w:r>
+        <w:rPr>
+          <w:sz w:val="44"/>
+          <w:szCs w:val="44"/>
+          <w:u w:val="single"/>
+        </w:rPr>
+        <w:lastRenderedPageBreak/>
+        <w:t xml:space="preserve">Lab </w:t>
+      </w:r>
+      <w:r>
+        <w:rPr>
+          <w:sz w:val="44"/>
+          <w:szCs w:val="44"/>
+          <w:u w:val="single"/>
+        </w:rPr>
+        <w:t>10</w:t>
+      </w:r>
+    </w:p>
+    <w:p>
+      <w:pPr>
+        <w:jc w:val="both"/>
+        <w:rPr>
+          <w:sz w:val="44"/>
+          <w:szCs w:val="44"/>
+          <w:u w:val="single"/>
+        </w:rPr>
+      </w:pPr>
+    </w:p>
+    <w:p>
+      <w:pPr>
+        <w:pStyle w:val="ListParagraph"/>
+        <w:numPr>
+          <w:ilvl w:val="0"/>
+          <w:numId w:val="11"/>
+        </w:numPr>
+        <w:jc w:val="both"/>
+        <w:rPr>
+          <w:sz w:val="24"/>
+          <w:szCs w:val="24"/>
+        </w:rPr>
+      </w:pPr>
+      <w:r>
+        <w:rPr>
+          <w:sz w:val="24"/>
+          <w:szCs w:val="24"/>
+        </w:rPr>
+        <w:t>Encoder.summary()</w:t>
+      </w:r>
+    </w:p>
+    <w:p>
+      <w:pPr>
+        <w:jc w:val="both"/>
+        <w:rPr>
+          <w:sz w:val="44"/>
+          <w:szCs w:val="44"/>
+          <w:u w:val="single"/>
+        </w:rPr>
+      </w:pPr>
+      <w:r>
+        <w:rPr>
+          <w:noProof/>
+          <w:sz w:val="44"/>
+          <w:szCs w:val="44"/>
+          <w:u w:val="single"/>
+        </w:rPr>
+        <w:drawing>
+          <wp:inline distT="0" distB="0" distL="0" distR="0" wp14:anchorId="17A87A0D" wp14:editId="355EFFD8">
+            <wp:extent cx="5731510" cy="1969770"/>
+            <wp:effectExtent l="0" t="0" r="2540" b="0"/>
+            <wp:docPr id="648014210" name="Picture 1"/>
+            <wp:cNvGraphicFramePr>
+              <a:graphicFrameLocks xmlns:a="http://schemas.openxmlformats.org/drawingml/2006/main" noChangeAspect="1"/>
+            </wp:cNvGraphicFramePr>
+            <a:graphic xmlns:a="http://schemas.openxmlformats.org/drawingml/2006/main">
+              <a:graphicData uri="http://schemas.openxmlformats.org/drawingml/2006/picture">
+                <pic:pic xmlns:pic="http://schemas.openxmlformats.org/drawingml/2006/picture">
+                  <pic:nvPicPr>
+                    <pic:cNvPr id="648014210" name=""/>
+                    <pic:cNvPicPr/>
+                  </pic:nvPicPr>
+                  <pic:blipFill>
+                    <a:blip r:embed="rId30"/>
+                    <a:stretch>
+                      <a:fillRect/>
+                    </a:stretch>
+                  </pic:blipFill>
+                  <pic:spPr>
+                    <a:xfrm>
+                      <a:off x="0" y="0"/>
+                      <a:ext cx="5731510" cy="1969770"/>
+                    </a:xfrm>
+                    <a:prstGeom prst="rect">
+                      <a:avLst/>
+                    </a:prstGeom>
+                  </pic:spPr>
+                </pic:pic>
+              </a:graphicData>
+            </a:graphic>
+          </wp:inline>
+        </w:drawing>
+      </w:r>
+    </w:p>
+    <w:p>
+      <w:pPr>
+        <w:jc w:val="both"/>
+        <w:rPr>
+          <w:sz w:val="44"/>
+          <w:szCs w:val="44"/>
+          <w:u w:val="single"/>
+        </w:rPr>
+      </w:pPr>
+    </w:p>
+    <w:p>
+      <w:pPr>
+        <w:jc w:val="both"/>
+        <w:rPr>
+          <w:sz w:val="24"/>
+          <w:szCs w:val="24"/>
+        </w:rPr>
+      </w:pPr>
+      <w:r>
+        <w:rPr>
+          <w:sz w:val="24"/>
+          <w:szCs w:val="24"/>
+        </w:rPr>
+        <w:t>02.decoder.summary()</w:t>
+      </w:r>
+    </w:p>
+    <w:p>
+      <w:pPr>
+        <w:jc w:val="both"/>
+        <w:rPr>
+          <w:sz w:val="44"/>
+          <w:szCs w:val="44"/>
+          <w:u w:val="single"/>
+        </w:rPr>
+      </w:pPr>
+      <w:r>
+        <w:rPr>
+          <w:noProof/>
+          <w:sz w:val="44"/>
+          <w:szCs w:val="44"/>
+          <w:u w:val="single"/>
+        </w:rPr>
+        <w:drawing>
+          <wp:inline distT="0" distB="0" distL="0" distR="0" wp14:anchorId="1889C103" wp14:editId="77BE44C3">
+            <wp:extent cx="5731510" cy="2249805"/>
+            <wp:effectExtent l="0" t="0" r="2540" b="0"/>
+            <wp:docPr id="551337300" name="Picture 1"/>
+            <wp:cNvGraphicFramePr>
+              <a:graphicFrameLocks xmlns:a="http://schemas.openxmlformats.org/drawingml/2006/main" noChangeAspect="1"/>
+            </wp:cNvGraphicFramePr>
+            <a:graphic xmlns:a="http://schemas.openxmlformats.org/drawingml/2006/main">
+              <a:graphicData uri="http://schemas.openxmlformats.org/drawingml/2006/picture">
+                <pic:pic xmlns:pic="http://schemas.openxmlformats.org/drawingml/2006/picture">
+                  <pic:nvPicPr>
+                    <pic:cNvPr id="551337300" name=""/>
+                    <pic:cNvPicPr/>
+                  </pic:nvPicPr>
+                  <pic:blipFill>
+                    <a:blip r:embed="rId31"/>
+                    <a:stretch>
+                      <a:fillRect/>
+                    </a:stretch>
+                  </pic:blipFill>
+                  <pic:spPr>
+                    <a:xfrm>
+                      <a:off x="0" y="0"/>
+                      <a:ext cx="5731510" cy="2249805"/>
+                    </a:xfrm>
+                    <a:prstGeom prst="rect">
+                      <a:avLst/>
+                    </a:prstGeom>
+                  </pic:spPr>
+                </pic:pic>
+              </a:graphicData>
+            </a:graphic>
+          </wp:inline>
+        </w:drawing>
+      </w:r>
     </w:p>
     <w:p>
       <w:pPr>
@@ -6576,7 +6053,7 @@
   <w:style w:type="paragraph" w:default="1" w:styleId="Normal">
     <w:name w:val="Normal"/>
     <w:qFormat/>
-    <w:rsid w:val="00975065"/>
+    <w:rsid w:val="00BF3E58"/>
   </w:style>
   <w:style w:type="paragraph" w:styleId="Heading3">
     <w:name w:val="heading 3"/>

</xml_diff>

<commit_message>
Week 11 Exercices added
</commit_message>
<xml_diff>
--- a/LABlogbook_2523747_Neural Computing and Deep Learning (2025 MOD006568 TRI2 F01CIN).docx
+++ b/LABlogbook_2523747_Neural Computing and Deep Learning (2025 MOD006568 TRI2 F01CIN).docx
@@ -4512,6 +4512,543 @@
           <w:u w:val="single"/>
         </w:rPr>
       </w:pPr>
+    </w:p>
+    <w:p>
+      <w:pPr>
+        <w:jc w:val="both"/>
+        <w:rPr>
+          <w:sz w:val="44"/>
+          <w:szCs w:val="44"/>
+          <w:u w:val="single"/>
+        </w:rPr>
+      </w:pPr>
+    </w:p>
+    <w:p>
+      <w:pPr>
+        <w:jc w:val="both"/>
+        <w:rPr>
+          <w:sz w:val="44"/>
+          <w:szCs w:val="44"/>
+          <w:u w:val="single"/>
+        </w:rPr>
+      </w:pPr>
+    </w:p>
+    <w:p>
+      <w:pPr>
+        <w:jc w:val="both"/>
+        <w:rPr>
+          <w:sz w:val="44"/>
+          <w:szCs w:val="44"/>
+          <w:u w:val="single"/>
+        </w:rPr>
+      </w:pPr>
+    </w:p>
+    <w:p>
+      <w:pPr>
+        <w:jc w:val="both"/>
+        <w:rPr>
+          <w:sz w:val="44"/>
+          <w:szCs w:val="44"/>
+          <w:u w:val="single"/>
+        </w:rPr>
+      </w:pPr>
+    </w:p>
+    <w:p>
+      <w:pPr>
+        <w:jc w:val="both"/>
+        <w:rPr>
+          <w:sz w:val="44"/>
+          <w:szCs w:val="44"/>
+          <w:u w:val="single"/>
+        </w:rPr>
+      </w:pPr>
+      <w:r>
+        <w:rPr>
+          <w:sz w:val="44"/>
+          <w:szCs w:val="44"/>
+          <w:u w:val="single"/>
+        </w:rPr>
+        <w:lastRenderedPageBreak/>
+        <w:t>Lab 11</w:t>
+      </w:r>
+    </w:p>
+    <w:p>
+      <w:pPr>
+        <w:pStyle w:val="ListParagraph"/>
+        <w:numPr>
+          <w:ilvl w:val="0"/>
+          <w:numId w:val="9"/>
+        </w:numPr>
+        <w:jc w:val="both"/>
+        <w:rPr>
+          <w:sz w:val="44"/>
+          <w:szCs w:val="44"/>
+          <w:u w:val="single"/>
+        </w:rPr>
+      </w:pPr>
+      <w:r>
+        <w:rPr>
+          <w:sz w:val="24"/>
+          <w:szCs w:val="24"/>
+          <w:lang w:val="en-US"/>
+        </w:rPr>
+        <w:t>screenshot</w:t>
+      </w:r>
+      <w:r>
+        <w:rPr>
+          <w:sz w:val="24"/>
+          <w:szCs w:val="24"/>
+          <w:lang w:val="en-US"/>
+        </w:rPr>
+        <w:t>s</w:t>
+      </w:r>
+      <w:r>
+        <w:rPr>
+          <w:sz w:val="24"/>
+          <w:szCs w:val="24"/>
+          <w:lang w:val="en-US"/>
+        </w:rPr>
+        <w:t xml:space="preserve"> of the GAN training result</w:t>
+      </w:r>
+    </w:p>
+    <w:p>
+      <w:pPr>
+        <w:jc w:val="both"/>
+        <w:rPr>
+          <w:sz w:val="44"/>
+          <w:szCs w:val="44"/>
+          <w:u w:val="single"/>
+        </w:rPr>
+      </w:pPr>
+    </w:p>
+    <w:p>
+      <w:pPr>
+        <w:jc w:val="both"/>
+        <w:rPr>
+          <w:sz w:val="44"/>
+          <w:szCs w:val="44"/>
+        </w:rPr>
+      </w:pPr>
+      <w:r>
+        <w:rPr>
+          <w:noProof/>
+          <w:sz w:val="44"/>
+          <w:szCs w:val="44"/>
+        </w:rPr>
+        <w:drawing>
+          <wp:inline distT="0" distB="0" distL="0" distR="0" wp14:anchorId="27050032" wp14:editId="05E54C3E">
+            <wp:extent cx="4405745" cy="3575299"/>
+            <wp:effectExtent l="0" t="0" r="0" b="6350"/>
+            <wp:docPr id="848887218" name="Picture 1"/>
+            <wp:cNvGraphicFramePr>
+              <a:graphicFrameLocks xmlns:a="http://schemas.openxmlformats.org/drawingml/2006/main" noChangeAspect="1"/>
+            </wp:cNvGraphicFramePr>
+            <a:graphic xmlns:a="http://schemas.openxmlformats.org/drawingml/2006/main">
+              <a:graphicData uri="http://schemas.openxmlformats.org/drawingml/2006/picture">
+                <pic:pic xmlns:pic="http://schemas.openxmlformats.org/drawingml/2006/picture">
+                  <pic:nvPicPr>
+                    <pic:cNvPr id="848887218" name=""/>
+                    <pic:cNvPicPr/>
+                  </pic:nvPicPr>
+                  <pic:blipFill>
+                    <a:blip r:embed="rId32"/>
+                    <a:stretch>
+                      <a:fillRect/>
+                    </a:stretch>
+                  </pic:blipFill>
+                  <pic:spPr>
+                    <a:xfrm>
+                      <a:off x="0" y="0"/>
+                      <a:ext cx="4439115" cy="3602379"/>
+                    </a:xfrm>
+                    <a:prstGeom prst="rect">
+                      <a:avLst/>
+                    </a:prstGeom>
+                  </pic:spPr>
+                </pic:pic>
+              </a:graphicData>
+            </a:graphic>
+          </wp:inline>
+        </w:drawing>
+      </w:r>
+    </w:p>
+    <w:p>
+      <w:pPr>
+        <w:jc w:val="both"/>
+        <w:rPr>
+          <w:sz w:val="44"/>
+          <w:szCs w:val="44"/>
+        </w:rPr>
+      </w:pPr>
+      <w:r>
+        <w:rPr>
+          <w:noProof/>
+          <w:sz w:val="44"/>
+          <w:szCs w:val="44"/>
+        </w:rPr>
+        <w:drawing>
+          <wp:inline distT="0" distB="0" distL="0" distR="0" wp14:anchorId="48AAA457" wp14:editId="556F71D3">
+            <wp:extent cx="3325091" cy="3305530"/>
+            <wp:effectExtent l="0" t="0" r="8890" b="9525"/>
+            <wp:docPr id="963665368" name="Picture 1"/>
+            <wp:cNvGraphicFramePr>
+              <a:graphicFrameLocks xmlns:a="http://schemas.openxmlformats.org/drawingml/2006/main" noChangeAspect="1"/>
+            </wp:cNvGraphicFramePr>
+            <a:graphic xmlns:a="http://schemas.openxmlformats.org/drawingml/2006/main">
+              <a:graphicData uri="http://schemas.openxmlformats.org/drawingml/2006/picture">
+                <pic:pic xmlns:pic="http://schemas.openxmlformats.org/drawingml/2006/picture">
+                  <pic:nvPicPr>
+                    <pic:cNvPr id="963665368" name=""/>
+                    <pic:cNvPicPr/>
+                  </pic:nvPicPr>
+                  <pic:blipFill>
+                    <a:blip r:embed="rId33"/>
+                    <a:stretch>
+                      <a:fillRect/>
+                    </a:stretch>
+                  </pic:blipFill>
+                  <pic:spPr>
+                    <a:xfrm>
+                      <a:off x="0" y="0"/>
+                      <a:ext cx="3346873" cy="3327184"/>
+                    </a:xfrm>
+                    <a:prstGeom prst="rect">
+                      <a:avLst/>
+                    </a:prstGeom>
+                  </pic:spPr>
+                </pic:pic>
+              </a:graphicData>
+            </a:graphic>
+          </wp:inline>
+        </w:drawing>
+      </w:r>
+    </w:p>
+    <w:p>
+      <w:pPr>
+        <w:jc w:val="both"/>
+        <w:rPr>
+          <w:sz w:val="44"/>
+          <w:szCs w:val="44"/>
+        </w:rPr>
+      </w:pPr>
+      <w:r>
+        <w:rPr>
+          <w:noProof/>
+          <w:sz w:val="44"/>
+          <w:szCs w:val="44"/>
+        </w:rPr>
+        <w:lastRenderedPageBreak/>
+        <w:drawing>
+          <wp:inline distT="0" distB="0" distL="0" distR="0" wp14:anchorId="2F6E8BC9" wp14:editId="3EF57995">
+            <wp:extent cx="3759232" cy="3692236"/>
+            <wp:effectExtent l="0" t="0" r="0" b="3810"/>
+            <wp:docPr id="244295002" name="Picture 1"/>
+            <wp:cNvGraphicFramePr>
+              <a:graphicFrameLocks xmlns:a="http://schemas.openxmlformats.org/drawingml/2006/main" noChangeAspect="1"/>
+            </wp:cNvGraphicFramePr>
+            <a:graphic xmlns:a="http://schemas.openxmlformats.org/drawingml/2006/main">
+              <a:graphicData uri="http://schemas.openxmlformats.org/drawingml/2006/picture">
+                <pic:pic xmlns:pic="http://schemas.openxmlformats.org/drawingml/2006/picture">
+                  <pic:nvPicPr>
+                    <pic:cNvPr id="244295002" name=""/>
+                    <pic:cNvPicPr/>
+                  </pic:nvPicPr>
+                  <pic:blipFill>
+                    <a:blip r:embed="rId34"/>
+                    <a:stretch>
+                      <a:fillRect/>
+                    </a:stretch>
+                  </pic:blipFill>
+                  <pic:spPr>
+                    <a:xfrm>
+                      <a:off x="0" y="0"/>
+                      <a:ext cx="3801698" cy="3733945"/>
+                    </a:xfrm>
+                    <a:prstGeom prst="rect">
+                      <a:avLst/>
+                    </a:prstGeom>
+                  </pic:spPr>
+                </pic:pic>
+              </a:graphicData>
+            </a:graphic>
+          </wp:inline>
+        </w:drawing>
+      </w:r>
+    </w:p>
+    <w:p>
+      <w:pPr>
+        <w:jc w:val="both"/>
+        <w:rPr>
+          <w:sz w:val="44"/>
+          <w:szCs w:val="44"/>
+        </w:rPr>
+      </w:pPr>
+      <w:r>
+        <w:rPr>
+          <w:noProof/>
+          <w:sz w:val="44"/>
+          <w:szCs w:val="44"/>
+        </w:rPr>
+        <w:drawing>
+          <wp:inline distT="0" distB="0" distL="0" distR="0" wp14:anchorId="6A46219E" wp14:editId="1F849819">
+            <wp:extent cx="3754582" cy="3822438"/>
+            <wp:effectExtent l="0" t="0" r="0" b="6985"/>
+            <wp:docPr id="870090070" name="Picture 1"/>
+            <wp:cNvGraphicFramePr>
+              <a:graphicFrameLocks xmlns:a="http://schemas.openxmlformats.org/drawingml/2006/main" noChangeAspect="1"/>
+            </wp:cNvGraphicFramePr>
+            <a:graphic xmlns:a="http://schemas.openxmlformats.org/drawingml/2006/main">
+              <a:graphicData uri="http://schemas.openxmlformats.org/drawingml/2006/picture">
+                <pic:pic xmlns:pic="http://schemas.openxmlformats.org/drawingml/2006/picture">
+                  <pic:nvPicPr>
+                    <pic:cNvPr id="870090070" name=""/>
+                    <pic:cNvPicPr/>
+                  </pic:nvPicPr>
+                  <pic:blipFill>
+                    <a:blip r:embed="rId35"/>
+                    <a:stretch>
+                      <a:fillRect/>
+                    </a:stretch>
+                  </pic:blipFill>
+                  <pic:spPr>
+                    <a:xfrm>
+                      <a:off x="0" y="0"/>
+                      <a:ext cx="3778861" cy="3847156"/>
+                    </a:xfrm>
+                    <a:prstGeom prst="rect">
+                      <a:avLst/>
+                    </a:prstGeom>
+                  </pic:spPr>
+                </pic:pic>
+              </a:graphicData>
+            </a:graphic>
+          </wp:inline>
+        </w:drawing>
+      </w:r>
+    </w:p>
+    <w:p>
+      <w:pPr>
+        <w:jc w:val="both"/>
+        <w:rPr>
+          <w:sz w:val="44"/>
+          <w:szCs w:val="44"/>
+        </w:rPr>
+      </w:pPr>
+      <w:r>
+        <w:rPr>
+          <w:noProof/>
+          <w:sz w:val="44"/>
+          <w:szCs w:val="44"/>
+        </w:rPr>
+        <w:lastRenderedPageBreak/>
+        <w:drawing>
+          <wp:inline distT="0" distB="0" distL="0" distR="0" wp14:anchorId="3CCBA790" wp14:editId="6BE806CB">
+            <wp:extent cx="3325091" cy="3305376"/>
+            <wp:effectExtent l="0" t="0" r="8890" b="0"/>
+            <wp:docPr id="1389893714" name="Picture 1"/>
+            <wp:cNvGraphicFramePr>
+              <a:graphicFrameLocks xmlns:a="http://schemas.openxmlformats.org/drawingml/2006/main" noChangeAspect="1"/>
+            </wp:cNvGraphicFramePr>
+            <a:graphic xmlns:a="http://schemas.openxmlformats.org/drawingml/2006/main">
+              <a:graphicData uri="http://schemas.openxmlformats.org/drawingml/2006/picture">
+                <pic:pic xmlns:pic="http://schemas.openxmlformats.org/drawingml/2006/picture">
+                  <pic:nvPicPr>
+                    <pic:cNvPr id="1389893714" name=""/>
+                    <pic:cNvPicPr/>
+                  </pic:nvPicPr>
+                  <pic:blipFill>
+                    <a:blip r:embed="rId36"/>
+                    <a:stretch>
+                      <a:fillRect/>
+                    </a:stretch>
+                  </pic:blipFill>
+                  <pic:spPr>
+                    <a:xfrm>
+                      <a:off x="0" y="0"/>
+                      <a:ext cx="3336441" cy="3316658"/>
+                    </a:xfrm>
+                    <a:prstGeom prst="rect">
+                      <a:avLst/>
+                    </a:prstGeom>
+                  </pic:spPr>
+                </pic:pic>
+              </a:graphicData>
+            </a:graphic>
+          </wp:inline>
+        </w:drawing>
+      </w:r>
+    </w:p>
+    <w:p>
+      <w:pPr>
+        <w:jc w:val="both"/>
+        <w:rPr>
+          <w:sz w:val="44"/>
+          <w:szCs w:val="44"/>
+        </w:rPr>
+      </w:pPr>
+    </w:p>
+    <w:p>
+      <w:pPr>
+        <w:jc w:val="both"/>
+        <w:rPr>
+          <w:sz w:val="44"/>
+          <w:szCs w:val="44"/>
+        </w:rPr>
+      </w:pPr>
+      <w:r>
+        <w:rPr>
+          <w:noProof/>
+          <w:sz w:val="44"/>
+          <w:szCs w:val="44"/>
+        </w:rPr>
+        <w:drawing>
+          <wp:inline distT="0" distB="0" distL="0" distR="0" wp14:anchorId="3F597E86" wp14:editId="6757C05B">
+            <wp:extent cx="3163454" cy="2874818"/>
+            <wp:effectExtent l="0" t="0" r="0" b="1905"/>
+            <wp:docPr id="1046218996" name="Picture 1"/>
+            <wp:cNvGraphicFramePr>
+              <a:graphicFrameLocks xmlns:a="http://schemas.openxmlformats.org/drawingml/2006/main" noChangeAspect="1"/>
+            </wp:cNvGraphicFramePr>
+            <a:graphic xmlns:a="http://schemas.openxmlformats.org/drawingml/2006/main">
+              <a:graphicData uri="http://schemas.openxmlformats.org/drawingml/2006/picture">
+                <pic:pic xmlns:pic="http://schemas.openxmlformats.org/drawingml/2006/picture">
+                  <pic:nvPicPr>
+                    <pic:cNvPr id="1046218996" name=""/>
+                    <pic:cNvPicPr/>
+                  </pic:nvPicPr>
+                  <pic:blipFill>
+                    <a:blip r:embed="rId37"/>
+                    <a:stretch>
+                      <a:fillRect/>
+                    </a:stretch>
+                  </pic:blipFill>
+                  <pic:spPr>
+                    <a:xfrm>
+                      <a:off x="0" y="0"/>
+                      <a:ext cx="3176268" cy="2886463"/>
+                    </a:xfrm>
+                    <a:prstGeom prst="rect">
+                      <a:avLst/>
+                    </a:prstGeom>
+                  </pic:spPr>
+                </pic:pic>
+              </a:graphicData>
+            </a:graphic>
+          </wp:inline>
+        </w:drawing>
+      </w:r>
+    </w:p>
+    <w:p>
+      <w:pPr>
+        <w:jc w:val="both"/>
+        <w:rPr>
+          <w:sz w:val="44"/>
+          <w:szCs w:val="44"/>
+        </w:rPr>
+      </w:pPr>
+    </w:p>
+    <w:p>
+      <w:pPr>
+        <w:jc w:val="both"/>
+        <w:rPr>
+          <w:sz w:val="44"/>
+          <w:szCs w:val="44"/>
+        </w:rPr>
+      </w:pPr>
+      <w:r>
+        <w:rPr>
+          <w:noProof/>
+          <w:sz w:val="44"/>
+          <w:szCs w:val="44"/>
+        </w:rPr>
+        <w:lastRenderedPageBreak/>
+        <w:drawing>
+          <wp:inline distT="0" distB="0" distL="0" distR="0" wp14:anchorId="2C7B4F8E" wp14:editId="11A7D507">
+            <wp:extent cx="3484418" cy="3429654"/>
+            <wp:effectExtent l="0" t="0" r="1905" b="0"/>
+            <wp:docPr id="1840487003" name="Picture 1"/>
+            <wp:cNvGraphicFramePr>
+              <a:graphicFrameLocks xmlns:a="http://schemas.openxmlformats.org/drawingml/2006/main" noChangeAspect="1"/>
+            </wp:cNvGraphicFramePr>
+            <a:graphic xmlns:a="http://schemas.openxmlformats.org/drawingml/2006/main">
+              <a:graphicData uri="http://schemas.openxmlformats.org/drawingml/2006/picture">
+                <pic:pic xmlns:pic="http://schemas.openxmlformats.org/drawingml/2006/picture">
+                  <pic:nvPicPr>
+                    <pic:cNvPr id="1840487003" name=""/>
+                    <pic:cNvPicPr/>
+                  </pic:nvPicPr>
+                  <pic:blipFill>
+                    <a:blip r:embed="rId38"/>
+                    <a:stretch>
+                      <a:fillRect/>
+                    </a:stretch>
+                  </pic:blipFill>
+                  <pic:spPr>
+                    <a:xfrm>
+                      <a:off x="0" y="0"/>
+                      <a:ext cx="3490857" cy="3435992"/>
+                    </a:xfrm>
+                    <a:prstGeom prst="rect">
+                      <a:avLst/>
+                    </a:prstGeom>
+                  </pic:spPr>
+                </pic:pic>
+              </a:graphicData>
+            </a:graphic>
+          </wp:inline>
+        </w:drawing>
+      </w:r>
+    </w:p>
+    <w:p>
+      <w:pPr>
+        <w:jc w:val="both"/>
+        <w:rPr>
+          <w:sz w:val="44"/>
+          <w:szCs w:val="44"/>
+        </w:rPr>
+      </w:pPr>
+      <w:r>
+        <w:rPr>
+          <w:noProof/>
+          <w:sz w:val="44"/>
+          <w:szCs w:val="44"/>
+        </w:rPr>
+        <w:drawing>
+          <wp:inline distT="0" distB="0" distL="0" distR="0" wp14:anchorId="6EA42A3B" wp14:editId="2AF51E95">
+            <wp:extent cx="3498273" cy="3436051"/>
+            <wp:effectExtent l="0" t="0" r="6985" b="0"/>
+            <wp:docPr id="1602930731" name="Picture 1"/>
+            <wp:cNvGraphicFramePr>
+              <a:graphicFrameLocks xmlns:a="http://schemas.openxmlformats.org/drawingml/2006/main" noChangeAspect="1"/>
+            </wp:cNvGraphicFramePr>
+            <a:graphic xmlns:a="http://schemas.openxmlformats.org/drawingml/2006/main">
+              <a:graphicData uri="http://schemas.openxmlformats.org/drawingml/2006/picture">
+                <pic:pic xmlns:pic="http://schemas.openxmlformats.org/drawingml/2006/picture">
+                  <pic:nvPicPr>
+                    <pic:cNvPr id="1602930731" name=""/>
+                    <pic:cNvPicPr/>
+                  </pic:nvPicPr>
+                  <pic:blipFill>
+                    <a:blip r:embed="rId39"/>
+                    <a:stretch>
+                      <a:fillRect/>
+                    </a:stretch>
+                  </pic:blipFill>
+                  <pic:spPr>
+                    <a:xfrm>
+                      <a:off x="0" y="0"/>
+                      <a:ext cx="3503431" cy="3441117"/>
+                    </a:xfrm>
+                    <a:prstGeom prst="rect">
+                      <a:avLst/>
+                    </a:prstGeom>
+                  </pic:spPr>
+                </pic:pic>
+              </a:graphicData>
+            </a:graphic>
+          </wp:inline>
+        </w:drawing>
+      </w:r>
     </w:p>
     <w:p>
       <w:pPr>

</xml_diff>

<commit_message>
Week 12 Excercises added
</commit_message>
<xml_diff>
--- a/LABlogbook_2523747_Neural Computing and Deep Learning (2025 MOD006568 TRI2 F01CIN).docx
+++ b/LABlogbook_2523747_Neural Computing and Deep Learning (2025 MOD006568 TRI2 F01CIN).docx
@@ -3561,15 +3561,7 @@
           <w:u w:val="single"/>
         </w:rPr>
         <w:lastRenderedPageBreak/>
-        <w:t xml:space="preserve">Lab </w:t>
-      </w:r>
-      <w:r>
-        <w:rPr>
-          <w:sz w:val="44"/>
-          <w:szCs w:val="44"/>
-          <w:u w:val="single"/>
-        </w:rPr>
-        <w:t>9</w:t>
+        <w:t xml:space="preserve">Lab 9 </w:t>
       </w:r>
     </w:p>
     <w:p>
@@ -3612,7 +3604,7 @@
           <w:lang w:val="en-US"/>
         </w:rPr>
         <w:drawing>
-          <wp:inline distT="0" distB="0" distL="0" distR="0" wp14:anchorId="4D6325F3" wp14:editId="6FB3CA9E">
+          <wp:inline distT="0" distB="0" distL="0" distR="0" wp14:anchorId="6CA34CBD" wp14:editId="008A7B11">
             <wp:extent cx="5731510" cy="1360805"/>
             <wp:effectExtent l="0" t="0" r="2540" b="0"/>
             <wp:docPr id="235934842" name="Picture 1"/>
@@ -3698,7 +3690,7 @@
           <w:u w:val="single"/>
         </w:rPr>
         <w:drawing>
-          <wp:inline distT="0" distB="0" distL="0" distR="0" wp14:anchorId="5F710C74" wp14:editId="0EF79E21">
+          <wp:inline distT="0" distB="0" distL="0" distR="0" wp14:anchorId="599E6DEB" wp14:editId="0E9E4096">
             <wp:extent cx="5731510" cy="1217295"/>
             <wp:effectExtent l="0" t="0" r="2540" b="1905"/>
             <wp:docPr id="1495966457" name="Picture 1"/>
@@ -3778,7 +3770,7 @@
           <w:noProof/>
         </w:rPr>
         <w:drawing>
-          <wp:inline distT="0" distB="0" distL="0" distR="0" wp14:anchorId="4C79FF40" wp14:editId="7F421AFB">
+          <wp:inline distT="0" distB="0" distL="0" distR="0" wp14:anchorId="2CEE4291" wp14:editId="766CE32B">
             <wp:extent cx="5731510" cy="1559560"/>
             <wp:effectExtent l="0" t="0" r="2540" b="2540"/>
             <wp:docPr id="462324162" name="Picture 1"/>
@@ -3975,7 +3967,7 @@
           <w:noProof/>
         </w:rPr>
         <w:drawing>
-          <wp:inline distT="0" distB="0" distL="0" distR="0" wp14:anchorId="2611FC22" wp14:editId="1B025C07">
+          <wp:inline distT="0" distB="0" distL="0" distR="0" wp14:anchorId="37D8FCE6" wp14:editId="1E9AD20F">
             <wp:extent cx="5731510" cy="3538855"/>
             <wp:effectExtent l="0" t="0" r="2540" b="4445"/>
             <wp:docPr id="1303297573" name="Picture 1"/>
@@ -4028,7 +4020,7 @@
           <w:u w:val="single"/>
         </w:rPr>
         <w:drawing>
-          <wp:inline distT="0" distB="0" distL="0" distR="0" wp14:anchorId="44912A72" wp14:editId="10163035">
+          <wp:inline distT="0" distB="0" distL="0" distR="0" wp14:anchorId="70DA39D9" wp14:editId="2D5121D8">
             <wp:extent cx="5731510" cy="3387725"/>
             <wp:effectExtent l="0" t="0" r="2540" b="3175"/>
             <wp:docPr id="1371738814" name="Picture 1"/>
@@ -4068,35 +4060,36 @@
       <w:pPr>
         <w:jc w:val="both"/>
         <w:rPr>
-          <w:sz w:val="24"/>
-          <w:szCs w:val="24"/>
-        </w:rPr>
-      </w:pPr>
-    </w:p>
-    <w:p>
-      <w:pPr>
-        <w:jc w:val="both"/>
-        <w:rPr>
-          <w:sz w:val="24"/>
-          <w:szCs w:val="24"/>
-        </w:rPr>
-      </w:pPr>
-    </w:p>
-    <w:p>
-      <w:pPr>
-        <w:jc w:val="both"/>
-        <w:rPr>
-          <w:sz w:val="24"/>
-          <w:szCs w:val="24"/>
-          <w:lang w:val="en-US"/>
-        </w:rPr>
-      </w:pPr>
-      <w:r>
-        <w:rPr>
-          <w:sz w:val="24"/>
-          <w:szCs w:val="24"/>
-        </w:rPr>
-        <w:lastRenderedPageBreak/>
+          <w:sz w:val="44"/>
+          <w:szCs w:val="44"/>
+          <w:u w:val="single"/>
+        </w:rPr>
+      </w:pPr>
+    </w:p>
+    <w:p>
+      <w:pPr>
+        <w:jc w:val="both"/>
+        <w:rPr>
+          <w:sz w:val="44"/>
+          <w:szCs w:val="44"/>
+          <w:u w:val="single"/>
+        </w:rPr>
+      </w:pPr>
+    </w:p>
+    <w:p>
+      <w:pPr>
+        <w:jc w:val="both"/>
+        <w:rPr>
+          <w:sz w:val="24"/>
+          <w:szCs w:val="24"/>
+          <w:lang w:val="en-US"/>
+        </w:rPr>
+      </w:pPr>
+      <w:r>
+        <w:rPr>
+          <w:sz w:val="24"/>
+          <w:szCs w:val="24"/>
+        </w:rPr>
         <w:t xml:space="preserve">(iv) </w:t>
       </w:r>
       <w:r>
@@ -4143,7 +4136,7 @@
           <w:u w:val="single"/>
         </w:rPr>
         <w:drawing>
-          <wp:inline distT="0" distB="0" distL="0" distR="0" wp14:anchorId="3E441E19" wp14:editId="56436B70">
+          <wp:inline distT="0" distB="0" distL="0" distR="0" wp14:anchorId="6CA83F62" wp14:editId="134EB4A4">
             <wp:extent cx="5731510" cy="2042160"/>
             <wp:effectExtent l="0" t="0" r="2540" b="0"/>
             <wp:docPr id="1806874566" name="Picture 1"/>
@@ -4228,7 +4221,7 @@
           <w:u w:val="single"/>
         </w:rPr>
         <w:drawing>
-          <wp:inline distT="0" distB="0" distL="0" distR="0" wp14:anchorId="737D9707" wp14:editId="3417E499">
+          <wp:inline distT="0" distB="0" distL="0" distR="0" wp14:anchorId="5811A91B" wp14:editId="16DBA523">
             <wp:extent cx="5730429" cy="2756535"/>
             <wp:effectExtent l="0" t="0" r="3810" b="5715"/>
             <wp:docPr id="1414790266" name="Picture 1"/>
@@ -4312,16 +4305,6 @@
           <w:u w:val="single"/>
         </w:rPr>
       </w:pPr>
-    </w:p>
-    <w:p>
-      <w:pPr>
-        <w:jc w:val="both"/>
-        <w:rPr>
-          <w:sz w:val="44"/>
-          <w:szCs w:val="44"/>
-          <w:u w:val="single"/>
-        </w:rPr>
-      </w:pPr>
       <w:r>
         <w:rPr>
           <w:sz w:val="44"/>
@@ -4329,15 +4312,7 @@
           <w:u w:val="single"/>
         </w:rPr>
         <w:lastRenderedPageBreak/>
-        <w:t xml:space="preserve">Lab </w:t>
-      </w:r>
-      <w:r>
-        <w:rPr>
-          <w:sz w:val="44"/>
-          <w:szCs w:val="44"/>
-          <w:u w:val="single"/>
-        </w:rPr>
-        <w:t>10</w:t>
+        <w:t>Lab 10</w:t>
       </w:r>
     </w:p>
     <w:p>
@@ -4388,7 +4363,7 @@
           <w:u w:val="single"/>
         </w:rPr>
         <w:drawing>
-          <wp:inline distT="0" distB="0" distL="0" distR="0" wp14:anchorId="17A87A0D" wp14:editId="355EFFD8">
+          <wp:inline distT="0" distB="0" distL="0" distR="0" wp14:anchorId="1990F17C" wp14:editId="0AC7D0FE">
             <wp:extent cx="5731510" cy="1969770"/>
             <wp:effectExtent l="0" t="0" r="2540" b="0"/>
             <wp:docPr id="648014210" name="Picture 1"/>
@@ -4467,7 +4442,7 @@
           <w:u w:val="single"/>
         </w:rPr>
         <w:drawing>
-          <wp:inline distT="0" distB="0" distL="0" distR="0" wp14:anchorId="1889C103" wp14:editId="77BE44C3">
+          <wp:inline distT="0" distB="0" distL="0" distR="0" wp14:anchorId="7A37615E" wp14:editId="1CD0DBEA">
             <wp:extent cx="5731510" cy="2249805"/>
             <wp:effectExtent l="0" t="0" r="2540" b="0"/>
             <wp:docPr id="551337300" name="Picture 1"/>
@@ -4592,23 +4567,7 @@
           <w:szCs w:val="24"/>
           <w:lang w:val="en-US"/>
         </w:rPr>
-        <w:t>screenshot</w:t>
-      </w:r>
-      <w:r>
-        <w:rPr>
-          <w:sz w:val="24"/>
-          <w:szCs w:val="24"/>
-          <w:lang w:val="en-US"/>
-        </w:rPr>
-        <w:t>s</w:t>
-      </w:r>
-      <w:r>
-        <w:rPr>
-          <w:sz w:val="24"/>
-          <w:szCs w:val="24"/>
-          <w:lang w:val="en-US"/>
-        </w:rPr>
-        <w:t xml:space="preserve"> of the GAN training result</w:t>
+        <w:t>screenshot of the GAN training result</w:t>
       </w:r>
     </w:p>
     <w:p>
@@ -4636,7 +4595,7 @@
           <w:szCs w:val="44"/>
         </w:rPr>
         <w:drawing>
-          <wp:inline distT="0" distB="0" distL="0" distR="0" wp14:anchorId="27050032" wp14:editId="05E54C3E">
+          <wp:inline distT="0" distB="0" distL="0" distR="0" wp14:anchorId="546219AB" wp14:editId="324FC7D8">
             <wp:extent cx="4405745" cy="3575299"/>
             <wp:effectExtent l="0" t="0" r="0" b="6350"/>
             <wp:docPr id="848887218" name="Picture 1"/>
@@ -4687,7 +4646,7 @@
           <w:szCs w:val="44"/>
         </w:rPr>
         <w:drawing>
-          <wp:inline distT="0" distB="0" distL="0" distR="0" wp14:anchorId="48AAA457" wp14:editId="556F71D3">
+          <wp:inline distT="0" distB="0" distL="0" distR="0" wp14:anchorId="2E1F4A80" wp14:editId="7094D362">
             <wp:extent cx="3325091" cy="3305530"/>
             <wp:effectExtent l="0" t="0" r="8890" b="9525"/>
             <wp:docPr id="963665368" name="Picture 1"/>
@@ -4739,7 +4698,7 @@
         </w:rPr>
         <w:lastRenderedPageBreak/>
         <w:drawing>
-          <wp:inline distT="0" distB="0" distL="0" distR="0" wp14:anchorId="2F6E8BC9" wp14:editId="3EF57995">
+          <wp:inline distT="0" distB="0" distL="0" distR="0" wp14:anchorId="6B8C44C1" wp14:editId="34488A74">
             <wp:extent cx="3759232" cy="3692236"/>
             <wp:effectExtent l="0" t="0" r="0" b="3810"/>
             <wp:docPr id="244295002" name="Picture 1"/>
@@ -4790,7 +4749,7 @@
           <w:szCs w:val="44"/>
         </w:rPr>
         <w:drawing>
-          <wp:inline distT="0" distB="0" distL="0" distR="0" wp14:anchorId="6A46219E" wp14:editId="1F849819">
+          <wp:inline distT="0" distB="0" distL="0" distR="0" wp14:anchorId="1DEC65C9" wp14:editId="5C8F6ABD">
             <wp:extent cx="3754582" cy="3822438"/>
             <wp:effectExtent l="0" t="0" r="0" b="6985"/>
             <wp:docPr id="870090070" name="Picture 1"/>
@@ -4842,7 +4801,7 @@
         </w:rPr>
         <w:lastRenderedPageBreak/>
         <w:drawing>
-          <wp:inline distT="0" distB="0" distL="0" distR="0" wp14:anchorId="3CCBA790" wp14:editId="6BE806CB">
+          <wp:inline distT="0" distB="0" distL="0" distR="0" wp14:anchorId="3D72BEAB" wp14:editId="4F8F5992">
             <wp:extent cx="3325091" cy="3305376"/>
             <wp:effectExtent l="0" t="0" r="8890" b="0"/>
             <wp:docPr id="1389893714" name="Picture 1"/>
@@ -4902,7 +4861,7 @@
           <w:szCs w:val="44"/>
         </w:rPr>
         <w:drawing>
-          <wp:inline distT="0" distB="0" distL="0" distR="0" wp14:anchorId="3F597E86" wp14:editId="6757C05B">
+          <wp:inline distT="0" distB="0" distL="0" distR="0" wp14:anchorId="46D41460" wp14:editId="15523855">
             <wp:extent cx="3163454" cy="2874818"/>
             <wp:effectExtent l="0" t="0" r="0" b="1905"/>
             <wp:docPr id="1046218996" name="Picture 1"/>
@@ -4963,7 +4922,7 @@
         </w:rPr>
         <w:lastRenderedPageBreak/>
         <w:drawing>
-          <wp:inline distT="0" distB="0" distL="0" distR="0" wp14:anchorId="2C7B4F8E" wp14:editId="11A7D507">
+          <wp:inline distT="0" distB="0" distL="0" distR="0" wp14:anchorId="292C92F5" wp14:editId="27ACB9E4">
             <wp:extent cx="3484418" cy="3429654"/>
             <wp:effectExtent l="0" t="0" r="1905" b="0"/>
             <wp:docPr id="1840487003" name="Picture 1"/>
@@ -5014,7 +4973,7 @@
           <w:szCs w:val="44"/>
         </w:rPr>
         <w:drawing>
-          <wp:inline distT="0" distB="0" distL="0" distR="0" wp14:anchorId="6EA42A3B" wp14:editId="2AF51E95">
+          <wp:inline distT="0" distB="0" distL="0" distR="0" wp14:anchorId="0D41EE35" wp14:editId="1D7FD2C7">
             <wp:extent cx="3498273" cy="3436051"/>
             <wp:effectExtent l="0" t="0" r="6985" b="0"/>
             <wp:docPr id="1602930731" name="Picture 1"/>
@@ -5049,6 +5008,700 @@
           </wp:inline>
         </w:drawing>
       </w:r>
+    </w:p>
+    <w:p>
+      <w:pPr>
+        <w:jc w:val="both"/>
+        <w:rPr>
+          <w:sz w:val="44"/>
+          <w:szCs w:val="44"/>
+          <w:u w:val="single"/>
+        </w:rPr>
+      </w:pPr>
+    </w:p>
+    <w:p>
+      <w:pPr>
+        <w:jc w:val="both"/>
+        <w:rPr>
+          <w:sz w:val="44"/>
+          <w:szCs w:val="44"/>
+          <w:u w:val="single"/>
+        </w:rPr>
+      </w:pPr>
+    </w:p>
+    <w:p>
+      <w:pPr>
+        <w:jc w:val="both"/>
+        <w:rPr>
+          <w:sz w:val="44"/>
+          <w:szCs w:val="44"/>
+          <w:u w:val="single"/>
+        </w:rPr>
+      </w:pPr>
+    </w:p>
+    <w:p>
+      <w:pPr>
+        <w:jc w:val="both"/>
+        <w:rPr>
+          <w:sz w:val="44"/>
+          <w:szCs w:val="44"/>
+          <w:u w:val="single"/>
+        </w:rPr>
+      </w:pPr>
+      <w:r>
+        <w:rPr>
+          <w:sz w:val="44"/>
+          <w:szCs w:val="44"/>
+          <w:u w:val="single"/>
+        </w:rPr>
+        <w:lastRenderedPageBreak/>
+        <w:t>Lab 12</w:t>
+      </w:r>
+    </w:p>
+    <w:p>
+      <w:pPr>
+        <w:pStyle w:val="ListParagraph"/>
+        <w:numPr>
+          <w:ilvl w:val="0"/>
+          <w:numId w:val="10"/>
+        </w:numPr>
+        <w:jc w:val="both"/>
+        <w:rPr>
+          <w:sz w:val="24"/>
+          <w:szCs w:val="24"/>
+          <w:lang w:val="en-US"/>
+        </w:rPr>
+      </w:pPr>
+      <w:r>
+        <w:rPr>
+          <w:sz w:val="24"/>
+          <w:szCs w:val="24"/>
+          <w:lang w:val="en-US"/>
+        </w:rPr>
+        <w:t>Loss function (MSE) graph during the training</w:t>
+      </w:r>
+    </w:p>
+    <w:p>
+      <w:pPr>
+        <w:jc w:val="both"/>
+        <w:rPr>
+          <w:sz w:val="44"/>
+          <w:szCs w:val="44"/>
+          <w:u w:val="single"/>
+        </w:rPr>
+      </w:pPr>
+      <w:r>
+        <w:rPr>
+          <w:noProof/>
+          <w:sz w:val="44"/>
+          <w:szCs w:val="44"/>
+          <w:u w:val="single"/>
+        </w:rPr>
+        <w:drawing>
+          <wp:inline distT="0" distB="0" distL="0" distR="0" wp14:anchorId="740F504B" wp14:editId="66B48C38">
+            <wp:extent cx="5731510" cy="2831465"/>
+            <wp:effectExtent l="0" t="0" r="2540" b="6985"/>
+            <wp:docPr id="1289244259" name="Picture 1"/>
+            <wp:cNvGraphicFramePr>
+              <a:graphicFrameLocks xmlns:a="http://schemas.openxmlformats.org/drawingml/2006/main" noChangeAspect="1"/>
+            </wp:cNvGraphicFramePr>
+            <a:graphic xmlns:a="http://schemas.openxmlformats.org/drawingml/2006/main">
+              <a:graphicData uri="http://schemas.openxmlformats.org/drawingml/2006/picture">
+                <pic:pic xmlns:pic="http://schemas.openxmlformats.org/drawingml/2006/picture">
+                  <pic:nvPicPr>
+                    <pic:cNvPr id="1289244259" name=""/>
+                    <pic:cNvPicPr/>
+                  </pic:nvPicPr>
+                  <pic:blipFill>
+                    <a:blip r:embed="rId40"/>
+                    <a:stretch>
+                      <a:fillRect/>
+                    </a:stretch>
+                  </pic:blipFill>
+                  <pic:spPr>
+                    <a:xfrm>
+                      <a:off x="0" y="0"/>
+                      <a:ext cx="5731510" cy="2831465"/>
+                    </a:xfrm>
+                    <a:prstGeom prst="rect">
+                      <a:avLst/>
+                    </a:prstGeom>
+                  </pic:spPr>
+                </pic:pic>
+              </a:graphicData>
+            </a:graphic>
+          </wp:inline>
+        </w:drawing>
+      </w:r>
+    </w:p>
+    <w:p>
+      <w:pPr>
+        <w:pStyle w:val="ListParagraph"/>
+        <w:numPr>
+          <w:ilvl w:val="0"/>
+          <w:numId w:val="10"/>
+        </w:numPr>
+        <w:jc w:val="both"/>
+        <w:rPr>
+          <w:sz w:val="24"/>
+          <w:szCs w:val="24"/>
+          <w:lang w:val="en-US"/>
+        </w:rPr>
+      </w:pPr>
+      <w:r>
+        <w:rPr>
+          <w:sz w:val="24"/>
+          <w:szCs w:val="24"/>
+          <w:lang w:val="en-US"/>
+        </w:rPr>
+        <w:t>calculation of your parameters</w:t>
+      </w:r>
+    </w:p>
+    <w:p>
+      <w:pPr>
+        <w:jc w:val="both"/>
+        <w:rPr>
+          <w:sz w:val="24"/>
+          <w:szCs w:val="24"/>
+        </w:rPr>
+      </w:pPr>
+      <w:r>
+        <w:rPr>
+          <w:noProof/>
+          <w:sz w:val="24"/>
+          <w:szCs w:val="24"/>
+        </w:rPr>
+        <w:drawing>
+          <wp:inline distT="0" distB="0" distL="0" distR="0" wp14:anchorId="507C2408" wp14:editId="457F155B">
+            <wp:extent cx="2876951" cy="1352739"/>
+            <wp:effectExtent l="0" t="0" r="0" b="0"/>
+            <wp:docPr id="2058706234" name="Picture 1"/>
+            <wp:cNvGraphicFramePr>
+              <a:graphicFrameLocks xmlns:a="http://schemas.openxmlformats.org/drawingml/2006/main" noChangeAspect="1"/>
+            </wp:cNvGraphicFramePr>
+            <a:graphic xmlns:a="http://schemas.openxmlformats.org/drawingml/2006/main">
+              <a:graphicData uri="http://schemas.openxmlformats.org/drawingml/2006/picture">
+                <pic:pic xmlns:pic="http://schemas.openxmlformats.org/drawingml/2006/picture">
+                  <pic:nvPicPr>
+                    <pic:cNvPr id="2058706234" name=""/>
+                    <pic:cNvPicPr/>
+                  </pic:nvPicPr>
+                  <pic:blipFill>
+                    <a:blip r:embed="rId41"/>
+                    <a:stretch>
+                      <a:fillRect/>
+                    </a:stretch>
+                  </pic:blipFill>
+                  <pic:spPr>
+                    <a:xfrm>
+                      <a:off x="0" y="0"/>
+                      <a:ext cx="2876951" cy="1352739"/>
+                    </a:xfrm>
+                    <a:prstGeom prst="rect">
+                      <a:avLst/>
+                    </a:prstGeom>
+                  </pic:spPr>
+                </pic:pic>
+              </a:graphicData>
+            </a:graphic>
+          </wp:inline>
+        </w:drawing>
+      </w:r>
+    </w:p>
+    <w:p>
+      <w:pPr>
+        <w:jc w:val="both"/>
+        <w:rPr>
+          <w:sz w:val="24"/>
+          <w:szCs w:val="24"/>
+        </w:rPr>
+      </w:pPr>
+    </w:p>
+    <w:p>
+      <w:pPr>
+        <w:jc w:val="both"/>
+        <w:rPr>
+          <w:sz w:val="24"/>
+          <w:szCs w:val="24"/>
+        </w:rPr>
+      </w:pPr>
+    </w:p>
+    <w:p>
+      <w:pPr>
+        <w:jc w:val="both"/>
+        <w:rPr>
+          <w:sz w:val="24"/>
+          <w:szCs w:val="24"/>
+        </w:rPr>
+      </w:pPr>
+    </w:p>
+    <w:p>
+      <w:pPr>
+        <w:jc w:val="both"/>
+        <w:rPr>
+          <w:sz w:val="24"/>
+          <w:szCs w:val="24"/>
+        </w:rPr>
+      </w:pPr>
+    </w:p>
+    <w:p>
+      <w:pPr>
+        <w:jc w:val="both"/>
+        <w:rPr>
+          <w:sz w:val="24"/>
+          <w:szCs w:val="24"/>
+        </w:rPr>
+      </w:pPr>
+    </w:p>
+    <w:p>
+      <w:pPr>
+        <w:jc w:val="both"/>
+        <w:rPr>
+          <w:sz w:val="24"/>
+          <w:szCs w:val="24"/>
+        </w:rPr>
+      </w:pPr>
+    </w:p>
+    <w:p>
+      <w:pPr>
+        <w:jc w:val="both"/>
+        <w:rPr>
+          <w:sz w:val="24"/>
+          <w:szCs w:val="24"/>
+        </w:rPr>
+      </w:pPr>
+    </w:p>
+    <w:p>
+      <w:pPr>
+        <w:jc w:val="both"/>
+        <w:rPr>
+          <w:sz w:val="24"/>
+          <w:szCs w:val="24"/>
+        </w:rPr>
+      </w:pPr>
+    </w:p>
+    <w:p>
+      <w:pPr>
+        <w:jc w:val="both"/>
+        <w:rPr>
+          <w:sz w:val="24"/>
+          <w:szCs w:val="24"/>
+        </w:rPr>
+      </w:pPr>
+    </w:p>
+    <w:p>
+      <w:pPr>
+        <w:jc w:val="both"/>
+        <w:rPr>
+          <w:sz w:val="24"/>
+          <w:szCs w:val="24"/>
+        </w:rPr>
+      </w:pPr>
+    </w:p>
+    <w:p>
+      <w:pPr>
+        <w:jc w:val="both"/>
+        <w:rPr>
+          <w:sz w:val="24"/>
+          <w:szCs w:val="24"/>
+        </w:rPr>
+      </w:pPr>
+    </w:p>
+    <w:p>
+      <w:pPr>
+        <w:pStyle w:val="ListParagraph"/>
+        <w:numPr>
+          <w:ilvl w:val="0"/>
+          <w:numId w:val="10"/>
+        </w:numPr>
+        <w:jc w:val="both"/>
+        <w:rPr>
+          <w:lang w:val="en-US"/>
+        </w:rPr>
+      </w:pPr>
+      <w:r>
+        <w:rPr>
+          <w:sz w:val="24"/>
+          <w:szCs w:val="24"/>
+        </w:rPr>
+        <w:lastRenderedPageBreak/>
+        <w:t xml:space="preserve">Code </w:t>
+      </w:r>
+      <w:r>
+        <w:rPr>
+          <w:lang w:val="en-US"/>
+        </w:rPr>
+        <w:t xml:space="preserve">of using EarlyStopping() and ModelCheckpoint() functions, </w:t>
+      </w:r>
+      <w:r>
+        <w:rPr>
+          <w:sz w:val="24"/>
+          <w:szCs w:val="24"/>
+          <w:lang w:val="en-US"/>
+        </w:rPr>
+        <w:t>c</w:t>
+      </w:r>
+      <w:r>
+        <w:rPr>
+          <w:sz w:val="24"/>
+          <w:szCs w:val="24"/>
+          <w:lang w:val="en-US"/>
+        </w:rPr>
+        <w:t>ode training result using model.fit()</w:t>
+      </w:r>
+    </w:p>
+    <w:p>
+      <w:pPr>
+        <w:pStyle w:val="ListParagraph"/>
+        <w:jc w:val="both"/>
+        <w:rPr>
+          <w:sz w:val="24"/>
+          <w:szCs w:val="24"/>
+        </w:rPr>
+      </w:pPr>
+    </w:p>
+    <w:p>
+      <w:pPr>
+        <w:jc w:val="both"/>
+        <w:rPr>
+          <w:sz w:val="44"/>
+          <w:szCs w:val="44"/>
+          <w:u w:val="single"/>
+        </w:rPr>
+      </w:pPr>
+      <w:r>
+        <w:rPr>
+          <w:noProof/>
+          <w:sz w:val="44"/>
+          <w:szCs w:val="44"/>
+          <w:u w:val="single"/>
+        </w:rPr>
+        <w:drawing>
+          <wp:inline distT="0" distB="0" distL="0" distR="0" wp14:anchorId="6AC3C65E" wp14:editId="3BF716D0">
+            <wp:extent cx="5731510" cy="4204970"/>
+            <wp:effectExtent l="0" t="0" r="2540" b="5080"/>
+            <wp:docPr id="1179730807" name="Picture 1"/>
+            <wp:cNvGraphicFramePr>
+              <a:graphicFrameLocks xmlns:a="http://schemas.openxmlformats.org/drawingml/2006/main" noChangeAspect="1"/>
+            </wp:cNvGraphicFramePr>
+            <a:graphic xmlns:a="http://schemas.openxmlformats.org/drawingml/2006/main">
+              <a:graphicData uri="http://schemas.openxmlformats.org/drawingml/2006/picture">
+                <pic:pic xmlns:pic="http://schemas.openxmlformats.org/drawingml/2006/picture">
+                  <pic:nvPicPr>
+                    <pic:cNvPr id="1179730807" name=""/>
+                    <pic:cNvPicPr/>
+                  </pic:nvPicPr>
+                  <pic:blipFill>
+                    <a:blip r:embed="rId42"/>
+                    <a:stretch>
+                      <a:fillRect/>
+                    </a:stretch>
+                  </pic:blipFill>
+                  <pic:spPr>
+                    <a:xfrm>
+                      <a:off x="0" y="0"/>
+                      <a:ext cx="5731510" cy="4204970"/>
+                    </a:xfrm>
+                    <a:prstGeom prst="rect">
+                      <a:avLst/>
+                    </a:prstGeom>
+                  </pic:spPr>
+                </pic:pic>
+              </a:graphicData>
+            </a:graphic>
+          </wp:inline>
+        </w:drawing>
+      </w:r>
+    </w:p>
+    <w:p>
+      <w:pPr>
+        <w:jc w:val="both"/>
+        <w:rPr>
+          <w:sz w:val="44"/>
+          <w:szCs w:val="44"/>
+          <w:u w:val="single"/>
+        </w:rPr>
+      </w:pPr>
+      <w:r>
+        <w:rPr>
+          <w:noProof/>
+          <w:sz w:val="44"/>
+          <w:szCs w:val="44"/>
+          <w:u w:val="single"/>
+        </w:rPr>
+        <w:lastRenderedPageBreak/>
+        <w:drawing>
+          <wp:inline distT="0" distB="0" distL="0" distR="0" wp14:anchorId="1BFC1110" wp14:editId="658862C5">
+            <wp:extent cx="4765738" cy="4336473"/>
+            <wp:effectExtent l="0" t="0" r="0" b="6985"/>
+            <wp:docPr id="1213719314" name="Picture 1"/>
+            <wp:cNvGraphicFramePr>
+              <a:graphicFrameLocks xmlns:a="http://schemas.openxmlformats.org/drawingml/2006/main" noChangeAspect="1"/>
+            </wp:cNvGraphicFramePr>
+            <a:graphic xmlns:a="http://schemas.openxmlformats.org/drawingml/2006/main">
+              <a:graphicData uri="http://schemas.openxmlformats.org/drawingml/2006/picture">
+                <pic:pic xmlns:pic="http://schemas.openxmlformats.org/drawingml/2006/picture">
+                  <pic:nvPicPr>
+                    <pic:cNvPr id="1213719314" name=""/>
+                    <pic:cNvPicPr/>
+                  </pic:nvPicPr>
+                  <pic:blipFill>
+                    <a:blip r:embed="rId43"/>
+                    <a:stretch>
+                      <a:fillRect/>
+                    </a:stretch>
+                  </pic:blipFill>
+                  <pic:spPr>
+                    <a:xfrm>
+                      <a:off x="0" y="0"/>
+                      <a:ext cx="4767567" cy="4338137"/>
+                    </a:xfrm>
+                    <a:prstGeom prst="rect">
+                      <a:avLst/>
+                    </a:prstGeom>
+                  </pic:spPr>
+                </pic:pic>
+              </a:graphicData>
+            </a:graphic>
+          </wp:inline>
+        </w:drawing>
+      </w:r>
+    </w:p>
+    <w:p>
+      <w:pPr>
+        <w:jc w:val="both"/>
+        <w:rPr>
+          <w:sz w:val="44"/>
+          <w:szCs w:val="44"/>
+          <w:u w:val="single"/>
+        </w:rPr>
+      </w:pPr>
+      <w:r>
+        <w:rPr>
+          <w:noProof/>
+          <w:sz w:val="44"/>
+          <w:szCs w:val="44"/>
+          <w:u w:val="single"/>
+        </w:rPr>
+        <w:drawing>
+          <wp:inline distT="0" distB="0" distL="0" distR="0" wp14:anchorId="0BA83A16" wp14:editId="398C9182">
+            <wp:extent cx="3955473" cy="2990927"/>
+            <wp:effectExtent l="0" t="0" r="6985" b="0"/>
+            <wp:docPr id="926587319" name="Picture 1"/>
+            <wp:cNvGraphicFramePr>
+              <a:graphicFrameLocks xmlns:a="http://schemas.openxmlformats.org/drawingml/2006/main" noChangeAspect="1"/>
+            </wp:cNvGraphicFramePr>
+            <a:graphic xmlns:a="http://schemas.openxmlformats.org/drawingml/2006/main">
+              <a:graphicData uri="http://schemas.openxmlformats.org/drawingml/2006/picture">
+                <pic:pic xmlns:pic="http://schemas.openxmlformats.org/drawingml/2006/picture">
+                  <pic:nvPicPr>
+                    <pic:cNvPr id="926587319" name=""/>
+                    <pic:cNvPicPr/>
+                  </pic:nvPicPr>
+                  <pic:blipFill>
+                    <a:blip r:embed="rId44"/>
+                    <a:stretch>
+                      <a:fillRect/>
+                    </a:stretch>
+                  </pic:blipFill>
+                  <pic:spPr>
+                    <a:xfrm>
+                      <a:off x="0" y="0"/>
+                      <a:ext cx="3956096" cy="2991398"/>
+                    </a:xfrm>
+                    <a:prstGeom prst="rect">
+                      <a:avLst/>
+                    </a:prstGeom>
+                  </pic:spPr>
+                </pic:pic>
+              </a:graphicData>
+            </a:graphic>
+          </wp:inline>
+        </w:drawing>
+      </w:r>
+    </w:p>
+    <w:p>
+      <w:pPr>
+        <w:pStyle w:val="ListParagraph"/>
+        <w:numPr>
+          <w:ilvl w:val="0"/>
+          <w:numId w:val="10"/>
+        </w:numPr>
+        <w:jc w:val="both"/>
+        <w:rPr>
+          <w:sz w:val="24"/>
+          <w:szCs w:val="24"/>
+          <w:lang w:val="en-US"/>
+        </w:rPr>
+      </w:pPr>
+      <w:r>
+        <w:rPr>
+          <w:sz w:val="24"/>
+          <w:szCs w:val="24"/>
+          <w:lang w:val="en-US"/>
+        </w:rPr>
+        <w:t>Received loss for train and test datasets</w:t>
+      </w:r>
+    </w:p>
+    <w:p>
+      <w:pPr>
+        <w:jc w:val="both"/>
+        <w:rPr>
+          <w:sz w:val="24"/>
+          <w:szCs w:val="24"/>
+          <w:lang w:val="en-US"/>
+        </w:rPr>
+      </w:pPr>
+      <w:r>
+        <w:rPr>
+          <w:noProof/>
+          <w:sz w:val="24"/>
+          <w:szCs w:val="24"/>
+          <w:lang w:val="en-US"/>
+        </w:rPr>
+        <w:drawing>
+          <wp:inline distT="0" distB="0" distL="0" distR="0" wp14:anchorId="29D569DE" wp14:editId="7B4B2F2E">
+            <wp:extent cx="3600953" cy="409632"/>
+            <wp:effectExtent l="0" t="0" r="0" b="9525"/>
+            <wp:docPr id="490378363" name="Picture 1"/>
+            <wp:cNvGraphicFramePr>
+              <a:graphicFrameLocks xmlns:a="http://schemas.openxmlformats.org/drawingml/2006/main" noChangeAspect="1"/>
+            </wp:cNvGraphicFramePr>
+            <a:graphic xmlns:a="http://schemas.openxmlformats.org/drawingml/2006/main">
+              <a:graphicData uri="http://schemas.openxmlformats.org/drawingml/2006/picture">
+                <pic:pic xmlns:pic="http://schemas.openxmlformats.org/drawingml/2006/picture">
+                  <pic:nvPicPr>
+                    <pic:cNvPr id="490378363" name=""/>
+                    <pic:cNvPicPr/>
+                  </pic:nvPicPr>
+                  <pic:blipFill>
+                    <a:blip r:embed="rId45"/>
+                    <a:stretch>
+                      <a:fillRect/>
+                    </a:stretch>
+                  </pic:blipFill>
+                  <pic:spPr>
+                    <a:xfrm>
+                      <a:off x="0" y="0"/>
+                      <a:ext cx="3600953" cy="409632"/>
+                    </a:xfrm>
+                    <a:prstGeom prst="rect">
+                      <a:avLst/>
+                    </a:prstGeom>
+                  </pic:spPr>
+                </pic:pic>
+              </a:graphicData>
+            </a:graphic>
+          </wp:inline>
+        </w:drawing>
+      </w:r>
+    </w:p>
+    <w:p>
+      <w:pPr>
+        <w:jc w:val="both"/>
+        <w:rPr>
+          <w:sz w:val="24"/>
+          <w:szCs w:val="24"/>
+          <w:lang w:val="en-US"/>
+        </w:rPr>
+      </w:pPr>
+    </w:p>
+    <w:p>
+      <w:pPr>
+        <w:pStyle w:val="ListParagraph"/>
+        <w:numPr>
+          <w:ilvl w:val="0"/>
+          <w:numId w:val="10"/>
+        </w:numPr>
+        <w:jc w:val="both"/>
+        <w:rPr>
+          <w:sz w:val="24"/>
+          <w:szCs w:val="24"/>
+          <w:lang w:val="en-US"/>
+        </w:rPr>
+      </w:pPr>
+      <w:r>
+        <w:rPr>
+          <w:sz w:val="24"/>
+          <w:szCs w:val="24"/>
+          <w:lang w:val="en-US"/>
+        </w:rPr>
+        <w:lastRenderedPageBreak/>
+        <w:t>Performance histogram for train and test loss (MSE) of the 3 models together</w:t>
+      </w:r>
+    </w:p>
+    <w:p>
+      <w:pPr>
+        <w:jc w:val="both"/>
+        <w:rPr>
+          <w:sz w:val="44"/>
+          <w:szCs w:val="44"/>
+          <w:u w:val="single"/>
+        </w:rPr>
+      </w:pPr>
+      <w:r>
+        <w:rPr>
+          <w:noProof/>
+          <w:sz w:val="44"/>
+          <w:szCs w:val="44"/>
+          <w:u w:val="single"/>
+        </w:rPr>
+        <w:drawing>
+          <wp:inline distT="0" distB="0" distL="0" distR="0" wp14:anchorId="16BF3F63" wp14:editId="30008787">
+            <wp:extent cx="5731510" cy="4180205"/>
+            <wp:effectExtent l="0" t="0" r="2540" b="0"/>
+            <wp:docPr id="200587222" name="Picture 1"/>
+            <wp:cNvGraphicFramePr>
+              <a:graphicFrameLocks xmlns:a="http://schemas.openxmlformats.org/drawingml/2006/main" noChangeAspect="1"/>
+            </wp:cNvGraphicFramePr>
+            <a:graphic xmlns:a="http://schemas.openxmlformats.org/drawingml/2006/main">
+              <a:graphicData uri="http://schemas.openxmlformats.org/drawingml/2006/picture">
+                <pic:pic xmlns:pic="http://schemas.openxmlformats.org/drawingml/2006/picture">
+                  <pic:nvPicPr>
+                    <pic:cNvPr id="200587222" name=""/>
+                    <pic:cNvPicPr/>
+                  </pic:nvPicPr>
+                  <pic:blipFill>
+                    <a:blip r:embed="rId46"/>
+                    <a:stretch>
+                      <a:fillRect/>
+                    </a:stretch>
+                  </pic:blipFill>
+                  <pic:spPr>
+                    <a:xfrm>
+                      <a:off x="0" y="0"/>
+                      <a:ext cx="5731510" cy="4180205"/>
+                    </a:xfrm>
+                    <a:prstGeom prst="rect">
+                      <a:avLst/>
+                    </a:prstGeom>
+                  </pic:spPr>
+                </pic:pic>
+              </a:graphicData>
+            </a:graphic>
+          </wp:inline>
+        </w:drawing>
+      </w:r>
+    </w:p>
+    <w:p>
+      <w:pPr>
+        <w:jc w:val="both"/>
+        <w:rPr>
+          <w:sz w:val="44"/>
+          <w:szCs w:val="44"/>
+          <w:u w:val="single"/>
+        </w:rPr>
+      </w:pPr>
+    </w:p>
+    <w:p>
+      <w:pPr>
+        <w:jc w:val="both"/>
+        <w:rPr>
+          <w:sz w:val="44"/>
+          <w:szCs w:val="44"/>
+          <w:u w:val="single"/>
+        </w:rPr>
+      </w:pPr>
     </w:p>
     <w:p>
       <w:pPr>
@@ -6590,7 +7243,7 @@
   <w:style w:type="paragraph" w:default="1" w:styleId="Normal">
     <w:name w:val="Normal"/>
     <w:qFormat/>
-    <w:rsid w:val="00BF3E58"/>
+    <w:rsid w:val="002B27D1"/>
   </w:style>
   <w:style w:type="paragraph" w:styleId="Heading3">
     <w:name w:val="heading 3"/>

</xml_diff>